<commit_message>
Novas atividades de ingles e python
</commit_message>
<xml_diff>
--- a/Curso Python/Anotações sobre o Curso de Python.docx
+++ b/Curso Python/Anotações sobre o Curso de Python.docx
@@ -5,7 +5,6 @@
     <w:p>
       <w:pPr>
         <w:spacing w:after="0" w:line="240" w:lineRule="auto"/>
-        <w:jc w:val="center"/>
         <w:rPr>
           <w:rFonts w:ascii="Times New Roman" w:eastAsia="Times New Roman" w:hAnsi="Times New Roman" w:cs="Times New Roman"/>
           <w:sz w:val="24"/>
@@ -4376,9 +4375,8 @@
       <w:pPr>
         <w:spacing w:line="240" w:lineRule="auto"/>
         <w:rPr>
-          <w:rFonts w:ascii="Times New Roman" w:eastAsia="Times New Roman" w:hAnsi="Times New Roman" w:cs="Times New Roman"/>
-          <w:sz w:val="24"/>
-          <w:szCs w:val="24"/>
+          <w:rFonts w:ascii="Calibri" w:eastAsia="Times New Roman" w:hAnsi="Calibri" w:cs="Calibri"/>
+          <w:color w:val="000000"/>
           <w:lang w:eastAsia="pt-BR"/>
         </w:rPr>
       </w:pPr>
@@ -4481,15 +4479,171 @@
     </w:p>
     <w:p>
       <w:pPr>
-        <w:spacing w:before="240" w:after="0" w:line="240" w:lineRule="auto"/>
-        <w:outlineLvl w:val="0"/>
-        <w:rPr>
-          <w:rFonts w:ascii="Times New Roman" w:eastAsia="Times New Roman" w:hAnsi="Times New Roman" w:cs="Times New Roman"/>
-          <w:b/>
-          <w:bCs/>
-          <w:kern w:val="36"/>
-          <w:sz w:val="48"/>
-          <w:szCs w:val="48"/>
+        <w:rPr>
+          <w:rFonts w:ascii="Calibri" w:hAnsi="Calibri" w:cs="Calibri"/>
+          <w:color w:val="000000"/>
+        </w:rPr>
+      </w:pPr>
+      <w:r>
+        <w:rPr>
+          <w:rFonts w:ascii="Calibri" w:eastAsia="Times New Roman" w:hAnsi="Calibri" w:cs="Calibri"/>
+          <w:color w:val="000000"/>
+          <w:lang w:eastAsia="pt-BR"/>
+        </w:rPr>
+        <w:lastRenderedPageBreak/>
+        <w:t>Print(f’[{matriz[l][c]:^5}]’ ess</w:t>
+      </w:r>
+      <w:r>
+        <w:rPr>
+          <w:rFonts w:ascii="Calibri" w:eastAsia="Times New Roman" w:hAnsi="Calibri" w:cs="Calibri"/>
+          <w:color w:val="000000"/>
+          <w:lang w:eastAsia="pt-BR"/>
+        </w:rPr>
+        <w:t xml:space="preserve">e ^5 quer dizer </w:t>
+      </w:r>
+      <w:proofErr w:type="gramStart"/>
+      <w:r>
+        <w:rPr>
+          <w:rFonts w:ascii="Calibri" w:eastAsia="Times New Roman" w:hAnsi="Calibri" w:cs="Calibri"/>
+          <w:color w:val="000000"/>
+          <w:lang w:eastAsia="pt-BR"/>
+        </w:rPr>
+        <w:t xml:space="preserve">para </w:t>
+      </w:r>
+      <w:r>
+        <w:rPr>
+          <w:rFonts w:ascii="Calibri" w:hAnsi="Calibri" w:cs="Calibri"/>
+          <w:color w:val="000000"/>
+        </w:rPr>
+        <w:t>:</w:t>
+      </w:r>
+      <w:proofErr w:type="gramEnd"/>
+      <w:r>
+        <w:rPr>
+          <w:rFonts w:ascii="Calibri" w:hAnsi="Calibri" w:cs="Calibri"/>
+          <w:color w:val="000000"/>
+        </w:rPr>
+        <w:t xml:space="preserve"> ^5 → instrução de formatação:</w:t>
+      </w:r>
+    </w:p>
+    <w:p>
+      <w:pPr>
+        <w:numPr>
+          <w:ilvl w:val="0"/>
+          <w:numId w:val="1"/>
+        </w:numPr>
+        <w:spacing w:line="240" w:lineRule="auto"/>
+        <w:rPr>
+          <w:rFonts w:ascii="Calibri" w:eastAsia="Times New Roman" w:hAnsi="Calibri" w:cs="Calibri"/>
+          <w:color w:val="000000"/>
+          <w:lang w:eastAsia="pt-BR"/>
+        </w:rPr>
+      </w:pPr>
+      <w:r>
+        <w:rPr>
+          <w:rFonts w:ascii="Calibri" w:eastAsia="Times New Roman" w:hAnsi="Calibri" w:cs="Calibri"/>
+          <w:color w:val="000000"/>
+          <w:lang w:eastAsia="pt-BR"/>
+        </w:rPr>
+        <w:t>^ → centraliza o valor.</w:t>
+      </w:r>
+    </w:p>
+    <w:p>
+      <w:pPr>
+        <w:numPr>
+          <w:ilvl w:val="0"/>
+          <w:numId w:val="1"/>
+        </w:numPr>
+        <w:spacing w:line="240" w:lineRule="auto"/>
+        <w:rPr>
+          <w:rFonts w:ascii="Calibri" w:eastAsia="Times New Roman" w:hAnsi="Calibri" w:cs="Calibri"/>
+          <w:color w:val="000000"/>
+          <w:lang w:eastAsia="pt-BR"/>
+        </w:rPr>
+      </w:pPr>
+      <w:r>
+        <w:rPr>
+          <w:rFonts w:ascii="Calibri" w:eastAsia="Times New Roman" w:hAnsi="Calibri" w:cs="Calibri"/>
+          <w:color w:val="000000"/>
+          <w:lang w:eastAsia="pt-BR"/>
+        </w:rPr>
+        <w:t>5 → largura total do campo (5 caracteres de espaço).</w:t>
+      </w:r>
+    </w:p>
+    <w:p>
+      <w:pPr>
+        <w:spacing w:line="240" w:lineRule="auto"/>
+        <w:rPr>
+          <w:rFonts w:ascii="Calibri" w:eastAsia="Times New Roman" w:hAnsi="Calibri" w:cs="Calibri"/>
+          <w:color w:val="000000"/>
+          <w:lang w:eastAsia="pt-BR"/>
+        </w:rPr>
+      </w:pPr>
+      <w:proofErr w:type="gramStart"/>
+      <w:r>
+        <w:rPr>
+          <w:rFonts w:ascii="Calibri" w:eastAsia="Times New Roman" w:hAnsi="Calibri" w:cs="Calibri"/>
+          <w:color w:val="000000"/>
+          <w:lang w:eastAsia="pt-BR"/>
+        </w:rPr>
+        <w:t>[  1  ]</w:t>
+      </w:r>
+      <w:proofErr w:type="gramEnd"/>
+    </w:p>
+    <w:p>
+      <w:pPr>
+        <w:spacing w:line="240" w:lineRule="auto"/>
+        <w:rPr>
+          <w:rFonts w:ascii="Calibri" w:eastAsia="Times New Roman" w:hAnsi="Calibri" w:cs="Calibri"/>
+          <w:color w:val="000000"/>
+          <w:lang w:eastAsia="pt-BR"/>
+        </w:rPr>
+      </w:pPr>
+      <w:proofErr w:type="gramStart"/>
+      <w:r>
+        <w:rPr>
+          <w:rFonts w:ascii="Calibri" w:eastAsia="Times New Roman" w:hAnsi="Calibri" w:cs="Calibri"/>
+          <w:color w:val="000000"/>
+          <w:lang w:eastAsia="pt-BR"/>
+        </w:rPr>
+        <w:t>[ 22  ]</w:t>
+      </w:r>
+      <w:proofErr w:type="gramEnd"/>
+    </w:p>
+    <w:p>
+      <w:pPr>
+        <w:spacing w:line="240" w:lineRule="auto"/>
+        <w:rPr>
+          <w:rFonts w:ascii="Calibri" w:eastAsia="Times New Roman" w:hAnsi="Calibri" w:cs="Calibri"/>
+          <w:color w:val="000000"/>
+          <w:lang w:eastAsia="pt-BR"/>
+        </w:rPr>
+      </w:pPr>
+      <w:proofErr w:type="gramStart"/>
+      <w:r>
+        <w:rPr>
+          <w:rFonts w:ascii="Calibri" w:eastAsia="Times New Roman" w:hAnsi="Calibri" w:cs="Calibri"/>
+          <w:color w:val="000000"/>
+          <w:lang w:eastAsia="pt-BR"/>
+        </w:rPr>
+        <w:t>[ 333</w:t>
+      </w:r>
+      <w:proofErr w:type="gramEnd"/>
+      <w:r>
+        <w:rPr>
+          <w:rFonts w:ascii="Calibri" w:eastAsia="Times New Roman" w:hAnsi="Calibri" w:cs="Calibri"/>
+          <w:color w:val="000000"/>
+          <w:lang w:eastAsia="pt-BR"/>
+        </w:rPr>
+        <w:t xml:space="preserve"> ]</w:t>
+      </w:r>
+    </w:p>
+    <w:p>
+      <w:pPr>
+        <w:spacing w:line="240" w:lineRule="auto"/>
+        <w:rPr>
+          <w:rFonts w:ascii="Calibri" w:eastAsia="Times New Roman" w:hAnsi="Calibri" w:cs="Calibri"/>
+          <w:color w:val="000000"/>
           <w:lang w:eastAsia="pt-BR"/>
         </w:rPr>
       </w:pPr>
@@ -4502,7 +4656,6 @@
           <w:szCs w:val="32"/>
           <w:lang w:eastAsia="pt-BR"/>
         </w:rPr>
-        <w:lastRenderedPageBreak/>
         <w:t>Condição</w:t>
       </w:r>
     </w:p>
@@ -5276,6 +5429,7 @@
           <w:color w:val="000000"/>
           <w:lang w:eastAsia="pt-BR"/>
         </w:rPr>
+        <w:lastRenderedPageBreak/>
         <w:t>voce</w:t>
       </w:r>
       <w:proofErr w:type="spellEnd"/>
@@ -5465,7 +5619,6 @@
           <w:color w:val="000000"/>
           <w:lang w:eastAsia="pt-BR"/>
         </w:rPr>
-        <w:lastRenderedPageBreak/>
         <w:t xml:space="preserve">inicialização de </w:t>
       </w:r>
       <w:proofErr w:type="spellStart"/>
@@ -6155,6 +6308,7 @@
           <w:szCs w:val="28"/>
           <w:lang w:eastAsia="pt-BR"/>
         </w:rPr>
+        <w:lastRenderedPageBreak/>
         <w:t xml:space="preserve">Variáveis compostas podem armazenar </w:t>
       </w:r>
       <w:proofErr w:type="gramStart"/>
@@ -6232,7 +6386,6 @@
           <w:szCs w:val="24"/>
           <w:lang w:eastAsia="pt-BR"/>
         </w:rPr>
-        <w:lastRenderedPageBreak/>
         <w:drawing>
           <wp:inline distT="0" distB="0" distL="0" distR="0" wp14:anchorId="31FAACB8" wp14:editId="30EC77A4">
             <wp:extent cx="5400040" cy="1875790"/>
@@ -6249,7 +6402,7 @@
                     <pic:cNvPicPr/>
                   </pic:nvPicPr>
                   <pic:blipFill>
-                    <a:blip r:embed="rId4"/>
+                    <a:blip r:embed="rId5"/>
                     <a:stretch>
                       <a:fillRect/>
                     </a:stretch>
@@ -7020,6 +7173,7 @@
           <w:color w:val="000000"/>
           <w:lang w:eastAsia="pt-BR"/>
         </w:rPr>
+        <w:lastRenderedPageBreak/>
         <w:t>lanche.pop</w:t>
       </w:r>
       <w:proofErr w:type="spellEnd"/>
@@ -7163,214 +7317,871 @@
           <w:color w:val="000000"/>
           <w:lang w:eastAsia="pt-BR"/>
         </w:rPr>
+        <w:t>nesses 3 casos vai remover a pizza</w:t>
+      </w:r>
+    </w:p>
+    <w:p>
+      <w:pPr>
+        <w:spacing w:line="240" w:lineRule="auto"/>
+        <w:rPr>
+          <w:rFonts w:ascii="Times New Roman" w:eastAsia="Times New Roman" w:hAnsi="Times New Roman" w:cs="Times New Roman"/>
+          <w:sz w:val="24"/>
+          <w:szCs w:val="24"/>
+          <w:lang w:eastAsia="pt-BR"/>
+        </w:rPr>
+      </w:pPr>
+      <w:r>
+        <w:rPr>
+          <w:rFonts w:ascii="Calibri" w:eastAsia="Times New Roman" w:hAnsi="Calibri" w:cs="Calibri"/>
+          <w:color w:val="000000"/>
+          <w:lang w:eastAsia="pt-BR"/>
+        </w:rPr>
+        <w:t xml:space="preserve">o recomendado é utilizar o </w:t>
+      </w:r>
+      <w:proofErr w:type="spellStart"/>
+      <w:r>
+        <w:rPr>
+          <w:rFonts w:ascii="Calibri" w:eastAsia="Times New Roman" w:hAnsi="Calibri" w:cs="Calibri"/>
+          <w:color w:val="000000"/>
+          <w:lang w:eastAsia="pt-BR"/>
+        </w:rPr>
+        <w:t>if</w:t>
+      </w:r>
+      <w:proofErr w:type="spellEnd"/>
+      <w:r>
+        <w:rPr>
+          <w:rFonts w:ascii="Calibri" w:eastAsia="Times New Roman" w:hAnsi="Calibri" w:cs="Calibri"/>
+          <w:color w:val="000000"/>
+          <w:lang w:eastAsia="pt-BR"/>
+        </w:rPr>
+        <w:t xml:space="preserve"> porque caso não exista ele vai dar erro</w:t>
+      </w:r>
+    </w:p>
+    <w:p>
+      <w:pPr>
+        <w:spacing w:line="240" w:lineRule="auto"/>
+        <w:rPr>
+          <w:rFonts w:ascii="Times New Roman" w:eastAsia="Times New Roman" w:hAnsi="Times New Roman" w:cs="Times New Roman"/>
+          <w:sz w:val="24"/>
+          <w:szCs w:val="24"/>
+          <w:lang w:eastAsia="pt-BR"/>
+        </w:rPr>
+      </w:pPr>
+      <w:proofErr w:type="spellStart"/>
+      <w:r>
+        <w:rPr>
+          <w:rFonts w:ascii="Calibri" w:eastAsia="Times New Roman" w:hAnsi="Calibri" w:cs="Calibri"/>
+          <w:color w:val="000000"/>
+          <w:lang w:eastAsia="pt-BR"/>
+        </w:rPr>
+        <w:t>ex</w:t>
+      </w:r>
+      <w:proofErr w:type="spellEnd"/>
+      <w:r>
+        <w:rPr>
+          <w:rFonts w:ascii="Calibri" w:eastAsia="Times New Roman" w:hAnsi="Calibri" w:cs="Calibri"/>
+          <w:color w:val="000000"/>
+          <w:lang w:eastAsia="pt-BR"/>
+        </w:rPr>
+        <w:t>: </w:t>
+      </w:r>
+    </w:p>
+    <w:p>
+      <w:pPr>
+        <w:spacing w:line="240" w:lineRule="auto"/>
+        <w:rPr>
+          <w:rFonts w:ascii="Times New Roman" w:eastAsia="Times New Roman" w:hAnsi="Times New Roman" w:cs="Times New Roman"/>
+          <w:sz w:val="24"/>
+          <w:szCs w:val="24"/>
+          <w:lang w:eastAsia="pt-BR"/>
+        </w:rPr>
+      </w:pPr>
+      <w:proofErr w:type="spellStart"/>
+      <w:r>
+        <w:rPr>
+          <w:rFonts w:ascii="Calibri" w:eastAsia="Times New Roman" w:hAnsi="Calibri" w:cs="Calibri"/>
+          <w:color w:val="000000"/>
+          <w:lang w:eastAsia="pt-BR"/>
+        </w:rPr>
+        <w:t>if</w:t>
+      </w:r>
+      <w:proofErr w:type="spellEnd"/>
+      <w:r>
+        <w:rPr>
+          <w:rFonts w:ascii="Calibri" w:eastAsia="Times New Roman" w:hAnsi="Calibri" w:cs="Calibri"/>
+          <w:color w:val="000000"/>
+          <w:lang w:eastAsia="pt-BR"/>
+        </w:rPr>
+        <w:t xml:space="preserve"> ‘ELEMENTO’ in ‘nome da lista’:</w:t>
+      </w:r>
+    </w:p>
+    <w:p>
+      <w:pPr>
+        <w:spacing w:line="240" w:lineRule="auto"/>
+        <w:rPr>
+          <w:rFonts w:ascii="Times New Roman" w:eastAsia="Times New Roman" w:hAnsi="Times New Roman" w:cs="Times New Roman"/>
+          <w:sz w:val="24"/>
+          <w:szCs w:val="24"/>
+          <w:lang w:eastAsia="pt-BR"/>
+        </w:rPr>
+      </w:pPr>
+      <w:r>
+        <w:rPr>
+          <w:rFonts w:ascii="Calibri" w:eastAsia="Times New Roman" w:hAnsi="Calibri" w:cs="Calibri"/>
+          <w:color w:val="000000"/>
+          <w:lang w:eastAsia="pt-BR"/>
+        </w:rPr>
+        <w:tab/>
+      </w:r>
+      <w:proofErr w:type="spellStart"/>
+      <w:r>
+        <w:rPr>
+          <w:rFonts w:ascii="Calibri" w:eastAsia="Times New Roman" w:hAnsi="Calibri" w:cs="Calibri"/>
+          <w:color w:val="000000"/>
+          <w:lang w:eastAsia="pt-BR"/>
+        </w:rPr>
+        <w:t>xxx.remove</w:t>
+      </w:r>
+      <w:proofErr w:type="spellEnd"/>
+      <w:r>
+        <w:rPr>
+          <w:rFonts w:ascii="Calibri" w:eastAsia="Times New Roman" w:hAnsi="Calibri" w:cs="Calibri"/>
+          <w:color w:val="000000"/>
+          <w:lang w:eastAsia="pt-BR"/>
+        </w:rPr>
+        <w:t>(‘elemento’)</w:t>
+      </w:r>
+    </w:p>
+    <w:p>
+      <w:pPr>
+        <w:spacing w:line="240" w:lineRule="auto"/>
+        <w:rPr>
+          <w:rFonts w:ascii="Times New Roman" w:eastAsia="Times New Roman" w:hAnsi="Times New Roman" w:cs="Times New Roman"/>
+          <w:sz w:val="24"/>
+          <w:szCs w:val="24"/>
+          <w:lang w:eastAsia="pt-BR"/>
+        </w:rPr>
+      </w:pPr>
+      <w:r>
+        <w:rPr>
+          <w:rFonts w:ascii="Calibri" w:eastAsia="Times New Roman" w:hAnsi="Calibri" w:cs="Calibri"/>
+          <w:color w:val="000000"/>
+          <w:lang w:eastAsia="pt-BR"/>
+        </w:rPr>
+        <w:t xml:space="preserve">Você pode criar listas com range </w:t>
+      </w:r>
+      <w:proofErr w:type="spellStart"/>
+      <w:r>
+        <w:rPr>
+          <w:rFonts w:ascii="Calibri" w:eastAsia="Times New Roman" w:hAnsi="Calibri" w:cs="Calibri"/>
+          <w:color w:val="000000"/>
+          <w:lang w:eastAsia="pt-BR"/>
+        </w:rPr>
+        <w:t>ex</w:t>
+      </w:r>
+      <w:proofErr w:type="spellEnd"/>
+      <w:r>
+        <w:rPr>
+          <w:rFonts w:ascii="Calibri" w:eastAsia="Times New Roman" w:hAnsi="Calibri" w:cs="Calibri"/>
+          <w:color w:val="000000"/>
+          <w:lang w:eastAsia="pt-BR"/>
+        </w:rPr>
+        <w:t>:</w:t>
+      </w:r>
+    </w:p>
+    <w:p>
+      <w:pPr>
+        <w:spacing w:line="240" w:lineRule="auto"/>
+        <w:rPr>
+          <w:rFonts w:ascii="Times New Roman" w:eastAsia="Times New Roman" w:hAnsi="Times New Roman" w:cs="Times New Roman"/>
+          <w:sz w:val="24"/>
+          <w:szCs w:val="24"/>
+          <w:lang w:eastAsia="pt-BR"/>
+        </w:rPr>
+      </w:pPr>
+      <w:r>
+        <w:rPr>
+          <w:rFonts w:ascii="Calibri" w:eastAsia="Times New Roman" w:hAnsi="Calibri" w:cs="Calibri"/>
+          <w:color w:val="000000"/>
+          <w:lang w:eastAsia="pt-BR"/>
+        </w:rPr>
+        <w:t xml:space="preserve">valores = </w:t>
+      </w:r>
+      <w:proofErr w:type="spellStart"/>
+      <w:r>
+        <w:rPr>
+          <w:rFonts w:ascii="Calibri" w:eastAsia="Times New Roman" w:hAnsi="Calibri" w:cs="Calibri"/>
+          <w:color w:val="000000"/>
+          <w:lang w:eastAsia="pt-BR"/>
+        </w:rPr>
+        <w:t>list</w:t>
+      </w:r>
+      <w:proofErr w:type="spellEnd"/>
+      <w:r>
+        <w:rPr>
+          <w:rFonts w:ascii="Calibri" w:eastAsia="Times New Roman" w:hAnsi="Calibri" w:cs="Calibri"/>
+          <w:color w:val="000000"/>
+          <w:lang w:eastAsia="pt-BR"/>
+        </w:rPr>
+        <w:t>(</w:t>
+      </w:r>
+      <w:proofErr w:type="gramStart"/>
+      <w:r>
+        <w:rPr>
+          <w:rFonts w:ascii="Calibri" w:eastAsia="Times New Roman" w:hAnsi="Calibri" w:cs="Calibri"/>
+          <w:color w:val="000000"/>
+          <w:lang w:eastAsia="pt-BR"/>
+        </w:rPr>
+        <w:t>range(</w:t>
+      </w:r>
+      <w:proofErr w:type="gramEnd"/>
+      <w:r>
+        <w:rPr>
+          <w:rFonts w:ascii="Calibri" w:eastAsia="Times New Roman" w:hAnsi="Calibri" w:cs="Calibri"/>
+          <w:color w:val="000000"/>
+          <w:lang w:eastAsia="pt-BR"/>
+        </w:rPr>
+        <w:t xml:space="preserve">4,11)) ele vai criar uma lista do 4 até o 10 lembrando q o </w:t>
+      </w:r>
+      <w:proofErr w:type="spellStart"/>
+      <w:proofErr w:type="gramStart"/>
+      <w:r>
+        <w:rPr>
+          <w:rFonts w:ascii="Calibri" w:eastAsia="Times New Roman" w:hAnsi="Calibri" w:cs="Calibri"/>
+          <w:color w:val="000000"/>
+          <w:lang w:eastAsia="pt-BR"/>
+        </w:rPr>
+        <w:t>ultimo</w:t>
+      </w:r>
+      <w:proofErr w:type="spellEnd"/>
+      <w:proofErr w:type="gramEnd"/>
+      <w:r>
+        <w:rPr>
+          <w:rFonts w:ascii="Calibri" w:eastAsia="Times New Roman" w:hAnsi="Calibri" w:cs="Calibri"/>
+          <w:color w:val="000000"/>
+          <w:lang w:eastAsia="pt-BR"/>
+        </w:rPr>
+        <w:t xml:space="preserve"> elemento é eliminado</w:t>
+      </w:r>
+    </w:p>
+    <w:p>
+      <w:pPr>
+        <w:spacing w:line="240" w:lineRule="auto"/>
+        <w:rPr>
+          <w:rFonts w:ascii="Times New Roman" w:eastAsia="Times New Roman" w:hAnsi="Times New Roman" w:cs="Times New Roman"/>
+          <w:sz w:val="24"/>
+          <w:szCs w:val="24"/>
+          <w:lang w:eastAsia="pt-BR"/>
+        </w:rPr>
+      </w:pPr>
+      <w:r>
+        <w:rPr>
+          <w:rFonts w:ascii="Calibri" w:eastAsia="Times New Roman" w:hAnsi="Calibri" w:cs="Calibri"/>
+          <w:color w:val="000000"/>
+          <w:lang w:eastAsia="pt-BR"/>
+        </w:rPr>
+        <w:t>se quiser colocar os elementos em ordem basta usar o nome_da_</w:t>
+      </w:r>
+      <w:proofErr w:type="spellStart"/>
+      <w:proofErr w:type="gramStart"/>
+      <w:r>
+        <w:rPr>
+          <w:rFonts w:ascii="Calibri" w:eastAsia="Times New Roman" w:hAnsi="Calibri" w:cs="Calibri"/>
+          <w:color w:val="000000"/>
+          <w:lang w:eastAsia="pt-BR"/>
+        </w:rPr>
+        <w:t>variavel</w:t>
+      </w:r>
+      <w:proofErr w:type="spellEnd"/>
+      <w:r>
+        <w:rPr>
+          <w:rFonts w:ascii="Calibri" w:eastAsia="Times New Roman" w:hAnsi="Calibri" w:cs="Calibri"/>
+          <w:color w:val="000000"/>
+          <w:lang w:eastAsia="pt-BR"/>
+        </w:rPr>
+        <w:t>..</w:t>
+      </w:r>
+      <w:proofErr w:type="spellStart"/>
+      <w:r>
+        <w:rPr>
+          <w:rFonts w:ascii="Calibri" w:eastAsia="Times New Roman" w:hAnsi="Calibri" w:cs="Calibri"/>
+          <w:color w:val="000000"/>
+          <w:lang w:eastAsia="pt-BR"/>
+        </w:rPr>
+        <w:t>sort</w:t>
+      </w:r>
+      <w:proofErr w:type="spellEnd"/>
+      <w:r>
+        <w:rPr>
+          <w:rFonts w:ascii="Calibri" w:eastAsia="Times New Roman" w:hAnsi="Calibri" w:cs="Calibri"/>
+          <w:color w:val="000000"/>
+          <w:lang w:eastAsia="pt-BR"/>
+        </w:rPr>
+        <w:t>(</w:t>
+      </w:r>
+      <w:proofErr w:type="gramEnd"/>
+      <w:r>
+        <w:rPr>
+          <w:rFonts w:ascii="Calibri" w:eastAsia="Times New Roman" w:hAnsi="Calibri" w:cs="Calibri"/>
+          <w:color w:val="000000"/>
+          <w:lang w:eastAsia="pt-BR"/>
+        </w:rPr>
+        <w:t>)</w:t>
+      </w:r>
+    </w:p>
+    <w:p>
+      <w:pPr>
+        <w:spacing w:line="240" w:lineRule="auto"/>
+        <w:rPr>
+          <w:rFonts w:ascii="Times New Roman" w:eastAsia="Times New Roman" w:hAnsi="Times New Roman" w:cs="Times New Roman"/>
+          <w:sz w:val="24"/>
+          <w:szCs w:val="24"/>
+          <w:lang w:eastAsia="pt-BR"/>
+        </w:rPr>
+      </w:pPr>
+      <w:r>
+        <w:rPr>
+          <w:rFonts w:ascii="Calibri" w:eastAsia="Times New Roman" w:hAnsi="Calibri" w:cs="Calibri"/>
+          <w:color w:val="000000"/>
+          <w:lang w:eastAsia="pt-BR"/>
+        </w:rPr>
+        <w:t xml:space="preserve">se quiser em ordem ao </w:t>
+      </w:r>
+      <w:proofErr w:type="spellStart"/>
+      <w:r>
+        <w:rPr>
+          <w:rFonts w:ascii="Calibri" w:eastAsia="Times New Roman" w:hAnsi="Calibri" w:cs="Calibri"/>
+          <w:color w:val="000000"/>
+          <w:lang w:eastAsia="pt-BR"/>
+        </w:rPr>
+        <w:t>contrario</w:t>
+      </w:r>
+      <w:proofErr w:type="spellEnd"/>
+      <w:r>
+        <w:rPr>
+          <w:rFonts w:ascii="Calibri" w:eastAsia="Times New Roman" w:hAnsi="Calibri" w:cs="Calibri"/>
+          <w:color w:val="000000"/>
+          <w:lang w:eastAsia="pt-BR"/>
+        </w:rPr>
+        <w:t>, decrescente basta usar o reverse=</w:t>
+      </w:r>
+      <w:proofErr w:type="spellStart"/>
+      <w:r>
+        <w:rPr>
+          <w:rFonts w:ascii="Calibri" w:eastAsia="Times New Roman" w:hAnsi="Calibri" w:cs="Calibri"/>
+          <w:color w:val="000000"/>
+          <w:lang w:eastAsia="pt-BR"/>
+        </w:rPr>
+        <w:t>True</w:t>
+      </w:r>
+      <w:proofErr w:type="spellEnd"/>
+    </w:p>
+    <w:p>
+      <w:pPr>
+        <w:spacing w:line="240" w:lineRule="auto"/>
+        <w:rPr>
+          <w:rFonts w:ascii="Times New Roman" w:eastAsia="Times New Roman" w:hAnsi="Times New Roman" w:cs="Times New Roman"/>
+          <w:sz w:val="24"/>
+          <w:szCs w:val="24"/>
+          <w:lang w:eastAsia="pt-BR"/>
+        </w:rPr>
+      </w:pPr>
+      <w:proofErr w:type="spellStart"/>
+      <w:r>
+        <w:rPr>
+          <w:rFonts w:ascii="Calibri" w:eastAsia="Times New Roman" w:hAnsi="Calibri" w:cs="Calibri"/>
+          <w:color w:val="000000"/>
+          <w:lang w:eastAsia="pt-BR"/>
+        </w:rPr>
+        <w:t>nome_da_</w:t>
+      </w:r>
+      <w:proofErr w:type="gramStart"/>
+      <w:r>
+        <w:rPr>
+          <w:rFonts w:ascii="Calibri" w:eastAsia="Times New Roman" w:hAnsi="Calibri" w:cs="Calibri"/>
+          <w:color w:val="000000"/>
+          <w:lang w:eastAsia="pt-BR"/>
+        </w:rPr>
+        <w:t>variavel.sort</w:t>
+      </w:r>
+      <w:proofErr w:type="spellEnd"/>
+      <w:proofErr w:type="gramEnd"/>
+      <w:r>
+        <w:rPr>
+          <w:rFonts w:ascii="Calibri" w:eastAsia="Times New Roman" w:hAnsi="Calibri" w:cs="Calibri"/>
+          <w:color w:val="000000"/>
+          <w:lang w:eastAsia="pt-BR"/>
+        </w:rPr>
+        <w:t>(reverse=</w:t>
+      </w:r>
+      <w:proofErr w:type="spellStart"/>
+      <w:r>
+        <w:rPr>
+          <w:rFonts w:ascii="Calibri" w:eastAsia="Times New Roman" w:hAnsi="Calibri" w:cs="Calibri"/>
+          <w:color w:val="000000"/>
+          <w:lang w:eastAsia="pt-BR"/>
+        </w:rPr>
+        <w:t>True</w:t>
+      </w:r>
+      <w:proofErr w:type="spellEnd"/>
+      <w:r>
+        <w:rPr>
+          <w:rFonts w:ascii="Calibri" w:eastAsia="Times New Roman" w:hAnsi="Calibri" w:cs="Calibri"/>
+          <w:color w:val="000000"/>
+          <w:lang w:eastAsia="pt-BR"/>
+        </w:rPr>
+        <w:t>)</w:t>
+      </w:r>
+    </w:p>
+    <w:p>
+      <w:pPr>
+        <w:spacing w:line="240" w:lineRule="auto"/>
+        <w:rPr>
+          <w:rFonts w:ascii="Times New Roman" w:eastAsia="Times New Roman" w:hAnsi="Times New Roman" w:cs="Times New Roman"/>
+          <w:sz w:val="24"/>
+          <w:szCs w:val="24"/>
+          <w:lang w:eastAsia="pt-BR"/>
+        </w:rPr>
+      </w:pPr>
+      <w:r>
+        <w:rPr>
+          <w:rFonts w:ascii="Calibri" w:eastAsia="Times New Roman" w:hAnsi="Calibri" w:cs="Calibri"/>
+          <w:color w:val="000000"/>
+          <w:lang w:eastAsia="pt-BR"/>
+        </w:rPr>
+        <w:t xml:space="preserve">para saber o tamanho de uma lista basta usar o </w:t>
+      </w:r>
+      <w:proofErr w:type="spellStart"/>
+      <w:proofErr w:type="gramStart"/>
+      <w:r>
+        <w:rPr>
+          <w:rFonts w:ascii="Calibri" w:eastAsia="Times New Roman" w:hAnsi="Calibri" w:cs="Calibri"/>
+          <w:color w:val="000000"/>
+          <w:lang w:eastAsia="pt-BR"/>
+        </w:rPr>
+        <w:t>len</w:t>
+      </w:r>
+      <w:proofErr w:type="spellEnd"/>
+      <w:r>
+        <w:rPr>
+          <w:rFonts w:ascii="Calibri" w:eastAsia="Times New Roman" w:hAnsi="Calibri" w:cs="Calibri"/>
+          <w:color w:val="000000"/>
+          <w:lang w:eastAsia="pt-BR"/>
+        </w:rPr>
+        <w:t>(</w:t>
+      </w:r>
+      <w:proofErr w:type="gramEnd"/>
+      <w:r>
+        <w:rPr>
+          <w:rFonts w:ascii="Calibri" w:eastAsia="Times New Roman" w:hAnsi="Calibri" w:cs="Calibri"/>
+          <w:color w:val="000000"/>
+          <w:lang w:eastAsia="pt-BR"/>
+        </w:rPr>
+        <w:t>nome da lista)</w:t>
+      </w:r>
+    </w:p>
+    <w:p>
+      <w:pPr>
+        <w:spacing w:line="240" w:lineRule="auto"/>
+        <w:rPr>
+          <w:rFonts w:ascii="Times New Roman" w:eastAsia="Times New Roman" w:hAnsi="Times New Roman" w:cs="Times New Roman"/>
+          <w:sz w:val="24"/>
+          <w:szCs w:val="24"/>
+          <w:lang w:eastAsia="pt-BR"/>
+        </w:rPr>
+      </w:pPr>
+      <w:r>
+        <w:rPr>
+          <w:rFonts w:ascii="Calibri" w:eastAsia="Times New Roman" w:hAnsi="Calibri" w:cs="Calibri"/>
+          <w:color w:val="000000"/>
+          <w:lang w:eastAsia="pt-BR"/>
+        </w:rPr>
+        <w:t>você pode fazer cópias de uma lista basta usar </w:t>
+      </w:r>
+    </w:p>
+    <w:p>
+      <w:pPr>
+        <w:spacing w:line="240" w:lineRule="auto"/>
+        <w:rPr>
+          <w:rFonts w:ascii="Times New Roman" w:eastAsia="Times New Roman" w:hAnsi="Times New Roman" w:cs="Times New Roman"/>
+          <w:sz w:val="24"/>
+          <w:szCs w:val="24"/>
+          <w:lang w:eastAsia="pt-BR"/>
+        </w:rPr>
+      </w:pPr>
+      <w:r>
+        <w:rPr>
+          <w:rFonts w:ascii="Calibri" w:eastAsia="Times New Roman" w:hAnsi="Calibri" w:cs="Calibri"/>
+          <w:color w:val="000000"/>
+          <w:lang w:eastAsia="pt-BR"/>
+        </w:rPr>
+        <w:t xml:space="preserve">nome da variável = </w:t>
+      </w:r>
+      <w:proofErr w:type="spellStart"/>
+      <w:proofErr w:type="gramStart"/>
+      <w:r>
+        <w:rPr>
+          <w:rFonts w:ascii="Calibri" w:eastAsia="Times New Roman" w:hAnsi="Calibri" w:cs="Calibri"/>
+          <w:color w:val="000000"/>
+          <w:lang w:eastAsia="pt-BR"/>
+        </w:rPr>
+        <w:t>list</w:t>
+      </w:r>
+      <w:proofErr w:type="spellEnd"/>
+      <w:r>
+        <w:rPr>
+          <w:rFonts w:ascii="Calibri" w:eastAsia="Times New Roman" w:hAnsi="Calibri" w:cs="Calibri"/>
+          <w:color w:val="000000"/>
+          <w:lang w:eastAsia="pt-BR"/>
+        </w:rPr>
+        <w:t>(</w:t>
+      </w:r>
+      <w:proofErr w:type="gramEnd"/>
+      <w:r>
+        <w:rPr>
+          <w:rFonts w:ascii="Calibri" w:eastAsia="Times New Roman" w:hAnsi="Calibri" w:cs="Calibri"/>
+          <w:color w:val="000000"/>
+          <w:lang w:eastAsia="pt-BR"/>
+        </w:rPr>
+        <w:t>nome da lista que vai ser copiada)</w:t>
+      </w:r>
+    </w:p>
+    <w:p>
+      <w:pPr>
+        <w:spacing w:line="240" w:lineRule="auto"/>
+        <w:rPr>
+          <w:rFonts w:ascii="Times New Roman" w:eastAsia="Times New Roman" w:hAnsi="Times New Roman" w:cs="Times New Roman"/>
+          <w:sz w:val="24"/>
+          <w:szCs w:val="24"/>
+          <w:lang w:eastAsia="pt-BR"/>
+        </w:rPr>
+      </w:pPr>
+      <w:proofErr w:type="spellStart"/>
+      <w:r>
+        <w:rPr>
+          <w:rFonts w:ascii="Calibri" w:eastAsia="Times New Roman" w:hAnsi="Calibri" w:cs="Calibri"/>
+          <w:color w:val="000000"/>
+          <w:lang w:eastAsia="pt-BR"/>
+        </w:rPr>
+        <w:t>Voce</w:t>
+      </w:r>
+      <w:proofErr w:type="spellEnd"/>
+      <w:r>
+        <w:rPr>
+          <w:rFonts w:ascii="Calibri" w:eastAsia="Times New Roman" w:hAnsi="Calibri" w:cs="Calibri"/>
+          <w:color w:val="000000"/>
+          <w:lang w:eastAsia="pt-BR"/>
+        </w:rPr>
+        <w:t xml:space="preserve"> também pode juntar listas, basta usar o + e criar outra variável </w:t>
+      </w:r>
+      <w:proofErr w:type="spellStart"/>
+      <w:r>
+        <w:rPr>
+          <w:rFonts w:ascii="Calibri" w:eastAsia="Times New Roman" w:hAnsi="Calibri" w:cs="Calibri"/>
+          <w:color w:val="000000"/>
+          <w:lang w:eastAsia="pt-BR"/>
+        </w:rPr>
+        <w:t>ex</w:t>
+      </w:r>
+      <w:proofErr w:type="spellEnd"/>
+      <w:r>
+        <w:rPr>
+          <w:rFonts w:ascii="Calibri" w:eastAsia="Times New Roman" w:hAnsi="Calibri" w:cs="Calibri"/>
+          <w:color w:val="000000"/>
+          <w:lang w:eastAsia="pt-BR"/>
+        </w:rPr>
+        <w:t>:</w:t>
+      </w:r>
+    </w:p>
+    <w:p>
+      <w:pPr>
+        <w:spacing w:line="240" w:lineRule="auto"/>
+        <w:rPr>
+          <w:rFonts w:ascii="Times New Roman" w:eastAsia="Times New Roman" w:hAnsi="Times New Roman" w:cs="Times New Roman"/>
+          <w:sz w:val="24"/>
+          <w:szCs w:val="24"/>
+          <w:lang w:eastAsia="pt-BR"/>
+        </w:rPr>
+      </w:pPr>
+      <w:r>
+        <w:rPr>
+          <w:rFonts w:ascii="Calibri" w:eastAsia="Times New Roman" w:hAnsi="Calibri" w:cs="Calibri"/>
+          <w:color w:val="000000"/>
+          <w:lang w:eastAsia="pt-BR"/>
+        </w:rPr>
+        <w:t xml:space="preserve">nome da variável = lista </w:t>
+      </w:r>
+      <w:proofErr w:type="gramStart"/>
+      <w:r>
+        <w:rPr>
+          <w:rFonts w:ascii="Calibri" w:eastAsia="Times New Roman" w:hAnsi="Calibri" w:cs="Calibri"/>
+          <w:color w:val="000000"/>
+          <w:lang w:eastAsia="pt-BR"/>
+        </w:rPr>
+        <w:t>um  +</w:t>
+      </w:r>
+      <w:proofErr w:type="gramEnd"/>
+      <w:r>
+        <w:rPr>
+          <w:rFonts w:ascii="Calibri" w:eastAsia="Times New Roman" w:hAnsi="Calibri" w:cs="Calibri"/>
+          <w:color w:val="000000"/>
+          <w:lang w:eastAsia="pt-BR"/>
+        </w:rPr>
+        <w:t xml:space="preserve"> lista 2</w:t>
+      </w:r>
+    </w:p>
+    <w:p>
+      <w:pPr>
+        <w:spacing w:line="240" w:lineRule="auto"/>
+        <w:rPr>
+          <w:rFonts w:ascii="Times New Roman" w:eastAsia="Times New Roman" w:hAnsi="Times New Roman" w:cs="Times New Roman"/>
+          <w:sz w:val="24"/>
+          <w:szCs w:val="24"/>
+          <w:lang w:eastAsia="pt-BR"/>
+        </w:rPr>
+      </w:pPr>
+      <w:r>
+        <w:rPr>
+          <w:rFonts w:ascii="Calibri" w:eastAsia="Times New Roman" w:hAnsi="Calibri" w:cs="Calibri"/>
+          <w:color w:val="000000"/>
+          <w:lang w:eastAsia="pt-BR"/>
+        </w:rPr>
+        <w:t xml:space="preserve">o </w:t>
+      </w:r>
+      <w:proofErr w:type="spellStart"/>
+      <w:r>
+        <w:rPr>
+          <w:rFonts w:ascii="Calibri" w:eastAsia="Times New Roman" w:hAnsi="Calibri" w:cs="Calibri"/>
+          <w:color w:val="000000"/>
+          <w:lang w:eastAsia="pt-BR"/>
+        </w:rPr>
+        <w:t>python</w:t>
+      </w:r>
+      <w:proofErr w:type="spellEnd"/>
+      <w:r>
+        <w:rPr>
+          <w:rFonts w:ascii="Calibri" w:eastAsia="Times New Roman" w:hAnsi="Calibri" w:cs="Calibri"/>
+          <w:color w:val="000000"/>
+          <w:lang w:eastAsia="pt-BR"/>
+        </w:rPr>
+        <w:t xml:space="preserve"> faz uma </w:t>
+      </w:r>
+      <w:proofErr w:type="gramStart"/>
+      <w:r>
+        <w:rPr>
+          <w:rFonts w:ascii="Calibri" w:eastAsia="Times New Roman" w:hAnsi="Calibri" w:cs="Calibri"/>
+          <w:color w:val="000000"/>
+          <w:lang w:eastAsia="pt-BR"/>
+        </w:rPr>
+        <w:t>ligação  entre</w:t>
+      </w:r>
+      <w:proofErr w:type="gramEnd"/>
+      <w:r>
+        <w:rPr>
+          <w:rFonts w:ascii="Calibri" w:eastAsia="Times New Roman" w:hAnsi="Calibri" w:cs="Calibri"/>
+          <w:color w:val="000000"/>
+          <w:lang w:eastAsia="pt-BR"/>
+        </w:rPr>
+        <w:t xml:space="preserve"> listas então se for mudar algo em uma lista ela automaticamente vai ser mudada na outra, para resolver isso basta fazer uma cópia usando </w:t>
+      </w:r>
+      <w:proofErr w:type="gramStart"/>
+      <w:r>
+        <w:rPr>
+          <w:rFonts w:ascii="Calibri" w:eastAsia="Times New Roman" w:hAnsi="Calibri" w:cs="Calibri"/>
+          <w:color w:val="000000"/>
+          <w:lang w:eastAsia="pt-BR"/>
+        </w:rPr>
+        <w:t>o :</w:t>
+      </w:r>
+      <w:proofErr w:type="gramEnd"/>
+      <w:r>
+        <w:rPr>
+          <w:rFonts w:ascii="Calibri" w:eastAsia="Times New Roman" w:hAnsi="Calibri" w:cs="Calibri"/>
+          <w:color w:val="000000"/>
+          <w:lang w:eastAsia="pt-BR"/>
+        </w:rPr>
+        <w:t xml:space="preserve"> fatiamento </w:t>
+      </w:r>
+      <w:proofErr w:type="spellStart"/>
+      <w:r>
+        <w:rPr>
+          <w:rFonts w:ascii="Calibri" w:eastAsia="Times New Roman" w:hAnsi="Calibri" w:cs="Calibri"/>
+          <w:color w:val="000000"/>
+          <w:lang w:eastAsia="pt-BR"/>
+        </w:rPr>
+        <w:t>ex</w:t>
+      </w:r>
+      <w:proofErr w:type="spellEnd"/>
+    </w:p>
+    <w:p>
+      <w:pPr>
+        <w:spacing w:line="240" w:lineRule="auto"/>
+        <w:rPr>
+          <w:rFonts w:ascii="Times New Roman" w:eastAsia="Times New Roman" w:hAnsi="Times New Roman" w:cs="Times New Roman"/>
+          <w:sz w:val="24"/>
+          <w:szCs w:val="24"/>
+          <w:lang w:eastAsia="pt-BR"/>
+        </w:rPr>
+      </w:pPr>
+      <w:r>
+        <w:rPr>
+          <w:rFonts w:ascii="Calibri" w:eastAsia="Times New Roman" w:hAnsi="Calibri" w:cs="Calibri"/>
+          <w:color w:val="000000"/>
+          <w:lang w:eastAsia="pt-BR"/>
+        </w:rPr>
+        <w:t>a = [2, 3, 4, 7]</w:t>
+      </w:r>
+    </w:p>
+    <w:p>
+      <w:pPr>
+        <w:spacing w:line="240" w:lineRule="auto"/>
+        <w:rPr>
+          <w:rFonts w:ascii="Times New Roman" w:eastAsia="Times New Roman" w:hAnsi="Times New Roman" w:cs="Times New Roman"/>
+          <w:sz w:val="24"/>
+          <w:szCs w:val="24"/>
+          <w:lang w:eastAsia="pt-BR"/>
+        </w:rPr>
+      </w:pPr>
+      <w:r>
+        <w:rPr>
+          <w:rFonts w:ascii="Calibri" w:eastAsia="Times New Roman" w:hAnsi="Calibri" w:cs="Calibri"/>
+          <w:color w:val="000000"/>
+          <w:lang w:eastAsia="pt-BR"/>
+        </w:rPr>
+        <w:t xml:space="preserve">b = </w:t>
+      </w:r>
+      <w:proofErr w:type="gramStart"/>
+      <w:r>
+        <w:rPr>
+          <w:rFonts w:ascii="Calibri" w:eastAsia="Times New Roman" w:hAnsi="Calibri" w:cs="Calibri"/>
+          <w:color w:val="000000"/>
+          <w:lang w:eastAsia="pt-BR"/>
+        </w:rPr>
+        <w:t>a[ :</w:t>
+      </w:r>
+      <w:proofErr w:type="gramEnd"/>
+      <w:r>
+        <w:rPr>
+          <w:rFonts w:ascii="Calibri" w:eastAsia="Times New Roman" w:hAnsi="Calibri" w:cs="Calibri"/>
+          <w:color w:val="000000"/>
+          <w:lang w:eastAsia="pt-BR"/>
+        </w:rPr>
+        <w:t xml:space="preserve"> ]</w:t>
+      </w:r>
+    </w:p>
+    <w:p>
+      <w:pPr>
+        <w:spacing w:line="240" w:lineRule="auto"/>
+        <w:rPr>
+          <w:rFonts w:ascii="Times New Roman" w:eastAsia="Times New Roman" w:hAnsi="Times New Roman" w:cs="Times New Roman"/>
+          <w:sz w:val="24"/>
+          <w:szCs w:val="24"/>
+          <w:lang w:eastAsia="pt-BR"/>
+        </w:rPr>
+      </w:pPr>
+      <w:proofErr w:type="gramStart"/>
+      <w:r>
+        <w:rPr>
+          <w:rFonts w:ascii="Calibri" w:eastAsia="Times New Roman" w:hAnsi="Calibri" w:cs="Calibri"/>
+          <w:color w:val="000000"/>
+          <w:lang w:eastAsia="pt-BR"/>
+        </w:rPr>
+        <w:t>b[</w:t>
+      </w:r>
+      <w:proofErr w:type="gramEnd"/>
+      <w:r>
+        <w:rPr>
+          <w:rFonts w:ascii="Calibri" w:eastAsia="Times New Roman" w:hAnsi="Calibri" w:cs="Calibri"/>
+          <w:color w:val="000000"/>
+          <w:lang w:eastAsia="pt-BR"/>
+        </w:rPr>
+        <w:t>2] = 8</w:t>
+      </w:r>
+    </w:p>
+    <w:p>
+      <w:pPr>
+        <w:spacing w:line="240" w:lineRule="auto"/>
+        <w:rPr>
+          <w:rFonts w:ascii="Times New Roman" w:eastAsia="Times New Roman" w:hAnsi="Times New Roman" w:cs="Times New Roman"/>
+          <w:sz w:val="24"/>
+          <w:szCs w:val="24"/>
+          <w:lang w:eastAsia="pt-BR"/>
+        </w:rPr>
+      </w:pPr>
+      <w:proofErr w:type="spellStart"/>
+      <w:r>
+        <w:rPr>
+          <w:rFonts w:ascii="Calibri" w:eastAsia="Times New Roman" w:hAnsi="Calibri" w:cs="Calibri"/>
+          <w:color w:val="000000"/>
+          <w:lang w:eastAsia="pt-BR"/>
+        </w:rPr>
+        <w:t>result</w:t>
+      </w:r>
+      <w:proofErr w:type="spellEnd"/>
+      <w:r>
+        <w:rPr>
+          <w:rFonts w:ascii="Calibri" w:eastAsia="Times New Roman" w:hAnsi="Calibri" w:cs="Calibri"/>
+          <w:color w:val="000000"/>
+          <w:lang w:eastAsia="pt-BR"/>
+        </w:rPr>
+        <w:t> </w:t>
+      </w:r>
+    </w:p>
+    <w:p>
+      <w:pPr>
+        <w:spacing w:line="240" w:lineRule="auto"/>
+        <w:rPr>
+          <w:rFonts w:ascii="Times New Roman" w:eastAsia="Times New Roman" w:hAnsi="Times New Roman" w:cs="Times New Roman"/>
+          <w:sz w:val="24"/>
+          <w:szCs w:val="24"/>
+          <w:lang w:eastAsia="pt-BR"/>
+        </w:rPr>
+      </w:pPr>
+      <w:r>
+        <w:rPr>
+          <w:rFonts w:ascii="Calibri" w:eastAsia="Times New Roman" w:hAnsi="Calibri" w:cs="Calibri"/>
+          <w:color w:val="000000"/>
+          <w:lang w:eastAsia="pt-BR"/>
+        </w:rPr>
+        <w:t>Lista A: [2, 3, 4, 7]</w:t>
+      </w:r>
+    </w:p>
+    <w:p>
+      <w:pPr>
+        <w:spacing w:line="240" w:lineRule="auto"/>
+        <w:rPr>
+          <w:rFonts w:ascii="Calibri" w:eastAsia="Times New Roman" w:hAnsi="Calibri" w:cs="Calibri"/>
+          <w:color w:val="000000"/>
+          <w:lang w:eastAsia="pt-BR"/>
+        </w:rPr>
+      </w:pPr>
+      <w:r>
+        <w:rPr>
+          <w:rFonts w:ascii="Calibri" w:eastAsia="Times New Roman" w:hAnsi="Calibri" w:cs="Calibri"/>
+          <w:color w:val="000000"/>
+          <w:lang w:eastAsia="pt-BR"/>
+        </w:rPr>
+        <w:t>Lista B: [2, 3, 8 ,7]</w:t>
+      </w:r>
+    </w:p>
+    <w:p>
+      <w:pPr>
+        <w:spacing w:line="240" w:lineRule="auto"/>
+        <w:rPr>
+          <w:rFonts w:ascii="Times New Roman" w:eastAsia="Times New Roman" w:hAnsi="Times New Roman" w:cs="Times New Roman"/>
+          <w:sz w:val="24"/>
+          <w:szCs w:val="24"/>
+          <w:lang w:eastAsia="pt-BR"/>
+        </w:rPr>
+      </w:pPr>
+      <w:r>
+        <w:rPr>
+          <w:rFonts w:ascii="Calibri" w:eastAsia="Times New Roman" w:hAnsi="Calibri" w:cs="Calibri"/>
+          <w:color w:val="000000"/>
+          <w:lang w:eastAsia="pt-BR"/>
+        </w:rPr>
         <w:lastRenderedPageBreak/>
-        <w:t>nesses 3 casos vai remover a pizza</w:t>
-      </w:r>
-    </w:p>
-    <w:p>
-      <w:pPr>
-        <w:spacing w:line="240" w:lineRule="auto"/>
-        <w:rPr>
-          <w:rFonts w:ascii="Times New Roman" w:eastAsia="Times New Roman" w:hAnsi="Times New Roman" w:cs="Times New Roman"/>
-          <w:sz w:val="24"/>
-          <w:szCs w:val="24"/>
-          <w:lang w:eastAsia="pt-BR"/>
-        </w:rPr>
-      </w:pPr>
-      <w:r>
-        <w:rPr>
-          <w:rFonts w:ascii="Calibri" w:eastAsia="Times New Roman" w:hAnsi="Calibri" w:cs="Calibri"/>
-          <w:color w:val="000000"/>
-          <w:lang w:eastAsia="pt-BR"/>
-        </w:rPr>
-        <w:t xml:space="preserve">o recomendado é utilizar o </w:t>
-      </w:r>
-      <w:proofErr w:type="spellStart"/>
-      <w:r>
-        <w:rPr>
-          <w:rFonts w:ascii="Calibri" w:eastAsia="Times New Roman" w:hAnsi="Calibri" w:cs="Calibri"/>
-          <w:color w:val="000000"/>
-          <w:lang w:eastAsia="pt-BR"/>
-        </w:rPr>
-        <w:t>if</w:t>
-      </w:r>
-      <w:proofErr w:type="spellEnd"/>
-      <w:r>
-        <w:rPr>
-          <w:rFonts w:ascii="Calibri" w:eastAsia="Times New Roman" w:hAnsi="Calibri" w:cs="Calibri"/>
-          <w:color w:val="000000"/>
-          <w:lang w:eastAsia="pt-BR"/>
-        </w:rPr>
-        <w:t xml:space="preserve"> porque caso não exista ele vai dar erro</w:t>
-      </w:r>
-    </w:p>
-    <w:p>
-      <w:pPr>
-        <w:spacing w:line="240" w:lineRule="auto"/>
-        <w:rPr>
-          <w:rFonts w:ascii="Times New Roman" w:eastAsia="Times New Roman" w:hAnsi="Times New Roman" w:cs="Times New Roman"/>
-          <w:sz w:val="24"/>
-          <w:szCs w:val="24"/>
-          <w:lang w:eastAsia="pt-BR"/>
-        </w:rPr>
-      </w:pPr>
-      <w:proofErr w:type="spellStart"/>
-      <w:r>
-        <w:rPr>
-          <w:rFonts w:ascii="Calibri" w:eastAsia="Times New Roman" w:hAnsi="Calibri" w:cs="Calibri"/>
-          <w:color w:val="000000"/>
-          <w:lang w:eastAsia="pt-BR"/>
-        </w:rPr>
-        <w:t>ex</w:t>
-      </w:r>
-      <w:proofErr w:type="spellEnd"/>
-      <w:r>
-        <w:rPr>
-          <w:rFonts w:ascii="Calibri" w:eastAsia="Times New Roman" w:hAnsi="Calibri" w:cs="Calibri"/>
-          <w:color w:val="000000"/>
-          <w:lang w:eastAsia="pt-BR"/>
-        </w:rPr>
-        <w:t>: </w:t>
-      </w:r>
-    </w:p>
-    <w:p>
-      <w:pPr>
-        <w:spacing w:line="240" w:lineRule="auto"/>
-        <w:rPr>
-          <w:rFonts w:ascii="Times New Roman" w:eastAsia="Times New Roman" w:hAnsi="Times New Roman" w:cs="Times New Roman"/>
-          <w:sz w:val="24"/>
-          <w:szCs w:val="24"/>
-          <w:lang w:eastAsia="pt-BR"/>
-        </w:rPr>
-      </w:pPr>
-      <w:proofErr w:type="spellStart"/>
-      <w:r>
-        <w:rPr>
-          <w:rFonts w:ascii="Calibri" w:eastAsia="Times New Roman" w:hAnsi="Calibri" w:cs="Calibri"/>
-          <w:color w:val="000000"/>
-          <w:lang w:eastAsia="pt-BR"/>
-        </w:rPr>
-        <w:t>if</w:t>
-      </w:r>
-      <w:proofErr w:type="spellEnd"/>
-      <w:r>
-        <w:rPr>
-          <w:rFonts w:ascii="Calibri" w:eastAsia="Times New Roman" w:hAnsi="Calibri" w:cs="Calibri"/>
-          <w:color w:val="000000"/>
-          <w:lang w:eastAsia="pt-BR"/>
-        </w:rPr>
-        <w:t xml:space="preserve"> ‘ELEMENTO’ in ‘nome da lista’:</w:t>
-      </w:r>
-    </w:p>
-    <w:p>
-      <w:pPr>
-        <w:spacing w:line="240" w:lineRule="auto"/>
-        <w:rPr>
-          <w:rFonts w:ascii="Times New Roman" w:eastAsia="Times New Roman" w:hAnsi="Times New Roman" w:cs="Times New Roman"/>
-          <w:sz w:val="24"/>
-          <w:szCs w:val="24"/>
-          <w:lang w:eastAsia="pt-BR"/>
-        </w:rPr>
-      </w:pPr>
-      <w:r>
-        <w:rPr>
-          <w:rFonts w:ascii="Calibri" w:eastAsia="Times New Roman" w:hAnsi="Calibri" w:cs="Calibri"/>
-          <w:color w:val="000000"/>
-          <w:lang w:eastAsia="pt-BR"/>
-        </w:rPr>
-        <w:tab/>
-      </w:r>
-      <w:proofErr w:type="spellStart"/>
-      <w:r>
-        <w:rPr>
-          <w:rFonts w:ascii="Calibri" w:eastAsia="Times New Roman" w:hAnsi="Calibri" w:cs="Calibri"/>
-          <w:color w:val="000000"/>
-          <w:lang w:eastAsia="pt-BR"/>
-        </w:rPr>
-        <w:t>xxx.remove</w:t>
-      </w:r>
-      <w:proofErr w:type="spellEnd"/>
-      <w:r>
-        <w:rPr>
-          <w:rFonts w:ascii="Calibri" w:eastAsia="Times New Roman" w:hAnsi="Calibri" w:cs="Calibri"/>
-          <w:color w:val="000000"/>
-          <w:lang w:eastAsia="pt-BR"/>
-        </w:rPr>
-        <w:t>(‘elemento’)</w:t>
-      </w:r>
-    </w:p>
-    <w:p>
-      <w:pPr>
-        <w:spacing w:line="240" w:lineRule="auto"/>
-        <w:rPr>
-          <w:rFonts w:ascii="Times New Roman" w:eastAsia="Times New Roman" w:hAnsi="Times New Roman" w:cs="Times New Roman"/>
-          <w:sz w:val="24"/>
-          <w:szCs w:val="24"/>
-          <w:lang w:eastAsia="pt-BR"/>
-        </w:rPr>
-      </w:pPr>
-      <w:r>
-        <w:rPr>
-          <w:rFonts w:ascii="Calibri" w:eastAsia="Times New Roman" w:hAnsi="Calibri" w:cs="Calibri"/>
-          <w:color w:val="000000"/>
-          <w:lang w:eastAsia="pt-BR"/>
-        </w:rPr>
-        <w:t xml:space="preserve">Você pode criar listas com range </w:t>
-      </w:r>
-      <w:proofErr w:type="spellStart"/>
-      <w:r>
-        <w:rPr>
-          <w:rFonts w:ascii="Calibri" w:eastAsia="Times New Roman" w:hAnsi="Calibri" w:cs="Calibri"/>
-          <w:color w:val="000000"/>
-          <w:lang w:eastAsia="pt-BR"/>
-        </w:rPr>
-        <w:t>ex</w:t>
-      </w:r>
-      <w:proofErr w:type="spellEnd"/>
-      <w:r>
-        <w:rPr>
-          <w:rFonts w:ascii="Calibri" w:eastAsia="Times New Roman" w:hAnsi="Calibri" w:cs="Calibri"/>
-          <w:color w:val="000000"/>
-          <w:lang w:eastAsia="pt-BR"/>
-        </w:rPr>
-        <w:t>:</w:t>
-      </w:r>
-    </w:p>
-    <w:p>
-      <w:pPr>
-        <w:spacing w:line="240" w:lineRule="auto"/>
-        <w:rPr>
-          <w:rFonts w:ascii="Times New Roman" w:eastAsia="Times New Roman" w:hAnsi="Times New Roman" w:cs="Times New Roman"/>
-          <w:sz w:val="24"/>
-          <w:szCs w:val="24"/>
-          <w:lang w:eastAsia="pt-BR"/>
-        </w:rPr>
-      </w:pPr>
-      <w:r>
-        <w:rPr>
-          <w:rFonts w:ascii="Calibri" w:eastAsia="Times New Roman" w:hAnsi="Calibri" w:cs="Calibri"/>
-          <w:color w:val="000000"/>
-          <w:lang w:eastAsia="pt-BR"/>
-        </w:rPr>
-        <w:t xml:space="preserve">valores = </w:t>
-      </w:r>
-      <w:proofErr w:type="spellStart"/>
-      <w:r>
-        <w:rPr>
-          <w:rFonts w:ascii="Calibri" w:eastAsia="Times New Roman" w:hAnsi="Calibri" w:cs="Calibri"/>
-          <w:color w:val="000000"/>
-          <w:lang w:eastAsia="pt-BR"/>
-        </w:rPr>
-        <w:t>list</w:t>
-      </w:r>
-      <w:proofErr w:type="spellEnd"/>
-      <w:r>
-        <w:rPr>
-          <w:rFonts w:ascii="Calibri" w:eastAsia="Times New Roman" w:hAnsi="Calibri" w:cs="Calibri"/>
-          <w:color w:val="000000"/>
-          <w:lang w:eastAsia="pt-BR"/>
-        </w:rPr>
-        <w:t>(</w:t>
+        <w:t xml:space="preserve">Outro </w:t>
       </w:r>
       <w:proofErr w:type="gramStart"/>
       <w:r>
@@ -7379,7 +8190,7 @@
           <w:color w:val="000000"/>
           <w:lang w:eastAsia="pt-BR"/>
         </w:rPr>
-        <w:t>range(</w:t>
+        <w:t>exemplo :</w:t>
       </w:r>
       <w:proofErr w:type="gramEnd"/>
       <w:r>
@@ -7388,628 +8199,50 @@
           <w:color w:val="000000"/>
           <w:lang w:eastAsia="pt-BR"/>
         </w:rPr>
-        <w:t xml:space="preserve">4,11)) ele vai criar uma lista do 4 até o 10 lembrando q o </w:t>
-      </w:r>
-      <w:proofErr w:type="spellStart"/>
-      <w:proofErr w:type="gramStart"/>
-      <w:r>
-        <w:rPr>
-          <w:rFonts w:ascii="Calibri" w:eastAsia="Times New Roman" w:hAnsi="Calibri" w:cs="Calibri"/>
-          <w:color w:val="000000"/>
-          <w:lang w:eastAsia="pt-BR"/>
-        </w:rPr>
-        <w:t>ultimo</w:t>
-      </w:r>
-      <w:proofErr w:type="spellEnd"/>
-      <w:proofErr w:type="gramEnd"/>
-      <w:r>
-        <w:rPr>
-          <w:rFonts w:ascii="Calibri" w:eastAsia="Times New Roman" w:hAnsi="Calibri" w:cs="Calibri"/>
-          <w:color w:val="000000"/>
-          <w:lang w:eastAsia="pt-BR"/>
-        </w:rPr>
-        <w:t xml:space="preserve"> elemento é eliminado</w:t>
-      </w:r>
-    </w:p>
-    <w:p>
-      <w:pPr>
-        <w:spacing w:line="240" w:lineRule="auto"/>
-        <w:rPr>
-          <w:rFonts w:ascii="Times New Roman" w:eastAsia="Times New Roman" w:hAnsi="Times New Roman" w:cs="Times New Roman"/>
-          <w:sz w:val="24"/>
-          <w:szCs w:val="24"/>
-          <w:lang w:eastAsia="pt-BR"/>
-        </w:rPr>
-      </w:pPr>
-      <w:r>
-        <w:rPr>
-          <w:rFonts w:ascii="Calibri" w:eastAsia="Times New Roman" w:hAnsi="Calibri" w:cs="Calibri"/>
-          <w:color w:val="000000"/>
-          <w:lang w:eastAsia="pt-BR"/>
-        </w:rPr>
-        <w:t>se quiser colocar os elementos em ordem basta usar o nome_da_</w:t>
-      </w:r>
-      <w:proofErr w:type="spellStart"/>
-      <w:proofErr w:type="gramStart"/>
-      <w:r>
-        <w:rPr>
-          <w:rFonts w:ascii="Calibri" w:eastAsia="Times New Roman" w:hAnsi="Calibri" w:cs="Calibri"/>
-          <w:color w:val="000000"/>
-          <w:lang w:eastAsia="pt-BR"/>
-        </w:rPr>
-        <w:t>variavel</w:t>
-      </w:r>
-      <w:proofErr w:type="spellEnd"/>
-      <w:r>
-        <w:rPr>
-          <w:rFonts w:ascii="Calibri" w:eastAsia="Times New Roman" w:hAnsi="Calibri" w:cs="Calibri"/>
-          <w:color w:val="000000"/>
-          <w:lang w:eastAsia="pt-BR"/>
-        </w:rPr>
-        <w:t>..</w:t>
-      </w:r>
-      <w:proofErr w:type="spellStart"/>
-      <w:r>
-        <w:rPr>
-          <w:rFonts w:ascii="Calibri" w:eastAsia="Times New Roman" w:hAnsi="Calibri" w:cs="Calibri"/>
-          <w:color w:val="000000"/>
-          <w:lang w:eastAsia="pt-BR"/>
-        </w:rPr>
-        <w:t>sort</w:t>
-      </w:r>
-      <w:proofErr w:type="spellEnd"/>
-      <w:r>
-        <w:rPr>
-          <w:rFonts w:ascii="Calibri" w:eastAsia="Times New Roman" w:hAnsi="Calibri" w:cs="Calibri"/>
-          <w:color w:val="000000"/>
-          <w:lang w:eastAsia="pt-BR"/>
-        </w:rPr>
-        <w:t>(</w:t>
-      </w:r>
-      <w:proofErr w:type="gramEnd"/>
-      <w:r>
-        <w:rPr>
-          <w:rFonts w:ascii="Calibri" w:eastAsia="Times New Roman" w:hAnsi="Calibri" w:cs="Calibri"/>
-          <w:color w:val="000000"/>
-          <w:lang w:eastAsia="pt-BR"/>
-        </w:rPr>
-        <w:t>)</w:t>
-      </w:r>
-    </w:p>
-    <w:p>
-      <w:pPr>
-        <w:spacing w:line="240" w:lineRule="auto"/>
-        <w:rPr>
-          <w:rFonts w:ascii="Times New Roman" w:eastAsia="Times New Roman" w:hAnsi="Times New Roman" w:cs="Times New Roman"/>
-          <w:sz w:val="24"/>
-          <w:szCs w:val="24"/>
-          <w:lang w:eastAsia="pt-BR"/>
-        </w:rPr>
-      </w:pPr>
-      <w:r>
-        <w:rPr>
-          <w:rFonts w:ascii="Calibri" w:eastAsia="Times New Roman" w:hAnsi="Calibri" w:cs="Calibri"/>
-          <w:color w:val="000000"/>
-          <w:lang w:eastAsia="pt-BR"/>
-        </w:rPr>
-        <w:t xml:space="preserve">se quiser em ordem ao </w:t>
-      </w:r>
-      <w:proofErr w:type="spellStart"/>
-      <w:r>
-        <w:rPr>
-          <w:rFonts w:ascii="Calibri" w:eastAsia="Times New Roman" w:hAnsi="Calibri" w:cs="Calibri"/>
-          <w:color w:val="000000"/>
-          <w:lang w:eastAsia="pt-BR"/>
-        </w:rPr>
-        <w:t>contrario</w:t>
-      </w:r>
-      <w:proofErr w:type="spellEnd"/>
-      <w:r>
-        <w:rPr>
-          <w:rFonts w:ascii="Calibri" w:eastAsia="Times New Roman" w:hAnsi="Calibri" w:cs="Calibri"/>
-          <w:color w:val="000000"/>
-          <w:lang w:eastAsia="pt-BR"/>
-        </w:rPr>
-        <w:t>, decrescente basta usar o reverse=</w:t>
-      </w:r>
-      <w:proofErr w:type="spellStart"/>
-      <w:r>
-        <w:rPr>
-          <w:rFonts w:ascii="Calibri" w:eastAsia="Times New Roman" w:hAnsi="Calibri" w:cs="Calibri"/>
-          <w:color w:val="000000"/>
-          <w:lang w:eastAsia="pt-BR"/>
-        </w:rPr>
-        <w:t>True</w:t>
-      </w:r>
-      <w:proofErr w:type="spellEnd"/>
-    </w:p>
-    <w:p>
-      <w:pPr>
-        <w:spacing w:line="240" w:lineRule="auto"/>
-        <w:rPr>
-          <w:rFonts w:ascii="Times New Roman" w:eastAsia="Times New Roman" w:hAnsi="Times New Roman" w:cs="Times New Roman"/>
-          <w:sz w:val="24"/>
-          <w:szCs w:val="24"/>
-          <w:lang w:eastAsia="pt-BR"/>
-        </w:rPr>
-      </w:pPr>
-      <w:proofErr w:type="spellStart"/>
-      <w:r>
-        <w:rPr>
-          <w:rFonts w:ascii="Calibri" w:eastAsia="Times New Roman" w:hAnsi="Calibri" w:cs="Calibri"/>
-          <w:color w:val="000000"/>
-          <w:lang w:eastAsia="pt-BR"/>
-        </w:rPr>
-        <w:t>nome_da_</w:t>
-      </w:r>
-      <w:proofErr w:type="gramStart"/>
-      <w:r>
-        <w:rPr>
-          <w:rFonts w:ascii="Calibri" w:eastAsia="Times New Roman" w:hAnsi="Calibri" w:cs="Calibri"/>
-          <w:color w:val="000000"/>
-          <w:lang w:eastAsia="pt-BR"/>
-        </w:rPr>
-        <w:t>variavel.sort</w:t>
-      </w:r>
-      <w:proofErr w:type="spellEnd"/>
-      <w:proofErr w:type="gramEnd"/>
-      <w:r>
-        <w:rPr>
-          <w:rFonts w:ascii="Calibri" w:eastAsia="Times New Roman" w:hAnsi="Calibri" w:cs="Calibri"/>
-          <w:color w:val="000000"/>
-          <w:lang w:eastAsia="pt-BR"/>
-        </w:rPr>
-        <w:t>(reverse=</w:t>
-      </w:r>
-      <w:proofErr w:type="spellStart"/>
-      <w:r>
-        <w:rPr>
-          <w:rFonts w:ascii="Calibri" w:eastAsia="Times New Roman" w:hAnsi="Calibri" w:cs="Calibri"/>
-          <w:color w:val="000000"/>
-          <w:lang w:eastAsia="pt-BR"/>
-        </w:rPr>
-        <w:t>True</w:t>
-      </w:r>
-      <w:proofErr w:type="spellEnd"/>
-      <w:r>
-        <w:rPr>
-          <w:rFonts w:ascii="Calibri" w:eastAsia="Times New Roman" w:hAnsi="Calibri" w:cs="Calibri"/>
-          <w:color w:val="000000"/>
-          <w:lang w:eastAsia="pt-BR"/>
-        </w:rPr>
-        <w:t>)</w:t>
-      </w:r>
-    </w:p>
-    <w:p>
-      <w:pPr>
-        <w:spacing w:line="240" w:lineRule="auto"/>
-        <w:rPr>
-          <w:rFonts w:ascii="Times New Roman" w:eastAsia="Times New Roman" w:hAnsi="Times New Roman" w:cs="Times New Roman"/>
-          <w:sz w:val="24"/>
-          <w:szCs w:val="24"/>
-          <w:lang w:eastAsia="pt-BR"/>
-        </w:rPr>
-      </w:pPr>
-      <w:r>
-        <w:rPr>
-          <w:rFonts w:ascii="Calibri" w:eastAsia="Times New Roman" w:hAnsi="Calibri" w:cs="Calibri"/>
-          <w:color w:val="000000"/>
-          <w:lang w:eastAsia="pt-BR"/>
-        </w:rPr>
-        <w:t xml:space="preserve">para saber o tamanho de uma lista basta usar o </w:t>
-      </w:r>
-      <w:proofErr w:type="spellStart"/>
-      <w:proofErr w:type="gramStart"/>
-      <w:r>
-        <w:rPr>
-          <w:rFonts w:ascii="Calibri" w:eastAsia="Times New Roman" w:hAnsi="Calibri" w:cs="Calibri"/>
-          <w:color w:val="000000"/>
-          <w:lang w:eastAsia="pt-BR"/>
-        </w:rPr>
-        <w:t>len</w:t>
-      </w:r>
-      <w:proofErr w:type="spellEnd"/>
-      <w:r>
-        <w:rPr>
-          <w:rFonts w:ascii="Calibri" w:eastAsia="Times New Roman" w:hAnsi="Calibri" w:cs="Calibri"/>
-          <w:color w:val="000000"/>
-          <w:lang w:eastAsia="pt-BR"/>
-        </w:rPr>
-        <w:t>(</w:t>
-      </w:r>
-      <w:proofErr w:type="gramEnd"/>
-      <w:r>
-        <w:rPr>
-          <w:rFonts w:ascii="Calibri" w:eastAsia="Times New Roman" w:hAnsi="Calibri" w:cs="Calibri"/>
-          <w:color w:val="000000"/>
-          <w:lang w:eastAsia="pt-BR"/>
-        </w:rPr>
-        <w:t>nome da lista)</w:t>
-      </w:r>
-    </w:p>
-    <w:p>
-      <w:pPr>
-        <w:spacing w:line="240" w:lineRule="auto"/>
-        <w:rPr>
-          <w:rFonts w:ascii="Times New Roman" w:eastAsia="Times New Roman" w:hAnsi="Times New Roman" w:cs="Times New Roman"/>
-          <w:sz w:val="24"/>
-          <w:szCs w:val="24"/>
-          <w:lang w:eastAsia="pt-BR"/>
-        </w:rPr>
-      </w:pPr>
-      <w:r>
-        <w:rPr>
-          <w:rFonts w:ascii="Calibri" w:eastAsia="Times New Roman" w:hAnsi="Calibri" w:cs="Calibri"/>
-          <w:color w:val="000000"/>
-          <w:lang w:eastAsia="pt-BR"/>
-        </w:rPr>
-        <w:t>você pode fazer cópias de uma lista basta usar </w:t>
-      </w:r>
-    </w:p>
-    <w:p>
-      <w:pPr>
-        <w:spacing w:line="240" w:lineRule="auto"/>
-        <w:rPr>
-          <w:rFonts w:ascii="Times New Roman" w:eastAsia="Times New Roman" w:hAnsi="Times New Roman" w:cs="Times New Roman"/>
-          <w:sz w:val="24"/>
-          <w:szCs w:val="24"/>
-          <w:lang w:eastAsia="pt-BR"/>
-        </w:rPr>
-      </w:pPr>
-      <w:r>
-        <w:rPr>
-          <w:rFonts w:ascii="Calibri" w:eastAsia="Times New Roman" w:hAnsi="Calibri" w:cs="Calibri"/>
-          <w:color w:val="000000"/>
-          <w:lang w:eastAsia="pt-BR"/>
-        </w:rPr>
-        <w:t xml:space="preserve">nome da variável = </w:t>
-      </w:r>
-      <w:proofErr w:type="spellStart"/>
-      <w:proofErr w:type="gramStart"/>
-      <w:r>
-        <w:rPr>
-          <w:rFonts w:ascii="Calibri" w:eastAsia="Times New Roman" w:hAnsi="Calibri" w:cs="Calibri"/>
-          <w:color w:val="000000"/>
-          <w:lang w:eastAsia="pt-BR"/>
-        </w:rPr>
-        <w:t>list</w:t>
-      </w:r>
-      <w:proofErr w:type="spellEnd"/>
-      <w:r>
-        <w:rPr>
-          <w:rFonts w:ascii="Calibri" w:eastAsia="Times New Roman" w:hAnsi="Calibri" w:cs="Calibri"/>
-          <w:color w:val="000000"/>
-          <w:lang w:eastAsia="pt-BR"/>
-        </w:rPr>
-        <w:t>(</w:t>
-      </w:r>
-      <w:proofErr w:type="gramEnd"/>
-      <w:r>
-        <w:rPr>
-          <w:rFonts w:ascii="Calibri" w:eastAsia="Times New Roman" w:hAnsi="Calibri" w:cs="Calibri"/>
-          <w:color w:val="000000"/>
-          <w:lang w:eastAsia="pt-BR"/>
-        </w:rPr>
-        <w:t>nome da lista que vai ser copiada)</w:t>
-      </w:r>
-    </w:p>
-    <w:p>
-      <w:pPr>
-        <w:spacing w:line="240" w:lineRule="auto"/>
-        <w:rPr>
-          <w:rFonts w:ascii="Times New Roman" w:eastAsia="Times New Roman" w:hAnsi="Times New Roman" w:cs="Times New Roman"/>
-          <w:sz w:val="24"/>
-          <w:szCs w:val="24"/>
-          <w:lang w:eastAsia="pt-BR"/>
-        </w:rPr>
-      </w:pPr>
-      <w:proofErr w:type="spellStart"/>
-      <w:r>
-        <w:rPr>
-          <w:rFonts w:ascii="Calibri" w:eastAsia="Times New Roman" w:hAnsi="Calibri" w:cs="Calibri"/>
-          <w:color w:val="000000"/>
-          <w:lang w:eastAsia="pt-BR"/>
-        </w:rPr>
-        <w:t>Voce</w:t>
-      </w:r>
-      <w:proofErr w:type="spellEnd"/>
-      <w:r>
-        <w:rPr>
-          <w:rFonts w:ascii="Calibri" w:eastAsia="Times New Roman" w:hAnsi="Calibri" w:cs="Calibri"/>
-          <w:color w:val="000000"/>
-          <w:lang w:eastAsia="pt-BR"/>
-        </w:rPr>
-        <w:t xml:space="preserve"> também pode juntar listas, basta usar o + e criar outra variável </w:t>
-      </w:r>
-      <w:proofErr w:type="spellStart"/>
-      <w:r>
-        <w:rPr>
-          <w:rFonts w:ascii="Calibri" w:eastAsia="Times New Roman" w:hAnsi="Calibri" w:cs="Calibri"/>
-          <w:color w:val="000000"/>
-          <w:lang w:eastAsia="pt-BR"/>
-        </w:rPr>
-        <w:t>ex</w:t>
-      </w:r>
-      <w:proofErr w:type="spellEnd"/>
-      <w:r>
-        <w:rPr>
-          <w:rFonts w:ascii="Calibri" w:eastAsia="Times New Roman" w:hAnsi="Calibri" w:cs="Calibri"/>
-          <w:color w:val="000000"/>
-          <w:lang w:eastAsia="pt-BR"/>
-        </w:rPr>
-        <w:t>:</w:t>
-      </w:r>
-    </w:p>
-    <w:p>
-      <w:pPr>
-        <w:spacing w:line="240" w:lineRule="auto"/>
-        <w:rPr>
-          <w:rFonts w:ascii="Times New Roman" w:eastAsia="Times New Roman" w:hAnsi="Times New Roman" w:cs="Times New Roman"/>
-          <w:sz w:val="24"/>
-          <w:szCs w:val="24"/>
-          <w:lang w:eastAsia="pt-BR"/>
-        </w:rPr>
-      </w:pPr>
-      <w:r>
-        <w:rPr>
-          <w:rFonts w:ascii="Calibri" w:eastAsia="Times New Roman" w:hAnsi="Calibri" w:cs="Calibri"/>
-          <w:color w:val="000000"/>
-          <w:lang w:eastAsia="pt-BR"/>
-        </w:rPr>
-        <w:t xml:space="preserve">nome da variável = lista </w:t>
-      </w:r>
-      <w:proofErr w:type="gramStart"/>
-      <w:r>
-        <w:rPr>
-          <w:rFonts w:ascii="Calibri" w:eastAsia="Times New Roman" w:hAnsi="Calibri" w:cs="Calibri"/>
-          <w:color w:val="000000"/>
-          <w:lang w:eastAsia="pt-BR"/>
-        </w:rPr>
-        <w:t>um  +</w:t>
-      </w:r>
-      <w:proofErr w:type="gramEnd"/>
-      <w:r>
-        <w:rPr>
-          <w:rFonts w:ascii="Calibri" w:eastAsia="Times New Roman" w:hAnsi="Calibri" w:cs="Calibri"/>
-          <w:color w:val="000000"/>
-          <w:lang w:eastAsia="pt-BR"/>
-        </w:rPr>
-        <w:t xml:space="preserve"> lista 2</w:t>
-      </w:r>
-    </w:p>
-    <w:p>
-      <w:pPr>
-        <w:spacing w:line="240" w:lineRule="auto"/>
-        <w:rPr>
-          <w:rFonts w:ascii="Times New Roman" w:eastAsia="Times New Roman" w:hAnsi="Times New Roman" w:cs="Times New Roman"/>
-          <w:sz w:val="24"/>
-          <w:szCs w:val="24"/>
-          <w:lang w:eastAsia="pt-BR"/>
-        </w:rPr>
-      </w:pPr>
-      <w:r>
-        <w:rPr>
-          <w:rFonts w:ascii="Calibri" w:eastAsia="Times New Roman" w:hAnsi="Calibri" w:cs="Calibri"/>
-          <w:color w:val="000000"/>
-          <w:lang w:eastAsia="pt-BR"/>
-        </w:rPr>
-        <w:t xml:space="preserve">o </w:t>
-      </w:r>
-      <w:proofErr w:type="spellStart"/>
-      <w:r>
-        <w:rPr>
-          <w:rFonts w:ascii="Calibri" w:eastAsia="Times New Roman" w:hAnsi="Calibri" w:cs="Calibri"/>
-          <w:color w:val="000000"/>
-          <w:lang w:eastAsia="pt-BR"/>
-        </w:rPr>
-        <w:t>python</w:t>
-      </w:r>
-      <w:proofErr w:type="spellEnd"/>
-      <w:r>
-        <w:rPr>
-          <w:rFonts w:ascii="Calibri" w:eastAsia="Times New Roman" w:hAnsi="Calibri" w:cs="Calibri"/>
-          <w:color w:val="000000"/>
-          <w:lang w:eastAsia="pt-BR"/>
-        </w:rPr>
-        <w:t xml:space="preserve"> faz uma </w:t>
-      </w:r>
-      <w:proofErr w:type="gramStart"/>
-      <w:r>
-        <w:rPr>
-          <w:rFonts w:ascii="Calibri" w:eastAsia="Times New Roman" w:hAnsi="Calibri" w:cs="Calibri"/>
-          <w:color w:val="000000"/>
-          <w:lang w:eastAsia="pt-BR"/>
-        </w:rPr>
-        <w:t>ligação  entre</w:t>
-      </w:r>
-      <w:proofErr w:type="gramEnd"/>
-      <w:r>
-        <w:rPr>
-          <w:rFonts w:ascii="Calibri" w:eastAsia="Times New Roman" w:hAnsi="Calibri" w:cs="Calibri"/>
-          <w:color w:val="000000"/>
-          <w:lang w:eastAsia="pt-BR"/>
-        </w:rPr>
-        <w:t xml:space="preserve"> listas então se for mudar algo em uma lista ela automaticamente vai ser mudada na outra, para resolver isso basta fazer uma cópia usando </w:t>
-      </w:r>
-      <w:proofErr w:type="gramStart"/>
-      <w:r>
-        <w:rPr>
-          <w:rFonts w:ascii="Calibri" w:eastAsia="Times New Roman" w:hAnsi="Calibri" w:cs="Calibri"/>
-          <w:color w:val="000000"/>
-          <w:lang w:eastAsia="pt-BR"/>
-        </w:rPr>
-        <w:t>o :</w:t>
-      </w:r>
-      <w:proofErr w:type="gramEnd"/>
-      <w:r>
-        <w:rPr>
-          <w:rFonts w:ascii="Calibri" w:eastAsia="Times New Roman" w:hAnsi="Calibri" w:cs="Calibri"/>
-          <w:color w:val="000000"/>
-          <w:lang w:eastAsia="pt-BR"/>
-        </w:rPr>
-        <w:t xml:space="preserve"> fatiamento </w:t>
-      </w:r>
-      <w:proofErr w:type="spellStart"/>
-      <w:r>
-        <w:rPr>
-          <w:rFonts w:ascii="Calibri" w:eastAsia="Times New Roman" w:hAnsi="Calibri" w:cs="Calibri"/>
-          <w:color w:val="000000"/>
-          <w:lang w:eastAsia="pt-BR"/>
-        </w:rPr>
-        <w:t>ex</w:t>
-      </w:r>
-      <w:proofErr w:type="spellEnd"/>
-    </w:p>
-    <w:p>
-      <w:pPr>
-        <w:spacing w:line="240" w:lineRule="auto"/>
-        <w:rPr>
-          <w:rFonts w:ascii="Times New Roman" w:eastAsia="Times New Roman" w:hAnsi="Times New Roman" w:cs="Times New Roman"/>
-          <w:sz w:val="24"/>
-          <w:szCs w:val="24"/>
-          <w:lang w:eastAsia="pt-BR"/>
-        </w:rPr>
-      </w:pPr>
-      <w:r>
-        <w:rPr>
-          <w:rFonts w:ascii="Calibri" w:eastAsia="Times New Roman" w:hAnsi="Calibri" w:cs="Calibri"/>
-          <w:color w:val="000000"/>
-          <w:lang w:eastAsia="pt-BR"/>
-        </w:rPr>
-        <w:t>a = [2, 3, 4, 7]</w:t>
-      </w:r>
-    </w:p>
-    <w:p>
-      <w:pPr>
-        <w:spacing w:line="240" w:lineRule="auto"/>
-        <w:rPr>
-          <w:rFonts w:ascii="Times New Roman" w:eastAsia="Times New Roman" w:hAnsi="Times New Roman" w:cs="Times New Roman"/>
-          <w:sz w:val="24"/>
-          <w:szCs w:val="24"/>
-          <w:lang w:eastAsia="pt-BR"/>
-        </w:rPr>
-      </w:pPr>
-      <w:r>
-        <w:rPr>
-          <w:rFonts w:ascii="Calibri" w:eastAsia="Times New Roman" w:hAnsi="Calibri" w:cs="Calibri"/>
-          <w:color w:val="000000"/>
-          <w:lang w:eastAsia="pt-BR"/>
-        </w:rPr>
-        <w:t xml:space="preserve">b = </w:t>
-      </w:r>
-      <w:proofErr w:type="gramStart"/>
-      <w:r>
-        <w:rPr>
-          <w:rFonts w:ascii="Calibri" w:eastAsia="Times New Roman" w:hAnsi="Calibri" w:cs="Calibri"/>
-          <w:color w:val="000000"/>
-          <w:lang w:eastAsia="pt-BR"/>
-        </w:rPr>
-        <w:t>a[ :</w:t>
-      </w:r>
-      <w:proofErr w:type="gramEnd"/>
-      <w:r>
-        <w:rPr>
-          <w:rFonts w:ascii="Calibri" w:eastAsia="Times New Roman" w:hAnsi="Calibri" w:cs="Calibri"/>
-          <w:color w:val="000000"/>
-          <w:lang w:eastAsia="pt-BR"/>
-        </w:rPr>
-        <w:t xml:space="preserve"> ]</w:t>
-      </w:r>
-    </w:p>
-    <w:p>
-      <w:pPr>
-        <w:spacing w:line="240" w:lineRule="auto"/>
-        <w:rPr>
-          <w:rFonts w:ascii="Times New Roman" w:eastAsia="Times New Roman" w:hAnsi="Times New Roman" w:cs="Times New Roman"/>
-          <w:sz w:val="24"/>
-          <w:szCs w:val="24"/>
-          <w:lang w:eastAsia="pt-BR"/>
-        </w:rPr>
-      </w:pPr>
-      <w:proofErr w:type="gramStart"/>
-      <w:r>
-        <w:rPr>
-          <w:rFonts w:ascii="Calibri" w:eastAsia="Times New Roman" w:hAnsi="Calibri" w:cs="Calibri"/>
-          <w:color w:val="000000"/>
-          <w:lang w:eastAsia="pt-BR"/>
-        </w:rPr>
-        <w:t>b[</w:t>
-      </w:r>
-      <w:proofErr w:type="gramEnd"/>
-      <w:r>
-        <w:rPr>
-          <w:rFonts w:ascii="Calibri" w:eastAsia="Times New Roman" w:hAnsi="Calibri" w:cs="Calibri"/>
-          <w:color w:val="000000"/>
-          <w:lang w:eastAsia="pt-BR"/>
-        </w:rPr>
-        <w:t>2] = 8</w:t>
-      </w:r>
-    </w:p>
-    <w:p>
-      <w:pPr>
-        <w:spacing w:line="240" w:lineRule="auto"/>
-        <w:rPr>
-          <w:rFonts w:ascii="Times New Roman" w:eastAsia="Times New Roman" w:hAnsi="Times New Roman" w:cs="Times New Roman"/>
-          <w:sz w:val="24"/>
-          <w:szCs w:val="24"/>
-          <w:lang w:eastAsia="pt-BR"/>
-        </w:rPr>
-      </w:pPr>
-      <w:proofErr w:type="spellStart"/>
-      <w:r>
-        <w:rPr>
-          <w:rFonts w:ascii="Calibri" w:eastAsia="Times New Roman" w:hAnsi="Calibri" w:cs="Calibri"/>
-          <w:color w:val="000000"/>
-          <w:lang w:eastAsia="pt-BR"/>
-        </w:rPr>
-        <w:t>result</w:t>
-      </w:r>
-      <w:proofErr w:type="spellEnd"/>
-      <w:r>
-        <w:rPr>
-          <w:rFonts w:ascii="Calibri" w:eastAsia="Times New Roman" w:hAnsi="Calibri" w:cs="Calibri"/>
-          <w:color w:val="000000"/>
-          <w:lang w:eastAsia="pt-BR"/>
-        </w:rPr>
-        <w:t> </w:t>
-      </w:r>
-    </w:p>
-    <w:p>
-      <w:pPr>
-        <w:spacing w:line="240" w:lineRule="auto"/>
-        <w:rPr>
-          <w:rFonts w:ascii="Times New Roman" w:eastAsia="Times New Roman" w:hAnsi="Times New Roman" w:cs="Times New Roman"/>
-          <w:sz w:val="24"/>
-          <w:szCs w:val="24"/>
-          <w:lang w:eastAsia="pt-BR"/>
-        </w:rPr>
-      </w:pPr>
-      <w:r>
-        <w:rPr>
-          <w:rFonts w:ascii="Calibri" w:eastAsia="Times New Roman" w:hAnsi="Calibri" w:cs="Calibri"/>
-          <w:color w:val="000000"/>
-          <w:lang w:eastAsia="pt-BR"/>
-        </w:rPr>
-        <w:t>Lista A: [2, 3, 4, 7]</w:t>
-      </w:r>
-    </w:p>
-    <w:p>
-      <w:pPr>
-        <w:spacing w:line="240" w:lineRule="auto"/>
-        <w:rPr>
-          <w:rFonts w:ascii="Times New Roman" w:eastAsia="Times New Roman" w:hAnsi="Times New Roman" w:cs="Times New Roman"/>
-          <w:sz w:val="24"/>
-          <w:szCs w:val="24"/>
-          <w:lang w:eastAsia="pt-BR"/>
-        </w:rPr>
-      </w:pPr>
-      <w:r>
-        <w:rPr>
-          <w:rFonts w:ascii="Calibri" w:eastAsia="Times New Roman" w:hAnsi="Calibri" w:cs="Calibri"/>
-          <w:color w:val="000000"/>
-          <w:lang w:eastAsia="pt-BR"/>
-        </w:rPr>
-        <w:t>Lista B: [2, 3, 8 ,7]</w:t>
+        <w:br/>
+      </w:r>
+      <w:r>
+        <w:rPr>
+          <w:rFonts w:ascii="Times New Roman" w:eastAsia="Times New Roman" w:hAnsi="Times New Roman" w:cs="Times New Roman"/>
+          <w:sz w:val="24"/>
+          <w:szCs w:val="24"/>
+          <w:lang w:eastAsia="pt-BR"/>
+        </w:rPr>
+        <w:drawing>
+          <wp:inline distT="0" distB="0" distL="0" distR="0" wp14:anchorId="2F73F3D2" wp14:editId="75A20C81">
+            <wp:extent cx="5400040" cy="2485390"/>
+            <wp:effectExtent l="0" t="0" r="0" b="0"/>
+            <wp:docPr id="1284893088" name="Imagem 1" descr="Texto&#10;&#10;O conteúdo gerado por IA pode estar incorreto."/>
+            <wp:cNvGraphicFramePr>
+              <a:graphicFrameLocks xmlns:a="http://schemas.openxmlformats.org/drawingml/2006/main" noChangeAspect="1"/>
+            </wp:cNvGraphicFramePr>
+            <a:graphic xmlns:a="http://schemas.openxmlformats.org/drawingml/2006/main">
+              <a:graphicData uri="http://schemas.openxmlformats.org/drawingml/2006/picture">
+                <pic:pic xmlns:pic="http://schemas.openxmlformats.org/drawingml/2006/picture">
+                  <pic:nvPicPr>
+                    <pic:cNvPr id="1284893088" name="Imagem 1" descr="Texto&#10;&#10;O conteúdo gerado por IA pode estar incorreto."/>
+                    <pic:cNvPicPr/>
+                  </pic:nvPicPr>
+                  <pic:blipFill>
+                    <a:blip r:embed="rId6"/>
+                    <a:stretch>
+                      <a:fillRect/>
+                    </a:stretch>
+                  </pic:blipFill>
+                  <pic:spPr>
+                    <a:xfrm>
+                      <a:off x="0" y="0"/>
+                      <a:ext cx="5400040" cy="2485390"/>
+                    </a:xfrm>
+                    <a:prstGeom prst="rect">
+                      <a:avLst/>
+                    </a:prstGeom>
+                  </pic:spPr>
+                </pic:pic>
+              </a:graphicData>
+            </a:graphic>
+          </wp:inline>
+        </w:drawing>
       </w:r>
     </w:p>
     <w:p>
@@ -8144,7 +8377,6 @@
         </w:rPr>
       </w:pPr>
       <w:r>
-        <w:lastRenderedPageBreak/>
         <w:t>Dados[‘sexo’] = ‘M’</w:t>
       </w:r>
     </w:p>
@@ -8165,6 +8397,9 @@
     </w:p>
     <w:p>
       <w:r>
+        <w:rPr>
+          <w:noProof/>
+        </w:rPr>
         <w:drawing>
           <wp:inline distT="0" distB="0" distL="0" distR="0" wp14:anchorId="11970838" wp14:editId="6B5AC659">
             <wp:extent cx="5400040" cy="2088515"/>
@@ -8181,7 +8416,7 @@
                     <pic:cNvPicPr/>
                   </pic:nvPicPr>
                   <pic:blipFill>
-                    <a:blip r:embed="rId5"/>
+                    <a:blip r:embed="rId7"/>
                     <a:stretch>
                       <a:fillRect/>
                     </a:stretch>
@@ -8206,11 +8441,23 @@
     <w:p>
       <w:proofErr w:type="spellStart"/>
       <w:r>
+        <w:rPr>
+          <w:sz w:val="40"/>
+          <w:szCs w:val="40"/>
+        </w:rPr>
+        <w:lastRenderedPageBreak/>
         <w:t>Values</w:t>
       </w:r>
       <w:proofErr w:type="spellEnd"/>
       <w:r>
-        <w:t xml:space="preserve"> são para pegar os valores de dentro do dicionário, nesse caso Star </w:t>
+        <w:rPr>
+          <w:sz w:val="40"/>
+          <w:szCs w:val="40"/>
+        </w:rPr>
+        <w:t xml:space="preserve"> </w:t>
+      </w:r>
+      <w:r>
+        <w:t xml:space="preserve">são para pegar os valores de dentro do dicionário, nesse caso Star </w:t>
       </w:r>
       <w:proofErr w:type="spellStart"/>
       <w:r>
@@ -8223,31 +8470,494 @@
     </w:p>
     <w:p>
       <w:r>
-        <w:t xml:space="preserve">Para pegar as chaves são esses que estão </w:t>
+        <w:t xml:space="preserve">Para pegar as </w:t>
+      </w:r>
+      <w:r>
+        <w:rPr>
+          <w:sz w:val="40"/>
+          <w:szCs w:val="40"/>
+        </w:rPr>
+        <w:t>chaves</w:t>
+      </w:r>
+      <w:r>
+        <w:t xml:space="preserve"> são esses que estão </w:t>
+      </w:r>
+      <w:proofErr w:type="spellStart"/>
+      <w:r>
+        <w:t>representrados</w:t>
+      </w:r>
+      <w:proofErr w:type="spellEnd"/>
+      <w:r>
+        <w:t>, ou seja,</w:t>
+      </w:r>
+      <w:r>
+        <w:t xml:space="preserve"> Título ano e diretor</w:t>
+      </w:r>
+    </w:p>
+    <w:p>
+      <w:r>
+        <w:t xml:space="preserve">Para pegar os 2 basta colocar </w:t>
+      </w:r>
+      <w:r>
+        <w:t>itens</w:t>
+      </w:r>
+    </w:p>
+    <w:p>
+      <w:r>
+        <w:t>Print(</w:t>
       </w:r>
       <w:proofErr w:type="spellStart"/>
       <w:proofErr w:type="gramStart"/>
       <w:r>
-        <w:t>representrados</w:t>
-      </w:r>
-      <w:proofErr w:type="spellEnd"/>
-      <w:r>
-        <w:t xml:space="preserve"> ou seja</w:t>
-      </w:r>
+        <w:t>filme.items</w:t>
+      </w:r>
+      <w:proofErr w:type="spellEnd"/>
       <w:proofErr w:type="gramEnd"/>
       <w:r>
-        <w:t xml:space="preserve"> Título ano e diretor</w:t>
-      </w:r>
-    </w:p>
-    <w:p>
-      <w:r>
-        <w:t xml:space="preserve">Para pegar os 2 basta colocar </w:t>
-      </w:r>
-      <w:proofErr w:type="spellStart"/>
-      <w:r>
-        <w:t>items</w:t>
-      </w:r>
-      <w:proofErr w:type="spellEnd"/>
+        <w:t>())</w:t>
+      </w:r>
+    </w:p>
+    <w:p>
+      <w:r>
+        <w:drawing>
+          <wp:inline distT="0" distB="0" distL="0" distR="0" wp14:anchorId="5E6284E7" wp14:editId="3332DB9A">
+            <wp:extent cx="5400040" cy="2414905"/>
+            <wp:effectExtent l="0" t="0" r="0" b="0"/>
+            <wp:docPr id="1695886461" name="Imagem 1" descr="Texto&#10;&#10;O conteúdo gerado por IA pode estar incorreto."/>
+            <wp:cNvGraphicFramePr>
+              <a:graphicFrameLocks xmlns:a="http://schemas.openxmlformats.org/drawingml/2006/main" noChangeAspect="1"/>
+            </wp:cNvGraphicFramePr>
+            <a:graphic xmlns:a="http://schemas.openxmlformats.org/drawingml/2006/main">
+              <a:graphicData uri="http://schemas.openxmlformats.org/drawingml/2006/picture">
+                <pic:pic xmlns:pic="http://schemas.openxmlformats.org/drawingml/2006/picture">
+                  <pic:nvPicPr>
+                    <pic:cNvPr id="1695886461" name="Imagem 1" descr="Texto&#10;&#10;O conteúdo gerado por IA pode estar incorreto."/>
+                    <pic:cNvPicPr/>
+                  </pic:nvPicPr>
+                  <pic:blipFill>
+                    <a:blip r:embed="rId8"/>
+                    <a:stretch>
+                      <a:fillRect/>
+                    </a:stretch>
+                  </pic:blipFill>
+                  <pic:spPr>
+                    <a:xfrm>
+                      <a:off x="0" y="0"/>
+                      <a:ext cx="5400040" cy="2414905"/>
+                    </a:xfrm>
+                    <a:prstGeom prst="rect">
+                      <a:avLst/>
+                    </a:prstGeom>
+                  </pic:spPr>
+                </pic:pic>
+              </a:graphicData>
+            </a:graphic>
+          </wp:inline>
+        </w:drawing>
+      </w:r>
+    </w:p>
+    <w:p/>
+    <w:p>
+      <w:r>
+        <w:t xml:space="preserve">Você também pode adicionar coisas no dicionário </w:t>
+      </w:r>
+      <w:proofErr w:type="gramStart"/>
+      <w:r>
+        <w:t>e também</w:t>
+      </w:r>
+      <w:proofErr w:type="gramEnd"/>
+      <w:r>
+        <w:t xml:space="preserve"> mudar diretamente </w:t>
+      </w:r>
+    </w:p>
+    <w:p>
+      <w:r>
+        <w:t>pessoas = {'nome': 'Lucas', 'sexo': 'M', 'idade': 22}</w:t>
+      </w:r>
+    </w:p>
+    <w:p>
+      <w:r>
+        <w:t>pessoas['nome'] = 'Marcos'</w:t>
+      </w:r>
+    </w:p>
+    <w:p>
+      <w:r>
+        <w:t>pessoas['peso'] = '98.5'</w:t>
+      </w:r>
+    </w:p>
+    <w:p/>
+    <w:p>
+      <w:r>
+        <w:t xml:space="preserve">for k, v in </w:t>
+      </w:r>
+      <w:proofErr w:type="spellStart"/>
+      <w:proofErr w:type="gramStart"/>
+      <w:r>
+        <w:t>pessoas.items</w:t>
+      </w:r>
+      <w:proofErr w:type="spellEnd"/>
+      <w:proofErr w:type="gramEnd"/>
+      <w:r>
+        <w:t>():</w:t>
+      </w:r>
+    </w:p>
+    <w:p>
+      <w:r>
+        <w:t>    print(f'{k} = {v}')</w:t>
+      </w:r>
+    </w:p>
+    <w:p/>
+    <w:p>
+      <w:r>
+        <w:t xml:space="preserve">nome = </w:t>
+      </w:r>
+      <w:proofErr w:type="spellStart"/>
+      <w:r>
+        <w:t>Macos</w:t>
+      </w:r>
+      <w:proofErr w:type="spellEnd"/>
+      <w:r>
+        <w:t xml:space="preserve"> </w:t>
+      </w:r>
+    </w:p>
+    <w:p>
+      <w:r>
+        <w:t>sexo = M</w:t>
+      </w:r>
+    </w:p>
+    <w:p>
+      <w:r>
+        <w:t>idade = 22</w:t>
+      </w:r>
+    </w:p>
+    <w:p>
+      <w:r>
+        <w:t>peso = 98.5</w:t>
+      </w:r>
+    </w:p>
+    <w:p/>
+    <w:p>
+      <w:r>
+        <w:t xml:space="preserve">para copiar um conteúdo quando envolve dicionários utiliza-se </w:t>
+      </w:r>
+      <w:proofErr w:type="gramStart"/>
+      <w:r>
+        <w:t>o  método</w:t>
+      </w:r>
+      <w:proofErr w:type="gramEnd"/>
+      <w:r>
+        <w:t xml:space="preserve"> </w:t>
+      </w:r>
+      <w:proofErr w:type="gramStart"/>
+      <w:r>
+        <w:t>copy(</w:t>
+      </w:r>
+      <w:proofErr w:type="gramEnd"/>
+      <w:r>
+        <w:t>)</w:t>
+      </w:r>
+    </w:p>
+    <w:p>
+      <w:pPr>
+        <w:rPr>
+          <w:sz w:val="40"/>
+          <w:szCs w:val="40"/>
+        </w:rPr>
+      </w:pPr>
+      <w:r>
+        <w:rPr>
+          <w:sz w:val="40"/>
+          <w:szCs w:val="40"/>
+        </w:rPr>
+        <w:t xml:space="preserve">FUNÇÕES </w:t>
+      </w:r>
+    </w:p>
+    <w:p>
+      <w:r>
+        <w:lastRenderedPageBreak/>
+        <w:t>Função é algo que já esta “</w:t>
+      </w:r>
+      <w:proofErr w:type="spellStart"/>
+      <w:proofErr w:type="gramStart"/>
+      <w:r>
+        <w:t>pré</w:t>
+      </w:r>
+      <w:proofErr w:type="spellEnd"/>
+      <w:r>
+        <w:t xml:space="preserve"> programado</w:t>
+      </w:r>
+      <w:proofErr w:type="gramEnd"/>
+      <w:r>
+        <w:t>” para ser utilizado</w:t>
+      </w:r>
+    </w:p>
+    <w:p>
+      <w:proofErr w:type="spellStart"/>
+      <w:r>
+        <w:t>Ex</w:t>
+      </w:r>
+      <w:proofErr w:type="spellEnd"/>
+      <w:r>
+        <w:t xml:space="preserve">: </w:t>
+      </w:r>
+      <w:proofErr w:type="gramStart"/>
+      <w:r>
+        <w:t>print(</w:t>
+      </w:r>
+      <w:proofErr w:type="gramEnd"/>
+      <w:r>
+        <w:t xml:space="preserve">), </w:t>
+      </w:r>
+      <w:proofErr w:type="spellStart"/>
+      <w:proofErr w:type="gramStart"/>
+      <w:r>
+        <w:t>len</w:t>
+      </w:r>
+      <w:proofErr w:type="spellEnd"/>
+      <w:r>
+        <w:t>(</w:t>
+      </w:r>
+      <w:proofErr w:type="gramEnd"/>
+      <w:r>
+        <w:t xml:space="preserve">), </w:t>
+      </w:r>
+      <w:proofErr w:type="gramStart"/>
+      <w:r>
+        <w:t>input(</w:t>
+      </w:r>
+      <w:proofErr w:type="gramEnd"/>
+      <w:r>
+        <w:t>)</w:t>
+      </w:r>
+    </w:p>
+    <w:p>
+      <w:r>
+        <w:t xml:space="preserve">Normalmente termina com </w:t>
+      </w:r>
+      <w:proofErr w:type="gramStart"/>
+      <w:r>
+        <w:t>Parênteses(</w:t>
+      </w:r>
+      <w:proofErr w:type="gramEnd"/>
+      <w:r>
+        <w:t xml:space="preserve">) </w:t>
+      </w:r>
+    </w:p>
+    <w:p>
+      <w:r>
+        <w:t>Exemplo simples</w:t>
+      </w:r>
+    </w:p>
+    <w:p>
+      <w:proofErr w:type="spellStart"/>
+      <w:r>
+        <w:t>def</w:t>
+      </w:r>
+      <w:proofErr w:type="spellEnd"/>
+      <w:r>
+        <w:t xml:space="preserve"> </w:t>
+      </w:r>
+      <w:proofErr w:type="spellStart"/>
+      <w:proofErr w:type="gramStart"/>
+      <w:r>
+        <w:t>mostraLinha</w:t>
+      </w:r>
+      <w:proofErr w:type="spellEnd"/>
+      <w:r>
+        <w:t>(</w:t>
+      </w:r>
+      <w:proofErr w:type="gramEnd"/>
+      <w:r>
+        <w:t>):</w:t>
+      </w:r>
+    </w:p>
+    <w:p>
+      <w:r>
+        <w:tab/>
+      </w:r>
+      <w:proofErr w:type="gramStart"/>
+      <w:r>
+        <w:t>print(</w:t>
+      </w:r>
+      <w:proofErr w:type="gramEnd"/>
+      <w:r>
+        <w:t>‘------------’)</w:t>
+      </w:r>
+    </w:p>
+    <w:p>
+      <w:r>
+        <w:t xml:space="preserve">e basta chamar </w:t>
+      </w:r>
+    </w:p>
+    <w:p>
+      <w:proofErr w:type="spellStart"/>
+      <w:proofErr w:type="gramStart"/>
+      <w:r>
+        <w:t>mostraLinha</w:t>
+      </w:r>
+      <w:proofErr w:type="spellEnd"/>
+      <w:r>
+        <w:t>(</w:t>
+      </w:r>
+      <w:proofErr w:type="gramEnd"/>
+      <w:r>
+        <w:t>)</w:t>
+      </w:r>
+    </w:p>
+    <w:p/>
+    <w:p>
+      <w:r>
+        <w:t xml:space="preserve">parâmetros dentro da </w:t>
+      </w:r>
+      <w:proofErr w:type="spellStart"/>
+      <w:r>
+        <w:t>def</w:t>
+      </w:r>
+      <w:proofErr w:type="spellEnd"/>
+    </w:p>
+    <w:p>
+      <w:r>
+        <w:drawing>
+          <wp:inline distT="0" distB="0" distL="0" distR="0" wp14:anchorId="27FF0532" wp14:editId="170B8BE4">
+            <wp:extent cx="5400040" cy="1924050"/>
+            <wp:effectExtent l="0" t="0" r="0" b="0"/>
+            <wp:docPr id="1559773861" name="Imagem 1" descr="Diagrama, Linha do tempo&#10;&#10;O conteúdo gerado por IA pode estar incorreto."/>
+            <wp:cNvGraphicFramePr>
+              <a:graphicFrameLocks xmlns:a="http://schemas.openxmlformats.org/drawingml/2006/main" noChangeAspect="1"/>
+            </wp:cNvGraphicFramePr>
+            <a:graphic xmlns:a="http://schemas.openxmlformats.org/drawingml/2006/main">
+              <a:graphicData uri="http://schemas.openxmlformats.org/drawingml/2006/picture">
+                <pic:pic xmlns:pic="http://schemas.openxmlformats.org/drawingml/2006/picture">
+                  <pic:nvPicPr>
+                    <pic:cNvPr id="1559773861" name="Imagem 1" descr="Diagrama, Linha do tempo&#10;&#10;O conteúdo gerado por IA pode estar incorreto."/>
+                    <pic:cNvPicPr/>
+                  </pic:nvPicPr>
+                  <pic:blipFill>
+                    <a:blip r:embed="rId9"/>
+                    <a:stretch>
+                      <a:fillRect/>
+                    </a:stretch>
+                  </pic:blipFill>
+                  <pic:spPr>
+                    <a:xfrm>
+                      <a:off x="0" y="0"/>
+                      <a:ext cx="5400040" cy="1924050"/>
+                    </a:xfrm>
+                    <a:prstGeom prst="rect">
+                      <a:avLst/>
+                    </a:prstGeom>
+                  </pic:spPr>
+                </pic:pic>
+              </a:graphicData>
+            </a:graphic>
+          </wp:inline>
+        </w:drawing>
+      </w:r>
+    </w:p>
+    <w:p/>
+    <w:p/>
+    <w:p>
+      <w:r>
+        <w:t xml:space="preserve">Você pode trabalhar com uma definição sem saber o tanto de argumentos que vai ser passado, basta colocar o * e o nome da variável, </w:t>
+      </w:r>
+      <w:proofErr w:type="spellStart"/>
+      <w:r>
+        <w:t>ex</w:t>
+      </w:r>
+      <w:proofErr w:type="spellEnd"/>
+      <w:r>
+        <w:t>:</w:t>
+      </w:r>
+      <w:r>
+        <w:br/>
+      </w:r>
+      <w:proofErr w:type="spellStart"/>
+      <w:r>
+        <w:t>def</w:t>
+      </w:r>
+      <w:proofErr w:type="spellEnd"/>
+      <w:r>
+        <w:t xml:space="preserve"> contador(*num):</w:t>
+      </w:r>
+    </w:p>
+    <w:p>
+      <w:r>
+        <w:t>    for valor in num:</w:t>
+      </w:r>
+    </w:p>
+    <w:p>
+      <w:r>
+        <w:t xml:space="preserve">        print(f'{valor}', </w:t>
+      </w:r>
+      <w:proofErr w:type="spellStart"/>
+      <w:r>
+        <w:t>end</w:t>
+      </w:r>
+      <w:proofErr w:type="spellEnd"/>
+      <w:r>
+        <w:t>=' ')</w:t>
+      </w:r>
+    </w:p>
+    <w:p/>
+    <w:p>
+      <w:proofErr w:type="gramStart"/>
+      <w:r>
+        <w:t>contador(</w:t>
+      </w:r>
+      <w:proofErr w:type="gramEnd"/>
+      <w:r>
+        <w:t>2,1,7)</w:t>
+      </w:r>
+    </w:p>
+    <w:p>
+      <w:proofErr w:type="gramStart"/>
+      <w:r>
+        <w:t>contador(</w:t>
+      </w:r>
+      <w:proofErr w:type="gramEnd"/>
+      <w:r>
+        <w:t>9,7,2)</w:t>
+      </w:r>
+    </w:p>
+    <w:p>
+      <w:proofErr w:type="gramStart"/>
+      <w:r>
+        <w:t>contador(</w:t>
+      </w:r>
+      <w:proofErr w:type="gramEnd"/>
+      <w:r>
+        <w:t>1,5,8)</w:t>
+      </w:r>
+    </w:p>
+    <w:p>
+      <w:r>
+        <w:t>2 1 7 9 7 2 1 5 8</w:t>
+      </w:r>
+    </w:p>
+    <w:p>
+      <w:r>
+        <w:t xml:space="preserve">Ele retorna como </w:t>
+      </w:r>
+      <w:r>
+        <w:rPr>
+          <w:b/>
+          <w:bCs/>
+        </w:rPr>
+        <w:t xml:space="preserve">tupla </w:t>
+      </w:r>
+    </w:p>
+    <w:p>
+      <w:r>
+        <w:t xml:space="preserve"> </w:t>
+      </w:r>
+      <w:r>
+        <w:t>O nome se chama DESEMPACOTAMENTO</w:t>
+      </w:r>
+    </w:p>
+    <w:p>
+      <w:r>
+        <w:t xml:space="preserve"> E quando for utilizar lista ele também funciona </w:t>
+      </w:r>
     </w:p>
     <w:sectPr>
       <w:pgSz w:w="11906" w:h="16838"/>
@@ -8257,6 +8967,163 @@
     </w:sectPr>
   </w:body>
 </w:document>
+</file>
+
+<file path=word/numbering.xml><?xml version="1.0" encoding="utf-8"?>
+<w:numbering xmlns:wpc="http://schemas.microsoft.com/office/word/2010/wordprocessingCanvas" xmlns:cx="http://schemas.microsoft.com/office/drawing/2014/chartex" xmlns:cx1="http://schemas.microsoft.com/office/drawing/2015/9/8/chartex" xmlns:cx2="http://schemas.microsoft.com/office/drawing/2015/10/21/chartex" xmlns:cx3="http://schemas.microsoft.com/office/drawing/2016/5/9/chartex" xmlns:cx4="http://schemas.microsoft.com/office/drawing/2016/5/10/chartex" xmlns:cx5="http://schemas.microsoft.com/office/drawing/2016/5/11/chartex" xmlns:cx6="http://schemas.microsoft.com/office/drawing/2016/5/12/chartex" xmlns:cx7="http://schemas.microsoft.com/office/drawing/2016/5/13/chartex" xmlns:cx8="http://schemas.microsoft.com/office/drawing/2016/5/14/chartex" xmlns:mc="http://schemas.openxmlformats.org/markup-compatibility/2006" xmlns:aink="http://schemas.microsoft.com/office/drawing/2016/ink" xmlns:am3d="http://schemas.microsoft.com/office/drawing/2017/model3d" xmlns:o="urn:schemas-microsoft-com:office:office" xmlns:oel="http://schemas.microsoft.com/office/2019/extlst" xmlns:r="http://schemas.openxmlformats.org/officeDocument/2006/relationships" xmlns:m="http://schemas.openxmlformats.org/officeDocument/2006/math" xmlns:v="urn:schemas-microsoft-com:vml" xmlns:wp14="http://schemas.microsoft.com/office/word/2010/wordprocessingDrawing" xmlns:wp="http://schemas.openxmlformats.org/drawingml/2006/wordprocessingDrawing" xmlns:w10="urn:schemas-microsoft-com:office:word" xmlns:w="http://schemas.openxmlformats.org/wordprocessingml/2006/main" xmlns:w14="http://schemas.microsoft.com/office/word/2010/wordml" xmlns:w15="http://schemas.microsoft.com/office/word/2012/wordml" xmlns:w16cex="http://schemas.microsoft.com/office/word/2018/wordml/cex" xmlns:w16cid="http://schemas.microsoft.com/office/word/2016/wordml/cid" xmlns:w16="http://schemas.microsoft.com/office/word/2018/wordml" xmlns:w16du="http://schemas.microsoft.com/office/word/2023/wordml/word16du" xmlns:w16sdtdh="http://schemas.microsoft.com/office/word/2020/wordml/sdtdatahash" xmlns:w16sdtfl="http://schemas.microsoft.com/office/word/2024/wordml/sdtformatlock" xmlns:w16se="http://schemas.microsoft.com/office/word/2015/wordml/symex" xmlns:wpg="http://schemas.microsoft.com/office/word/2010/wordprocessingGroup" xmlns:wpi="http://schemas.microsoft.com/office/word/2010/wordprocessingInk" xmlns:wne="http://schemas.microsoft.com/office/word/2006/wordml" xmlns:wps="http://schemas.microsoft.com/office/word/2010/wordprocessingShape" mc:Ignorable="w14 w15 w16se w16cid w16 w16cex w16sdtdh w16sdtfl w16du wp14">
+  <w:abstractNum w:abstractNumId="0" w15:restartNumberingAfterBreak="0">
+    <w:nsid w:val="5EE77BF7"/>
+    <w:multiLevelType w:val="multilevel"/>
+    <w:tmpl w:val="148481A0"/>
+    <w:lvl w:ilvl="0">
+      <w:start w:val="1"/>
+      <w:numFmt w:val="bullet"/>
+      <w:lvlText w:val=""/>
+      <w:lvlJc w:val="left"/>
+      <w:pPr>
+        <w:tabs>
+          <w:tab w:val="num" w:pos="720"/>
+        </w:tabs>
+        <w:ind w:left="720" w:hanging="360"/>
+      </w:pPr>
+      <w:rPr>
+        <w:rFonts w:ascii="Symbol" w:hAnsi="Symbol" w:hint="default"/>
+        <w:sz w:val="20"/>
+      </w:rPr>
+    </w:lvl>
+    <w:lvl w:ilvl="1" w:tentative="1">
+      <w:start w:val="1"/>
+      <w:numFmt w:val="bullet"/>
+      <w:lvlText w:val="o"/>
+      <w:lvlJc w:val="left"/>
+      <w:pPr>
+        <w:tabs>
+          <w:tab w:val="num" w:pos="1440"/>
+        </w:tabs>
+        <w:ind w:left="1440" w:hanging="360"/>
+      </w:pPr>
+      <w:rPr>
+        <w:rFonts w:ascii="Courier New" w:hAnsi="Courier New" w:hint="default"/>
+        <w:sz w:val="20"/>
+      </w:rPr>
+    </w:lvl>
+    <w:lvl w:ilvl="2" w:tentative="1">
+      <w:start w:val="1"/>
+      <w:numFmt w:val="bullet"/>
+      <w:lvlText w:val=""/>
+      <w:lvlJc w:val="left"/>
+      <w:pPr>
+        <w:tabs>
+          <w:tab w:val="num" w:pos="2160"/>
+        </w:tabs>
+        <w:ind w:left="2160" w:hanging="360"/>
+      </w:pPr>
+      <w:rPr>
+        <w:rFonts w:ascii="Wingdings" w:hAnsi="Wingdings" w:hint="default"/>
+        <w:sz w:val="20"/>
+      </w:rPr>
+    </w:lvl>
+    <w:lvl w:ilvl="3" w:tentative="1">
+      <w:start w:val="1"/>
+      <w:numFmt w:val="bullet"/>
+      <w:lvlText w:val=""/>
+      <w:lvlJc w:val="left"/>
+      <w:pPr>
+        <w:tabs>
+          <w:tab w:val="num" w:pos="2880"/>
+        </w:tabs>
+        <w:ind w:left="2880" w:hanging="360"/>
+      </w:pPr>
+      <w:rPr>
+        <w:rFonts w:ascii="Wingdings" w:hAnsi="Wingdings" w:hint="default"/>
+        <w:sz w:val="20"/>
+      </w:rPr>
+    </w:lvl>
+    <w:lvl w:ilvl="4" w:tentative="1">
+      <w:start w:val="1"/>
+      <w:numFmt w:val="bullet"/>
+      <w:lvlText w:val=""/>
+      <w:lvlJc w:val="left"/>
+      <w:pPr>
+        <w:tabs>
+          <w:tab w:val="num" w:pos="3600"/>
+        </w:tabs>
+        <w:ind w:left="3600" w:hanging="360"/>
+      </w:pPr>
+      <w:rPr>
+        <w:rFonts w:ascii="Wingdings" w:hAnsi="Wingdings" w:hint="default"/>
+        <w:sz w:val="20"/>
+      </w:rPr>
+    </w:lvl>
+    <w:lvl w:ilvl="5" w:tentative="1">
+      <w:start w:val="1"/>
+      <w:numFmt w:val="bullet"/>
+      <w:lvlText w:val=""/>
+      <w:lvlJc w:val="left"/>
+      <w:pPr>
+        <w:tabs>
+          <w:tab w:val="num" w:pos="4320"/>
+        </w:tabs>
+        <w:ind w:left="4320" w:hanging="360"/>
+      </w:pPr>
+      <w:rPr>
+        <w:rFonts w:ascii="Wingdings" w:hAnsi="Wingdings" w:hint="default"/>
+        <w:sz w:val="20"/>
+      </w:rPr>
+    </w:lvl>
+    <w:lvl w:ilvl="6" w:tentative="1">
+      <w:start w:val="1"/>
+      <w:numFmt w:val="bullet"/>
+      <w:lvlText w:val=""/>
+      <w:lvlJc w:val="left"/>
+      <w:pPr>
+        <w:tabs>
+          <w:tab w:val="num" w:pos="5040"/>
+        </w:tabs>
+        <w:ind w:left="5040" w:hanging="360"/>
+      </w:pPr>
+      <w:rPr>
+        <w:rFonts w:ascii="Wingdings" w:hAnsi="Wingdings" w:hint="default"/>
+        <w:sz w:val="20"/>
+      </w:rPr>
+    </w:lvl>
+    <w:lvl w:ilvl="7" w:tentative="1">
+      <w:start w:val="1"/>
+      <w:numFmt w:val="bullet"/>
+      <w:lvlText w:val=""/>
+      <w:lvlJc w:val="left"/>
+      <w:pPr>
+        <w:tabs>
+          <w:tab w:val="num" w:pos="5760"/>
+        </w:tabs>
+        <w:ind w:left="5760" w:hanging="360"/>
+      </w:pPr>
+      <w:rPr>
+        <w:rFonts w:ascii="Wingdings" w:hAnsi="Wingdings" w:hint="default"/>
+        <w:sz w:val="20"/>
+      </w:rPr>
+    </w:lvl>
+    <w:lvl w:ilvl="8" w:tentative="1">
+      <w:start w:val="1"/>
+      <w:numFmt w:val="bullet"/>
+      <w:lvlText w:val=""/>
+      <w:lvlJc w:val="left"/>
+      <w:pPr>
+        <w:tabs>
+          <w:tab w:val="num" w:pos="6480"/>
+        </w:tabs>
+        <w:ind w:left="6480" w:hanging="360"/>
+      </w:pPr>
+      <w:rPr>
+        <w:rFonts w:ascii="Wingdings" w:hAnsi="Wingdings" w:hint="default"/>
+        <w:sz w:val="20"/>
+      </w:rPr>
+    </w:lvl>
+  </w:abstractNum>
+  <w:num w:numId="1" w16cid:durableId="721563420">
+    <w:abstractNumId w:val="0"/>
+  </w:num>
+</w:numbering>
 </file>
 
 <file path=word/styles.xml><?xml version="1.0" encoding="utf-8"?>
@@ -8704,7 +9571,6 @@
   <w:style w:type="character" w:default="1" w:styleId="Fontepargpadro">
     <w:name w:val="Default Paragraph Font"/>
     <w:uiPriority w:val="1"/>
-    <w:semiHidden/>
     <w:unhideWhenUsed/>
   </w:style>
   <w:style w:type="table" w:default="1" w:styleId="Tabelanormal">

</xml_diff>

<commit_message>
Novas atividades de python
</commit_message>
<xml_diff>
--- a/Curso Python/Anotações sobre o Curso de Python.docx
+++ b/Curso Python/Anotações sobre o Curso de Python.docx
@@ -100,9 +100,471 @@
           <w:color w:val="000000"/>
           <w:lang w:eastAsia="pt-BR"/>
         </w:rPr>
+        <w:t>: Print(‘</w:t>
+      </w:r>
+      <w:proofErr w:type="spellStart"/>
+      <w:r>
+        <w:rPr>
+          <w:rFonts w:ascii="Calibri" w:eastAsia="Times New Roman" w:hAnsi="Calibri" w:cs="Calibri"/>
+          <w:color w:val="000000"/>
+          <w:lang w:eastAsia="pt-BR"/>
+        </w:rPr>
+        <w:t>Ola</w:t>
+      </w:r>
+      <w:proofErr w:type="spellEnd"/>
+      <w:r>
+        <w:rPr>
+          <w:rFonts w:ascii="Calibri" w:eastAsia="Times New Roman" w:hAnsi="Calibri" w:cs="Calibri"/>
+          <w:color w:val="000000"/>
+          <w:lang w:eastAsia="pt-BR"/>
+        </w:rPr>
+        <w:t xml:space="preserve"> Mundo!)</w:t>
+      </w:r>
+    </w:p>
+    <w:p>
+      <w:pPr>
+        <w:spacing w:line="240" w:lineRule="auto"/>
+        <w:rPr>
+          <w:rFonts w:ascii="Times New Roman" w:eastAsia="Times New Roman" w:hAnsi="Times New Roman" w:cs="Times New Roman"/>
+          <w:sz w:val="24"/>
+          <w:szCs w:val="24"/>
+          <w:lang w:eastAsia="pt-BR"/>
+        </w:rPr>
+      </w:pPr>
+      <w:r>
+        <w:rPr>
+          <w:rFonts w:ascii="Calibri" w:eastAsia="Times New Roman" w:hAnsi="Calibri" w:cs="Calibri"/>
+          <w:color w:val="000000"/>
+          <w:lang w:eastAsia="pt-BR"/>
+        </w:rPr>
+        <w:t>Variáveis só precisam colocar o = </w:t>
+      </w:r>
+    </w:p>
+    <w:p>
+      <w:pPr>
+        <w:spacing w:line="240" w:lineRule="auto"/>
+        <w:rPr>
+          <w:rFonts w:ascii="Times New Roman" w:eastAsia="Times New Roman" w:hAnsi="Times New Roman" w:cs="Times New Roman"/>
+          <w:sz w:val="24"/>
+          <w:szCs w:val="24"/>
+          <w:lang w:eastAsia="pt-BR"/>
+        </w:rPr>
+      </w:pPr>
+      <w:proofErr w:type="spellStart"/>
+      <w:r>
+        <w:rPr>
+          <w:rFonts w:ascii="Calibri" w:eastAsia="Times New Roman" w:hAnsi="Calibri" w:cs="Calibri"/>
+          <w:color w:val="000000"/>
+          <w:lang w:eastAsia="pt-BR"/>
+        </w:rPr>
+        <w:t>ex</w:t>
+      </w:r>
+      <w:proofErr w:type="spellEnd"/>
+      <w:r>
+        <w:rPr>
+          <w:rFonts w:ascii="Calibri" w:eastAsia="Times New Roman" w:hAnsi="Calibri" w:cs="Calibri"/>
+          <w:color w:val="000000"/>
+          <w:lang w:eastAsia="pt-BR"/>
+        </w:rPr>
+        <w:t>: a = 1</w:t>
+      </w:r>
+    </w:p>
+    <w:p>
+      <w:pPr>
+        <w:spacing w:line="240" w:lineRule="auto"/>
+        <w:rPr>
+          <w:rFonts w:ascii="Times New Roman" w:eastAsia="Times New Roman" w:hAnsi="Times New Roman" w:cs="Times New Roman"/>
+          <w:sz w:val="24"/>
+          <w:szCs w:val="24"/>
+          <w:lang w:eastAsia="pt-BR"/>
+        </w:rPr>
+      </w:pPr>
+      <w:r>
+        <w:rPr>
+          <w:rFonts w:ascii="Calibri" w:eastAsia="Times New Roman" w:hAnsi="Calibri" w:cs="Calibri"/>
+          <w:color w:val="000000"/>
+          <w:lang w:eastAsia="pt-BR"/>
+        </w:rPr>
+        <w:t xml:space="preserve">Input: serve para receber algo do usuário, </w:t>
+      </w:r>
+      <w:proofErr w:type="spellStart"/>
+      <w:r>
+        <w:rPr>
+          <w:rFonts w:ascii="Calibri" w:eastAsia="Times New Roman" w:hAnsi="Calibri" w:cs="Calibri"/>
+          <w:color w:val="000000"/>
+          <w:lang w:eastAsia="pt-BR"/>
+        </w:rPr>
+        <w:t>voce</w:t>
+      </w:r>
+      <w:proofErr w:type="spellEnd"/>
+      <w:r>
+        <w:rPr>
+          <w:rFonts w:ascii="Calibri" w:eastAsia="Times New Roman" w:hAnsi="Calibri" w:cs="Calibri"/>
+          <w:color w:val="000000"/>
+          <w:lang w:eastAsia="pt-BR"/>
+        </w:rPr>
+        <w:t xml:space="preserve"> precisa colocar o tipo que </w:t>
+      </w:r>
+      <w:proofErr w:type="spellStart"/>
+      <w:r>
+        <w:rPr>
+          <w:rFonts w:ascii="Calibri" w:eastAsia="Times New Roman" w:hAnsi="Calibri" w:cs="Calibri"/>
+          <w:color w:val="000000"/>
+          <w:lang w:eastAsia="pt-BR"/>
+        </w:rPr>
+        <w:t>ira</w:t>
+      </w:r>
+      <w:proofErr w:type="spellEnd"/>
+      <w:r>
+        <w:rPr>
+          <w:rFonts w:ascii="Calibri" w:eastAsia="Times New Roman" w:hAnsi="Calibri" w:cs="Calibri"/>
+          <w:color w:val="000000"/>
+          <w:lang w:eastAsia="pt-BR"/>
+        </w:rPr>
+        <w:t xml:space="preserve"> receber do usuário:</w:t>
+      </w:r>
+    </w:p>
+    <w:p>
+      <w:pPr>
+        <w:spacing w:line="240" w:lineRule="auto"/>
+        <w:rPr>
+          <w:rFonts w:ascii="Times New Roman" w:eastAsia="Times New Roman" w:hAnsi="Times New Roman" w:cs="Times New Roman"/>
+          <w:sz w:val="24"/>
+          <w:szCs w:val="24"/>
+          <w:lang w:eastAsia="pt-BR"/>
+        </w:rPr>
+      </w:pPr>
+      <w:proofErr w:type="spellStart"/>
+      <w:r>
+        <w:rPr>
+          <w:rFonts w:ascii="Calibri" w:eastAsia="Times New Roman" w:hAnsi="Calibri" w:cs="Calibri"/>
+          <w:color w:val="000000"/>
+          <w:lang w:eastAsia="pt-BR"/>
+        </w:rPr>
+        <w:t>ex</w:t>
+      </w:r>
+      <w:proofErr w:type="spellEnd"/>
+      <w:r>
+        <w:rPr>
+          <w:rFonts w:ascii="Calibri" w:eastAsia="Times New Roman" w:hAnsi="Calibri" w:cs="Calibri"/>
+          <w:color w:val="000000"/>
+          <w:lang w:eastAsia="pt-BR"/>
+        </w:rPr>
+        <w:t xml:space="preserve">: n1 = </w:t>
+      </w:r>
+      <w:proofErr w:type="spellStart"/>
+      <w:r>
+        <w:rPr>
+          <w:rFonts w:ascii="Calibri" w:eastAsia="Times New Roman" w:hAnsi="Calibri" w:cs="Calibri"/>
+          <w:color w:val="000000"/>
+          <w:lang w:eastAsia="pt-BR"/>
+        </w:rPr>
+        <w:t>int</w:t>
+      </w:r>
+      <w:proofErr w:type="spellEnd"/>
+      <w:r>
+        <w:rPr>
+          <w:rFonts w:ascii="Calibri" w:eastAsia="Times New Roman" w:hAnsi="Calibri" w:cs="Calibri"/>
+          <w:color w:val="000000"/>
+          <w:lang w:eastAsia="pt-BR"/>
+        </w:rPr>
+        <w:t>(input(‘Digite um número’) </w:t>
+      </w:r>
+    </w:p>
+    <w:p>
+      <w:pPr>
+        <w:spacing w:line="240" w:lineRule="auto"/>
+        <w:rPr>
+          <w:rFonts w:ascii="Times New Roman" w:eastAsia="Times New Roman" w:hAnsi="Times New Roman" w:cs="Times New Roman"/>
+          <w:sz w:val="24"/>
+          <w:szCs w:val="24"/>
+          <w:lang w:eastAsia="pt-BR"/>
+        </w:rPr>
+      </w:pPr>
+      <w:r>
+        <w:rPr>
+          <w:rFonts w:ascii="Calibri" w:eastAsia="Times New Roman" w:hAnsi="Calibri" w:cs="Calibri"/>
+          <w:color w:val="000000"/>
+          <w:lang w:eastAsia="pt-BR"/>
+        </w:rPr>
+        <w:t xml:space="preserve">Pode se criar </w:t>
+      </w:r>
+      <w:proofErr w:type="spellStart"/>
+      <w:r>
+        <w:rPr>
+          <w:rFonts w:ascii="Calibri" w:eastAsia="Times New Roman" w:hAnsi="Calibri" w:cs="Calibri"/>
+          <w:color w:val="000000"/>
+          <w:lang w:eastAsia="pt-BR"/>
+        </w:rPr>
+        <w:t>scrips</w:t>
+      </w:r>
+      <w:proofErr w:type="spellEnd"/>
+      <w:r>
+        <w:rPr>
+          <w:rFonts w:ascii="Calibri" w:eastAsia="Times New Roman" w:hAnsi="Calibri" w:cs="Calibri"/>
+          <w:color w:val="000000"/>
+          <w:lang w:eastAsia="pt-BR"/>
+        </w:rPr>
+        <w:t xml:space="preserve"> para deixar uma programação </w:t>
+      </w:r>
+      <w:proofErr w:type="spellStart"/>
+      <w:r>
+        <w:rPr>
+          <w:rFonts w:ascii="Calibri" w:eastAsia="Times New Roman" w:hAnsi="Calibri" w:cs="Calibri"/>
+          <w:color w:val="000000"/>
+          <w:lang w:eastAsia="pt-BR"/>
+        </w:rPr>
+        <w:t>pré</w:t>
+      </w:r>
+      <w:proofErr w:type="spellEnd"/>
+      <w:r>
+        <w:rPr>
+          <w:rFonts w:ascii="Calibri" w:eastAsia="Times New Roman" w:hAnsi="Calibri" w:cs="Calibri"/>
+          <w:color w:val="000000"/>
+          <w:lang w:eastAsia="pt-BR"/>
+        </w:rPr>
+        <w:t xml:space="preserve"> definida</w:t>
+      </w:r>
+    </w:p>
+    <w:p>
+      <w:pPr>
+        <w:spacing w:line="240" w:lineRule="auto"/>
+        <w:rPr>
+          <w:rFonts w:ascii="Times New Roman" w:eastAsia="Times New Roman" w:hAnsi="Times New Roman" w:cs="Times New Roman"/>
+          <w:sz w:val="24"/>
+          <w:szCs w:val="24"/>
+          <w:lang w:eastAsia="pt-BR"/>
+        </w:rPr>
+      </w:pPr>
+      <w:r>
+        <w:rPr>
+          <w:rFonts w:ascii="Calibri" w:eastAsia="Times New Roman" w:hAnsi="Calibri" w:cs="Calibri"/>
+          <w:color w:val="000000"/>
+          <w:lang w:eastAsia="pt-BR"/>
+        </w:rPr>
+        <w:t xml:space="preserve">Para descobrir o tipo de caractere pasta usar o </w:t>
+      </w:r>
+      <w:proofErr w:type="spellStart"/>
+      <w:r>
+        <w:rPr>
+          <w:rFonts w:ascii="Calibri" w:eastAsia="Times New Roman" w:hAnsi="Calibri" w:cs="Calibri"/>
+          <w:color w:val="000000"/>
+          <w:lang w:eastAsia="pt-BR"/>
+        </w:rPr>
+        <w:t>Type</w:t>
+      </w:r>
+      <w:proofErr w:type="spellEnd"/>
+    </w:p>
+    <w:p>
+      <w:pPr>
+        <w:spacing w:line="240" w:lineRule="auto"/>
+        <w:rPr>
+          <w:rFonts w:ascii="Times New Roman" w:eastAsia="Times New Roman" w:hAnsi="Times New Roman" w:cs="Times New Roman"/>
+          <w:sz w:val="24"/>
+          <w:szCs w:val="24"/>
+          <w:lang w:eastAsia="pt-BR"/>
+        </w:rPr>
+      </w:pPr>
+      <w:proofErr w:type="spellStart"/>
+      <w:r>
+        <w:rPr>
+          <w:rFonts w:ascii="Calibri" w:eastAsia="Times New Roman" w:hAnsi="Calibri" w:cs="Calibri"/>
+          <w:color w:val="000000"/>
+          <w:lang w:eastAsia="pt-BR"/>
+        </w:rPr>
+        <w:t>ex</w:t>
+      </w:r>
+      <w:proofErr w:type="spellEnd"/>
+      <w:r>
+        <w:rPr>
+          <w:rFonts w:ascii="Calibri" w:eastAsia="Times New Roman" w:hAnsi="Calibri" w:cs="Calibri"/>
+          <w:color w:val="000000"/>
+          <w:lang w:eastAsia="pt-BR"/>
+        </w:rPr>
         <w:t xml:space="preserve">: </w:t>
       </w:r>
-      <w:proofErr w:type="gramStart"/>
+      <w:proofErr w:type="spellStart"/>
+      <w:r>
+        <w:rPr>
+          <w:rFonts w:ascii="Calibri" w:eastAsia="Times New Roman" w:hAnsi="Calibri" w:cs="Calibri"/>
+          <w:color w:val="000000"/>
+          <w:lang w:eastAsia="pt-BR"/>
+        </w:rPr>
+        <w:t>type</w:t>
+      </w:r>
+      <w:proofErr w:type="spellEnd"/>
+      <w:r>
+        <w:rPr>
+          <w:rFonts w:ascii="Calibri" w:eastAsia="Times New Roman" w:hAnsi="Calibri" w:cs="Calibri"/>
+          <w:color w:val="000000"/>
+          <w:lang w:eastAsia="pt-BR"/>
+        </w:rPr>
+        <w:t>(</w:t>
+      </w:r>
+      <w:proofErr w:type="spellStart"/>
+      <w:r>
+        <w:rPr>
+          <w:rFonts w:ascii="Calibri" w:eastAsia="Times New Roman" w:hAnsi="Calibri" w:cs="Calibri"/>
+          <w:color w:val="000000"/>
+          <w:lang w:eastAsia="pt-BR"/>
+        </w:rPr>
+        <w:t>n.isalnum</w:t>
+      </w:r>
+      <w:proofErr w:type="spellEnd"/>
+      <w:r>
+        <w:rPr>
+          <w:rFonts w:ascii="Calibri" w:eastAsia="Times New Roman" w:hAnsi="Calibri" w:cs="Calibri"/>
+          <w:color w:val="000000"/>
+          <w:lang w:eastAsia="pt-BR"/>
+        </w:rPr>
+        <w:t>())</w:t>
+      </w:r>
+    </w:p>
+    <w:p>
+      <w:pPr>
+        <w:spacing w:line="240" w:lineRule="auto"/>
+        <w:rPr>
+          <w:rFonts w:ascii="Times New Roman" w:eastAsia="Times New Roman" w:hAnsi="Times New Roman" w:cs="Times New Roman"/>
+          <w:sz w:val="24"/>
+          <w:szCs w:val="24"/>
+          <w:lang w:eastAsia="pt-BR"/>
+        </w:rPr>
+      </w:pPr>
+      <w:r>
+        <w:rPr>
+          <w:rFonts w:ascii="Calibri" w:eastAsia="Times New Roman" w:hAnsi="Calibri" w:cs="Calibri"/>
+          <w:color w:val="000000"/>
+          <w:lang w:eastAsia="pt-BR"/>
+        </w:rPr>
+        <w:t xml:space="preserve">O </w:t>
+      </w:r>
+      <w:proofErr w:type="spellStart"/>
+      <w:r>
+        <w:rPr>
+          <w:rFonts w:ascii="Calibri" w:eastAsia="Times New Roman" w:hAnsi="Calibri" w:cs="Calibri"/>
+          <w:color w:val="000000"/>
+          <w:lang w:eastAsia="pt-BR"/>
+        </w:rPr>
+        <w:t>isalnum</w:t>
+      </w:r>
+      <w:proofErr w:type="spellEnd"/>
+      <w:r>
+        <w:rPr>
+          <w:rFonts w:ascii="Calibri" w:eastAsia="Times New Roman" w:hAnsi="Calibri" w:cs="Calibri"/>
+          <w:color w:val="000000"/>
+          <w:lang w:eastAsia="pt-BR"/>
+        </w:rPr>
+        <w:t xml:space="preserve">()método retornará </w:t>
+      </w:r>
+      <w:proofErr w:type="spellStart"/>
+      <w:r>
+        <w:rPr>
+          <w:rFonts w:ascii="Calibri" w:eastAsia="Times New Roman" w:hAnsi="Calibri" w:cs="Calibri"/>
+          <w:color w:val="000000"/>
+          <w:lang w:eastAsia="pt-BR"/>
+        </w:rPr>
+        <w:t>True</w:t>
+      </w:r>
+      <w:proofErr w:type="spellEnd"/>
+      <w:r>
+        <w:rPr>
+          <w:rFonts w:ascii="Calibri" w:eastAsia="Times New Roman" w:hAnsi="Calibri" w:cs="Calibri"/>
+          <w:color w:val="000000"/>
+          <w:lang w:eastAsia="pt-BR"/>
+        </w:rPr>
+        <w:t xml:space="preserve"> se todos os caracteres forem alfanuméricos, ou seja, letra do alfabeto (az) e números (0-9).</w:t>
+      </w:r>
+    </w:p>
+    <w:p>
+      <w:pPr>
+        <w:spacing w:line="240" w:lineRule="auto"/>
+        <w:rPr>
+          <w:rFonts w:ascii="Times New Roman" w:eastAsia="Times New Roman" w:hAnsi="Times New Roman" w:cs="Times New Roman"/>
+          <w:sz w:val="24"/>
+          <w:szCs w:val="24"/>
+          <w:lang w:eastAsia="pt-BR"/>
+        </w:rPr>
+      </w:pPr>
+      <w:r>
+        <w:rPr>
+          <w:rFonts w:ascii="Calibri" w:eastAsia="Times New Roman" w:hAnsi="Calibri" w:cs="Calibri"/>
+          <w:color w:val="000000"/>
+          <w:lang w:eastAsia="pt-BR"/>
+        </w:rPr>
+        <w:t>Exemplo de caracteres que não são alfanuméricos: (espaço)!#%&amp;? etc.</w:t>
+      </w:r>
+    </w:p>
+    <w:p>
+      <w:pPr>
+        <w:spacing w:line="240" w:lineRule="auto"/>
+        <w:rPr>
+          <w:rFonts w:ascii="Calibri" w:eastAsia="Times New Roman" w:hAnsi="Calibri" w:cs="Calibri"/>
+          <w:color w:val="000000"/>
+          <w:lang w:eastAsia="pt-BR"/>
+        </w:rPr>
+      </w:pPr>
+      <w:r>
+        <w:rPr>
+          <w:rFonts w:ascii="Calibri" w:eastAsia="Times New Roman" w:hAnsi="Calibri" w:cs="Calibri"/>
+          <w:color w:val="000000"/>
+          <w:lang w:eastAsia="pt-BR"/>
+        </w:rPr>
+        <w:t> </w:t>
+      </w:r>
+      <w:r>
+        <w:rPr>
+          <w:rFonts w:ascii="Calibri" w:eastAsia="Times New Roman" w:hAnsi="Calibri" w:cs="Calibri"/>
+          <w:color w:val="000000"/>
+          <w:lang w:eastAsia="pt-BR"/>
+        </w:rPr>
+        <w:t xml:space="preserve">Print </w:t>
+      </w:r>
+      <w:proofErr w:type="spellStart"/>
+      <w:r>
+        <w:rPr>
+          <w:rFonts w:ascii="Calibri" w:eastAsia="Times New Roman" w:hAnsi="Calibri" w:cs="Calibri"/>
+          <w:color w:val="000000"/>
+          <w:lang w:eastAsia="pt-BR"/>
+        </w:rPr>
+        <w:t>isalpha</w:t>
+      </w:r>
+      <w:proofErr w:type="spellEnd"/>
+      <w:r>
+        <w:rPr>
+          <w:rFonts w:ascii="Calibri" w:eastAsia="Times New Roman" w:hAnsi="Calibri" w:cs="Calibri"/>
+          <w:color w:val="000000"/>
+          <w:lang w:eastAsia="pt-BR"/>
+        </w:rPr>
+        <w:t xml:space="preserve">() é pra saber se é </w:t>
+      </w:r>
+      <w:proofErr w:type="spellStart"/>
+      <w:r>
+        <w:rPr>
+          <w:rFonts w:ascii="Calibri" w:eastAsia="Times New Roman" w:hAnsi="Calibri" w:cs="Calibri"/>
+          <w:color w:val="000000"/>
+          <w:lang w:eastAsia="pt-BR"/>
+        </w:rPr>
+        <w:t>string</w:t>
+      </w:r>
+      <w:proofErr w:type="spellEnd"/>
+      <w:r>
+        <w:rPr>
+          <w:rFonts w:ascii="Calibri" w:eastAsia="Times New Roman" w:hAnsi="Calibri" w:cs="Calibri"/>
+          <w:color w:val="000000"/>
+          <w:lang w:eastAsia="pt-BR"/>
+        </w:rPr>
+        <w:t xml:space="preserve"> </w:t>
+      </w:r>
+    </w:p>
+    <w:p>
+      <w:pPr>
+        <w:spacing w:line="240" w:lineRule="auto"/>
+        <w:rPr>
+          <w:rFonts w:ascii="Calibri" w:eastAsia="Times New Roman" w:hAnsi="Calibri" w:cs="Calibri"/>
+          <w:color w:val="000000"/>
+          <w:lang w:eastAsia="pt-BR"/>
+        </w:rPr>
+      </w:pPr>
       <w:r>
         <w:rPr>
           <w:rFonts w:ascii="Calibri" w:eastAsia="Times New Roman" w:hAnsi="Calibri" w:cs="Calibri"/>
@@ -111,558 +573,7 @@
         </w:rPr>
         <w:t>Print(</w:t>
       </w:r>
-      <w:proofErr w:type="gramEnd"/>
-      <w:r>
-        <w:rPr>
-          <w:rFonts w:ascii="Calibri" w:eastAsia="Times New Roman" w:hAnsi="Calibri" w:cs="Calibri"/>
-          <w:color w:val="000000"/>
-          <w:lang w:eastAsia="pt-BR"/>
-        </w:rPr>
-        <w:t>‘</w:t>
-      </w:r>
-      <w:proofErr w:type="spellStart"/>
-      <w:r>
-        <w:rPr>
-          <w:rFonts w:ascii="Calibri" w:eastAsia="Times New Roman" w:hAnsi="Calibri" w:cs="Calibri"/>
-          <w:color w:val="000000"/>
-          <w:lang w:eastAsia="pt-BR"/>
-        </w:rPr>
-        <w:t>Ola</w:t>
-      </w:r>
-      <w:proofErr w:type="spellEnd"/>
-      <w:r>
-        <w:rPr>
-          <w:rFonts w:ascii="Calibri" w:eastAsia="Times New Roman" w:hAnsi="Calibri" w:cs="Calibri"/>
-          <w:color w:val="000000"/>
-          <w:lang w:eastAsia="pt-BR"/>
-        </w:rPr>
-        <w:t xml:space="preserve"> Mundo!)</w:t>
-      </w:r>
-    </w:p>
-    <w:p>
-      <w:pPr>
-        <w:spacing w:line="240" w:lineRule="auto"/>
-        <w:rPr>
-          <w:rFonts w:ascii="Times New Roman" w:eastAsia="Times New Roman" w:hAnsi="Times New Roman" w:cs="Times New Roman"/>
-          <w:sz w:val="24"/>
-          <w:szCs w:val="24"/>
-          <w:lang w:eastAsia="pt-BR"/>
-        </w:rPr>
-      </w:pPr>
-      <w:r>
-        <w:rPr>
-          <w:rFonts w:ascii="Calibri" w:eastAsia="Times New Roman" w:hAnsi="Calibri" w:cs="Calibri"/>
-          <w:color w:val="000000"/>
-          <w:lang w:eastAsia="pt-BR"/>
-        </w:rPr>
-        <w:t>Variáveis só precisam colocar o = </w:t>
-      </w:r>
-    </w:p>
-    <w:p>
-      <w:pPr>
-        <w:spacing w:line="240" w:lineRule="auto"/>
-        <w:rPr>
-          <w:rFonts w:ascii="Times New Roman" w:eastAsia="Times New Roman" w:hAnsi="Times New Roman" w:cs="Times New Roman"/>
-          <w:sz w:val="24"/>
-          <w:szCs w:val="24"/>
-          <w:lang w:eastAsia="pt-BR"/>
-        </w:rPr>
-      </w:pPr>
-      <w:proofErr w:type="spellStart"/>
-      <w:r>
-        <w:rPr>
-          <w:rFonts w:ascii="Calibri" w:eastAsia="Times New Roman" w:hAnsi="Calibri" w:cs="Calibri"/>
-          <w:color w:val="000000"/>
-          <w:lang w:eastAsia="pt-BR"/>
-        </w:rPr>
-        <w:t>ex</w:t>
-      </w:r>
-      <w:proofErr w:type="spellEnd"/>
-      <w:r>
-        <w:rPr>
-          <w:rFonts w:ascii="Calibri" w:eastAsia="Times New Roman" w:hAnsi="Calibri" w:cs="Calibri"/>
-          <w:color w:val="000000"/>
-          <w:lang w:eastAsia="pt-BR"/>
-        </w:rPr>
-        <w:t>: a = 1</w:t>
-      </w:r>
-    </w:p>
-    <w:p>
-      <w:pPr>
-        <w:spacing w:line="240" w:lineRule="auto"/>
-        <w:rPr>
-          <w:rFonts w:ascii="Times New Roman" w:eastAsia="Times New Roman" w:hAnsi="Times New Roman" w:cs="Times New Roman"/>
-          <w:sz w:val="24"/>
-          <w:szCs w:val="24"/>
-          <w:lang w:eastAsia="pt-BR"/>
-        </w:rPr>
-      </w:pPr>
-      <w:r>
-        <w:rPr>
-          <w:rFonts w:ascii="Calibri" w:eastAsia="Times New Roman" w:hAnsi="Calibri" w:cs="Calibri"/>
-          <w:color w:val="000000"/>
-          <w:lang w:eastAsia="pt-BR"/>
-        </w:rPr>
-        <w:t xml:space="preserve">Input: serve para receber algo do usuário, </w:t>
-      </w:r>
-      <w:proofErr w:type="spellStart"/>
-      <w:r>
-        <w:rPr>
-          <w:rFonts w:ascii="Calibri" w:eastAsia="Times New Roman" w:hAnsi="Calibri" w:cs="Calibri"/>
-          <w:color w:val="000000"/>
-          <w:lang w:eastAsia="pt-BR"/>
-        </w:rPr>
-        <w:t>voce</w:t>
-      </w:r>
-      <w:proofErr w:type="spellEnd"/>
-      <w:r>
-        <w:rPr>
-          <w:rFonts w:ascii="Calibri" w:eastAsia="Times New Roman" w:hAnsi="Calibri" w:cs="Calibri"/>
-          <w:color w:val="000000"/>
-          <w:lang w:eastAsia="pt-BR"/>
-        </w:rPr>
-        <w:t xml:space="preserve"> precisa colocar o tipo que </w:t>
-      </w:r>
-      <w:proofErr w:type="spellStart"/>
-      <w:proofErr w:type="gramStart"/>
-      <w:r>
-        <w:rPr>
-          <w:rFonts w:ascii="Calibri" w:eastAsia="Times New Roman" w:hAnsi="Calibri" w:cs="Calibri"/>
-          <w:color w:val="000000"/>
-          <w:lang w:eastAsia="pt-BR"/>
-        </w:rPr>
-        <w:t>ira</w:t>
-      </w:r>
-      <w:proofErr w:type="spellEnd"/>
-      <w:proofErr w:type="gramEnd"/>
-      <w:r>
-        <w:rPr>
-          <w:rFonts w:ascii="Calibri" w:eastAsia="Times New Roman" w:hAnsi="Calibri" w:cs="Calibri"/>
-          <w:color w:val="000000"/>
-          <w:lang w:eastAsia="pt-BR"/>
-        </w:rPr>
-        <w:t xml:space="preserve"> receber do usuário:</w:t>
-      </w:r>
-    </w:p>
-    <w:p>
-      <w:pPr>
-        <w:spacing w:line="240" w:lineRule="auto"/>
-        <w:rPr>
-          <w:rFonts w:ascii="Times New Roman" w:eastAsia="Times New Roman" w:hAnsi="Times New Roman" w:cs="Times New Roman"/>
-          <w:sz w:val="24"/>
-          <w:szCs w:val="24"/>
-          <w:lang w:eastAsia="pt-BR"/>
-        </w:rPr>
-      </w:pPr>
-      <w:proofErr w:type="spellStart"/>
-      <w:r>
-        <w:rPr>
-          <w:rFonts w:ascii="Calibri" w:eastAsia="Times New Roman" w:hAnsi="Calibri" w:cs="Calibri"/>
-          <w:color w:val="000000"/>
-          <w:lang w:eastAsia="pt-BR"/>
-        </w:rPr>
-        <w:t>ex</w:t>
-      </w:r>
-      <w:proofErr w:type="spellEnd"/>
-      <w:r>
-        <w:rPr>
-          <w:rFonts w:ascii="Calibri" w:eastAsia="Times New Roman" w:hAnsi="Calibri" w:cs="Calibri"/>
-          <w:color w:val="000000"/>
-          <w:lang w:eastAsia="pt-BR"/>
-        </w:rPr>
-        <w:t xml:space="preserve">: n1 = </w:t>
-      </w:r>
-      <w:proofErr w:type="spellStart"/>
-      <w:proofErr w:type="gramStart"/>
-      <w:r>
-        <w:rPr>
-          <w:rFonts w:ascii="Calibri" w:eastAsia="Times New Roman" w:hAnsi="Calibri" w:cs="Calibri"/>
-          <w:color w:val="000000"/>
-          <w:lang w:eastAsia="pt-BR"/>
-        </w:rPr>
-        <w:t>int</w:t>
-      </w:r>
-      <w:proofErr w:type="spellEnd"/>
-      <w:r>
-        <w:rPr>
-          <w:rFonts w:ascii="Calibri" w:eastAsia="Times New Roman" w:hAnsi="Calibri" w:cs="Calibri"/>
-          <w:color w:val="000000"/>
-          <w:lang w:eastAsia="pt-BR"/>
-        </w:rPr>
-        <w:t>(input(</w:t>
-      </w:r>
-      <w:proofErr w:type="gramEnd"/>
-      <w:r>
-        <w:rPr>
-          <w:rFonts w:ascii="Calibri" w:eastAsia="Times New Roman" w:hAnsi="Calibri" w:cs="Calibri"/>
-          <w:color w:val="000000"/>
-          <w:lang w:eastAsia="pt-BR"/>
-        </w:rPr>
-        <w:t>‘Digite um número’) </w:t>
-      </w:r>
-    </w:p>
-    <w:p>
-      <w:pPr>
-        <w:spacing w:line="240" w:lineRule="auto"/>
-        <w:rPr>
-          <w:rFonts w:ascii="Times New Roman" w:eastAsia="Times New Roman" w:hAnsi="Times New Roman" w:cs="Times New Roman"/>
-          <w:sz w:val="24"/>
-          <w:szCs w:val="24"/>
-          <w:lang w:eastAsia="pt-BR"/>
-        </w:rPr>
-      </w:pPr>
-      <w:r>
-        <w:rPr>
-          <w:rFonts w:ascii="Calibri" w:eastAsia="Times New Roman" w:hAnsi="Calibri" w:cs="Calibri"/>
-          <w:color w:val="000000"/>
-          <w:lang w:eastAsia="pt-BR"/>
-        </w:rPr>
-        <w:t xml:space="preserve">Pode se criar </w:t>
-      </w:r>
-      <w:proofErr w:type="spellStart"/>
-      <w:r>
-        <w:rPr>
-          <w:rFonts w:ascii="Calibri" w:eastAsia="Times New Roman" w:hAnsi="Calibri" w:cs="Calibri"/>
-          <w:color w:val="000000"/>
-          <w:lang w:eastAsia="pt-BR"/>
-        </w:rPr>
-        <w:t>scrips</w:t>
-      </w:r>
-      <w:proofErr w:type="spellEnd"/>
-      <w:r>
-        <w:rPr>
-          <w:rFonts w:ascii="Calibri" w:eastAsia="Times New Roman" w:hAnsi="Calibri" w:cs="Calibri"/>
-          <w:color w:val="000000"/>
-          <w:lang w:eastAsia="pt-BR"/>
-        </w:rPr>
-        <w:t xml:space="preserve"> para deixar uma programação </w:t>
-      </w:r>
-      <w:proofErr w:type="spellStart"/>
-      <w:r>
-        <w:rPr>
-          <w:rFonts w:ascii="Calibri" w:eastAsia="Times New Roman" w:hAnsi="Calibri" w:cs="Calibri"/>
-          <w:color w:val="000000"/>
-          <w:lang w:eastAsia="pt-BR"/>
-        </w:rPr>
-        <w:t>pré</w:t>
-      </w:r>
-      <w:proofErr w:type="spellEnd"/>
-      <w:r>
-        <w:rPr>
-          <w:rFonts w:ascii="Calibri" w:eastAsia="Times New Roman" w:hAnsi="Calibri" w:cs="Calibri"/>
-          <w:color w:val="000000"/>
-          <w:lang w:eastAsia="pt-BR"/>
-        </w:rPr>
-        <w:t xml:space="preserve"> definida</w:t>
-      </w:r>
-    </w:p>
-    <w:p>
-      <w:pPr>
-        <w:spacing w:line="240" w:lineRule="auto"/>
-        <w:rPr>
-          <w:rFonts w:ascii="Times New Roman" w:eastAsia="Times New Roman" w:hAnsi="Times New Roman" w:cs="Times New Roman"/>
-          <w:sz w:val="24"/>
-          <w:szCs w:val="24"/>
-          <w:lang w:eastAsia="pt-BR"/>
-        </w:rPr>
-      </w:pPr>
-      <w:r>
-        <w:rPr>
-          <w:rFonts w:ascii="Calibri" w:eastAsia="Times New Roman" w:hAnsi="Calibri" w:cs="Calibri"/>
-          <w:color w:val="000000"/>
-          <w:lang w:eastAsia="pt-BR"/>
-        </w:rPr>
-        <w:t xml:space="preserve">Para descobrir o tipo de caractere pasta usar o </w:t>
-      </w:r>
-      <w:proofErr w:type="spellStart"/>
-      <w:r>
-        <w:rPr>
-          <w:rFonts w:ascii="Calibri" w:eastAsia="Times New Roman" w:hAnsi="Calibri" w:cs="Calibri"/>
-          <w:color w:val="000000"/>
-          <w:lang w:eastAsia="pt-BR"/>
-        </w:rPr>
-        <w:t>Type</w:t>
-      </w:r>
-      <w:proofErr w:type="spellEnd"/>
-    </w:p>
-    <w:p>
-      <w:pPr>
-        <w:spacing w:line="240" w:lineRule="auto"/>
-        <w:rPr>
-          <w:rFonts w:ascii="Times New Roman" w:eastAsia="Times New Roman" w:hAnsi="Times New Roman" w:cs="Times New Roman"/>
-          <w:sz w:val="24"/>
-          <w:szCs w:val="24"/>
-          <w:lang w:eastAsia="pt-BR"/>
-        </w:rPr>
-      </w:pPr>
-      <w:proofErr w:type="spellStart"/>
-      <w:r>
-        <w:rPr>
-          <w:rFonts w:ascii="Calibri" w:eastAsia="Times New Roman" w:hAnsi="Calibri" w:cs="Calibri"/>
-          <w:color w:val="000000"/>
-          <w:lang w:eastAsia="pt-BR"/>
-        </w:rPr>
-        <w:t>ex</w:t>
-      </w:r>
-      <w:proofErr w:type="spellEnd"/>
-      <w:r>
-        <w:rPr>
-          <w:rFonts w:ascii="Calibri" w:eastAsia="Times New Roman" w:hAnsi="Calibri" w:cs="Calibri"/>
-          <w:color w:val="000000"/>
-          <w:lang w:eastAsia="pt-BR"/>
-        </w:rPr>
-        <w:t xml:space="preserve">: </w:t>
-      </w:r>
-      <w:proofErr w:type="spellStart"/>
-      <w:r>
-        <w:rPr>
-          <w:rFonts w:ascii="Calibri" w:eastAsia="Times New Roman" w:hAnsi="Calibri" w:cs="Calibri"/>
-          <w:color w:val="000000"/>
-          <w:lang w:eastAsia="pt-BR"/>
-        </w:rPr>
-        <w:t>type</w:t>
-      </w:r>
-      <w:proofErr w:type="spellEnd"/>
-      <w:r>
-        <w:rPr>
-          <w:rFonts w:ascii="Calibri" w:eastAsia="Times New Roman" w:hAnsi="Calibri" w:cs="Calibri"/>
-          <w:color w:val="000000"/>
-          <w:lang w:eastAsia="pt-BR"/>
-        </w:rPr>
-        <w:t>(</w:t>
-      </w:r>
-      <w:proofErr w:type="spellStart"/>
-      <w:proofErr w:type="gramStart"/>
-      <w:r>
-        <w:rPr>
-          <w:rFonts w:ascii="Calibri" w:eastAsia="Times New Roman" w:hAnsi="Calibri" w:cs="Calibri"/>
-          <w:color w:val="000000"/>
-          <w:lang w:eastAsia="pt-BR"/>
-        </w:rPr>
-        <w:t>n.isalnum</w:t>
-      </w:r>
-      <w:proofErr w:type="spellEnd"/>
-      <w:proofErr w:type="gramEnd"/>
-      <w:r>
-        <w:rPr>
-          <w:rFonts w:ascii="Calibri" w:eastAsia="Times New Roman" w:hAnsi="Calibri" w:cs="Calibri"/>
-          <w:color w:val="000000"/>
-          <w:lang w:eastAsia="pt-BR"/>
-        </w:rPr>
-        <w:t>())</w:t>
-      </w:r>
-    </w:p>
-    <w:p>
-      <w:pPr>
-        <w:spacing w:line="240" w:lineRule="auto"/>
-        <w:rPr>
-          <w:rFonts w:ascii="Times New Roman" w:eastAsia="Times New Roman" w:hAnsi="Times New Roman" w:cs="Times New Roman"/>
-          <w:sz w:val="24"/>
-          <w:szCs w:val="24"/>
-          <w:lang w:eastAsia="pt-BR"/>
-        </w:rPr>
-      </w:pPr>
-      <w:r>
-        <w:rPr>
-          <w:rFonts w:ascii="Calibri" w:eastAsia="Times New Roman" w:hAnsi="Calibri" w:cs="Calibri"/>
-          <w:color w:val="000000"/>
-          <w:lang w:eastAsia="pt-BR"/>
-        </w:rPr>
-        <w:t xml:space="preserve">O </w:t>
-      </w:r>
-      <w:proofErr w:type="spellStart"/>
-      <w:proofErr w:type="gramStart"/>
-      <w:r>
-        <w:rPr>
-          <w:rFonts w:ascii="Calibri" w:eastAsia="Times New Roman" w:hAnsi="Calibri" w:cs="Calibri"/>
-          <w:color w:val="000000"/>
-          <w:lang w:eastAsia="pt-BR"/>
-        </w:rPr>
-        <w:t>isalnum</w:t>
-      </w:r>
-      <w:proofErr w:type="spellEnd"/>
-      <w:r>
-        <w:rPr>
-          <w:rFonts w:ascii="Calibri" w:eastAsia="Times New Roman" w:hAnsi="Calibri" w:cs="Calibri"/>
-          <w:color w:val="000000"/>
-          <w:lang w:eastAsia="pt-BR"/>
-        </w:rPr>
-        <w:t>(</w:t>
-      </w:r>
-      <w:proofErr w:type="gramEnd"/>
-      <w:r>
-        <w:rPr>
-          <w:rFonts w:ascii="Calibri" w:eastAsia="Times New Roman" w:hAnsi="Calibri" w:cs="Calibri"/>
-          <w:color w:val="000000"/>
-          <w:lang w:eastAsia="pt-BR"/>
-        </w:rPr>
-        <w:t xml:space="preserve">)método retornará </w:t>
-      </w:r>
-      <w:proofErr w:type="spellStart"/>
-      <w:r>
-        <w:rPr>
-          <w:rFonts w:ascii="Calibri" w:eastAsia="Times New Roman" w:hAnsi="Calibri" w:cs="Calibri"/>
-          <w:color w:val="000000"/>
-          <w:lang w:eastAsia="pt-BR"/>
-        </w:rPr>
-        <w:t>True</w:t>
-      </w:r>
-      <w:proofErr w:type="spellEnd"/>
-      <w:r>
-        <w:rPr>
-          <w:rFonts w:ascii="Calibri" w:eastAsia="Times New Roman" w:hAnsi="Calibri" w:cs="Calibri"/>
-          <w:color w:val="000000"/>
-          <w:lang w:eastAsia="pt-BR"/>
-        </w:rPr>
-        <w:t xml:space="preserve"> se todos os caracteres forem alfanuméricos, ou seja, letra do alfabeto (az) e números (0-9).</w:t>
-      </w:r>
-    </w:p>
-    <w:p>
-      <w:pPr>
-        <w:spacing w:line="240" w:lineRule="auto"/>
-        <w:rPr>
-          <w:rFonts w:ascii="Times New Roman" w:eastAsia="Times New Roman" w:hAnsi="Times New Roman" w:cs="Times New Roman"/>
-          <w:sz w:val="24"/>
-          <w:szCs w:val="24"/>
-          <w:lang w:eastAsia="pt-BR"/>
-        </w:rPr>
-      </w:pPr>
-      <w:r>
-        <w:rPr>
-          <w:rFonts w:ascii="Calibri" w:eastAsia="Times New Roman" w:hAnsi="Calibri" w:cs="Calibri"/>
-          <w:color w:val="000000"/>
-          <w:lang w:eastAsia="pt-BR"/>
-        </w:rPr>
-        <w:t>Exemplo de caracteres que não são alfanuméricos: (espaço</w:t>
-      </w:r>
-      <w:proofErr w:type="gramStart"/>
-      <w:r>
-        <w:rPr>
-          <w:rFonts w:ascii="Calibri" w:eastAsia="Times New Roman" w:hAnsi="Calibri" w:cs="Calibri"/>
-          <w:color w:val="000000"/>
-          <w:lang w:eastAsia="pt-BR"/>
-        </w:rPr>
-        <w:t>)!#</w:t>
-      </w:r>
-      <w:proofErr w:type="gramEnd"/>
-      <w:r>
-        <w:rPr>
-          <w:rFonts w:ascii="Calibri" w:eastAsia="Times New Roman" w:hAnsi="Calibri" w:cs="Calibri"/>
-          <w:color w:val="000000"/>
-          <w:lang w:eastAsia="pt-BR"/>
-        </w:rPr>
-        <w:t>%&amp;? etc.</w:t>
-      </w:r>
-    </w:p>
-    <w:p>
-      <w:pPr>
-        <w:spacing w:line="240" w:lineRule="auto"/>
-        <w:rPr>
-          <w:rFonts w:ascii="Calibri" w:eastAsia="Times New Roman" w:hAnsi="Calibri" w:cs="Calibri"/>
-          <w:color w:val="000000"/>
-          <w:lang w:eastAsia="pt-BR"/>
-        </w:rPr>
-      </w:pPr>
-      <w:r>
-        <w:rPr>
-          <w:rFonts w:ascii="Calibri" w:eastAsia="Times New Roman" w:hAnsi="Calibri" w:cs="Calibri"/>
-          <w:color w:val="000000"/>
-          <w:lang w:eastAsia="pt-BR"/>
-        </w:rPr>
-        <w:t> </w:t>
-      </w:r>
-      <w:r>
-        <w:rPr>
-          <w:rFonts w:ascii="Calibri" w:eastAsia="Times New Roman" w:hAnsi="Calibri" w:cs="Calibri"/>
-          <w:color w:val="000000"/>
-          <w:lang w:eastAsia="pt-BR"/>
-        </w:rPr>
-        <w:t xml:space="preserve">Print </w:t>
-      </w:r>
-      <w:proofErr w:type="spellStart"/>
-      <w:proofErr w:type="gramStart"/>
-      <w:r>
-        <w:rPr>
-          <w:rFonts w:ascii="Calibri" w:eastAsia="Times New Roman" w:hAnsi="Calibri" w:cs="Calibri"/>
-          <w:color w:val="000000"/>
-          <w:lang w:eastAsia="pt-BR"/>
-        </w:rPr>
-        <w:t>isalpha</w:t>
-      </w:r>
-      <w:proofErr w:type="spellEnd"/>
-      <w:r>
-        <w:rPr>
-          <w:rFonts w:ascii="Calibri" w:eastAsia="Times New Roman" w:hAnsi="Calibri" w:cs="Calibri"/>
-          <w:color w:val="000000"/>
-          <w:lang w:eastAsia="pt-BR"/>
-        </w:rPr>
-        <w:t>(</w:t>
-      </w:r>
-      <w:proofErr w:type="gramEnd"/>
-      <w:r>
-        <w:rPr>
-          <w:rFonts w:ascii="Calibri" w:eastAsia="Times New Roman" w:hAnsi="Calibri" w:cs="Calibri"/>
-          <w:color w:val="000000"/>
-          <w:lang w:eastAsia="pt-BR"/>
-        </w:rPr>
-        <w:t xml:space="preserve">) é </w:t>
-      </w:r>
-      <w:proofErr w:type="gramStart"/>
-      <w:r>
-        <w:rPr>
-          <w:rFonts w:ascii="Calibri" w:eastAsia="Times New Roman" w:hAnsi="Calibri" w:cs="Calibri"/>
-          <w:color w:val="000000"/>
-          <w:lang w:eastAsia="pt-BR"/>
-        </w:rPr>
-        <w:t>pra</w:t>
-      </w:r>
-      <w:proofErr w:type="gramEnd"/>
-      <w:r>
-        <w:rPr>
-          <w:rFonts w:ascii="Calibri" w:eastAsia="Times New Roman" w:hAnsi="Calibri" w:cs="Calibri"/>
-          <w:color w:val="000000"/>
-          <w:lang w:eastAsia="pt-BR"/>
-        </w:rPr>
-        <w:t xml:space="preserve"> saber se é </w:t>
-      </w:r>
-      <w:proofErr w:type="spellStart"/>
-      <w:r>
-        <w:rPr>
-          <w:rFonts w:ascii="Calibri" w:eastAsia="Times New Roman" w:hAnsi="Calibri" w:cs="Calibri"/>
-          <w:color w:val="000000"/>
-          <w:lang w:eastAsia="pt-BR"/>
-        </w:rPr>
-        <w:t>string</w:t>
-      </w:r>
-      <w:proofErr w:type="spellEnd"/>
-      <w:r>
-        <w:rPr>
-          <w:rFonts w:ascii="Calibri" w:eastAsia="Times New Roman" w:hAnsi="Calibri" w:cs="Calibri"/>
-          <w:color w:val="000000"/>
-          <w:lang w:eastAsia="pt-BR"/>
-        </w:rPr>
-        <w:t xml:space="preserve"> </w:t>
-      </w:r>
-    </w:p>
-    <w:p>
-      <w:pPr>
-        <w:spacing w:line="240" w:lineRule="auto"/>
-        <w:rPr>
-          <w:rFonts w:ascii="Calibri" w:eastAsia="Times New Roman" w:hAnsi="Calibri" w:cs="Calibri"/>
-          <w:color w:val="000000"/>
-          <w:lang w:eastAsia="pt-BR"/>
-        </w:rPr>
-      </w:pPr>
-      <w:r>
-        <w:rPr>
-          <w:rFonts w:ascii="Calibri" w:eastAsia="Times New Roman" w:hAnsi="Calibri" w:cs="Calibri"/>
-          <w:color w:val="000000"/>
-          <w:lang w:eastAsia="pt-BR"/>
-        </w:rPr>
-        <w:t>Print(</w:t>
-      </w:r>
-      <w:proofErr w:type="spellStart"/>
-      <w:proofErr w:type="gramStart"/>
+      <w:proofErr w:type="spellStart"/>
       <w:r>
         <w:rPr>
           <w:rFonts w:ascii="Calibri" w:eastAsia="Times New Roman" w:hAnsi="Calibri" w:cs="Calibri"/>
@@ -672,32 +583,13 @@
         <w:t>n.isnumeric</w:t>
       </w:r>
       <w:proofErr w:type="spellEnd"/>
-      <w:proofErr w:type="gramEnd"/>
-      <w:r>
-        <w:rPr>
-          <w:rFonts w:ascii="Calibri" w:eastAsia="Times New Roman" w:hAnsi="Calibri" w:cs="Calibri"/>
-          <w:color w:val="000000"/>
-          <w:lang w:eastAsia="pt-BR"/>
-        </w:rPr>
-        <w:t xml:space="preserve">()) é </w:t>
-      </w:r>
-      <w:proofErr w:type="gramStart"/>
-      <w:r>
-        <w:rPr>
-          <w:rFonts w:ascii="Calibri" w:eastAsia="Times New Roman" w:hAnsi="Calibri" w:cs="Calibri"/>
-          <w:color w:val="000000"/>
-          <w:lang w:eastAsia="pt-BR"/>
-        </w:rPr>
-        <w:t>pra</w:t>
-      </w:r>
-      <w:proofErr w:type="gramEnd"/>
-      <w:r>
-        <w:rPr>
-          <w:rFonts w:ascii="Calibri" w:eastAsia="Times New Roman" w:hAnsi="Calibri" w:cs="Calibri"/>
-          <w:color w:val="000000"/>
-          <w:lang w:eastAsia="pt-BR"/>
-        </w:rPr>
-        <w:t xml:space="preserve"> saber se é número</w:t>
+      <w:r>
+        <w:rPr>
+          <w:rFonts w:ascii="Calibri" w:eastAsia="Times New Roman" w:hAnsi="Calibri" w:cs="Calibri"/>
+          <w:color w:val="000000"/>
+          <w:lang w:eastAsia="pt-BR"/>
+        </w:rPr>
+        <w:t>()) é pra saber se é número</w:t>
       </w:r>
     </w:p>
     <w:p>
@@ -900,7 +792,6 @@
           <w:lang w:eastAsia="pt-BR"/>
         </w:rPr>
       </w:pPr>
-      <w:proofErr w:type="gramStart"/>
       <w:r>
         <w:rPr>
           <w:rFonts w:ascii="Calibri" w:eastAsia="Times New Roman" w:hAnsi="Calibri" w:cs="Calibri"/>
@@ -919,7 +810,6 @@
         <w:t>format</w:t>
       </w:r>
       <w:proofErr w:type="spellEnd"/>
-      <w:proofErr w:type="gramEnd"/>
       <w:r>
         <w:rPr>
           <w:rFonts w:ascii="Calibri" w:eastAsia="Times New Roman" w:hAnsi="Calibri" w:cs="Calibri"/>
@@ -929,7 +819,6 @@
         <w:t xml:space="preserve"> para mostrar o que </w:t>
       </w:r>
       <w:proofErr w:type="spellStart"/>
-      <w:proofErr w:type="gramStart"/>
       <w:r>
         <w:rPr>
           <w:rFonts w:ascii="Calibri" w:eastAsia="Times New Roman" w:hAnsi="Calibri" w:cs="Calibri"/>
@@ -939,7 +828,6 @@
         <w:t>esta</w:t>
       </w:r>
       <w:proofErr w:type="spellEnd"/>
-      <w:proofErr w:type="gramEnd"/>
       <w:r>
         <w:rPr>
           <w:rFonts w:ascii="Calibri" w:eastAsia="Times New Roman" w:hAnsi="Calibri" w:cs="Calibri"/>
@@ -1174,18 +1062,8 @@
           <w:color w:val="000000"/>
           <w:lang w:eastAsia="pt-BR"/>
         </w:rPr>
-        <w:t xml:space="preserve">1° </w:t>
-      </w:r>
-      <w:proofErr w:type="gramStart"/>
-      <w:r>
-        <w:rPr>
-          <w:rFonts w:ascii="Calibri" w:eastAsia="Times New Roman" w:hAnsi="Calibri" w:cs="Calibri"/>
-          <w:color w:val="000000"/>
-          <w:lang w:eastAsia="pt-BR"/>
-        </w:rPr>
-        <w:t>( )</w:t>
-      </w:r>
-      <w:proofErr w:type="gramEnd"/>
+        <w:t>1° ( )</w:t>
+      </w:r>
     </w:p>
     <w:p>
       <w:pPr>
@@ -1443,7 +1321,6 @@
         </w:rPr>
       </w:pPr>
       <w:proofErr w:type="spellStart"/>
-      <w:proofErr w:type="gramStart"/>
       <w:r>
         <w:rPr>
           <w:rFonts w:ascii="Calibri" w:eastAsia="Times New Roman" w:hAnsi="Calibri" w:cs="Calibri"/>
@@ -1459,16 +1336,7 @@
           <w:color w:val="000000"/>
           <w:lang w:eastAsia="pt-BR"/>
         </w:rPr>
-        <w:t xml:space="preserve"> :</w:t>
-      </w:r>
-      <w:proofErr w:type="gramEnd"/>
-      <w:r>
-        <w:rPr>
-          <w:rFonts w:ascii="Calibri" w:eastAsia="Times New Roman" w:hAnsi="Calibri" w:cs="Calibri"/>
-          <w:color w:val="000000"/>
-          <w:lang w:eastAsia="pt-BR"/>
-        </w:rPr>
-        <w:t xml:space="preserve"> faz arredondamento para cima</w:t>
+        <w:t xml:space="preserve"> : faz arredondamento para cima</w:t>
       </w:r>
     </w:p>
     <w:p>
@@ -1656,23 +1524,13 @@
         </w:rPr>
       </w:pPr>
       <w:proofErr w:type="spellStart"/>
-      <w:proofErr w:type="gramStart"/>
-      <w:r>
-        <w:rPr>
-          <w:rFonts w:ascii="Calibri" w:eastAsia="Times New Roman" w:hAnsi="Calibri" w:cs="Calibri"/>
-          <w:color w:val="000000"/>
-          <w:lang w:eastAsia="pt-BR"/>
-        </w:rPr>
-        <w:t>Cos,sin</w:t>
-      </w:r>
-      <w:proofErr w:type="gramEnd"/>
-      <w:r>
-        <w:rPr>
-          <w:rFonts w:ascii="Calibri" w:eastAsia="Times New Roman" w:hAnsi="Calibri" w:cs="Calibri"/>
-          <w:color w:val="000000"/>
-          <w:lang w:eastAsia="pt-BR"/>
-        </w:rPr>
-        <w:t>,tan</w:t>
+      <w:r>
+        <w:rPr>
+          <w:rFonts w:ascii="Calibri" w:eastAsia="Times New Roman" w:hAnsi="Calibri" w:cs="Calibri"/>
+          <w:color w:val="000000"/>
+          <w:lang w:eastAsia="pt-BR"/>
+        </w:rPr>
+        <w:t>Cos,sin,tan</w:t>
       </w:r>
       <w:proofErr w:type="spellEnd"/>
       <w:r>
@@ -1684,7 +1542,6 @@
         <w:t xml:space="preserve">: para calcular o cosseno seno e tangente, e para calcular precisa colocar o </w:t>
       </w:r>
       <w:proofErr w:type="spellStart"/>
-      <w:proofErr w:type="gramStart"/>
       <w:r>
         <w:rPr>
           <w:rFonts w:ascii="Calibri" w:eastAsia="Times New Roman" w:hAnsi="Calibri" w:cs="Calibri"/>
@@ -1700,16 +1557,7 @@
           <w:color w:val="000000"/>
           <w:lang w:eastAsia="pt-BR"/>
         </w:rPr>
-        <w:t>( )</w:t>
-      </w:r>
-      <w:proofErr w:type="gramEnd"/>
-      <w:r>
-        <w:rPr>
-          <w:rFonts w:ascii="Calibri" w:eastAsia="Times New Roman" w:hAnsi="Calibri" w:cs="Calibri"/>
-          <w:color w:val="000000"/>
-          <w:lang w:eastAsia="pt-BR"/>
-        </w:rPr>
-        <w:t xml:space="preserve"> para calcular em radiano</w:t>
+        <w:t>( ) para calcular em radiano</w:t>
       </w:r>
     </w:p>
     <w:p>
@@ -1768,7 +1616,6 @@
         <w:t xml:space="preserve">; </w:t>
       </w:r>
       <w:proofErr w:type="spellStart"/>
-      <w:proofErr w:type="gramStart"/>
       <w:r>
         <w:rPr>
           <w:rFonts w:ascii="Calibri" w:eastAsia="Times New Roman" w:hAnsi="Calibri" w:cs="Calibri"/>
@@ -1778,32 +1625,13 @@
         <w:t>text;back</w:t>
       </w:r>
       <w:proofErr w:type="spellEnd"/>
-      <w:proofErr w:type="gramEnd"/>
-      <w:r>
-        <w:rPr>
-          <w:rFonts w:ascii="Calibri" w:eastAsia="Times New Roman" w:hAnsi="Calibri" w:cs="Calibri"/>
-          <w:color w:val="000000"/>
-          <w:lang w:eastAsia="pt-BR"/>
-        </w:rPr>
-        <w:t xml:space="preserve"> </w:t>
-      </w:r>
-      <w:proofErr w:type="gramStart"/>
-      <w:r>
-        <w:rPr>
-          <w:rFonts w:ascii="Calibri" w:eastAsia="Times New Roman" w:hAnsi="Calibri" w:cs="Calibri"/>
-          <w:color w:val="000000"/>
-          <w:lang w:eastAsia="pt-BR"/>
-        </w:rPr>
-        <w:t>m ,</w:t>
-      </w:r>
-      <w:proofErr w:type="gramEnd"/>
-      <w:r>
-        <w:rPr>
-          <w:rFonts w:ascii="Calibri" w:eastAsia="Times New Roman" w:hAnsi="Calibri" w:cs="Calibri"/>
-          <w:color w:val="000000"/>
-          <w:lang w:eastAsia="pt-BR"/>
-        </w:rPr>
-        <w:t xml:space="preserve"> serve para colocar cores no </w:t>
+      <w:r>
+        <w:rPr>
+          <w:rFonts w:ascii="Calibri" w:eastAsia="Times New Roman" w:hAnsi="Calibri" w:cs="Calibri"/>
+          <w:color w:val="000000"/>
+          <w:lang w:eastAsia="pt-BR"/>
+        </w:rPr>
+        <w:t xml:space="preserve"> m , serve para colocar cores no </w:t>
       </w:r>
       <w:proofErr w:type="spellStart"/>
       <w:r>
@@ -1900,7 +1728,6 @@
               </w:rPr>
             </w:pPr>
             <w:proofErr w:type="spellStart"/>
-            <w:proofErr w:type="gramStart"/>
             <w:r>
               <w:rPr>
                 <w:rFonts w:ascii="Calibri" w:eastAsia="Times New Roman" w:hAnsi="Calibri" w:cs="Calibri"/>
@@ -1916,16 +1743,7 @@
                 <w:color w:val="000000"/>
                 <w:lang w:eastAsia="pt-BR"/>
               </w:rPr>
-              <w:t>(</w:t>
-            </w:r>
-            <w:proofErr w:type="gramEnd"/>
-            <w:r>
-              <w:rPr>
-                <w:rFonts w:ascii="Calibri" w:eastAsia="Times New Roman" w:hAnsi="Calibri" w:cs="Calibri"/>
-                <w:color w:val="000000"/>
-                <w:lang w:eastAsia="pt-BR"/>
-              </w:rPr>
-              <w:t>cor da letra)</w:t>
+              <w:t>(cor da letra)</w:t>
             </w:r>
           </w:p>
         </w:tc>
@@ -1956,23 +1774,13 @@
                 <w:lang w:eastAsia="pt-BR"/>
               </w:rPr>
             </w:pPr>
-            <w:proofErr w:type="gramStart"/>
             <w:r>
               <w:rPr>
                 <w:rFonts w:ascii="Calibri" w:eastAsia="Times New Roman" w:hAnsi="Calibri" w:cs="Calibri"/>
                 <w:color w:val="000000"/>
                 <w:lang w:eastAsia="pt-BR"/>
               </w:rPr>
-              <w:t>Back(</w:t>
-            </w:r>
-            <w:proofErr w:type="gramEnd"/>
-            <w:r>
-              <w:rPr>
-                <w:rFonts w:ascii="Calibri" w:eastAsia="Times New Roman" w:hAnsi="Calibri" w:cs="Calibri"/>
-                <w:color w:val="000000"/>
-                <w:lang w:eastAsia="pt-BR"/>
-              </w:rPr>
-              <w:t>cor de fundo)</w:t>
+              <w:t>Back(cor de fundo)</w:t>
             </w:r>
           </w:p>
         </w:tc>
@@ -2974,7 +2782,6 @@
         <w:t>x</w:t>
       </w:r>
       <w:proofErr w:type="spellEnd"/>
-      <w:proofErr w:type="gramStart"/>
       <w:r>
         <w:rPr>
           <w:rFonts w:ascii="Calibri" w:eastAsia="Times New Roman" w:hAnsi="Calibri" w:cs="Calibri"/>
@@ -2991,16 +2798,7 @@
           <w:color w:val="000000"/>
           <w:lang w:eastAsia="pt-BR"/>
         </w:rPr>
-        <w:t>  fatiamento</w:t>
-      </w:r>
-      <w:proofErr w:type="gramEnd"/>
-      <w:r>
-        <w:rPr>
-          <w:rFonts w:ascii="Calibri" w:eastAsia="Times New Roman" w:hAnsi="Calibri" w:cs="Calibri"/>
-          <w:color w:val="000000"/>
-          <w:lang w:eastAsia="pt-BR"/>
-        </w:rPr>
-        <w:t xml:space="preserve"> de </w:t>
+        <w:t xml:space="preserve">  fatiamento de </w:t>
       </w:r>
       <w:proofErr w:type="spellStart"/>
       <w:r>
@@ -3018,43 +2816,7 @@
           <w:color w:val="000000"/>
           <w:lang w:eastAsia="pt-BR"/>
         </w:rPr>
-        <w:t xml:space="preserve"> usa para pegar uma lista e terminar uma antes dela, </w:t>
-      </w:r>
-      <w:proofErr w:type="gramStart"/>
-      <w:r>
-        <w:rPr>
-          <w:rFonts w:ascii="Calibri" w:eastAsia="Times New Roman" w:hAnsi="Calibri" w:cs="Calibri"/>
-          <w:color w:val="000000"/>
-          <w:lang w:eastAsia="pt-BR"/>
-        </w:rPr>
-        <w:t>aonde</w:t>
-      </w:r>
-      <w:proofErr w:type="gramEnd"/>
-      <w:r>
-        <w:rPr>
-          <w:rFonts w:ascii="Calibri" w:eastAsia="Times New Roman" w:hAnsi="Calibri" w:cs="Calibri"/>
-          <w:color w:val="000000"/>
-          <w:lang w:eastAsia="pt-BR"/>
-        </w:rPr>
-        <w:t xml:space="preserve"> começa e </w:t>
-      </w:r>
-      <w:proofErr w:type="gramStart"/>
-      <w:r>
-        <w:rPr>
-          <w:rFonts w:ascii="Calibri" w:eastAsia="Times New Roman" w:hAnsi="Calibri" w:cs="Calibri"/>
-          <w:color w:val="000000"/>
-          <w:lang w:eastAsia="pt-BR"/>
-        </w:rPr>
-        <w:t>aonde</w:t>
-      </w:r>
-      <w:proofErr w:type="gramEnd"/>
-      <w:r>
-        <w:rPr>
-          <w:rFonts w:ascii="Calibri" w:eastAsia="Times New Roman" w:hAnsi="Calibri" w:cs="Calibri"/>
-          <w:color w:val="000000"/>
-          <w:lang w:eastAsia="pt-BR"/>
-        </w:rPr>
-        <w:t xml:space="preserve"> termina um antes</w:t>
+        <w:t xml:space="preserve"> usa para pegar uma lista e terminar uma antes dela, aonde começa e aonde termina um antes</w:t>
       </w:r>
     </w:p>
     <w:p>
@@ -3177,7 +2939,6 @@
         </w:rPr>
       </w:pPr>
       <w:proofErr w:type="spellStart"/>
-      <w:proofErr w:type="gramStart"/>
       <w:r>
         <w:rPr>
           <w:rFonts w:ascii="Calibri" w:eastAsia="Times New Roman" w:hAnsi="Calibri" w:cs="Calibri"/>
@@ -3197,9 +2958,36 @@
           <w:color w:val="000000"/>
           <w:lang w:eastAsia="pt-BR"/>
         </w:rPr>
-        <w:t>( XXX</w:t>
-      </w:r>
-      <w:proofErr w:type="gramEnd"/>
+        <w:t>( XXX ):</w:t>
+      </w:r>
+      <w:r>
+        <w:rPr>
+          <w:rFonts w:ascii="Calibri" w:eastAsia="Times New Roman" w:hAnsi="Calibri" w:cs="Calibri"/>
+          <w:color w:val="000000"/>
+          <w:lang w:eastAsia="pt-BR"/>
+        </w:rPr>
+        <w:t>é para saber o tanto de caracteres que existem.</w:t>
+      </w:r>
+    </w:p>
+    <w:p>
+      <w:pPr>
+        <w:spacing w:line="240" w:lineRule="auto"/>
+        <w:rPr>
+          <w:rFonts w:ascii="Times New Roman" w:eastAsia="Times New Roman" w:hAnsi="Times New Roman" w:cs="Times New Roman"/>
+          <w:sz w:val="24"/>
+          <w:szCs w:val="24"/>
+          <w:lang w:eastAsia="pt-BR"/>
+        </w:rPr>
+      </w:pPr>
+      <w:proofErr w:type="spellStart"/>
+      <w:r>
+        <w:rPr>
+          <w:rFonts w:ascii="Calibri" w:eastAsia="Times New Roman" w:hAnsi="Calibri" w:cs="Calibri"/>
+          <w:color w:val="000000"/>
+          <w:lang w:eastAsia="pt-BR"/>
+        </w:rPr>
+        <w:t>xx</w:t>
+      </w:r>
       <w:r>
         <w:rPr>
           <w:rFonts w:ascii="Calibri" w:eastAsia="Times New Roman" w:hAnsi="Calibri" w:cs="Calibri"/>
@@ -3208,15 +2996,109 @@
           <w:color w:val="000000"/>
           <w:lang w:eastAsia="pt-BR"/>
         </w:rPr>
-        <w:t xml:space="preserve"> ):</w:t>
-      </w:r>
-      <w:r>
-        <w:rPr>
-          <w:rFonts w:ascii="Calibri" w:eastAsia="Times New Roman" w:hAnsi="Calibri" w:cs="Calibri"/>
-          <w:color w:val="000000"/>
-          <w:lang w:eastAsia="pt-BR"/>
-        </w:rPr>
-        <w:t>é para saber o tanto de caracteres que existem.</w:t>
+        <w:t>.count</w:t>
+      </w:r>
+      <w:proofErr w:type="spellEnd"/>
+      <w:r>
+        <w:rPr>
+          <w:rFonts w:ascii="Calibri" w:eastAsia="Times New Roman" w:hAnsi="Calibri" w:cs="Calibri"/>
+          <w:color w:val="000000"/>
+          <w:lang w:eastAsia="pt-BR"/>
+        </w:rPr>
+        <w:t>(x): serve para contar o tanto de caracteres que existe na frase</w:t>
+      </w:r>
+    </w:p>
+    <w:p>
+      <w:pPr>
+        <w:spacing w:line="240" w:lineRule="auto"/>
+        <w:rPr>
+          <w:rFonts w:ascii="Times New Roman" w:eastAsia="Times New Roman" w:hAnsi="Times New Roman" w:cs="Times New Roman"/>
+          <w:sz w:val="24"/>
+          <w:szCs w:val="24"/>
+          <w:lang w:eastAsia="pt-BR"/>
+        </w:rPr>
+      </w:pPr>
+      <w:r>
+        <w:rPr>
+          <w:rFonts w:ascii="Calibri" w:eastAsia="Times New Roman" w:hAnsi="Calibri" w:cs="Calibri"/>
+          <w:color w:val="000000"/>
+          <w:lang w:eastAsia="pt-BR"/>
+        </w:rPr>
+        <w:t xml:space="preserve">frase = Curso em </w:t>
+      </w:r>
+      <w:proofErr w:type="spellStart"/>
+      <w:r>
+        <w:rPr>
+          <w:rFonts w:ascii="Calibri" w:eastAsia="Times New Roman" w:hAnsi="Calibri" w:cs="Calibri"/>
+          <w:color w:val="000000"/>
+          <w:lang w:eastAsia="pt-BR"/>
+        </w:rPr>
+        <w:t>Video</w:t>
+      </w:r>
+      <w:proofErr w:type="spellEnd"/>
+      <w:r>
+        <w:rPr>
+          <w:rFonts w:ascii="Calibri" w:eastAsia="Times New Roman" w:hAnsi="Calibri" w:cs="Calibri"/>
+          <w:color w:val="000000"/>
+          <w:lang w:eastAsia="pt-BR"/>
+        </w:rPr>
+        <w:t xml:space="preserve"> Python</w:t>
+      </w:r>
+    </w:p>
+    <w:p>
+      <w:pPr>
+        <w:spacing w:line="240" w:lineRule="auto"/>
+        <w:rPr>
+          <w:rFonts w:ascii="Times New Roman" w:eastAsia="Times New Roman" w:hAnsi="Times New Roman" w:cs="Times New Roman"/>
+          <w:sz w:val="24"/>
+          <w:szCs w:val="24"/>
+          <w:lang w:eastAsia="pt-BR"/>
+        </w:rPr>
+      </w:pPr>
+      <w:r>
+        <w:rPr>
+          <w:rFonts w:ascii="Calibri" w:eastAsia="Times New Roman" w:hAnsi="Calibri" w:cs="Calibri"/>
+          <w:color w:val="000000"/>
+          <w:lang w:eastAsia="pt-BR"/>
+        </w:rPr>
+        <w:t xml:space="preserve">ex. </w:t>
+      </w:r>
+      <w:proofErr w:type="spellStart"/>
+      <w:r>
+        <w:rPr>
+          <w:rFonts w:ascii="Calibri" w:eastAsia="Times New Roman" w:hAnsi="Calibri" w:cs="Calibri"/>
+          <w:color w:val="000000"/>
+          <w:lang w:eastAsia="pt-BR"/>
+        </w:rPr>
+        <w:t>frase.count</w:t>
+      </w:r>
+      <w:proofErr w:type="spellEnd"/>
+      <w:r>
+        <w:rPr>
+          <w:rFonts w:ascii="Calibri" w:eastAsia="Times New Roman" w:hAnsi="Calibri" w:cs="Calibri"/>
+          <w:color w:val="000000"/>
+          <w:lang w:eastAsia="pt-BR"/>
+        </w:rPr>
+        <w:t>(‘o’)</w:t>
+      </w:r>
+    </w:p>
+    <w:p>
+      <w:pPr>
+        <w:spacing w:line="240" w:lineRule="auto"/>
+        <w:rPr>
+          <w:rFonts w:ascii="Times New Roman" w:eastAsia="Times New Roman" w:hAnsi="Times New Roman" w:cs="Times New Roman"/>
+          <w:sz w:val="24"/>
+          <w:szCs w:val="24"/>
+          <w:lang w:eastAsia="pt-BR"/>
+        </w:rPr>
+      </w:pPr>
+      <w:r>
+        <w:rPr>
+          <w:rFonts w:ascii="Calibri" w:eastAsia="Times New Roman" w:hAnsi="Calibri" w:cs="Calibri"/>
+          <w:color w:val="000000"/>
+          <w:lang w:eastAsia="pt-BR"/>
+        </w:rPr>
+        <w:t>3</w:t>
       </w:r>
     </w:p>
     <w:p>
@@ -3246,132 +3128,66 @@
           <w:color w:val="000000"/>
           <w:lang w:eastAsia="pt-BR"/>
         </w:rPr>
-        <w:t>.count</w:t>
-      </w:r>
-      <w:proofErr w:type="spellEnd"/>
-      <w:r>
-        <w:rPr>
-          <w:rFonts w:ascii="Calibri" w:eastAsia="Times New Roman" w:hAnsi="Calibri" w:cs="Calibri"/>
-          <w:color w:val="000000"/>
-          <w:lang w:eastAsia="pt-BR"/>
-        </w:rPr>
-        <w:t>(x): serve para contar o tanto de caracteres que existe na frase</w:t>
-      </w:r>
-    </w:p>
-    <w:p>
-      <w:pPr>
-        <w:spacing w:line="240" w:lineRule="auto"/>
-        <w:rPr>
-          <w:rFonts w:ascii="Times New Roman" w:eastAsia="Times New Roman" w:hAnsi="Times New Roman" w:cs="Times New Roman"/>
-          <w:sz w:val="24"/>
-          <w:szCs w:val="24"/>
-          <w:lang w:eastAsia="pt-BR"/>
-        </w:rPr>
-      </w:pPr>
-      <w:r>
-        <w:rPr>
-          <w:rFonts w:ascii="Calibri" w:eastAsia="Times New Roman" w:hAnsi="Calibri" w:cs="Calibri"/>
-          <w:color w:val="000000"/>
-          <w:lang w:eastAsia="pt-BR"/>
-        </w:rPr>
-        <w:t xml:space="preserve">frase = Curso em </w:t>
-      </w:r>
-      <w:proofErr w:type="spellStart"/>
-      <w:r>
-        <w:rPr>
-          <w:rFonts w:ascii="Calibri" w:eastAsia="Times New Roman" w:hAnsi="Calibri" w:cs="Calibri"/>
-          <w:color w:val="000000"/>
-          <w:lang w:eastAsia="pt-BR"/>
-        </w:rPr>
-        <w:t>Video</w:t>
-      </w:r>
-      <w:proofErr w:type="spellEnd"/>
-      <w:r>
-        <w:rPr>
-          <w:rFonts w:ascii="Calibri" w:eastAsia="Times New Roman" w:hAnsi="Calibri" w:cs="Calibri"/>
-          <w:color w:val="000000"/>
-          <w:lang w:eastAsia="pt-BR"/>
-        </w:rPr>
-        <w:t xml:space="preserve"> Python</w:t>
-      </w:r>
-    </w:p>
-    <w:p>
-      <w:pPr>
-        <w:spacing w:line="240" w:lineRule="auto"/>
-        <w:rPr>
-          <w:rFonts w:ascii="Times New Roman" w:eastAsia="Times New Roman" w:hAnsi="Times New Roman" w:cs="Times New Roman"/>
-          <w:sz w:val="24"/>
-          <w:szCs w:val="24"/>
-          <w:lang w:eastAsia="pt-BR"/>
-        </w:rPr>
-      </w:pPr>
-      <w:r>
-        <w:rPr>
-          <w:rFonts w:ascii="Calibri" w:eastAsia="Times New Roman" w:hAnsi="Calibri" w:cs="Calibri"/>
-          <w:color w:val="000000"/>
-          <w:lang w:eastAsia="pt-BR"/>
-        </w:rPr>
-        <w:t xml:space="preserve">ex. </w:t>
-      </w:r>
-      <w:proofErr w:type="spellStart"/>
-      <w:proofErr w:type="gramStart"/>
-      <w:r>
-        <w:rPr>
-          <w:rFonts w:ascii="Calibri" w:eastAsia="Times New Roman" w:hAnsi="Calibri" w:cs="Calibri"/>
-          <w:color w:val="000000"/>
-          <w:lang w:eastAsia="pt-BR"/>
-        </w:rPr>
-        <w:t>frase.count</w:t>
-      </w:r>
-      <w:proofErr w:type="spellEnd"/>
-      <w:proofErr w:type="gramEnd"/>
-      <w:r>
-        <w:rPr>
-          <w:rFonts w:ascii="Calibri" w:eastAsia="Times New Roman" w:hAnsi="Calibri" w:cs="Calibri"/>
-          <w:color w:val="000000"/>
-          <w:lang w:eastAsia="pt-BR"/>
-        </w:rPr>
-        <w:t>(‘o’)</w:t>
-      </w:r>
-    </w:p>
-    <w:p>
-      <w:pPr>
-        <w:spacing w:line="240" w:lineRule="auto"/>
-        <w:rPr>
-          <w:rFonts w:ascii="Times New Roman" w:eastAsia="Times New Roman" w:hAnsi="Times New Roman" w:cs="Times New Roman"/>
-          <w:sz w:val="24"/>
-          <w:szCs w:val="24"/>
-          <w:lang w:eastAsia="pt-BR"/>
-        </w:rPr>
-      </w:pPr>
-      <w:r>
-        <w:rPr>
-          <w:rFonts w:ascii="Calibri" w:eastAsia="Times New Roman" w:hAnsi="Calibri" w:cs="Calibri"/>
-          <w:color w:val="000000"/>
-          <w:lang w:eastAsia="pt-BR"/>
-        </w:rPr>
-        <w:t>3</w:t>
-      </w:r>
-    </w:p>
-    <w:p>
-      <w:pPr>
-        <w:spacing w:line="240" w:lineRule="auto"/>
-        <w:rPr>
-          <w:rFonts w:ascii="Times New Roman" w:eastAsia="Times New Roman" w:hAnsi="Times New Roman" w:cs="Times New Roman"/>
-          <w:sz w:val="24"/>
-          <w:szCs w:val="24"/>
-          <w:lang w:eastAsia="pt-BR"/>
-        </w:rPr>
-      </w:pPr>
-      <w:proofErr w:type="spellStart"/>
-      <w:r>
-        <w:rPr>
-          <w:rFonts w:ascii="Calibri" w:eastAsia="Times New Roman" w:hAnsi="Calibri" w:cs="Calibri"/>
-          <w:color w:val="000000"/>
-          <w:lang w:eastAsia="pt-BR"/>
-        </w:rPr>
-        <w:t>xx</w:t>
-      </w:r>
+        <w:t>.find</w:t>
+      </w:r>
+      <w:proofErr w:type="spellEnd"/>
+      <w:r>
+        <w:rPr>
+          <w:rFonts w:ascii="Calibri" w:eastAsia="Times New Roman" w:hAnsi="Calibri" w:cs="Calibri"/>
+          <w:color w:val="000000"/>
+          <w:lang w:eastAsia="pt-BR"/>
+        </w:rPr>
+        <w:t>(‘</w:t>
+      </w:r>
+      <w:proofErr w:type="spellStart"/>
+      <w:r>
+        <w:rPr>
+          <w:rFonts w:ascii="Calibri" w:eastAsia="Times New Roman" w:hAnsi="Calibri" w:cs="Calibri"/>
+          <w:color w:val="000000"/>
+          <w:lang w:eastAsia="pt-BR"/>
+        </w:rPr>
+        <w:t>xxx</w:t>
+      </w:r>
+      <w:proofErr w:type="spellEnd"/>
+      <w:r>
+        <w:rPr>
+          <w:rFonts w:ascii="Calibri" w:eastAsia="Times New Roman" w:hAnsi="Calibri" w:cs="Calibri"/>
+          <w:color w:val="000000"/>
+          <w:lang w:eastAsia="pt-BR"/>
+        </w:rPr>
+        <w:t>’)Serve para mostrar aonde encontrou o que ele pediu</w:t>
+      </w:r>
+    </w:p>
+    <w:p>
+      <w:pPr>
+        <w:spacing w:line="240" w:lineRule="auto"/>
+        <w:rPr>
+          <w:rFonts w:ascii="Times New Roman" w:eastAsia="Times New Roman" w:hAnsi="Times New Roman" w:cs="Times New Roman"/>
+          <w:sz w:val="24"/>
+          <w:szCs w:val="24"/>
+          <w:lang w:eastAsia="pt-BR"/>
+        </w:rPr>
+      </w:pPr>
+      <w:r>
+        <w:rPr>
+          <w:rFonts w:ascii="Calibri" w:eastAsia="Times New Roman" w:hAnsi="Calibri" w:cs="Calibri"/>
+          <w:color w:val="000000"/>
+          <w:lang w:eastAsia="pt-BR"/>
+        </w:rPr>
+        <w:t>aonde não existe ele vai te mostrar -1(significa que não tem)</w:t>
+      </w:r>
+    </w:p>
+    <w:p>
+      <w:pPr>
+        <w:spacing w:line="240" w:lineRule="auto"/>
+        <w:rPr>
+          <w:rFonts w:ascii="Times New Roman" w:eastAsia="Times New Roman" w:hAnsi="Times New Roman" w:cs="Times New Roman"/>
+          <w:sz w:val="24"/>
+          <w:szCs w:val="24"/>
+          <w:lang w:eastAsia="pt-BR"/>
+        </w:rPr>
+      </w:pPr>
+      <w:proofErr w:type="spellStart"/>
       <w:r>
         <w:rPr>
           <w:rFonts w:ascii="Calibri" w:eastAsia="Times New Roman" w:hAnsi="Calibri" w:cs="Calibri"/>
@@ -3380,102 +3196,6 @@
           <w:color w:val="000000"/>
           <w:lang w:eastAsia="pt-BR"/>
         </w:rPr>
-        <w:t>.find</w:t>
-      </w:r>
-      <w:proofErr w:type="spellEnd"/>
-      <w:r>
-        <w:rPr>
-          <w:rFonts w:ascii="Calibri" w:eastAsia="Times New Roman" w:hAnsi="Calibri" w:cs="Calibri"/>
-          <w:color w:val="000000"/>
-          <w:lang w:eastAsia="pt-BR"/>
-        </w:rPr>
-        <w:t>(‘</w:t>
-      </w:r>
-      <w:proofErr w:type="spellStart"/>
-      <w:r>
-        <w:rPr>
-          <w:rFonts w:ascii="Calibri" w:eastAsia="Times New Roman" w:hAnsi="Calibri" w:cs="Calibri"/>
-          <w:color w:val="000000"/>
-          <w:lang w:eastAsia="pt-BR"/>
-        </w:rPr>
-        <w:t>xxx</w:t>
-      </w:r>
-      <w:proofErr w:type="spellEnd"/>
-      <w:proofErr w:type="gramStart"/>
-      <w:r>
-        <w:rPr>
-          <w:rFonts w:ascii="Calibri" w:eastAsia="Times New Roman" w:hAnsi="Calibri" w:cs="Calibri"/>
-          <w:color w:val="000000"/>
-          <w:lang w:eastAsia="pt-BR"/>
-        </w:rPr>
-        <w:t>’)Serve</w:t>
-      </w:r>
-      <w:proofErr w:type="gramEnd"/>
-      <w:r>
-        <w:rPr>
-          <w:rFonts w:ascii="Calibri" w:eastAsia="Times New Roman" w:hAnsi="Calibri" w:cs="Calibri"/>
-          <w:color w:val="000000"/>
-          <w:lang w:eastAsia="pt-BR"/>
-        </w:rPr>
-        <w:t xml:space="preserve"> para mostrar </w:t>
-      </w:r>
-      <w:proofErr w:type="gramStart"/>
-      <w:r>
-        <w:rPr>
-          <w:rFonts w:ascii="Calibri" w:eastAsia="Times New Roman" w:hAnsi="Calibri" w:cs="Calibri"/>
-          <w:color w:val="000000"/>
-          <w:lang w:eastAsia="pt-BR"/>
-        </w:rPr>
-        <w:t>aonde</w:t>
-      </w:r>
-      <w:proofErr w:type="gramEnd"/>
-      <w:r>
-        <w:rPr>
-          <w:rFonts w:ascii="Calibri" w:eastAsia="Times New Roman" w:hAnsi="Calibri" w:cs="Calibri"/>
-          <w:color w:val="000000"/>
-          <w:lang w:eastAsia="pt-BR"/>
-        </w:rPr>
-        <w:t xml:space="preserve"> encontrou o que ele pediu</w:t>
-      </w:r>
-    </w:p>
-    <w:p>
-      <w:pPr>
-        <w:spacing w:line="240" w:lineRule="auto"/>
-        <w:rPr>
-          <w:rFonts w:ascii="Times New Roman" w:eastAsia="Times New Roman" w:hAnsi="Times New Roman" w:cs="Times New Roman"/>
-          <w:sz w:val="24"/>
-          <w:szCs w:val="24"/>
-          <w:lang w:eastAsia="pt-BR"/>
-        </w:rPr>
-      </w:pPr>
-      <w:r>
-        <w:rPr>
-          <w:rFonts w:ascii="Calibri" w:eastAsia="Times New Roman" w:hAnsi="Calibri" w:cs="Calibri"/>
-          <w:color w:val="000000"/>
-          <w:lang w:eastAsia="pt-BR"/>
-        </w:rPr>
-        <w:t>aonde não existe ele vai te mostrar -1(significa que não tem)</w:t>
-      </w:r>
-    </w:p>
-    <w:p>
-      <w:pPr>
-        <w:spacing w:line="240" w:lineRule="auto"/>
-        <w:rPr>
-          <w:rFonts w:ascii="Times New Roman" w:eastAsia="Times New Roman" w:hAnsi="Times New Roman" w:cs="Times New Roman"/>
-          <w:sz w:val="24"/>
-          <w:szCs w:val="24"/>
-          <w:lang w:eastAsia="pt-BR"/>
-        </w:rPr>
-      </w:pPr>
-      <w:proofErr w:type="spellStart"/>
-      <w:r>
-        <w:rPr>
-          <w:rFonts w:ascii="Calibri" w:eastAsia="Times New Roman" w:hAnsi="Calibri" w:cs="Calibri"/>
-          <w:b/>
-          <w:bCs/>
-          <w:color w:val="000000"/>
-          <w:lang w:eastAsia="pt-BR"/>
-        </w:rPr>
         <w:t>in</w:t>
       </w:r>
       <w:r>
@@ -3598,25 +3318,7 @@
           <w:color w:val="000000"/>
           <w:lang w:eastAsia="pt-BR"/>
         </w:rPr>
-        <w:t xml:space="preserve">Para printar as aspas “” basta usar o \” que no print </w:t>
-      </w:r>
-      <w:proofErr w:type="gramStart"/>
-      <w:r>
-        <w:rPr>
-          <w:rFonts w:ascii="Calibri" w:eastAsia="Times New Roman" w:hAnsi="Calibri" w:cs="Calibri"/>
-          <w:color w:val="000000"/>
-          <w:lang w:eastAsia="pt-BR"/>
-        </w:rPr>
-        <w:t>ira</w:t>
-      </w:r>
-      <w:proofErr w:type="gramEnd"/>
-      <w:r>
-        <w:rPr>
-          <w:rFonts w:ascii="Calibri" w:eastAsia="Times New Roman" w:hAnsi="Calibri" w:cs="Calibri"/>
-          <w:color w:val="000000"/>
-          <w:lang w:eastAsia="pt-BR"/>
-        </w:rPr>
-        <w:t xml:space="preserve"> aparecer as aspas.</w:t>
+        <w:t>Para printar as aspas “” basta usar o \” que no print ira aparecer as aspas.</w:t>
       </w:r>
     </w:p>
     <w:p>
@@ -3683,7 +3385,6 @@
         </w:rPr>
         <w:t>xxx.</w:t>
       </w:r>
-      <w:proofErr w:type="gramStart"/>
       <w:r>
         <w:rPr>
           <w:rFonts w:ascii="Calibri" w:eastAsia="Times New Roman" w:hAnsi="Calibri" w:cs="Calibri"/>
@@ -3704,7 +3405,6 @@
         <w:t>(</w:t>
       </w:r>
       <w:proofErr w:type="spellStart"/>
-      <w:proofErr w:type="gramEnd"/>
       <w:r>
         <w:rPr>
           <w:rFonts w:ascii="Calibri" w:eastAsia="Times New Roman" w:hAnsi="Calibri" w:cs="Calibri"/>
@@ -3720,25 +3420,7 @@
           <w:color w:val="000000"/>
           <w:lang w:eastAsia="pt-BR"/>
         </w:rPr>
-        <w:t xml:space="preserve"> que você </w:t>
-      </w:r>
-      <w:proofErr w:type="gramStart"/>
-      <w:r>
-        <w:rPr>
-          <w:rFonts w:ascii="Calibri" w:eastAsia="Times New Roman" w:hAnsi="Calibri" w:cs="Calibri"/>
-          <w:color w:val="000000"/>
-          <w:lang w:eastAsia="pt-BR"/>
-        </w:rPr>
-        <w:t>quer)-</w:t>
-      </w:r>
-      <w:proofErr w:type="gramEnd"/>
-      <w:r>
-        <w:rPr>
-          <w:rFonts w:ascii="Calibri" w:eastAsia="Times New Roman" w:hAnsi="Calibri" w:cs="Calibri"/>
-          <w:color w:val="000000"/>
-          <w:lang w:eastAsia="pt-BR"/>
-        </w:rPr>
-        <w:t>: serve para substituir a palavra que você quer pela palavra que você quer.</w:t>
+        <w:t xml:space="preserve"> que você quer)-: serve para substituir a palavra que você quer pela palavra que você quer.</w:t>
       </w:r>
     </w:p>
     <w:p>
@@ -3768,9 +3450,9 @@
           <w:color w:val="000000"/>
           <w:lang w:eastAsia="pt-BR"/>
         </w:rPr>
-        <w:t>.</w:t>
-      </w:r>
-      <w:proofErr w:type="gramStart"/>
+        <w:t>.upper</w:t>
+      </w:r>
+      <w:proofErr w:type="spellEnd"/>
       <w:r>
         <w:rPr>
           <w:rFonts w:ascii="Calibri" w:eastAsia="Times New Roman" w:hAnsi="Calibri" w:cs="Calibri"/>
@@ -3779,9 +3461,36 @@
           <w:color w:val="000000"/>
           <w:lang w:eastAsia="pt-BR"/>
         </w:rPr>
-        <w:t>upper</w:t>
-      </w:r>
-      <w:proofErr w:type="spellEnd"/>
+        <w:t>()</w:t>
+      </w:r>
+      <w:r>
+        <w:rPr>
+          <w:rFonts w:ascii="Calibri" w:eastAsia="Times New Roman" w:hAnsi="Calibri" w:cs="Calibri"/>
+          <w:color w:val="000000"/>
+          <w:lang w:eastAsia="pt-BR"/>
+        </w:rPr>
+        <w:t>: ele vai transformar o que você quer em letras maiúsculas</w:t>
+      </w:r>
+    </w:p>
+    <w:p>
+      <w:pPr>
+        <w:spacing w:line="240" w:lineRule="auto"/>
+        <w:rPr>
+          <w:rFonts w:ascii="Times New Roman" w:eastAsia="Times New Roman" w:hAnsi="Times New Roman" w:cs="Times New Roman"/>
+          <w:sz w:val="24"/>
+          <w:szCs w:val="24"/>
+          <w:lang w:eastAsia="pt-BR"/>
+        </w:rPr>
+      </w:pPr>
+      <w:proofErr w:type="spellStart"/>
+      <w:r>
+        <w:rPr>
+          <w:rFonts w:ascii="Calibri" w:eastAsia="Times New Roman" w:hAnsi="Calibri" w:cs="Calibri"/>
+          <w:color w:val="000000"/>
+          <w:lang w:eastAsia="pt-BR"/>
+        </w:rPr>
+        <w:t>xxx</w:t>
+      </w:r>
       <w:r>
         <w:rPr>
           <w:rFonts w:ascii="Calibri" w:eastAsia="Times New Roman" w:hAnsi="Calibri" w:cs="Calibri"/>
@@ -3790,9 +3499,9 @@
           <w:color w:val="000000"/>
           <w:lang w:eastAsia="pt-BR"/>
         </w:rPr>
-        <w:t>(</w:t>
-      </w:r>
-      <w:proofErr w:type="gramEnd"/>
+        <w:t>.lower</w:t>
+      </w:r>
+      <w:proofErr w:type="spellEnd"/>
       <w:r>
         <w:rPr>
           <w:rFonts w:ascii="Calibri" w:eastAsia="Times New Roman" w:hAnsi="Calibri" w:cs="Calibri"/>
@@ -3801,15 +3510,15 @@
           <w:color w:val="000000"/>
           <w:lang w:eastAsia="pt-BR"/>
         </w:rPr>
-        <w:t>)</w:t>
-      </w:r>
-      <w:r>
-        <w:rPr>
-          <w:rFonts w:ascii="Calibri" w:eastAsia="Times New Roman" w:hAnsi="Calibri" w:cs="Calibri"/>
-          <w:color w:val="000000"/>
-          <w:lang w:eastAsia="pt-BR"/>
-        </w:rPr>
-        <w:t>: ele vai transformar o que você quer em letras maiúsculas</w:t>
+        <w:t>()</w:t>
+      </w:r>
+      <w:r>
+        <w:rPr>
+          <w:rFonts w:ascii="Calibri" w:eastAsia="Times New Roman" w:hAnsi="Calibri" w:cs="Calibri"/>
+          <w:color w:val="000000"/>
+          <w:lang w:eastAsia="pt-BR"/>
+        </w:rPr>
+        <w:t>: ele vai transformar o que você quer em letras minúsculas</w:t>
       </w:r>
     </w:p>
     <w:p>
@@ -3839,9 +3548,9 @@
           <w:color w:val="000000"/>
           <w:lang w:eastAsia="pt-BR"/>
         </w:rPr>
-        <w:t>.</w:t>
-      </w:r>
-      <w:proofErr w:type="gramStart"/>
+        <w:t>.capitalize</w:t>
+      </w:r>
+      <w:proofErr w:type="spellEnd"/>
       <w:r>
         <w:rPr>
           <w:rFonts w:ascii="Calibri" w:eastAsia="Times New Roman" w:hAnsi="Calibri" w:cs="Calibri"/>
@@ -3850,9 +3559,16 @@
           <w:color w:val="000000"/>
           <w:lang w:eastAsia="pt-BR"/>
         </w:rPr>
-        <w:t>lower</w:t>
-      </w:r>
-      <w:proofErr w:type="spellEnd"/>
+        <w:t xml:space="preserve">(): </w:t>
+      </w:r>
+      <w:r>
+        <w:rPr>
+          <w:rFonts w:ascii="Calibri" w:eastAsia="Times New Roman" w:hAnsi="Calibri" w:cs="Calibri"/>
+          <w:color w:val="000000"/>
+          <w:lang w:eastAsia="pt-BR"/>
+        </w:rPr>
+        <w:t xml:space="preserve">ele vai pegar toda a sua frase e transformar para minúscula , </w:t>
+      </w:r>
       <w:r>
         <w:rPr>
           <w:rFonts w:ascii="Calibri" w:eastAsia="Times New Roman" w:hAnsi="Calibri" w:cs="Calibri"/>
@@ -3861,9 +3577,28 @@
           <w:color w:val="000000"/>
           <w:lang w:eastAsia="pt-BR"/>
         </w:rPr>
-        <w:t>(</w:t>
-      </w:r>
-      <w:proofErr w:type="gramEnd"/>
+        <w:t>menos a primeira letra</w:t>
+      </w:r>
+    </w:p>
+    <w:p>
+      <w:pPr>
+        <w:spacing w:line="240" w:lineRule="auto"/>
+        <w:rPr>
+          <w:rFonts w:ascii="Times New Roman" w:eastAsia="Times New Roman" w:hAnsi="Times New Roman" w:cs="Times New Roman"/>
+          <w:sz w:val="24"/>
+          <w:szCs w:val="24"/>
+          <w:lang w:eastAsia="pt-BR"/>
+        </w:rPr>
+      </w:pPr>
+      <w:proofErr w:type="spellStart"/>
+      <w:r>
+        <w:rPr>
+          <w:rFonts w:ascii="Calibri" w:eastAsia="Times New Roman" w:hAnsi="Calibri" w:cs="Calibri"/>
+          <w:color w:val="000000"/>
+          <w:lang w:eastAsia="pt-BR"/>
+        </w:rPr>
+        <w:t>xxx</w:t>
+      </w:r>
       <w:r>
         <w:rPr>
           <w:rFonts w:ascii="Calibri" w:eastAsia="Times New Roman" w:hAnsi="Calibri" w:cs="Calibri"/>
@@ -3872,36 +3607,9 @@
           <w:color w:val="000000"/>
           <w:lang w:eastAsia="pt-BR"/>
         </w:rPr>
-        <w:t>)</w:t>
-      </w:r>
-      <w:r>
-        <w:rPr>
-          <w:rFonts w:ascii="Calibri" w:eastAsia="Times New Roman" w:hAnsi="Calibri" w:cs="Calibri"/>
-          <w:color w:val="000000"/>
-          <w:lang w:eastAsia="pt-BR"/>
-        </w:rPr>
-        <w:t>: ele vai transformar o que você quer em letras minúsculas</w:t>
-      </w:r>
-    </w:p>
-    <w:p>
-      <w:pPr>
-        <w:spacing w:line="240" w:lineRule="auto"/>
-        <w:rPr>
-          <w:rFonts w:ascii="Times New Roman" w:eastAsia="Times New Roman" w:hAnsi="Times New Roman" w:cs="Times New Roman"/>
-          <w:sz w:val="24"/>
-          <w:szCs w:val="24"/>
-          <w:lang w:eastAsia="pt-BR"/>
-        </w:rPr>
-      </w:pPr>
-      <w:proofErr w:type="spellStart"/>
-      <w:r>
-        <w:rPr>
-          <w:rFonts w:ascii="Calibri" w:eastAsia="Times New Roman" w:hAnsi="Calibri" w:cs="Calibri"/>
-          <w:color w:val="000000"/>
-          <w:lang w:eastAsia="pt-BR"/>
-        </w:rPr>
-        <w:t>xxx</w:t>
-      </w:r>
+        <w:t>.title</w:t>
+      </w:r>
+      <w:proofErr w:type="spellEnd"/>
       <w:r>
         <w:rPr>
           <w:rFonts w:ascii="Calibri" w:eastAsia="Times New Roman" w:hAnsi="Calibri" w:cs="Calibri"/>
@@ -3910,9 +3618,36 @@
           <w:color w:val="000000"/>
           <w:lang w:eastAsia="pt-BR"/>
         </w:rPr>
-        <w:t>.</w:t>
-      </w:r>
-      <w:proofErr w:type="gramStart"/>
+        <w:t xml:space="preserve">() </w:t>
+      </w:r>
+      <w:r>
+        <w:rPr>
+          <w:rFonts w:ascii="Calibri" w:eastAsia="Times New Roman" w:hAnsi="Calibri" w:cs="Calibri"/>
+          <w:color w:val="000000"/>
+          <w:lang w:eastAsia="pt-BR"/>
+        </w:rPr>
+        <w:t>: ele pega palavra por palavra e coloca com a primeira letra maiúscula.</w:t>
+      </w:r>
+    </w:p>
+    <w:p>
+      <w:pPr>
+        <w:spacing w:line="240" w:lineRule="auto"/>
+        <w:rPr>
+          <w:rFonts w:ascii="Times New Roman" w:eastAsia="Times New Roman" w:hAnsi="Times New Roman" w:cs="Times New Roman"/>
+          <w:sz w:val="24"/>
+          <w:szCs w:val="24"/>
+          <w:lang w:eastAsia="pt-BR"/>
+        </w:rPr>
+      </w:pPr>
+      <w:proofErr w:type="spellStart"/>
+      <w:r>
+        <w:rPr>
+          <w:rFonts w:ascii="Calibri" w:eastAsia="Times New Roman" w:hAnsi="Calibri" w:cs="Calibri"/>
+          <w:color w:val="000000"/>
+          <w:lang w:eastAsia="pt-BR"/>
+        </w:rPr>
+        <w:t>xxx</w:t>
+      </w:r>
       <w:r>
         <w:rPr>
           <w:rFonts w:ascii="Calibri" w:eastAsia="Times New Roman" w:hAnsi="Calibri" w:cs="Calibri"/>
@@ -3921,7 +3656,7 @@
           <w:color w:val="000000"/>
           <w:lang w:eastAsia="pt-BR"/>
         </w:rPr>
-        <w:t>capitalize</w:t>
+        <w:t>.strip</w:t>
       </w:r>
       <w:proofErr w:type="spellEnd"/>
       <w:r>
@@ -3932,9 +3667,36 @@
           <w:color w:val="000000"/>
           <w:lang w:eastAsia="pt-BR"/>
         </w:rPr>
-        <w:t>(</w:t>
-      </w:r>
-      <w:proofErr w:type="gramEnd"/>
+        <w:t>()</w:t>
+      </w:r>
+      <w:r>
+        <w:rPr>
+          <w:rFonts w:ascii="Calibri" w:eastAsia="Times New Roman" w:hAnsi="Calibri" w:cs="Calibri"/>
+          <w:color w:val="000000"/>
+          <w:lang w:eastAsia="pt-BR"/>
+        </w:rPr>
+        <w:t>: serve para remover os espaços antes e depois da sua frase</w:t>
+      </w:r>
+    </w:p>
+    <w:p>
+      <w:pPr>
+        <w:spacing w:line="240" w:lineRule="auto"/>
+        <w:rPr>
+          <w:rFonts w:ascii="Times New Roman" w:eastAsia="Times New Roman" w:hAnsi="Times New Roman" w:cs="Times New Roman"/>
+          <w:sz w:val="24"/>
+          <w:szCs w:val="24"/>
+          <w:lang w:eastAsia="pt-BR"/>
+        </w:rPr>
+      </w:pPr>
+      <w:proofErr w:type="spellStart"/>
+      <w:r>
+        <w:rPr>
+          <w:rFonts w:ascii="Calibri" w:eastAsia="Times New Roman" w:hAnsi="Calibri" w:cs="Calibri"/>
+          <w:color w:val="000000"/>
+          <w:lang w:eastAsia="pt-BR"/>
+        </w:rPr>
+        <w:t>xxx</w:t>
+      </w:r>
       <w:r>
         <w:rPr>
           <w:rFonts w:ascii="Calibri" w:eastAsia="Times New Roman" w:hAnsi="Calibri" w:cs="Calibri"/>
@@ -3943,34 +3705,9 @@
           <w:color w:val="000000"/>
           <w:lang w:eastAsia="pt-BR"/>
         </w:rPr>
-        <w:t xml:space="preserve">): </w:t>
-      </w:r>
-      <w:r>
-        <w:rPr>
-          <w:rFonts w:ascii="Calibri" w:eastAsia="Times New Roman" w:hAnsi="Calibri" w:cs="Calibri"/>
-          <w:color w:val="000000"/>
-          <w:lang w:eastAsia="pt-BR"/>
-        </w:rPr>
-        <w:t xml:space="preserve">ele vai pegar toda a sua frase e transformar para </w:t>
-      </w:r>
-      <w:proofErr w:type="gramStart"/>
-      <w:r>
-        <w:rPr>
-          <w:rFonts w:ascii="Calibri" w:eastAsia="Times New Roman" w:hAnsi="Calibri" w:cs="Calibri"/>
-          <w:color w:val="000000"/>
-          <w:lang w:eastAsia="pt-BR"/>
-        </w:rPr>
-        <w:t>minúscula ,</w:t>
-      </w:r>
-      <w:proofErr w:type="gramEnd"/>
-      <w:r>
-        <w:rPr>
-          <w:rFonts w:ascii="Calibri" w:eastAsia="Times New Roman" w:hAnsi="Calibri" w:cs="Calibri"/>
-          <w:color w:val="000000"/>
-          <w:lang w:eastAsia="pt-BR"/>
-        </w:rPr>
-        <w:t xml:space="preserve"> </w:t>
-      </w:r>
+        <w:t>.rstrip</w:t>
+      </w:r>
+      <w:proofErr w:type="spellEnd"/>
       <w:r>
         <w:rPr>
           <w:rFonts w:ascii="Calibri" w:eastAsia="Times New Roman" w:hAnsi="Calibri" w:cs="Calibri"/>
@@ -3979,7 +3716,33 @@
           <w:color w:val="000000"/>
           <w:lang w:eastAsia="pt-BR"/>
         </w:rPr>
-        <w:t>menos a primeira letra</w:t>
+        <w:t>()</w:t>
+      </w:r>
+      <w:r>
+        <w:rPr>
+          <w:rFonts w:ascii="Calibri" w:eastAsia="Times New Roman" w:hAnsi="Calibri" w:cs="Calibri"/>
+          <w:color w:val="000000"/>
+          <w:lang w:eastAsia="pt-BR"/>
+        </w:rPr>
+        <w:t>: remove todos os espaços em brancos da direita(</w:t>
+      </w:r>
+      <w:proofErr w:type="spellStart"/>
+      <w:r>
+        <w:rPr>
+          <w:rFonts w:ascii="Calibri" w:eastAsia="Times New Roman" w:hAnsi="Calibri" w:cs="Calibri"/>
+          <w:color w:val="000000"/>
+          <w:lang w:eastAsia="pt-BR"/>
+        </w:rPr>
+        <w:t>right</w:t>
+      </w:r>
+      <w:proofErr w:type="spellEnd"/>
+      <w:r>
+        <w:rPr>
+          <w:rFonts w:ascii="Calibri" w:eastAsia="Times New Roman" w:hAnsi="Calibri" w:cs="Calibri"/>
+          <w:color w:val="000000"/>
+          <w:lang w:eastAsia="pt-BR"/>
+        </w:rPr>
+        <w:t>)</w:t>
       </w:r>
     </w:p>
     <w:p>
@@ -4009,9 +3772,9 @@
           <w:color w:val="000000"/>
           <w:lang w:eastAsia="pt-BR"/>
         </w:rPr>
-        <w:t>.</w:t>
-      </w:r>
-      <w:proofErr w:type="gramStart"/>
+        <w:t>.lstrip</w:t>
+      </w:r>
+      <w:proofErr w:type="spellEnd"/>
       <w:r>
         <w:rPr>
           <w:rFonts w:ascii="Calibri" w:eastAsia="Times New Roman" w:hAnsi="Calibri" w:cs="Calibri"/>
@@ -4020,9 +3783,54 @@
           <w:color w:val="000000"/>
           <w:lang w:eastAsia="pt-BR"/>
         </w:rPr>
-        <w:t>title</w:t>
-      </w:r>
-      <w:proofErr w:type="spellEnd"/>
+        <w:t>()</w:t>
+      </w:r>
+      <w:r>
+        <w:rPr>
+          <w:rFonts w:ascii="Calibri" w:eastAsia="Times New Roman" w:hAnsi="Calibri" w:cs="Calibri"/>
+          <w:color w:val="000000"/>
+          <w:lang w:eastAsia="pt-BR"/>
+        </w:rPr>
+        <w:t>: remove todos os espaços em branco da esquerda(</w:t>
+      </w:r>
+      <w:proofErr w:type="spellStart"/>
+      <w:r>
+        <w:rPr>
+          <w:rFonts w:ascii="Calibri" w:eastAsia="Times New Roman" w:hAnsi="Calibri" w:cs="Calibri"/>
+          <w:color w:val="000000"/>
+          <w:lang w:eastAsia="pt-BR"/>
+        </w:rPr>
+        <w:t>left</w:t>
+      </w:r>
+      <w:proofErr w:type="spellEnd"/>
+      <w:r>
+        <w:rPr>
+          <w:rFonts w:ascii="Calibri" w:eastAsia="Times New Roman" w:hAnsi="Calibri" w:cs="Calibri"/>
+          <w:color w:val="000000"/>
+          <w:lang w:eastAsia="pt-BR"/>
+        </w:rPr>
+        <w:t>)</w:t>
+      </w:r>
+    </w:p>
+    <w:p>
+      <w:pPr>
+        <w:spacing w:line="240" w:lineRule="auto"/>
+        <w:rPr>
+          <w:rFonts w:ascii="Times New Roman" w:eastAsia="Times New Roman" w:hAnsi="Times New Roman" w:cs="Times New Roman"/>
+          <w:sz w:val="24"/>
+          <w:szCs w:val="24"/>
+          <w:lang w:eastAsia="pt-BR"/>
+        </w:rPr>
+      </w:pPr>
+      <w:proofErr w:type="spellStart"/>
+      <w:r>
+        <w:rPr>
+          <w:rFonts w:ascii="Calibri" w:eastAsia="Times New Roman" w:hAnsi="Calibri" w:cs="Calibri"/>
+          <w:color w:val="000000"/>
+          <w:lang w:eastAsia="pt-BR"/>
+        </w:rPr>
+        <w:t>xxx</w:t>
+      </w:r>
       <w:r>
         <w:rPr>
           <w:rFonts w:ascii="Calibri" w:eastAsia="Times New Roman" w:hAnsi="Calibri" w:cs="Calibri"/>
@@ -4031,45 +3839,9 @@
           <w:color w:val="000000"/>
           <w:lang w:eastAsia="pt-BR"/>
         </w:rPr>
-        <w:t xml:space="preserve">() </w:t>
-      </w:r>
-      <w:r>
-        <w:rPr>
-          <w:rFonts w:ascii="Calibri" w:eastAsia="Times New Roman" w:hAnsi="Calibri" w:cs="Calibri"/>
-          <w:color w:val="000000"/>
-          <w:lang w:eastAsia="pt-BR"/>
-        </w:rPr>
-        <w:t>:</w:t>
-      </w:r>
-      <w:proofErr w:type="gramEnd"/>
-      <w:r>
-        <w:rPr>
-          <w:rFonts w:ascii="Calibri" w:eastAsia="Times New Roman" w:hAnsi="Calibri" w:cs="Calibri"/>
-          <w:color w:val="000000"/>
-          <w:lang w:eastAsia="pt-BR"/>
-        </w:rPr>
-        <w:t xml:space="preserve"> ele pega palavra por palavra e coloca com a primeira letra maiúscula.</w:t>
-      </w:r>
-    </w:p>
-    <w:p>
-      <w:pPr>
-        <w:spacing w:line="240" w:lineRule="auto"/>
-        <w:rPr>
-          <w:rFonts w:ascii="Times New Roman" w:eastAsia="Times New Roman" w:hAnsi="Times New Roman" w:cs="Times New Roman"/>
-          <w:sz w:val="24"/>
-          <w:szCs w:val="24"/>
-          <w:lang w:eastAsia="pt-BR"/>
-        </w:rPr>
-      </w:pPr>
-      <w:proofErr w:type="spellStart"/>
-      <w:r>
-        <w:rPr>
-          <w:rFonts w:ascii="Calibri" w:eastAsia="Times New Roman" w:hAnsi="Calibri" w:cs="Calibri"/>
-          <w:color w:val="000000"/>
-          <w:lang w:eastAsia="pt-BR"/>
-        </w:rPr>
-        <w:t>xxx</w:t>
-      </w:r>
+        <w:t>.split</w:t>
+      </w:r>
+      <w:proofErr w:type="spellEnd"/>
       <w:r>
         <w:rPr>
           <w:rFonts w:ascii="Calibri" w:eastAsia="Times New Roman" w:hAnsi="Calibri" w:cs="Calibri"/>
@@ -4078,9 +3850,34 @@
           <w:color w:val="000000"/>
           <w:lang w:eastAsia="pt-BR"/>
         </w:rPr>
-        <w:t>.</w:t>
-      </w:r>
-      <w:proofErr w:type="gramStart"/>
+        <w:t>()</w:t>
+      </w:r>
+      <w:r>
+        <w:rPr>
+          <w:rFonts w:ascii="Calibri" w:eastAsia="Times New Roman" w:hAnsi="Calibri" w:cs="Calibri"/>
+          <w:color w:val="000000"/>
+          <w:lang w:eastAsia="pt-BR"/>
+        </w:rPr>
+        <w:t>: serve para dividir onde existem os espaços em branco.</w:t>
+      </w:r>
+    </w:p>
+    <w:p>
+      <w:pPr>
+        <w:spacing w:line="240" w:lineRule="auto"/>
+        <w:rPr>
+          <w:rFonts w:ascii="Calibri" w:eastAsia="Times New Roman" w:hAnsi="Calibri" w:cs="Calibri"/>
+          <w:color w:val="000000"/>
+          <w:lang w:eastAsia="pt-BR"/>
+        </w:rPr>
+      </w:pPr>
+      <w:r>
+        <w:rPr>
+          <w:rFonts w:ascii="Calibri" w:eastAsia="Times New Roman" w:hAnsi="Calibri" w:cs="Calibri"/>
+          <w:color w:val="000000"/>
+          <w:lang w:eastAsia="pt-BR"/>
+        </w:rPr>
+        <w:t>‘X’</w:t>
+      </w:r>
       <w:r>
         <w:rPr>
           <w:rFonts w:ascii="Calibri" w:eastAsia="Times New Roman" w:hAnsi="Calibri" w:cs="Calibri"/>
@@ -4089,9 +3886,9 @@
           <w:color w:val="000000"/>
           <w:lang w:eastAsia="pt-BR"/>
         </w:rPr>
-        <w:t>strip</w:t>
-      </w:r>
-      <w:proofErr w:type="spellEnd"/>
+        <w:t>.</w:t>
+      </w:r>
+      <w:proofErr w:type="spellStart"/>
       <w:r>
         <w:rPr>
           <w:rFonts w:ascii="Calibri" w:eastAsia="Times New Roman" w:hAnsi="Calibri" w:cs="Calibri"/>
@@ -4100,9 +3897,9 @@
           <w:color w:val="000000"/>
           <w:lang w:eastAsia="pt-BR"/>
         </w:rPr>
-        <w:t>(</w:t>
-      </w:r>
-      <w:proofErr w:type="gramEnd"/>
+        <w:t>join</w:t>
+      </w:r>
+      <w:proofErr w:type="spellEnd"/>
       <w:r>
         <w:rPr>
           <w:rFonts w:ascii="Calibri" w:eastAsia="Times New Roman" w:hAnsi="Calibri" w:cs="Calibri"/>
@@ -4111,27 +3908,8 @@
           <w:color w:val="000000"/>
           <w:lang w:eastAsia="pt-BR"/>
         </w:rPr>
-        <w:t>)</w:t>
-      </w:r>
-      <w:r>
-        <w:rPr>
-          <w:rFonts w:ascii="Calibri" w:eastAsia="Times New Roman" w:hAnsi="Calibri" w:cs="Calibri"/>
-          <w:color w:val="000000"/>
-          <w:lang w:eastAsia="pt-BR"/>
-        </w:rPr>
-        <w:t>: serve para remover os espaços antes e depois da sua frase</w:t>
-      </w:r>
-    </w:p>
-    <w:p>
-      <w:pPr>
-        <w:spacing w:line="240" w:lineRule="auto"/>
-        <w:rPr>
-          <w:rFonts w:ascii="Times New Roman" w:eastAsia="Times New Roman" w:hAnsi="Times New Roman" w:cs="Times New Roman"/>
-          <w:sz w:val="24"/>
-          <w:szCs w:val="24"/>
-          <w:lang w:eastAsia="pt-BR"/>
-        </w:rPr>
-      </w:pPr>
+        <w:t>(</w:t>
+      </w:r>
       <w:proofErr w:type="spellStart"/>
       <w:r>
         <w:rPr>
@@ -4141,6 +3919,7 @@
         </w:rPr>
         <w:t>xxx</w:t>
       </w:r>
+      <w:proofErr w:type="spellEnd"/>
       <w:r>
         <w:rPr>
           <w:rFonts w:ascii="Calibri" w:eastAsia="Times New Roman" w:hAnsi="Calibri" w:cs="Calibri"/>
@@ -4149,305 +3928,6 @@
           <w:color w:val="000000"/>
           <w:lang w:eastAsia="pt-BR"/>
         </w:rPr>
-        <w:t>.</w:t>
-      </w:r>
-      <w:proofErr w:type="gramStart"/>
-      <w:r>
-        <w:rPr>
-          <w:rFonts w:ascii="Calibri" w:eastAsia="Times New Roman" w:hAnsi="Calibri" w:cs="Calibri"/>
-          <w:b/>
-          <w:bCs/>
-          <w:color w:val="000000"/>
-          <w:lang w:eastAsia="pt-BR"/>
-        </w:rPr>
-        <w:t>rstrip</w:t>
-      </w:r>
-      <w:proofErr w:type="spellEnd"/>
-      <w:r>
-        <w:rPr>
-          <w:rFonts w:ascii="Calibri" w:eastAsia="Times New Roman" w:hAnsi="Calibri" w:cs="Calibri"/>
-          <w:b/>
-          <w:bCs/>
-          <w:color w:val="000000"/>
-          <w:lang w:eastAsia="pt-BR"/>
-        </w:rPr>
-        <w:t>(</w:t>
-      </w:r>
-      <w:proofErr w:type="gramEnd"/>
-      <w:r>
-        <w:rPr>
-          <w:rFonts w:ascii="Calibri" w:eastAsia="Times New Roman" w:hAnsi="Calibri" w:cs="Calibri"/>
-          <w:b/>
-          <w:bCs/>
-          <w:color w:val="000000"/>
-          <w:lang w:eastAsia="pt-BR"/>
-        </w:rPr>
-        <w:t>)</w:t>
-      </w:r>
-      <w:r>
-        <w:rPr>
-          <w:rFonts w:ascii="Calibri" w:eastAsia="Times New Roman" w:hAnsi="Calibri" w:cs="Calibri"/>
-          <w:color w:val="000000"/>
-          <w:lang w:eastAsia="pt-BR"/>
-        </w:rPr>
-        <w:t>: remove todos os espaços em brancos da direita(</w:t>
-      </w:r>
-      <w:proofErr w:type="spellStart"/>
-      <w:r>
-        <w:rPr>
-          <w:rFonts w:ascii="Calibri" w:eastAsia="Times New Roman" w:hAnsi="Calibri" w:cs="Calibri"/>
-          <w:color w:val="000000"/>
-          <w:lang w:eastAsia="pt-BR"/>
-        </w:rPr>
-        <w:t>right</w:t>
-      </w:r>
-      <w:proofErr w:type="spellEnd"/>
-      <w:r>
-        <w:rPr>
-          <w:rFonts w:ascii="Calibri" w:eastAsia="Times New Roman" w:hAnsi="Calibri" w:cs="Calibri"/>
-          <w:color w:val="000000"/>
-          <w:lang w:eastAsia="pt-BR"/>
-        </w:rPr>
-        <w:t>)</w:t>
-      </w:r>
-    </w:p>
-    <w:p>
-      <w:pPr>
-        <w:spacing w:line="240" w:lineRule="auto"/>
-        <w:rPr>
-          <w:rFonts w:ascii="Times New Roman" w:eastAsia="Times New Roman" w:hAnsi="Times New Roman" w:cs="Times New Roman"/>
-          <w:sz w:val="24"/>
-          <w:szCs w:val="24"/>
-          <w:lang w:eastAsia="pt-BR"/>
-        </w:rPr>
-      </w:pPr>
-      <w:proofErr w:type="spellStart"/>
-      <w:r>
-        <w:rPr>
-          <w:rFonts w:ascii="Calibri" w:eastAsia="Times New Roman" w:hAnsi="Calibri" w:cs="Calibri"/>
-          <w:color w:val="000000"/>
-          <w:lang w:eastAsia="pt-BR"/>
-        </w:rPr>
-        <w:t>xxx</w:t>
-      </w:r>
-      <w:r>
-        <w:rPr>
-          <w:rFonts w:ascii="Calibri" w:eastAsia="Times New Roman" w:hAnsi="Calibri" w:cs="Calibri"/>
-          <w:b/>
-          <w:bCs/>
-          <w:color w:val="000000"/>
-          <w:lang w:eastAsia="pt-BR"/>
-        </w:rPr>
-        <w:t>.</w:t>
-      </w:r>
-      <w:proofErr w:type="gramStart"/>
-      <w:r>
-        <w:rPr>
-          <w:rFonts w:ascii="Calibri" w:eastAsia="Times New Roman" w:hAnsi="Calibri" w:cs="Calibri"/>
-          <w:b/>
-          <w:bCs/>
-          <w:color w:val="000000"/>
-          <w:lang w:eastAsia="pt-BR"/>
-        </w:rPr>
-        <w:t>lstrip</w:t>
-      </w:r>
-      <w:proofErr w:type="spellEnd"/>
-      <w:r>
-        <w:rPr>
-          <w:rFonts w:ascii="Calibri" w:eastAsia="Times New Roman" w:hAnsi="Calibri" w:cs="Calibri"/>
-          <w:b/>
-          <w:bCs/>
-          <w:color w:val="000000"/>
-          <w:lang w:eastAsia="pt-BR"/>
-        </w:rPr>
-        <w:t>(</w:t>
-      </w:r>
-      <w:proofErr w:type="gramEnd"/>
-      <w:r>
-        <w:rPr>
-          <w:rFonts w:ascii="Calibri" w:eastAsia="Times New Roman" w:hAnsi="Calibri" w:cs="Calibri"/>
-          <w:b/>
-          <w:bCs/>
-          <w:color w:val="000000"/>
-          <w:lang w:eastAsia="pt-BR"/>
-        </w:rPr>
-        <w:t>)</w:t>
-      </w:r>
-      <w:r>
-        <w:rPr>
-          <w:rFonts w:ascii="Calibri" w:eastAsia="Times New Roman" w:hAnsi="Calibri" w:cs="Calibri"/>
-          <w:color w:val="000000"/>
-          <w:lang w:eastAsia="pt-BR"/>
-        </w:rPr>
-        <w:t>: remove todos os espaços em branco da esquerda(</w:t>
-      </w:r>
-      <w:proofErr w:type="spellStart"/>
-      <w:r>
-        <w:rPr>
-          <w:rFonts w:ascii="Calibri" w:eastAsia="Times New Roman" w:hAnsi="Calibri" w:cs="Calibri"/>
-          <w:color w:val="000000"/>
-          <w:lang w:eastAsia="pt-BR"/>
-        </w:rPr>
-        <w:t>left</w:t>
-      </w:r>
-      <w:proofErr w:type="spellEnd"/>
-      <w:r>
-        <w:rPr>
-          <w:rFonts w:ascii="Calibri" w:eastAsia="Times New Roman" w:hAnsi="Calibri" w:cs="Calibri"/>
-          <w:color w:val="000000"/>
-          <w:lang w:eastAsia="pt-BR"/>
-        </w:rPr>
-        <w:t>)</w:t>
-      </w:r>
-    </w:p>
-    <w:p>
-      <w:pPr>
-        <w:spacing w:line="240" w:lineRule="auto"/>
-        <w:rPr>
-          <w:rFonts w:ascii="Times New Roman" w:eastAsia="Times New Roman" w:hAnsi="Times New Roman" w:cs="Times New Roman"/>
-          <w:sz w:val="24"/>
-          <w:szCs w:val="24"/>
-          <w:lang w:eastAsia="pt-BR"/>
-        </w:rPr>
-      </w:pPr>
-      <w:proofErr w:type="spellStart"/>
-      <w:r>
-        <w:rPr>
-          <w:rFonts w:ascii="Calibri" w:eastAsia="Times New Roman" w:hAnsi="Calibri" w:cs="Calibri"/>
-          <w:color w:val="000000"/>
-          <w:lang w:eastAsia="pt-BR"/>
-        </w:rPr>
-        <w:t>xxx</w:t>
-      </w:r>
-      <w:r>
-        <w:rPr>
-          <w:rFonts w:ascii="Calibri" w:eastAsia="Times New Roman" w:hAnsi="Calibri" w:cs="Calibri"/>
-          <w:b/>
-          <w:bCs/>
-          <w:color w:val="000000"/>
-          <w:lang w:eastAsia="pt-BR"/>
-        </w:rPr>
-        <w:t>.</w:t>
-      </w:r>
-      <w:proofErr w:type="gramStart"/>
-      <w:r>
-        <w:rPr>
-          <w:rFonts w:ascii="Calibri" w:eastAsia="Times New Roman" w:hAnsi="Calibri" w:cs="Calibri"/>
-          <w:b/>
-          <w:bCs/>
-          <w:color w:val="000000"/>
-          <w:lang w:eastAsia="pt-BR"/>
-        </w:rPr>
-        <w:t>split</w:t>
-      </w:r>
-      <w:proofErr w:type="spellEnd"/>
-      <w:r>
-        <w:rPr>
-          <w:rFonts w:ascii="Calibri" w:eastAsia="Times New Roman" w:hAnsi="Calibri" w:cs="Calibri"/>
-          <w:b/>
-          <w:bCs/>
-          <w:color w:val="000000"/>
-          <w:lang w:eastAsia="pt-BR"/>
-        </w:rPr>
-        <w:t>(</w:t>
-      </w:r>
-      <w:proofErr w:type="gramEnd"/>
-      <w:r>
-        <w:rPr>
-          <w:rFonts w:ascii="Calibri" w:eastAsia="Times New Roman" w:hAnsi="Calibri" w:cs="Calibri"/>
-          <w:b/>
-          <w:bCs/>
-          <w:color w:val="000000"/>
-          <w:lang w:eastAsia="pt-BR"/>
-        </w:rPr>
-        <w:t>)</w:t>
-      </w:r>
-      <w:r>
-        <w:rPr>
-          <w:rFonts w:ascii="Calibri" w:eastAsia="Times New Roman" w:hAnsi="Calibri" w:cs="Calibri"/>
-          <w:color w:val="000000"/>
-          <w:lang w:eastAsia="pt-BR"/>
-        </w:rPr>
-        <w:t>: serve para dividir onde existem os espaços em branco.</w:t>
-      </w:r>
-    </w:p>
-    <w:p>
-      <w:pPr>
-        <w:spacing w:line="240" w:lineRule="auto"/>
-        <w:rPr>
-          <w:rFonts w:ascii="Calibri" w:eastAsia="Times New Roman" w:hAnsi="Calibri" w:cs="Calibri"/>
-          <w:color w:val="000000"/>
-          <w:lang w:eastAsia="pt-BR"/>
-        </w:rPr>
-      </w:pPr>
-      <w:r>
-        <w:rPr>
-          <w:rFonts w:ascii="Calibri" w:eastAsia="Times New Roman" w:hAnsi="Calibri" w:cs="Calibri"/>
-          <w:color w:val="000000"/>
-          <w:lang w:eastAsia="pt-BR"/>
-        </w:rPr>
-        <w:t>‘X</w:t>
-      </w:r>
-      <w:proofErr w:type="gramStart"/>
-      <w:r>
-        <w:rPr>
-          <w:rFonts w:ascii="Calibri" w:eastAsia="Times New Roman" w:hAnsi="Calibri" w:cs="Calibri"/>
-          <w:color w:val="000000"/>
-          <w:lang w:eastAsia="pt-BR"/>
-        </w:rPr>
-        <w:t>’</w:t>
-      </w:r>
-      <w:r>
-        <w:rPr>
-          <w:rFonts w:ascii="Calibri" w:eastAsia="Times New Roman" w:hAnsi="Calibri" w:cs="Calibri"/>
-          <w:b/>
-          <w:bCs/>
-          <w:color w:val="000000"/>
-          <w:lang w:eastAsia="pt-BR"/>
-        </w:rPr>
-        <w:t>.</w:t>
-      </w:r>
-      <w:proofErr w:type="spellStart"/>
-      <w:r>
-        <w:rPr>
-          <w:rFonts w:ascii="Calibri" w:eastAsia="Times New Roman" w:hAnsi="Calibri" w:cs="Calibri"/>
-          <w:b/>
-          <w:bCs/>
-          <w:color w:val="000000"/>
-          <w:lang w:eastAsia="pt-BR"/>
-        </w:rPr>
-        <w:t>join</w:t>
-      </w:r>
-      <w:proofErr w:type="spellEnd"/>
-      <w:proofErr w:type="gramEnd"/>
-      <w:r>
-        <w:rPr>
-          <w:rFonts w:ascii="Calibri" w:eastAsia="Times New Roman" w:hAnsi="Calibri" w:cs="Calibri"/>
-          <w:b/>
-          <w:bCs/>
-          <w:color w:val="000000"/>
-          <w:lang w:eastAsia="pt-BR"/>
-        </w:rPr>
-        <w:t>(</w:t>
-      </w:r>
-      <w:proofErr w:type="spellStart"/>
-      <w:r>
-        <w:rPr>
-          <w:rFonts w:ascii="Calibri" w:eastAsia="Times New Roman" w:hAnsi="Calibri" w:cs="Calibri"/>
-          <w:color w:val="000000"/>
-          <w:lang w:eastAsia="pt-BR"/>
-        </w:rPr>
-        <w:t>xxx</w:t>
-      </w:r>
-      <w:proofErr w:type="spellEnd"/>
-      <w:r>
-        <w:rPr>
-          <w:rFonts w:ascii="Calibri" w:eastAsia="Times New Roman" w:hAnsi="Calibri" w:cs="Calibri"/>
-          <w:b/>
-          <w:bCs/>
-          <w:color w:val="000000"/>
-          <w:lang w:eastAsia="pt-BR"/>
-        </w:rPr>
         <w:t xml:space="preserve">): </w:t>
       </w:r>
       <w:r>
@@ -4499,31 +3979,14 @@
           <w:color w:val="000000"/>
           <w:lang w:eastAsia="pt-BR"/>
         </w:rPr>
-        <w:t xml:space="preserve">e ^5 quer dizer </w:t>
-      </w:r>
-      <w:proofErr w:type="gramStart"/>
-      <w:r>
-        <w:rPr>
-          <w:rFonts w:ascii="Calibri" w:eastAsia="Times New Roman" w:hAnsi="Calibri" w:cs="Calibri"/>
-          <w:color w:val="000000"/>
-          <w:lang w:eastAsia="pt-BR"/>
-        </w:rPr>
-        <w:t xml:space="preserve">para </w:t>
+        <w:t xml:space="preserve">e ^5 quer dizer para </w:t>
       </w:r>
       <w:r>
         <w:rPr>
           <w:rFonts w:ascii="Calibri" w:hAnsi="Calibri" w:cs="Calibri"/>
           <w:color w:val="000000"/>
         </w:rPr>
-        <w:t>:</w:t>
-      </w:r>
-      <w:proofErr w:type="gramEnd"/>
-      <w:r>
-        <w:rPr>
-          <w:rFonts w:ascii="Calibri" w:hAnsi="Calibri" w:cs="Calibri"/>
-          <w:color w:val="000000"/>
-        </w:rPr>
-        <w:t xml:space="preserve"> ^5 → instrução de formatação:</w:t>
+        <w:t>: ^5 → instrução de formatação:</w:t>
       </w:r>
     </w:p>
     <w:p>
@@ -4579,7 +4042,6 @@
           <w:lang w:eastAsia="pt-BR"/>
         </w:rPr>
       </w:pPr>
-      <w:proofErr w:type="gramStart"/>
       <w:r>
         <w:rPr>
           <w:rFonts w:ascii="Calibri" w:eastAsia="Times New Roman" w:hAnsi="Calibri" w:cs="Calibri"/>
@@ -4588,18 +4050,16 @@
         </w:rPr>
         <w:t>[  1  ]</w:t>
       </w:r>
-      <w:proofErr w:type="gramEnd"/>
-    </w:p>
-    <w:p>
-      <w:pPr>
-        <w:spacing w:line="240" w:lineRule="auto"/>
-        <w:rPr>
-          <w:rFonts w:ascii="Calibri" w:eastAsia="Times New Roman" w:hAnsi="Calibri" w:cs="Calibri"/>
-          <w:color w:val="000000"/>
-          <w:lang w:eastAsia="pt-BR"/>
-        </w:rPr>
-      </w:pPr>
-      <w:proofErr w:type="gramStart"/>
+    </w:p>
+    <w:p>
+      <w:pPr>
+        <w:spacing w:line="240" w:lineRule="auto"/>
+        <w:rPr>
+          <w:rFonts w:ascii="Calibri" w:eastAsia="Times New Roman" w:hAnsi="Calibri" w:cs="Calibri"/>
+          <w:color w:val="000000"/>
+          <w:lang w:eastAsia="pt-BR"/>
+        </w:rPr>
+      </w:pPr>
       <w:r>
         <w:rPr>
           <w:rFonts w:ascii="Calibri" w:eastAsia="Times New Roman" w:hAnsi="Calibri" w:cs="Calibri"/>
@@ -4608,34 +4068,23 @@
         </w:rPr>
         <w:t>[ 22  ]</w:t>
       </w:r>
-      <w:proofErr w:type="gramEnd"/>
-    </w:p>
-    <w:p>
-      <w:pPr>
-        <w:spacing w:line="240" w:lineRule="auto"/>
-        <w:rPr>
-          <w:rFonts w:ascii="Calibri" w:eastAsia="Times New Roman" w:hAnsi="Calibri" w:cs="Calibri"/>
-          <w:color w:val="000000"/>
-          <w:lang w:eastAsia="pt-BR"/>
-        </w:rPr>
-      </w:pPr>
-      <w:proofErr w:type="gramStart"/>
-      <w:r>
-        <w:rPr>
-          <w:rFonts w:ascii="Calibri" w:eastAsia="Times New Roman" w:hAnsi="Calibri" w:cs="Calibri"/>
-          <w:color w:val="000000"/>
-          <w:lang w:eastAsia="pt-BR"/>
-        </w:rPr>
-        <w:t>[ 333</w:t>
-      </w:r>
-      <w:proofErr w:type="gramEnd"/>
-      <w:r>
-        <w:rPr>
-          <w:rFonts w:ascii="Calibri" w:eastAsia="Times New Roman" w:hAnsi="Calibri" w:cs="Calibri"/>
-          <w:color w:val="000000"/>
-          <w:lang w:eastAsia="pt-BR"/>
-        </w:rPr>
-        <w:t xml:space="preserve"> ]</w:t>
+    </w:p>
+    <w:p>
+      <w:pPr>
+        <w:spacing w:line="240" w:lineRule="auto"/>
+        <w:rPr>
+          <w:rFonts w:ascii="Calibri" w:eastAsia="Times New Roman" w:hAnsi="Calibri" w:cs="Calibri"/>
+          <w:color w:val="000000"/>
+          <w:lang w:eastAsia="pt-BR"/>
+        </w:rPr>
+      </w:pPr>
+      <w:r>
+        <w:rPr>
+          <w:rFonts w:ascii="Calibri" w:eastAsia="Times New Roman" w:hAnsi="Calibri" w:cs="Calibri"/>
+          <w:color w:val="000000"/>
+          <w:lang w:eastAsia="pt-BR"/>
+        </w:rPr>
+        <w:t>[ 333 ]</w:t>
       </w:r>
     </w:p>
     <w:p>
@@ -4717,7 +4166,6 @@
         </w:rPr>
       </w:pPr>
       <w:proofErr w:type="spellStart"/>
-      <w:proofErr w:type="gramStart"/>
       <w:r>
         <w:rPr>
           <w:rFonts w:ascii="Calibri" w:eastAsia="Times New Roman" w:hAnsi="Calibri" w:cs="Calibri"/>
@@ -4745,18 +4193,7 @@
           <w:color w:val="000000"/>
           <w:lang w:eastAsia="pt-BR"/>
         </w:rPr>
-        <w:t>(</w:t>
-      </w:r>
-      <w:proofErr w:type="gramEnd"/>
-      <w:r>
-        <w:rPr>
-          <w:rFonts w:ascii="Calibri" w:eastAsia="Times New Roman" w:hAnsi="Calibri" w:cs="Calibri"/>
-          <w:b/>
-          <w:bCs/>
-          <w:color w:val="000000"/>
-          <w:lang w:eastAsia="pt-BR"/>
-        </w:rPr>
-        <w:t>):</w:t>
+        <w:t>():</w:t>
       </w:r>
     </w:p>
     <w:p>
@@ -5193,25 +4630,7 @@
           <w:color w:val="000000"/>
           <w:lang w:eastAsia="pt-BR"/>
         </w:rPr>
-        <w:t xml:space="preserve">for c in </w:t>
-      </w:r>
-      <w:proofErr w:type="gramStart"/>
-      <w:r>
-        <w:rPr>
-          <w:rFonts w:ascii="Calibri" w:eastAsia="Times New Roman" w:hAnsi="Calibri" w:cs="Calibri"/>
-          <w:color w:val="000000"/>
-          <w:lang w:eastAsia="pt-BR"/>
-        </w:rPr>
-        <w:t>range(</w:t>
-      </w:r>
-      <w:proofErr w:type="gramEnd"/>
-      <w:r>
-        <w:rPr>
-          <w:rFonts w:ascii="Calibri" w:eastAsia="Times New Roman" w:hAnsi="Calibri" w:cs="Calibri"/>
-          <w:color w:val="000000"/>
-          <w:lang w:eastAsia="pt-BR"/>
-        </w:rPr>
-        <w:t>0,3): </w:t>
+        <w:t>for c in range(0,3): </w:t>
       </w:r>
     </w:p>
     <w:p>
@@ -5288,25 +4707,7 @@
           <w:color w:val="000000"/>
           <w:lang w:eastAsia="pt-BR"/>
         </w:rPr>
-        <w:t>Na contagem regressiva você coloca -</w:t>
-      </w:r>
-      <w:proofErr w:type="gramStart"/>
-      <w:r>
-        <w:rPr>
-          <w:rFonts w:ascii="Calibri" w:eastAsia="Times New Roman" w:hAnsi="Calibri" w:cs="Calibri"/>
-          <w:color w:val="000000"/>
-          <w:lang w:eastAsia="pt-BR"/>
-        </w:rPr>
-        <w:t>1  no</w:t>
-      </w:r>
-      <w:proofErr w:type="gramEnd"/>
-      <w:r>
-        <w:rPr>
-          <w:rFonts w:ascii="Calibri" w:eastAsia="Times New Roman" w:hAnsi="Calibri" w:cs="Calibri"/>
-          <w:color w:val="000000"/>
-          <w:lang w:eastAsia="pt-BR"/>
-        </w:rPr>
-        <w:t xml:space="preserve"> final</w:t>
+        <w:t>Na contagem regressiva você coloca -1  no final</w:t>
       </w:r>
     </w:p>
     <w:p>
@@ -5354,25 +4755,7 @@
           <w:color w:val="000000"/>
           <w:lang w:eastAsia="pt-BR"/>
         </w:rPr>
-        <w:t xml:space="preserve">for c in </w:t>
-      </w:r>
-      <w:proofErr w:type="gramStart"/>
-      <w:r>
-        <w:rPr>
-          <w:rFonts w:ascii="Calibri" w:eastAsia="Times New Roman" w:hAnsi="Calibri" w:cs="Calibri"/>
-          <w:color w:val="000000"/>
-          <w:lang w:eastAsia="pt-BR"/>
-        </w:rPr>
-        <w:t>range(</w:t>
-      </w:r>
-      <w:proofErr w:type="gramEnd"/>
-      <w:r>
-        <w:rPr>
-          <w:rFonts w:ascii="Calibri" w:eastAsia="Times New Roman" w:hAnsi="Calibri" w:cs="Calibri"/>
-          <w:color w:val="000000"/>
-          <w:lang w:eastAsia="pt-BR"/>
-        </w:rPr>
-        <w:t>0, 10, -1)</w:t>
+        <w:t>for c in range(0, 10, -1)</w:t>
       </w:r>
     </w:p>
     <w:p>
@@ -5489,7 +4872,6 @@
         <w:t xml:space="preserve">for c in </w:t>
       </w:r>
       <w:proofErr w:type="spellStart"/>
-      <w:proofErr w:type="gramStart"/>
       <w:r>
         <w:rPr>
           <w:rFonts w:ascii="Calibri" w:eastAsia="Times New Roman" w:hAnsi="Calibri" w:cs="Calibri"/>
@@ -5505,16 +4887,7 @@
           <w:color w:val="000000"/>
           <w:lang w:eastAsia="pt-BR"/>
         </w:rPr>
-        <w:t>(</w:t>
-      </w:r>
-      <w:proofErr w:type="gramEnd"/>
-      <w:r>
-        <w:rPr>
-          <w:rFonts w:ascii="Calibri" w:eastAsia="Times New Roman" w:hAnsi="Calibri" w:cs="Calibri"/>
-          <w:color w:val="000000"/>
-          <w:lang w:eastAsia="pt-BR"/>
-        </w:rPr>
-        <w:t>1, 10, 2)</w:t>
+        <w:t>(1, 10, 2)</w:t>
       </w:r>
     </w:p>
     <w:p>
@@ -5650,23 +5023,13 @@
           <w:lang w:eastAsia="pt-BR"/>
         </w:rPr>
       </w:pPr>
-      <w:proofErr w:type="gramStart"/>
-      <w:r>
-        <w:rPr>
-          <w:rFonts w:ascii="Calibri" w:eastAsia="Times New Roman" w:hAnsi="Calibri" w:cs="Calibri"/>
-          <w:color w:val="000000"/>
-          <w:lang w:eastAsia="pt-BR"/>
-        </w:rPr>
-        <w:t>condição( teste</w:t>
-      </w:r>
-      <w:proofErr w:type="gramEnd"/>
-      <w:r>
-        <w:rPr>
-          <w:rFonts w:ascii="Calibri" w:eastAsia="Times New Roman" w:hAnsi="Calibri" w:cs="Calibri"/>
-          <w:color w:val="000000"/>
-          <w:lang w:eastAsia="pt-BR"/>
-        </w:rPr>
-        <w:t xml:space="preserve"> logico)</w:t>
+      <w:r>
+        <w:rPr>
+          <w:rFonts w:ascii="Calibri" w:eastAsia="Times New Roman" w:hAnsi="Calibri" w:cs="Calibri"/>
+          <w:color w:val="000000"/>
+          <w:lang w:eastAsia="pt-BR"/>
+        </w:rPr>
+        <w:t>condição( teste logico)</w:t>
       </w:r>
     </w:p>
     <w:p>
@@ -5834,23 +5197,13 @@
           <w:lang w:eastAsia="pt-BR"/>
         </w:rPr>
       </w:pPr>
-      <w:proofErr w:type="gramStart"/>
-      <w:r>
-        <w:rPr>
-          <w:rFonts w:ascii="Calibri" w:eastAsia="Times New Roman" w:hAnsi="Calibri" w:cs="Calibri"/>
-          <w:color w:val="000000"/>
-          <w:lang w:eastAsia="pt-BR"/>
-        </w:rPr>
-        <w:t>print(</w:t>
-      </w:r>
-      <w:proofErr w:type="gramEnd"/>
-      <w:r>
-        <w:rPr>
-          <w:rFonts w:ascii="Calibri" w:eastAsia="Times New Roman" w:hAnsi="Calibri" w:cs="Calibri"/>
-          <w:color w:val="000000"/>
-          <w:lang w:eastAsia="pt-BR"/>
-        </w:rPr>
-        <w:t>"Fim do Loop")</w:t>
+      <w:r>
+        <w:rPr>
+          <w:rFonts w:ascii="Calibri" w:eastAsia="Times New Roman" w:hAnsi="Calibri" w:cs="Calibri"/>
+          <w:color w:val="000000"/>
+          <w:lang w:eastAsia="pt-BR"/>
+        </w:rPr>
+        <w:t>print("Fim do Loop")</w:t>
       </w:r>
     </w:p>
     <w:p>
@@ -6053,23 +5406,13 @@
           <w:lang w:eastAsia="pt-BR"/>
         </w:rPr>
       </w:pPr>
-      <w:proofErr w:type="gramStart"/>
-      <w:r>
-        <w:rPr>
-          <w:rFonts w:ascii="Calibri" w:eastAsia="Times New Roman" w:hAnsi="Calibri" w:cs="Calibri"/>
-          <w:color w:val="000000"/>
-          <w:lang w:eastAsia="pt-BR"/>
-        </w:rPr>
-        <w:t>print(</w:t>
-      </w:r>
-      <w:proofErr w:type="gramEnd"/>
-      <w:r>
-        <w:rPr>
-          <w:rFonts w:ascii="Calibri" w:eastAsia="Times New Roman" w:hAnsi="Calibri" w:cs="Calibri"/>
-          <w:color w:val="000000"/>
-          <w:lang w:eastAsia="pt-BR"/>
-        </w:rPr>
-        <w:t>"Fim do Loop")</w:t>
+      <w:r>
+        <w:rPr>
+          <w:rFonts w:ascii="Calibri" w:eastAsia="Times New Roman" w:hAnsi="Calibri" w:cs="Calibri"/>
+          <w:color w:val="000000"/>
+          <w:lang w:eastAsia="pt-BR"/>
+        </w:rPr>
+        <w:t>print("Fim do Loop")</w:t>
       </w:r>
     </w:p>
     <w:p>
@@ -6107,43 +5450,7 @@
           <w:color w:val="000000"/>
           <w:lang w:eastAsia="pt-BR"/>
         </w:rPr>
-        <w:t xml:space="preserve">Tuplas: as tuplas são </w:t>
-      </w:r>
-      <w:proofErr w:type="gramStart"/>
-      <w:r>
-        <w:rPr>
-          <w:rFonts w:ascii="Calibri" w:eastAsia="Times New Roman" w:hAnsi="Calibri" w:cs="Calibri"/>
-          <w:color w:val="000000"/>
-          <w:lang w:eastAsia="pt-BR"/>
-        </w:rPr>
-        <w:t>imutáveis  ou</w:t>
-      </w:r>
-      <w:proofErr w:type="gramEnd"/>
-      <w:r>
-        <w:rPr>
-          <w:rFonts w:ascii="Calibri" w:eastAsia="Times New Roman" w:hAnsi="Calibri" w:cs="Calibri"/>
-          <w:color w:val="000000"/>
-          <w:lang w:eastAsia="pt-BR"/>
-        </w:rPr>
-        <w:t xml:space="preserve"> seja, não pode ser mudada de jeito nenhum se é declarada ela fica armazenada </w:t>
-      </w:r>
-      <w:proofErr w:type="gramStart"/>
-      <w:r>
-        <w:rPr>
-          <w:rFonts w:ascii="Calibri" w:eastAsia="Times New Roman" w:hAnsi="Calibri" w:cs="Calibri"/>
-          <w:color w:val="000000"/>
-          <w:lang w:eastAsia="pt-BR"/>
-        </w:rPr>
-        <w:t>pra</w:t>
-      </w:r>
-      <w:proofErr w:type="gramEnd"/>
-      <w:r>
-        <w:rPr>
-          <w:rFonts w:ascii="Calibri" w:eastAsia="Times New Roman" w:hAnsi="Calibri" w:cs="Calibri"/>
-          <w:color w:val="000000"/>
-          <w:lang w:eastAsia="pt-BR"/>
-        </w:rPr>
-        <w:t xml:space="preserve"> sempre </w:t>
+        <w:t>Tuplas: as tuplas são imutáveis  ou seja, não pode ser mudada de jeito nenhum se é declarada ela fica armazenada pra sempre </w:t>
       </w:r>
     </w:p>
     <w:p>
@@ -6181,53 +5488,26 @@
           <w:color w:val="000000"/>
           <w:lang w:eastAsia="pt-BR"/>
         </w:rPr>
-        <w:t xml:space="preserve">A tupla pode ser </w:t>
-      </w:r>
-      <w:proofErr w:type="gramStart"/>
-      <w:r>
-        <w:rPr>
-          <w:rFonts w:ascii="Calibri" w:eastAsia="Times New Roman" w:hAnsi="Calibri" w:cs="Calibri"/>
-          <w:color w:val="000000"/>
-          <w:lang w:eastAsia="pt-BR"/>
-        </w:rPr>
-        <w:t>apagada</w:t>
-      </w:r>
-      <w:proofErr w:type="gramEnd"/>
-      <w:r>
-        <w:rPr>
-          <w:rFonts w:ascii="Calibri" w:eastAsia="Times New Roman" w:hAnsi="Calibri" w:cs="Calibri"/>
-          <w:color w:val="000000"/>
-          <w:lang w:eastAsia="pt-BR"/>
-        </w:rPr>
-        <w:t xml:space="preserve"> mas não mudada</w:t>
-      </w:r>
-    </w:p>
-    <w:p>
-      <w:pPr>
-        <w:spacing w:line="240" w:lineRule="auto"/>
-        <w:rPr>
-          <w:rFonts w:ascii="Times New Roman" w:eastAsia="Times New Roman" w:hAnsi="Times New Roman" w:cs="Times New Roman"/>
-          <w:sz w:val="24"/>
-          <w:szCs w:val="24"/>
-          <w:lang w:eastAsia="pt-BR"/>
-        </w:rPr>
-      </w:pPr>
-      <w:r>
-        <w:rPr>
-          <w:rFonts w:ascii="Calibri" w:eastAsia="Times New Roman" w:hAnsi="Calibri" w:cs="Calibri"/>
-          <w:color w:val="000000"/>
-          <w:lang w:eastAsia="pt-BR"/>
-        </w:rPr>
-        <w:t xml:space="preserve">Para apagar algo basta </w:t>
-      </w:r>
-      <w:proofErr w:type="gramStart"/>
-      <w:r>
-        <w:rPr>
-          <w:rFonts w:ascii="Calibri" w:eastAsia="Times New Roman" w:hAnsi="Calibri" w:cs="Calibri"/>
-          <w:color w:val="000000"/>
-          <w:lang w:eastAsia="pt-BR"/>
-        </w:rPr>
-        <w:t xml:space="preserve">colocar  </w:t>
+        <w:t>A tupla pode ser apagada mas não mudada</w:t>
+      </w:r>
+    </w:p>
+    <w:p>
+      <w:pPr>
+        <w:spacing w:line="240" w:lineRule="auto"/>
+        <w:rPr>
+          <w:rFonts w:ascii="Times New Roman" w:eastAsia="Times New Roman" w:hAnsi="Times New Roman" w:cs="Times New Roman"/>
+          <w:sz w:val="24"/>
+          <w:szCs w:val="24"/>
+          <w:lang w:eastAsia="pt-BR"/>
+        </w:rPr>
+      </w:pPr>
+      <w:r>
+        <w:rPr>
+          <w:rFonts w:ascii="Calibri" w:eastAsia="Times New Roman" w:hAnsi="Calibri" w:cs="Calibri"/>
+          <w:color w:val="000000"/>
+          <w:lang w:eastAsia="pt-BR"/>
+        </w:rPr>
+        <w:t xml:space="preserve">Para apagar algo basta colocar  </w:t>
       </w:r>
       <w:proofErr w:type="spellStart"/>
       <w:r>
@@ -6239,7 +5519,6 @@
         <w:t>del</w:t>
       </w:r>
       <w:proofErr w:type="spellEnd"/>
-      <w:proofErr w:type="gramEnd"/>
       <w:r>
         <w:rPr>
           <w:rFonts w:ascii="Calibri" w:eastAsia="Times New Roman" w:hAnsi="Calibri" w:cs="Calibri"/>
@@ -6309,20 +5588,8 @@
           <w:lang w:eastAsia="pt-BR"/>
         </w:rPr>
         <w:lastRenderedPageBreak/>
-        <w:t xml:space="preserve">Variáveis compostas podem armazenar </w:t>
-      </w:r>
-      <w:proofErr w:type="gramStart"/>
-      <w:r>
-        <w:rPr>
-          <w:rFonts w:ascii="Calibri" w:eastAsia="Times New Roman" w:hAnsi="Calibri" w:cs="Calibri"/>
-          <w:color w:val="000000"/>
-          <w:sz w:val="28"/>
-          <w:szCs w:val="28"/>
-          <w:lang w:eastAsia="pt-BR"/>
-        </w:rPr>
-        <w:t>varias</w:t>
-      </w:r>
-      <w:proofErr w:type="gramEnd"/>
+        <w:t>Variáveis compostas podem armazenar varias</w:t>
+      </w:r>
     </w:p>
     <w:p>
       <w:pPr>
@@ -6402,7 +5669,7 @@
                     <pic:cNvPicPr/>
                   </pic:nvPicPr>
                   <pic:blipFill>
-                    <a:blip r:embed="rId5"/>
+                    <a:blip r:embed="rId7"/>
                     <a:stretch>
                       <a:fillRect/>
                     </a:stretch>
@@ -6441,29 +5708,7 @@
           <w:szCs w:val="24"/>
           <w:lang w:eastAsia="pt-BR"/>
         </w:rPr>
-        <w:t xml:space="preserve">Pode mandar printar algo em </w:t>
-      </w:r>
-      <w:proofErr w:type="gramStart"/>
-      <w:r>
-        <w:rPr>
-          <w:rFonts w:ascii="Calibri" w:eastAsia="Times New Roman" w:hAnsi="Calibri" w:cs="Calibri"/>
-          <w:color w:val="000000"/>
-          <w:sz w:val="24"/>
-          <w:szCs w:val="24"/>
-          <w:lang w:eastAsia="pt-BR"/>
-        </w:rPr>
-        <w:t>especifico</w:t>
-      </w:r>
-      <w:proofErr w:type="gramEnd"/>
-      <w:r>
-        <w:rPr>
-          <w:rFonts w:ascii="Calibri" w:eastAsia="Times New Roman" w:hAnsi="Calibri" w:cs="Calibri"/>
-          <w:color w:val="000000"/>
-          <w:sz w:val="24"/>
-          <w:szCs w:val="24"/>
-          <w:lang w:eastAsia="pt-BR"/>
-        </w:rPr>
-        <w:t xml:space="preserve"> em uma tupla, utilizando comandos de texto</w:t>
+        <w:t>Pode mandar printar algo em especifico em uma tupla, utilizando comandos de texto</w:t>
       </w:r>
     </w:p>
     <w:p>
@@ -6641,25 +5886,7 @@
           <w:color w:val="000000"/>
           <w:lang w:eastAsia="pt-BR"/>
         </w:rPr>
-        <w:t xml:space="preserve">Para fazer listas basta colocar eles entre colchetes </w:t>
-      </w:r>
-      <w:proofErr w:type="gramStart"/>
-      <w:r>
-        <w:rPr>
-          <w:rFonts w:ascii="Calibri" w:eastAsia="Times New Roman" w:hAnsi="Calibri" w:cs="Calibri"/>
-          <w:color w:val="000000"/>
-          <w:lang w:eastAsia="pt-BR"/>
-        </w:rPr>
-        <w:t>[ ].elas</w:t>
-      </w:r>
-      <w:proofErr w:type="gramEnd"/>
-      <w:r>
-        <w:rPr>
-          <w:rFonts w:ascii="Calibri" w:eastAsia="Times New Roman" w:hAnsi="Calibri" w:cs="Calibri"/>
-          <w:color w:val="000000"/>
-          <w:lang w:eastAsia="pt-BR"/>
-        </w:rPr>
-        <w:t xml:space="preserve"> podem ser modificadas.</w:t>
+        <w:t>Para fazer listas basta colocar eles entre colchetes [ ].elas podem ser modificadas.</w:t>
       </w:r>
     </w:p>
     <w:p>
@@ -6794,7 +6021,6 @@
         </w:rPr>
       </w:pPr>
       <w:proofErr w:type="spellStart"/>
-      <w:proofErr w:type="gramStart"/>
       <w:r>
         <w:rPr>
           <w:rFonts w:ascii="Calibri" w:eastAsia="Times New Roman" w:hAnsi="Calibri" w:cs="Calibri"/>
@@ -6804,7 +6030,6 @@
         <w:t>lanche.append</w:t>
       </w:r>
       <w:proofErr w:type="spellEnd"/>
-      <w:proofErr w:type="gramEnd"/>
       <w:r>
         <w:rPr>
           <w:rFonts w:ascii="Calibri" w:eastAsia="Times New Roman" w:hAnsi="Calibri" w:cs="Calibri"/>
@@ -6894,7 +6119,6 @@
         </w:rPr>
       </w:pPr>
       <w:proofErr w:type="spellStart"/>
-      <w:proofErr w:type="gramStart"/>
       <w:r>
         <w:rPr>
           <w:rFonts w:ascii="Calibri" w:eastAsia="Times New Roman" w:hAnsi="Calibri" w:cs="Calibri"/>
@@ -6904,32 +6128,13 @@
         <w:t>lanche.insert</w:t>
       </w:r>
       <w:proofErr w:type="spellEnd"/>
-      <w:proofErr w:type="gramEnd"/>
-      <w:r>
-        <w:rPr>
-          <w:rFonts w:ascii="Calibri" w:eastAsia="Times New Roman" w:hAnsi="Calibri" w:cs="Calibri"/>
-          <w:color w:val="000000"/>
-          <w:lang w:eastAsia="pt-BR"/>
-        </w:rPr>
-        <w:t>(</w:t>
-      </w:r>
-      <w:proofErr w:type="gramStart"/>
-      <w:r>
-        <w:rPr>
-          <w:rFonts w:ascii="Calibri" w:eastAsia="Times New Roman" w:hAnsi="Calibri" w:cs="Calibri"/>
-          <w:color w:val="000000"/>
-          <w:lang w:eastAsia="pt-BR"/>
-        </w:rPr>
-        <w:t>0,cachorro</w:t>
-      </w:r>
-      <w:proofErr w:type="gramEnd"/>
-      <w:r>
-        <w:rPr>
-          <w:rFonts w:ascii="Calibri" w:eastAsia="Times New Roman" w:hAnsi="Calibri" w:cs="Calibri"/>
-          <w:color w:val="000000"/>
-          <w:lang w:eastAsia="pt-BR"/>
-        </w:rPr>
-        <w:t xml:space="preserve"> quente)</w:t>
+      <w:r>
+        <w:rPr>
+          <w:rFonts w:ascii="Calibri" w:eastAsia="Times New Roman" w:hAnsi="Calibri" w:cs="Calibri"/>
+          <w:color w:val="000000"/>
+          <w:lang w:eastAsia="pt-BR"/>
+        </w:rPr>
+        <w:t>(0,cachorro quente)</w:t>
       </w:r>
     </w:p>
     <w:p>
@@ -6985,79 +6190,7 @@
           <w:color w:val="000000"/>
           <w:lang w:eastAsia="pt-BR"/>
         </w:rPr>
-        <w:t xml:space="preserve"> ou </w:t>
-      </w:r>
-      <w:proofErr w:type="gramStart"/>
-      <w:r>
-        <w:rPr>
-          <w:rFonts w:ascii="Calibri" w:eastAsia="Times New Roman" w:hAnsi="Calibri" w:cs="Calibri"/>
-          <w:color w:val="000000"/>
-          <w:lang w:eastAsia="pt-BR"/>
-        </w:rPr>
-        <w:t>pop(</w:t>
-      </w:r>
-      <w:proofErr w:type="gramEnd"/>
-      <w:r>
-        <w:rPr>
-          <w:rFonts w:ascii="Calibri" w:eastAsia="Times New Roman" w:hAnsi="Calibri" w:cs="Calibri"/>
-          <w:color w:val="000000"/>
-          <w:lang w:eastAsia="pt-BR"/>
-        </w:rPr>
-        <w:t xml:space="preserve">normalmente ele é utilizado para eliminar o último </w:t>
-      </w:r>
-      <w:proofErr w:type="gramStart"/>
-      <w:r>
-        <w:rPr>
-          <w:rFonts w:ascii="Calibri" w:eastAsia="Times New Roman" w:hAnsi="Calibri" w:cs="Calibri"/>
-          <w:color w:val="000000"/>
-          <w:lang w:eastAsia="pt-BR"/>
-        </w:rPr>
-        <w:t>elemento</w:t>
-      </w:r>
-      <w:proofErr w:type="gramEnd"/>
-      <w:r>
-        <w:rPr>
-          <w:rFonts w:ascii="Calibri" w:eastAsia="Times New Roman" w:hAnsi="Calibri" w:cs="Calibri"/>
-          <w:color w:val="000000"/>
-          <w:lang w:eastAsia="pt-BR"/>
-        </w:rPr>
-        <w:t xml:space="preserve"> mas você pode especificar utilizando o número da posição entre parênteses (</w:t>
-      </w:r>
-      <w:proofErr w:type="gramStart"/>
-      <w:r>
-        <w:rPr>
-          <w:rFonts w:ascii="Calibri" w:eastAsia="Times New Roman" w:hAnsi="Calibri" w:cs="Calibri"/>
-          <w:color w:val="000000"/>
-          <w:lang w:eastAsia="pt-BR"/>
-        </w:rPr>
-        <w:t>) )</w:t>
-      </w:r>
-      <w:proofErr w:type="gramEnd"/>
-      <w:r>
-        <w:rPr>
-          <w:rFonts w:ascii="Calibri" w:eastAsia="Times New Roman" w:hAnsi="Calibri" w:cs="Calibri"/>
-          <w:color w:val="000000"/>
-          <w:lang w:eastAsia="pt-BR"/>
-        </w:rPr>
-        <w:t xml:space="preserve">, </w:t>
-      </w:r>
-      <w:proofErr w:type="gramStart"/>
-      <w:r>
-        <w:rPr>
-          <w:rFonts w:ascii="Calibri" w:eastAsia="Times New Roman" w:hAnsi="Calibri" w:cs="Calibri"/>
-          <w:color w:val="000000"/>
-          <w:lang w:eastAsia="pt-BR"/>
-        </w:rPr>
-        <w:t>ou .remove( você</w:t>
-      </w:r>
-      <w:proofErr w:type="gramEnd"/>
-      <w:r>
-        <w:rPr>
-          <w:rFonts w:ascii="Calibri" w:eastAsia="Times New Roman" w:hAnsi="Calibri" w:cs="Calibri"/>
-          <w:color w:val="000000"/>
-          <w:lang w:eastAsia="pt-BR"/>
-        </w:rPr>
-        <w:t xml:space="preserve"> pode especificar algo que você vai remover da lista)</w:t>
+        <w:t xml:space="preserve"> ou pop(normalmente ele é utilizado para eliminar o último elemento mas você pode especificar utilizando o número da posição entre parênteses () ), ou .remove( você pode especificar algo que você vai remover da lista)</w:t>
       </w:r>
     </w:p>
     <w:p>
@@ -7115,25 +6248,7 @@
           <w:color w:val="000000"/>
           <w:lang w:eastAsia="pt-BR"/>
         </w:rPr>
-        <w:t xml:space="preserve"> </w:t>
-      </w:r>
-      <w:proofErr w:type="gramStart"/>
-      <w:r>
-        <w:rPr>
-          <w:rFonts w:ascii="Calibri" w:eastAsia="Times New Roman" w:hAnsi="Calibri" w:cs="Calibri"/>
-          <w:color w:val="000000"/>
-          <w:lang w:eastAsia="pt-BR"/>
-        </w:rPr>
-        <w:t>lanche[</w:t>
-      </w:r>
-      <w:proofErr w:type="gramEnd"/>
-      <w:r>
-        <w:rPr>
-          <w:rFonts w:ascii="Calibri" w:eastAsia="Times New Roman" w:hAnsi="Calibri" w:cs="Calibri"/>
-          <w:color w:val="000000"/>
-          <w:lang w:eastAsia="pt-BR"/>
-        </w:rPr>
-        <w:t>3]</w:t>
+        <w:t xml:space="preserve"> lanche[3]</w:t>
       </w:r>
     </w:p>
     <w:p>
@@ -7166,7 +6281,6 @@
         </w:rPr>
       </w:pPr>
       <w:proofErr w:type="spellStart"/>
-      <w:proofErr w:type="gramStart"/>
       <w:r>
         <w:rPr>
           <w:rFonts w:ascii="Calibri" w:eastAsia="Times New Roman" w:hAnsi="Calibri" w:cs="Calibri"/>
@@ -7183,16 +6297,7 @@
           <w:color w:val="000000"/>
           <w:lang w:eastAsia="pt-BR"/>
         </w:rPr>
-        <w:t>(</w:t>
-      </w:r>
-      <w:proofErr w:type="gramEnd"/>
-      <w:r>
-        <w:rPr>
-          <w:rFonts w:ascii="Calibri" w:eastAsia="Times New Roman" w:hAnsi="Calibri" w:cs="Calibri"/>
-          <w:color w:val="000000"/>
-          <w:lang w:eastAsia="pt-BR"/>
-        </w:rPr>
-        <w:t xml:space="preserve">3) neste caso se </w:t>
+        <w:t xml:space="preserve">(3) neste caso se </w:t>
       </w:r>
       <w:proofErr w:type="spellStart"/>
       <w:r>
@@ -7231,7 +6336,6 @@
         <w:t xml:space="preserve"> ele vai remover o </w:t>
       </w:r>
       <w:proofErr w:type="spellStart"/>
-      <w:proofErr w:type="gramStart"/>
       <w:r>
         <w:rPr>
           <w:rFonts w:ascii="Calibri" w:eastAsia="Times New Roman" w:hAnsi="Calibri" w:cs="Calibri"/>
@@ -7241,7 +6345,6 @@
         <w:t>ultimo</w:t>
       </w:r>
       <w:proofErr w:type="spellEnd"/>
-      <w:proofErr w:type="gramEnd"/>
       <w:r>
         <w:rPr>
           <w:rFonts w:ascii="Calibri" w:eastAsia="Times New Roman" w:hAnsi="Calibri" w:cs="Calibri"/>
@@ -7281,7 +6384,6 @@
         </w:rPr>
       </w:pPr>
       <w:proofErr w:type="spellStart"/>
-      <w:proofErr w:type="gramStart"/>
       <w:r>
         <w:rPr>
           <w:rFonts w:ascii="Calibri" w:eastAsia="Times New Roman" w:hAnsi="Calibri" w:cs="Calibri"/>
@@ -7291,7 +6393,6 @@
         <w:t>lanche.remove</w:t>
       </w:r>
       <w:proofErr w:type="spellEnd"/>
-      <w:proofErr w:type="gramEnd"/>
       <w:r>
         <w:rPr>
           <w:rFonts w:ascii="Calibri" w:eastAsia="Times New Roman" w:hAnsi="Calibri" w:cs="Calibri"/>
@@ -7523,28 +6624,9 @@
           <w:color w:val="000000"/>
           <w:lang w:eastAsia="pt-BR"/>
         </w:rPr>
-        <w:t>(</w:t>
-      </w:r>
-      <w:proofErr w:type="gramStart"/>
-      <w:r>
-        <w:rPr>
-          <w:rFonts w:ascii="Calibri" w:eastAsia="Times New Roman" w:hAnsi="Calibri" w:cs="Calibri"/>
-          <w:color w:val="000000"/>
-          <w:lang w:eastAsia="pt-BR"/>
-        </w:rPr>
-        <w:t>range(</w:t>
-      </w:r>
-      <w:proofErr w:type="gramEnd"/>
-      <w:r>
-        <w:rPr>
-          <w:rFonts w:ascii="Calibri" w:eastAsia="Times New Roman" w:hAnsi="Calibri" w:cs="Calibri"/>
-          <w:color w:val="000000"/>
-          <w:lang w:eastAsia="pt-BR"/>
-        </w:rPr>
-        <w:t xml:space="preserve">4,11)) ele vai criar uma lista do 4 até o 10 lembrando q o </w:t>
-      </w:r>
-      <w:proofErr w:type="spellStart"/>
-      <w:proofErr w:type="gramStart"/>
+        <w:t xml:space="preserve">(range(4,11)) ele vai criar uma lista do 4 até o 10 lembrando q o </w:t>
+      </w:r>
+      <w:proofErr w:type="spellStart"/>
       <w:r>
         <w:rPr>
           <w:rFonts w:ascii="Calibri" w:eastAsia="Times New Roman" w:hAnsi="Calibri" w:cs="Calibri"/>
@@ -7554,7 +6636,6 @@
         <w:t>ultimo</w:t>
       </w:r>
       <w:proofErr w:type="spellEnd"/>
-      <w:proofErr w:type="gramEnd"/>
       <w:r>
         <w:rPr>
           <w:rFonts w:ascii="Calibri" w:eastAsia="Times New Roman" w:hAnsi="Calibri" w:cs="Calibri"/>
@@ -7583,7 +6664,6 @@
         <w:t>se quiser colocar os elementos em ordem basta usar o nome_da_</w:t>
       </w:r>
       <w:proofErr w:type="spellStart"/>
-      <w:proofErr w:type="gramStart"/>
       <w:r>
         <w:rPr>
           <w:rFonts w:ascii="Calibri" w:eastAsia="Times New Roman" w:hAnsi="Calibri" w:cs="Calibri"/>
@@ -7617,9 +6697,94 @@
           <w:color w:val="000000"/>
           <w:lang w:eastAsia="pt-BR"/>
         </w:rPr>
-        <w:t>(</w:t>
-      </w:r>
-      <w:proofErr w:type="gramEnd"/>
+        <w:t>()</w:t>
+      </w:r>
+    </w:p>
+    <w:p>
+      <w:pPr>
+        <w:spacing w:line="240" w:lineRule="auto"/>
+        <w:rPr>
+          <w:rFonts w:ascii="Times New Roman" w:eastAsia="Times New Roman" w:hAnsi="Times New Roman" w:cs="Times New Roman"/>
+          <w:sz w:val="24"/>
+          <w:szCs w:val="24"/>
+          <w:lang w:eastAsia="pt-BR"/>
+        </w:rPr>
+      </w:pPr>
+      <w:r>
+        <w:rPr>
+          <w:rFonts w:ascii="Calibri" w:eastAsia="Times New Roman" w:hAnsi="Calibri" w:cs="Calibri"/>
+          <w:color w:val="000000"/>
+          <w:lang w:eastAsia="pt-BR"/>
+        </w:rPr>
+        <w:t xml:space="preserve">se quiser em ordem ao </w:t>
+      </w:r>
+      <w:proofErr w:type="spellStart"/>
+      <w:r>
+        <w:rPr>
+          <w:rFonts w:ascii="Calibri" w:eastAsia="Times New Roman" w:hAnsi="Calibri" w:cs="Calibri"/>
+          <w:color w:val="000000"/>
+          <w:lang w:eastAsia="pt-BR"/>
+        </w:rPr>
+        <w:t>contrario</w:t>
+      </w:r>
+      <w:proofErr w:type="spellEnd"/>
+      <w:r>
+        <w:rPr>
+          <w:rFonts w:ascii="Calibri" w:eastAsia="Times New Roman" w:hAnsi="Calibri" w:cs="Calibri"/>
+          <w:color w:val="000000"/>
+          <w:lang w:eastAsia="pt-BR"/>
+        </w:rPr>
+        <w:t>, decrescente basta usar o reverse=</w:t>
+      </w:r>
+      <w:proofErr w:type="spellStart"/>
+      <w:r>
+        <w:rPr>
+          <w:rFonts w:ascii="Calibri" w:eastAsia="Times New Roman" w:hAnsi="Calibri" w:cs="Calibri"/>
+          <w:color w:val="000000"/>
+          <w:lang w:eastAsia="pt-BR"/>
+        </w:rPr>
+        <w:t>True</w:t>
+      </w:r>
+      <w:proofErr w:type="spellEnd"/>
+    </w:p>
+    <w:p>
+      <w:pPr>
+        <w:spacing w:line="240" w:lineRule="auto"/>
+        <w:rPr>
+          <w:rFonts w:ascii="Times New Roman" w:eastAsia="Times New Roman" w:hAnsi="Times New Roman" w:cs="Times New Roman"/>
+          <w:sz w:val="24"/>
+          <w:szCs w:val="24"/>
+          <w:lang w:eastAsia="pt-BR"/>
+        </w:rPr>
+      </w:pPr>
+      <w:proofErr w:type="spellStart"/>
+      <w:r>
+        <w:rPr>
+          <w:rFonts w:ascii="Calibri" w:eastAsia="Times New Roman" w:hAnsi="Calibri" w:cs="Calibri"/>
+          <w:color w:val="000000"/>
+          <w:lang w:eastAsia="pt-BR"/>
+        </w:rPr>
+        <w:t>nome_da_variavel.sort</w:t>
+      </w:r>
+      <w:proofErr w:type="spellEnd"/>
+      <w:r>
+        <w:rPr>
+          <w:rFonts w:ascii="Calibri" w:eastAsia="Times New Roman" w:hAnsi="Calibri" w:cs="Calibri"/>
+          <w:color w:val="000000"/>
+          <w:lang w:eastAsia="pt-BR"/>
+        </w:rPr>
+        <w:t>(reverse=</w:t>
+      </w:r>
+      <w:proofErr w:type="spellStart"/>
+      <w:r>
+        <w:rPr>
+          <w:rFonts w:ascii="Calibri" w:eastAsia="Times New Roman" w:hAnsi="Calibri" w:cs="Calibri"/>
+          <w:color w:val="000000"/>
+          <w:lang w:eastAsia="pt-BR"/>
+        </w:rPr>
+        <w:t>True</w:t>
+      </w:r>
+      <w:proofErr w:type="spellEnd"/>
       <w:r>
         <w:rPr>
           <w:rFonts w:ascii="Calibri" w:eastAsia="Times New Roman" w:hAnsi="Calibri" w:cs="Calibri"/>
@@ -7645,114 +6810,9 @@
           <w:color w:val="000000"/>
           <w:lang w:eastAsia="pt-BR"/>
         </w:rPr>
-        <w:t xml:space="preserve">se quiser em ordem ao </w:t>
-      </w:r>
-      <w:proofErr w:type="spellStart"/>
-      <w:r>
-        <w:rPr>
-          <w:rFonts w:ascii="Calibri" w:eastAsia="Times New Roman" w:hAnsi="Calibri" w:cs="Calibri"/>
-          <w:color w:val="000000"/>
-          <w:lang w:eastAsia="pt-BR"/>
-        </w:rPr>
-        <w:t>contrario</w:t>
-      </w:r>
-      <w:proofErr w:type="spellEnd"/>
-      <w:r>
-        <w:rPr>
-          <w:rFonts w:ascii="Calibri" w:eastAsia="Times New Roman" w:hAnsi="Calibri" w:cs="Calibri"/>
-          <w:color w:val="000000"/>
-          <w:lang w:eastAsia="pt-BR"/>
-        </w:rPr>
-        <w:t>, decrescente basta usar o reverse=</w:t>
-      </w:r>
-      <w:proofErr w:type="spellStart"/>
-      <w:r>
-        <w:rPr>
-          <w:rFonts w:ascii="Calibri" w:eastAsia="Times New Roman" w:hAnsi="Calibri" w:cs="Calibri"/>
-          <w:color w:val="000000"/>
-          <w:lang w:eastAsia="pt-BR"/>
-        </w:rPr>
-        <w:t>True</w:t>
-      </w:r>
-      <w:proofErr w:type="spellEnd"/>
-    </w:p>
-    <w:p>
-      <w:pPr>
-        <w:spacing w:line="240" w:lineRule="auto"/>
-        <w:rPr>
-          <w:rFonts w:ascii="Times New Roman" w:eastAsia="Times New Roman" w:hAnsi="Times New Roman" w:cs="Times New Roman"/>
-          <w:sz w:val="24"/>
-          <w:szCs w:val="24"/>
-          <w:lang w:eastAsia="pt-BR"/>
-        </w:rPr>
-      </w:pPr>
-      <w:proofErr w:type="spellStart"/>
-      <w:r>
-        <w:rPr>
-          <w:rFonts w:ascii="Calibri" w:eastAsia="Times New Roman" w:hAnsi="Calibri" w:cs="Calibri"/>
-          <w:color w:val="000000"/>
-          <w:lang w:eastAsia="pt-BR"/>
-        </w:rPr>
-        <w:t>nome_da_</w:t>
-      </w:r>
-      <w:proofErr w:type="gramStart"/>
-      <w:r>
-        <w:rPr>
-          <w:rFonts w:ascii="Calibri" w:eastAsia="Times New Roman" w:hAnsi="Calibri" w:cs="Calibri"/>
-          <w:color w:val="000000"/>
-          <w:lang w:eastAsia="pt-BR"/>
-        </w:rPr>
-        <w:t>variavel.sort</w:t>
-      </w:r>
-      <w:proofErr w:type="spellEnd"/>
-      <w:proofErr w:type="gramEnd"/>
-      <w:r>
-        <w:rPr>
-          <w:rFonts w:ascii="Calibri" w:eastAsia="Times New Roman" w:hAnsi="Calibri" w:cs="Calibri"/>
-          <w:color w:val="000000"/>
-          <w:lang w:eastAsia="pt-BR"/>
-        </w:rPr>
-        <w:t>(reverse=</w:t>
-      </w:r>
-      <w:proofErr w:type="spellStart"/>
-      <w:r>
-        <w:rPr>
-          <w:rFonts w:ascii="Calibri" w:eastAsia="Times New Roman" w:hAnsi="Calibri" w:cs="Calibri"/>
-          <w:color w:val="000000"/>
-          <w:lang w:eastAsia="pt-BR"/>
-        </w:rPr>
-        <w:t>True</w:t>
-      </w:r>
-      <w:proofErr w:type="spellEnd"/>
-      <w:r>
-        <w:rPr>
-          <w:rFonts w:ascii="Calibri" w:eastAsia="Times New Roman" w:hAnsi="Calibri" w:cs="Calibri"/>
-          <w:color w:val="000000"/>
-          <w:lang w:eastAsia="pt-BR"/>
-        </w:rPr>
-        <w:t>)</w:t>
-      </w:r>
-    </w:p>
-    <w:p>
-      <w:pPr>
-        <w:spacing w:line="240" w:lineRule="auto"/>
-        <w:rPr>
-          <w:rFonts w:ascii="Times New Roman" w:eastAsia="Times New Roman" w:hAnsi="Times New Roman" w:cs="Times New Roman"/>
-          <w:sz w:val="24"/>
-          <w:szCs w:val="24"/>
-          <w:lang w:eastAsia="pt-BR"/>
-        </w:rPr>
-      </w:pPr>
-      <w:r>
-        <w:rPr>
-          <w:rFonts w:ascii="Calibri" w:eastAsia="Times New Roman" w:hAnsi="Calibri" w:cs="Calibri"/>
-          <w:color w:val="000000"/>
-          <w:lang w:eastAsia="pt-BR"/>
-        </w:rPr>
         <w:t xml:space="preserve">para saber o tamanho de uma lista basta usar o </w:t>
       </w:r>
       <w:proofErr w:type="spellStart"/>
-      <w:proofErr w:type="gramStart"/>
       <w:r>
         <w:rPr>
           <w:rFonts w:ascii="Calibri" w:eastAsia="Times New Roman" w:hAnsi="Calibri" w:cs="Calibri"/>
@@ -7768,16 +6828,7 @@
           <w:color w:val="000000"/>
           <w:lang w:eastAsia="pt-BR"/>
         </w:rPr>
-        <w:t>(</w:t>
-      </w:r>
-      <w:proofErr w:type="gramEnd"/>
-      <w:r>
-        <w:rPr>
-          <w:rFonts w:ascii="Calibri" w:eastAsia="Times New Roman" w:hAnsi="Calibri" w:cs="Calibri"/>
-          <w:color w:val="000000"/>
-          <w:lang w:eastAsia="pt-BR"/>
-        </w:rPr>
-        <w:t>nome da lista)</w:t>
+        <w:t>(nome da lista)</w:t>
       </w:r>
     </w:p>
     <w:p>
@@ -7818,7 +6869,6 @@
         <w:t xml:space="preserve">nome da variável = </w:t>
       </w:r>
       <w:proofErr w:type="spellStart"/>
-      <w:proofErr w:type="gramStart"/>
       <w:r>
         <w:rPr>
           <w:rFonts w:ascii="Calibri" w:eastAsia="Times New Roman" w:hAnsi="Calibri" w:cs="Calibri"/>
@@ -7834,16 +6884,7 @@
           <w:color w:val="000000"/>
           <w:lang w:eastAsia="pt-BR"/>
         </w:rPr>
-        <w:t>(</w:t>
-      </w:r>
-      <w:proofErr w:type="gramEnd"/>
-      <w:r>
-        <w:rPr>
-          <w:rFonts w:ascii="Calibri" w:eastAsia="Times New Roman" w:hAnsi="Calibri" w:cs="Calibri"/>
-          <w:color w:val="000000"/>
-          <w:lang w:eastAsia="pt-BR"/>
-        </w:rPr>
-        <w:t>nome da lista que vai ser copiada)</w:t>
+        <w:t>(nome da lista que vai ser copiada)</w:t>
       </w:r>
     </w:p>
     <w:p>
@@ -7909,25 +6950,7 @@
           <w:color w:val="000000"/>
           <w:lang w:eastAsia="pt-BR"/>
         </w:rPr>
-        <w:t xml:space="preserve">nome da variável = lista </w:t>
-      </w:r>
-      <w:proofErr w:type="gramStart"/>
-      <w:r>
-        <w:rPr>
-          <w:rFonts w:ascii="Calibri" w:eastAsia="Times New Roman" w:hAnsi="Calibri" w:cs="Calibri"/>
-          <w:color w:val="000000"/>
-          <w:lang w:eastAsia="pt-BR"/>
-        </w:rPr>
-        <w:t>um  +</w:t>
-      </w:r>
-      <w:proofErr w:type="gramEnd"/>
-      <w:r>
-        <w:rPr>
-          <w:rFonts w:ascii="Calibri" w:eastAsia="Times New Roman" w:hAnsi="Calibri" w:cs="Calibri"/>
-          <w:color w:val="000000"/>
-          <w:lang w:eastAsia="pt-BR"/>
-        </w:rPr>
-        <w:t xml:space="preserve"> lista 2</w:t>
+        <w:t>nome da variável = lista um  + lista 2</w:t>
       </w:r>
     </w:p>
     <w:p>
@@ -7964,43 +6987,7 @@
           <w:color w:val="000000"/>
           <w:lang w:eastAsia="pt-BR"/>
         </w:rPr>
-        <w:t xml:space="preserve"> faz uma </w:t>
-      </w:r>
-      <w:proofErr w:type="gramStart"/>
-      <w:r>
-        <w:rPr>
-          <w:rFonts w:ascii="Calibri" w:eastAsia="Times New Roman" w:hAnsi="Calibri" w:cs="Calibri"/>
-          <w:color w:val="000000"/>
-          <w:lang w:eastAsia="pt-BR"/>
-        </w:rPr>
-        <w:t>ligação  entre</w:t>
-      </w:r>
-      <w:proofErr w:type="gramEnd"/>
-      <w:r>
-        <w:rPr>
-          <w:rFonts w:ascii="Calibri" w:eastAsia="Times New Roman" w:hAnsi="Calibri" w:cs="Calibri"/>
-          <w:color w:val="000000"/>
-          <w:lang w:eastAsia="pt-BR"/>
-        </w:rPr>
-        <w:t xml:space="preserve"> listas então se for mudar algo em uma lista ela automaticamente vai ser mudada na outra, para resolver isso basta fazer uma cópia usando </w:t>
-      </w:r>
-      <w:proofErr w:type="gramStart"/>
-      <w:r>
-        <w:rPr>
-          <w:rFonts w:ascii="Calibri" w:eastAsia="Times New Roman" w:hAnsi="Calibri" w:cs="Calibri"/>
-          <w:color w:val="000000"/>
-          <w:lang w:eastAsia="pt-BR"/>
-        </w:rPr>
-        <w:t>o :</w:t>
-      </w:r>
-      <w:proofErr w:type="gramEnd"/>
-      <w:r>
-        <w:rPr>
-          <w:rFonts w:ascii="Calibri" w:eastAsia="Times New Roman" w:hAnsi="Calibri" w:cs="Calibri"/>
-          <w:color w:val="000000"/>
-          <w:lang w:eastAsia="pt-BR"/>
-        </w:rPr>
-        <w:t xml:space="preserve"> fatiamento </w:t>
+        <w:t xml:space="preserve"> faz uma ligação  entre listas então se for mudar algo em uma lista ela automaticamente vai ser mudada na outra, para resolver isso basta fazer uma cópia usando o : fatiamento </w:t>
       </w:r>
       <w:proofErr w:type="spellStart"/>
       <w:r>
@@ -8048,54 +7035,26 @@
           <w:color w:val="000000"/>
           <w:lang w:eastAsia="pt-BR"/>
         </w:rPr>
-        <w:t xml:space="preserve">b = </w:t>
-      </w:r>
-      <w:proofErr w:type="gramStart"/>
-      <w:r>
-        <w:rPr>
-          <w:rFonts w:ascii="Calibri" w:eastAsia="Times New Roman" w:hAnsi="Calibri" w:cs="Calibri"/>
-          <w:color w:val="000000"/>
-          <w:lang w:eastAsia="pt-BR"/>
-        </w:rPr>
-        <w:t>a[ :</w:t>
-      </w:r>
-      <w:proofErr w:type="gramEnd"/>
-      <w:r>
-        <w:rPr>
-          <w:rFonts w:ascii="Calibri" w:eastAsia="Times New Roman" w:hAnsi="Calibri" w:cs="Calibri"/>
-          <w:color w:val="000000"/>
-          <w:lang w:eastAsia="pt-BR"/>
-        </w:rPr>
-        <w:t xml:space="preserve"> ]</w:t>
-      </w:r>
-    </w:p>
-    <w:p>
-      <w:pPr>
-        <w:spacing w:line="240" w:lineRule="auto"/>
-        <w:rPr>
-          <w:rFonts w:ascii="Times New Roman" w:eastAsia="Times New Roman" w:hAnsi="Times New Roman" w:cs="Times New Roman"/>
-          <w:sz w:val="24"/>
-          <w:szCs w:val="24"/>
-          <w:lang w:eastAsia="pt-BR"/>
-        </w:rPr>
-      </w:pPr>
-      <w:proofErr w:type="gramStart"/>
-      <w:r>
-        <w:rPr>
-          <w:rFonts w:ascii="Calibri" w:eastAsia="Times New Roman" w:hAnsi="Calibri" w:cs="Calibri"/>
-          <w:color w:val="000000"/>
-          <w:lang w:eastAsia="pt-BR"/>
-        </w:rPr>
-        <w:t>b[</w:t>
-      </w:r>
-      <w:proofErr w:type="gramEnd"/>
-      <w:r>
-        <w:rPr>
-          <w:rFonts w:ascii="Calibri" w:eastAsia="Times New Roman" w:hAnsi="Calibri" w:cs="Calibri"/>
-          <w:color w:val="000000"/>
-          <w:lang w:eastAsia="pt-BR"/>
-        </w:rPr>
-        <w:t>2] = 8</w:t>
+        <w:t>b = a[ : ]</w:t>
+      </w:r>
+    </w:p>
+    <w:p>
+      <w:pPr>
+        <w:spacing w:line="240" w:lineRule="auto"/>
+        <w:rPr>
+          <w:rFonts w:ascii="Times New Roman" w:eastAsia="Times New Roman" w:hAnsi="Times New Roman" w:cs="Times New Roman"/>
+          <w:sz w:val="24"/>
+          <w:szCs w:val="24"/>
+          <w:lang w:eastAsia="pt-BR"/>
+        </w:rPr>
+      </w:pPr>
+      <w:r>
+        <w:rPr>
+          <w:rFonts w:ascii="Calibri" w:eastAsia="Times New Roman" w:hAnsi="Calibri" w:cs="Calibri"/>
+          <w:color w:val="000000"/>
+          <w:lang w:eastAsia="pt-BR"/>
+        </w:rPr>
+        <w:t>b[2] = 8</w:t>
       </w:r>
     </w:p>
     <w:p>
@@ -8181,18 +7140,8 @@
           <w:lang w:eastAsia="pt-BR"/>
         </w:rPr>
         <w:lastRenderedPageBreak/>
-        <w:t xml:space="preserve">Outro </w:t>
-      </w:r>
-      <w:proofErr w:type="gramStart"/>
-      <w:r>
-        <w:rPr>
-          <w:rFonts w:ascii="Calibri" w:eastAsia="Times New Roman" w:hAnsi="Calibri" w:cs="Calibri"/>
-          <w:color w:val="000000"/>
-          <w:lang w:eastAsia="pt-BR"/>
-        </w:rPr>
-        <w:t>exemplo :</w:t>
-      </w:r>
-      <w:proofErr w:type="gramEnd"/>
+        <w:t>Outro exemplo :</w:t>
+      </w:r>
       <w:r>
         <w:rPr>
           <w:rFonts w:ascii="Calibri" w:eastAsia="Times New Roman" w:hAnsi="Calibri" w:cs="Calibri"/>
@@ -8204,6 +7153,7 @@
       <w:r>
         <w:rPr>
           <w:rFonts w:ascii="Times New Roman" w:eastAsia="Times New Roman" w:hAnsi="Times New Roman" w:cs="Times New Roman"/>
+          <w:noProof/>
           <w:sz w:val="24"/>
           <w:szCs w:val="24"/>
           <w:lang w:eastAsia="pt-BR"/>
@@ -8224,7 +7174,7 @@
                     <pic:cNvPicPr/>
                   </pic:nvPicPr>
                   <pic:blipFill>
-                    <a:blip r:embed="rId6"/>
+                    <a:blip r:embed="rId8"/>
                     <a:stretch>
                       <a:fillRect/>
                     </a:stretch>
@@ -8290,7 +7240,6 @@
         <w:t xml:space="preserve">Dados = </w:t>
       </w:r>
       <w:proofErr w:type="spellStart"/>
-      <w:proofErr w:type="gramStart"/>
       <w:r>
         <w:rPr>
           <w:sz w:val="24"/>
@@ -8304,15 +7253,7 @@
           <w:sz w:val="24"/>
           <w:szCs w:val="24"/>
         </w:rPr>
-        <w:t>(</w:t>
-      </w:r>
-      <w:proofErr w:type="gramEnd"/>
-      <w:r>
-        <w:rPr>
-          <w:sz w:val="24"/>
-          <w:szCs w:val="24"/>
-        </w:rPr>
-        <w:t>)</w:t>
+        <w:t>()</w:t>
       </w:r>
     </w:p>
     <w:p>
@@ -8361,13 +7302,8 @@
       </w:r>
     </w:p>
     <w:p>
-      <w:proofErr w:type="gramStart"/>
-      <w:r>
-        <w:t>Para  colocar</w:t>
-      </w:r>
-      <w:proofErr w:type="gramEnd"/>
-      <w:r>
-        <w:t xml:space="preserve"> mais um basta colocar </w:t>
+      <w:r>
+        <w:t xml:space="preserve">Para  colocar mais um basta colocar </w:t>
       </w:r>
     </w:p>
     <w:p>
@@ -8416,7 +7352,7 @@
                     <pic:cNvPicPr/>
                   </pic:nvPicPr>
                   <pic:blipFill>
-                    <a:blip r:embed="rId7"/>
+                    <a:blip r:embed="rId9"/>
                     <a:stretch>
                       <a:fillRect/>
                     </a:stretch>
@@ -8507,18 +7443,19 @@
         <w:t>Print(</w:t>
       </w:r>
       <w:proofErr w:type="spellStart"/>
-      <w:proofErr w:type="gramStart"/>
       <w:r>
         <w:t>filme.items</w:t>
       </w:r>
       <w:proofErr w:type="spellEnd"/>
-      <w:proofErr w:type="gramEnd"/>
       <w:r>
         <w:t>())</w:t>
       </w:r>
     </w:p>
     <w:p>
       <w:r>
+        <w:rPr>
+          <w:noProof/>
+        </w:rPr>
         <w:drawing>
           <wp:inline distT="0" distB="0" distL="0" distR="0" wp14:anchorId="5E6284E7" wp14:editId="3332DB9A">
             <wp:extent cx="5400040" cy="2414905"/>
@@ -8535,7 +7472,7 @@
                     <pic:cNvPicPr/>
                   </pic:nvPicPr>
                   <pic:blipFill>
-                    <a:blip r:embed="rId8"/>
+                    <a:blip r:embed="rId10"/>
                     <a:stretch>
                       <a:fillRect/>
                     </a:stretch>
@@ -8559,15 +7496,7 @@
     <w:p/>
     <w:p>
       <w:r>
-        <w:t xml:space="preserve">Você também pode adicionar coisas no dicionário </w:t>
-      </w:r>
-      <w:proofErr w:type="gramStart"/>
-      <w:r>
-        <w:t>e também</w:t>
-      </w:r>
-      <w:proofErr w:type="gramEnd"/>
-      <w:r>
-        <w:t xml:space="preserve"> mudar diretamente </w:t>
+        <w:t xml:space="preserve">Você também pode adicionar coisas no dicionário e também mudar diretamente </w:t>
       </w:r>
     </w:p>
     <w:p>
@@ -8591,12 +7520,10 @@
         <w:t xml:space="preserve">for k, v in </w:t>
       </w:r>
       <w:proofErr w:type="spellStart"/>
-      <w:proofErr w:type="gramStart"/>
       <w:r>
         <w:t>pessoas.items</w:t>
       </w:r>
       <w:proofErr w:type="spellEnd"/>
-      <w:proofErr w:type="gramEnd"/>
       <w:r>
         <w:t>():</w:t>
       </w:r>
@@ -8638,23 +7565,7 @@
     <w:p/>
     <w:p>
       <w:r>
-        <w:t xml:space="preserve">para copiar um conteúdo quando envolve dicionários utiliza-se </w:t>
-      </w:r>
-      <w:proofErr w:type="gramStart"/>
-      <w:r>
-        <w:t>o  método</w:t>
-      </w:r>
-      <w:proofErr w:type="gramEnd"/>
-      <w:r>
-        <w:t xml:space="preserve"> </w:t>
-      </w:r>
-      <w:proofErr w:type="gramStart"/>
-      <w:r>
-        <w:t>copy(</w:t>
-      </w:r>
-      <w:proofErr w:type="gramEnd"/>
-      <w:r>
-        <w:t>)</w:t>
+        <w:t>para copiar um conteúdo quando envolve dicionários utiliza-se o  método copy()</w:t>
       </w:r>
     </w:p>
     <w:p>
@@ -8675,20 +7586,23 @@
     <w:p>
       <w:r>
         <w:lastRenderedPageBreak/>
-        <w:t>Função é algo que já esta “</w:t>
-      </w:r>
-      <w:proofErr w:type="spellStart"/>
-      <w:proofErr w:type="gramStart"/>
+        <w:t xml:space="preserve">Função é algo que já </w:t>
+      </w:r>
+      <w:proofErr w:type="spellStart"/>
+      <w:r>
+        <w:t>esta</w:t>
+      </w:r>
+      <w:proofErr w:type="spellEnd"/>
+      <w:r>
+        <w:t xml:space="preserve"> “</w:t>
+      </w:r>
+      <w:proofErr w:type="spellStart"/>
       <w:r>
         <w:t>pré</w:t>
       </w:r>
       <w:proofErr w:type="spellEnd"/>
       <w:r>
-        <w:t xml:space="preserve"> programado</w:t>
-      </w:r>
-      <w:proofErr w:type="gramEnd"/>
-      <w:r>
-        <w:t>” para ser utilizado</w:t>
+        <w:t xml:space="preserve"> programado” para ser utilizado</w:t>
       </w:r>
     </w:p>
     <w:p>
@@ -8698,49 +7612,20 @@
       </w:r>
       <w:proofErr w:type="spellEnd"/>
       <w:r>
-        <w:t xml:space="preserve">: </w:t>
-      </w:r>
-      <w:proofErr w:type="gramStart"/>
-      <w:r>
-        <w:t>print(</w:t>
-      </w:r>
-      <w:proofErr w:type="gramEnd"/>
-      <w:r>
-        <w:t xml:space="preserve">), </w:t>
-      </w:r>
-      <w:proofErr w:type="spellStart"/>
-      <w:proofErr w:type="gramStart"/>
+        <w:t xml:space="preserve">: print(), </w:t>
+      </w:r>
+      <w:proofErr w:type="spellStart"/>
       <w:r>
         <w:t>len</w:t>
       </w:r>
       <w:proofErr w:type="spellEnd"/>
       <w:r>
-        <w:t>(</w:t>
-      </w:r>
-      <w:proofErr w:type="gramEnd"/>
-      <w:r>
-        <w:t xml:space="preserve">), </w:t>
-      </w:r>
-      <w:proofErr w:type="gramStart"/>
-      <w:r>
-        <w:t>input(</w:t>
-      </w:r>
-      <w:proofErr w:type="gramEnd"/>
-      <w:r>
-        <w:t>)</w:t>
-      </w:r>
-    </w:p>
-    <w:p>
-      <w:r>
-        <w:t xml:space="preserve">Normalmente termina com </w:t>
-      </w:r>
-      <w:proofErr w:type="gramStart"/>
-      <w:r>
-        <w:t>Parênteses(</w:t>
-      </w:r>
-      <w:proofErr w:type="gramEnd"/>
-      <w:r>
-        <w:t xml:space="preserve">) </w:t>
+        <w:t>(), input()</w:t>
+      </w:r>
+    </w:p>
+    <w:p>
+      <w:r>
+        <w:t xml:space="preserve">Normalmente termina com Parênteses() </w:t>
       </w:r>
     </w:p>
     <w:p>
@@ -8758,30 +7643,18 @@
         <w:t xml:space="preserve"> </w:t>
       </w:r>
       <w:proofErr w:type="spellStart"/>
-      <w:proofErr w:type="gramStart"/>
       <w:r>
         <w:t>mostraLinha</w:t>
       </w:r>
       <w:proofErr w:type="spellEnd"/>
       <w:r>
-        <w:t>(</w:t>
-      </w:r>
-      <w:proofErr w:type="gramEnd"/>
-      <w:r>
-        <w:t>):</w:t>
+        <w:t>():</w:t>
       </w:r>
     </w:p>
     <w:p>
       <w:r>
         <w:tab/>
-      </w:r>
-      <w:proofErr w:type="gramStart"/>
-      <w:r>
-        <w:t>print(</w:t>
-      </w:r>
-      <w:proofErr w:type="gramEnd"/>
-      <w:r>
-        <w:t>‘------------’)</w:t>
+        <w:t>print(‘------------’)</w:t>
       </w:r>
     </w:p>
     <w:p>
@@ -8791,17 +7664,12 @@
     </w:p>
     <w:p>
       <w:proofErr w:type="spellStart"/>
-      <w:proofErr w:type="gramStart"/>
       <w:r>
         <w:t>mostraLinha</w:t>
       </w:r>
       <w:proofErr w:type="spellEnd"/>
       <w:r>
-        <w:t>(</w:t>
-      </w:r>
-      <w:proofErr w:type="gramEnd"/>
-      <w:r>
-        <w:t>)</w:t>
+        <w:t>()</w:t>
       </w:r>
     </w:p>
     <w:p/>
@@ -8817,6 +7685,9 @@
     </w:p>
     <w:p>
       <w:r>
+        <w:rPr>
+          <w:noProof/>
+        </w:rPr>
         <w:drawing>
           <wp:inline distT="0" distB="0" distL="0" distR="0" wp14:anchorId="27FF0532" wp14:editId="170B8BE4">
             <wp:extent cx="5400040" cy="1924050"/>
@@ -8833,7 +7704,7 @@
                     <pic:cNvPicPr/>
                   </pic:nvPicPr>
                   <pic:blipFill>
-                    <a:blip r:embed="rId9"/>
+                    <a:blip r:embed="rId11"/>
                     <a:stretch>
                       <a:fillRect/>
                     </a:stretch>
@@ -8900,33 +7771,18 @@
     </w:p>
     <w:p/>
     <w:p>
-      <w:proofErr w:type="gramStart"/>
-      <w:r>
-        <w:t>contador(</w:t>
-      </w:r>
-      <w:proofErr w:type="gramEnd"/>
-      <w:r>
-        <w:t>2,1,7)</w:t>
-      </w:r>
-    </w:p>
-    <w:p>
-      <w:proofErr w:type="gramStart"/>
-      <w:r>
-        <w:t>contador(</w:t>
-      </w:r>
-      <w:proofErr w:type="gramEnd"/>
-      <w:r>
-        <w:t>9,7,2)</w:t>
-      </w:r>
-    </w:p>
-    <w:p>
-      <w:proofErr w:type="gramStart"/>
-      <w:r>
-        <w:t>contador(</w:t>
-      </w:r>
-      <w:proofErr w:type="gramEnd"/>
-      <w:r>
-        <w:t>1,5,8)</w:t>
+      <w:r>
+        <w:t>contador(2,1,7)</w:t>
+      </w:r>
+    </w:p>
+    <w:p>
+      <w:r>
+        <w:t>contador(9,7,2)</w:t>
+      </w:r>
+    </w:p>
+    <w:p>
+      <w:r>
+        <w:t>contador(1,5,8)</w:t>
       </w:r>
     </w:p>
     <w:p>
@@ -8957,6 +7813,343 @@
     <w:p>
       <w:r>
         <w:t xml:space="preserve"> E quando for utilizar lista ele também funciona </w:t>
+      </w:r>
+    </w:p>
+    <w:p>
+      <w:proofErr w:type="spellStart"/>
+      <w:r>
+        <w:rPr>
+          <w:b/>
+          <w:bCs/>
+        </w:rPr>
+        <w:lastRenderedPageBreak/>
+        <w:t>Interactive</w:t>
+      </w:r>
+      <w:proofErr w:type="spellEnd"/>
+      <w:r>
+        <w:rPr>
+          <w:b/>
+          <w:bCs/>
+        </w:rPr>
+        <w:t xml:space="preserve"> help</w:t>
+      </w:r>
+      <w:r>
+        <w:t xml:space="preserve"> (Ajuda interativa)</w:t>
+      </w:r>
+    </w:p>
+    <w:p>
+      <w:r>
+        <w:t xml:space="preserve"> Pode utilizar o help()</w:t>
+      </w:r>
+    </w:p>
+    <w:p>
+      <w:r>
+        <w:t>Pode colocar help(print) que ele ira mostrar uma ajuda sobre o print</w:t>
+      </w:r>
+    </w:p>
+    <w:p>
+      <w:pPr>
+        <w:rPr>
+          <w:b/>
+          <w:bCs/>
+        </w:rPr>
+      </w:pPr>
+      <w:proofErr w:type="spellStart"/>
+      <w:r>
+        <w:rPr>
+          <w:b/>
+          <w:bCs/>
+        </w:rPr>
+        <w:t>Docstrings</w:t>
+      </w:r>
+      <w:proofErr w:type="spellEnd"/>
+      <w:r>
+        <w:rPr>
+          <w:b/>
+          <w:bCs/>
+        </w:rPr>
+        <w:t xml:space="preserve"> </w:t>
+      </w:r>
+    </w:p>
+    <w:p>
+      <w:r>
+        <w:t xml:space="preserve">É basicamente uma </w:t>
+      </w:r>
+      <w:proofErr w:type="spellStart"/>
+      <w:r>
+        <w:t>string</w:t>
+      </w:r>
+      <w:proofErr w:type="spellEnd"/>
+      <w:r>
+        <w:t xml:space="preserve"> de documentação, é como se fosse um manual </w:t>
+      </w:r>
+    </w:p>
+    <w:p>
+      <w:r>
+        <w:t xml:space="preserve">Você pode fazer uma </w:t>
+      </w:r>
+      <w:proofErr w:type="spellStart"/>
+      <w:r>
+        <w:t>docstring</w:t>
+      </w:r>
+      <w:proofErr w:type="spellEnd"/>
+      <w:r>
+        <w:t xml:space="preserve"> própria em qualquer função, basta colocar 3 aspas duplas logo depois da </w:t>
+      </w:r>
+      <w:proofErr w:type="spellStart"/>
+      <w:r>
+        <w:t>def</w:t>
+      </w:r>
+      <w:proofErr w:type="spellEnd"/>
+    </w:p>
+    <w:p>
+      <w:proofErr w:type="spellStart"/>
+      <w:r>
+        <w:t>Def</w:t>
+      </w:r>
+      <w:proofErr w:type="spellEnd"/>
+      <w:r>
+        <w:t xml:space="preserve"> contador (</w:t>
+      </w:r>
+      <w:proofErr w:type="spellStart"/>
+      <w:r>
+        <w:t>i,f,p</w:t>
+      </w:r>
+      <w:proofErr w:type="spellEnd"/>
+      <w:r>
+        <w:t>):</w:t>
+      </w:r>
+    </w:p>
+    <w:p>
+      <w:r>
+        <w:t>“””</w:t>
+      </w:r>
+    </w:p>
+    <w:p>
+      <w:r>
+        <w:t>Asuidhq8wydgq8ywd</w:t>
+      </w:r>
+    </w:p>
+    <w:p>
+      <w:r>
+        <w:t>“””</w:t>
+      </w:r>
+    </w:p>
+    <w:p>
+      <w:r>
+        <w:t>E quando der o help(contador)</w:t>
+      </w:r>
+    </w:p>
+    <w:p>
+      <w:r>
+        <w:t xml:space="preserve">Ele aparece o que foi escrito </w:t>
+      </w:r>
+    </w:p>
+    <w:p>
+      <w:pPr>
+        <w:rPr>
+          <w:b/>
+          <w:bCs/>
+        </w:rPr>
+      </w:pPr>
+      <w:r>
+        <w:rPr>
+          <w:b/>
+          <w:bCs/>
+        </w:rPr>
+        <w:t xml:space="preserve">Parâmetros opcionais </w:t>
+      </w:r>
+      <w:r>
+        <w:rPr>
+          <w:b/>
+          <w:bCs/>
+        </w:rPr>
+        <w:t>:</w:t>
+      </w:r>
+    </w:p>
+    <w:p>
+      <w:proofErr w:type="spellStart"/>
+      <w:r>
+        <w:t>Voce</w:t>
+      </w:r>
+      <w:proofErr w:type="spellEnd"/>
+      <w:r>
+        <w:t xml:space="preserve"> pode igualar seu parâmetro a 0, que ele vai funcionar sem precisar receber todos os parâmetros, analise a baixo</w:t>
+      </w:r>
+    </w:p>
+    <w:p>
+      <w:r>
+        <w:drawing>
+          <wp:inline distT="0" distB="0" distL="0" distR="0" wp14:anchorId="2A2B2A58" wp14:editId="598CFA4E">
+            <wp:extent cx="5400040" cy="3982085"/>
+            <wp:effectExtent l="0" t="0" r="0" b="0"/>
+            <wp:docPr id="967598721" name="Imagem 1" descr="Texto&#10;&#10;O conteúdo gerado por IA pode estar incorreto."/>
+            <wp:cNvGraphicFramePr>
+              <a:graphicFrameLocks xmlns:a="http://schemas.openxmlformats.org/drawingml/2006/main" noChangeAspect="1"/>
+            </wp:cNvGraphicFramePr>
+            <a:graphic xmlns:a="http://schemas.openxmlformats.org/drawingml/2006/main">
+              <a:graphicData uri="http://schemas.openxmlformats.org/drawingml/2006/picture">
+                <pic:pic xmlns:pic="http://schemas.openxmlformats.org/drawingml/2006/picture">
+                  <pic:nvPicPr>
+                    <pic:cNvPr id="967598721" name="Imagem 1" descr="Texto&#10;&#10;O conteúdo gerado por IA pode estar incorreto."/>
+                    <pic:cNvPicPr/>
+                  </pic:nvPicPr>
+                  <pic:blipFill>
+                    <a:blip r:embed="rId12"/>
+                    <a:stretch>
+                      <a:fillRect/>
+                    </a:stretch>
+                  </pic:blipFill>
+                  <pic:spPr>
+                    <a:xfrm>
+                      <a:off x="0" y="0"/>
+                      <a:ext cx="5400040" cy="3982085"/>
+                    </a:xfrm>
+                    <a:prstGeom prst="rect">
+                      <a:avLst/>
+                    </a:prstGeom>
+                  </pic:spPr>
+                </pic:pic>
+              </a:graphicData>
+            </a:graphic>
+          </wp:inline>
+        </w:drawing>
+      </w:r>
+    </w:p>
+    <w:p>
+      <w:pPr>
+        <w:rPr>
+          <w:b/>
+          <w:bCs/>
+        </w:rPr>
+      </w:pPr>
+      <w:r>
+        <w:rPr>
+          <w:b/>
+          <w:bCs/>
+        </w:rPr>
+        <w:t xml:space="preserve">Escopo de variáveis </w:t>
+      </w:r>
+      <w:r>
+        <w:rPr>
+          <w:b/>
+          <w:bCs/>
+        </w:rPr>
+        <w:t>:</w:t>
+      </w:r>
+    </w:p>
+    <w:p>
+      <w:r>
+        <w:lastRenderedPageBreak/>
+        <w:drawing>
+          <wp:inline distT="0" distB="0" distL="0" distR="0" wp14:anchorId="6811E1F9" wp14:editId="067790F9">
+            <wp:extent cx="5400040" cy="3072130"/>
+            <wp:effectExtent l="0" t="0" r="0" b="0"/>
+            <wp:docPr id="1364266135" name="Imagem 1" descr="Diagrama&#10;&#10;O conteúdo gerado por IA pode estar incorreto."/>
+            <wp:cNvGraphicFramePr>
+              <a:graphicFrameLocks xmlns:a="http://schemas.openxmlformats.org/drawingml/2006/main" noChangeAspect="1"/>
+            </wp:cNvGraphicFramePr>
+            <a:graphic xmlns:a="http://schemas.openxmlformats.org/drawingml/2006/main">
+              <a:graphicData uri="http://schemas.openxmlformats.org/drawingml/2006/picture">
+                <pic:pic xmlns:pic="http://schemas.openxmlformats.org/drawingml/2006/picture">
+                  <pic:nvPicPr>
+                    <pic:cNvPr id="1364266135" name="Imagem 1" descr="Diagrama&#10;&#10;O conteúdo gerado por IA pode estar incorreto."/>
+                    <pic:cNvPicPr/>
+                  </pic:nvPicPr>
+                  <pic:blipFill>
+                    <a:blip r:embed="rId13"/>
+                    <a:stretch>
+                      <a:fillRect/>
+                    </a:stretch>
+                  </pic:blipFill>
+                  <pic:spPr>
+                    <a:xfrm>
+                      <a:off x="0" y="0"/>
+                      <a:ext cx="5400040" cy="3072130"/>
+                    </a:xfrm>
+                    <a:prstGeom prst="rect">
+                      <a:avLst/>
+                    </a:prstGeom>
+                  </pic:spPr>
+                </pic:pic>
+              </a:graphicData>
+            </a:graphic>
+          </wp:inline>
+        </w:drawing>
+      </w:r>
+    </w:p>
+    <w:p>
+      <w:r>
+        <w:t>No caso a variável depende de onde estiver , ela vai funcionar</w:t>
+      </w:r>
+    </w:p>
+    <w:p/>
+    <w:p>
+      <w:r>
+        <w:t xml:space="preserve">Se quiser deixar uma variável global, basta colocar </w:t>
+      </w:r>
+    </w:p>
+    <w:p>
+      <w:r>
+        <w:t>Global a por exemplo que a variável a vai ser global</w:t>
+      </w:r>
+    </w:p>
+    <w:p/>
+    <w:p>
+      <w:r>
+        <w:t>Variáveis de retorno:</w:t>
+      </w:r>
+    </w:p>
+    <w:p>
+      <w:r>
+        <w:t>Usado para alterar o a resposta e se vai precisar de algo</w:t>
+      </w:r>
+    </w:p>
+    <w:p/>
+    <w:p>
+      <w:proofErr w:type="spellStart"/>
+      <w:r>
+        <w:t>Return</w:t>
+      </w:r>
+      <w:proofErr w:type="spellEnd"/>
+    </w:p>
+    <w:p>
+      <w:r>
+        <w:drawing>
+          <wp:inline distT="0" distB="0" distL="0" distR="0" wp14:anchorId="0B9CD7CF" wp14:editId="12F76022">
+            <wp:extent cx="5400040" cy="2498090"/>
+            <wp:effectExtent l="0" t="0" r="0" b="0"/>
+            <wp:docPr id="389183317" name="Imagem 1" descr="Texto&#10;&#10;O conteúdo gerado por IA pode estar incorreto."/>
+            <wp:cNvGraphicFramePr>
+              <a:graphicFrameLocks xmlns:a="http://schemas.openxmlformats.org/drawingml/2006/main" noChangeAspect="1"/>
+            </wp:cNvGraphicFramePr>
+            <a:graphic xmlns:a="http://schemas.openxmlformats.org/drawingml/2006/main">
+              <a:graphicData uri="http://schemas.openxmlformats.org/drawingml/2006/picture">
+                <pic:pic xmlns:pic="http://schemas.openxmlformats.org/drawingml/2006/picture">
+                  <pic:nvPicPr>
+                    <pic:cNvPr id="389183317" name="Imagem 1" descr="Texto&#10;&#10;O conteúdo gerado por IA pode estar incorreto."/>
+                    <pic:cNvPicPr/>
+                  </pic:nvPicPr>
+                  <pic:blipFill>
+                    <a:blip r:embed="rId14"/>
+                    <a:stretch>
+                      <a:fillRect/>
+                    </a:stretch>
+                  </pic:blipFill>
+                  <pic:spPr>
+                    <a:xfrm>
+                      <a:off x="0" y="0"/>
+                      <a:ext cx="5400040" cy="2498090"/>
+                    </a:xfrm>
+                    <a:prstGeom prst="rect">
+                      <a:avLst/>
+                    </a:prstGeom>
+                  </pic:spPr>
+                </pic:pic>
+              </a:graphicData>
+            </a:graphic>
+          </wp:inline>
+        </w:drawing>
       </w:r>
     </w:p>
     <w:sectPr>
@@ -8967,6 +8160,56 @@
     </w:sectPr>
   </w:body>
 </w:document>
+</file>
+
+<file path=word/endnotes.xml><?xml version="1.0" encoding="utf-8"?>
+<w:endnotes xmlns:wpc="http://schemas.microsoft.com/office/word/2010/wordprocessingCanvas" xmlns:cx="http://schemas.microsoft.com/office/drawing/2014/chartex" xmlns:cx1="http://schemas.microsoft.com/office/drawing/2015/9/8/chartex" xmlns:cx2="http://schemas.microsoft.com/office/drawing/2015/10/21/chartex" xmlns:cx3="http://schemas.microsoft.com/office/drawing/2016/5/9/chartex" xmlns:cx4="http://schemas.microsoft.com/office/drawing/2016/5/10/chartex" xmlns:cx5="http://schemas.microsoft.com/office/drawing/2016/5/11/chartex" xmlns:cx6="http://schemas.microsoft.com/office/drawing/2016/5/12/chartex" xmlns:cx7="http://schemas.microsoft.com/office/drawing/2016/5/13/chartex" xmlns:cx8="http://schemas.microsoft.com/office/drawing/2016/5/14/chartex" xmlns:mc="http://schemas.openxmlformats.org/markup-compatibility/2006" xmlns:aink="http://schemas.microsoft.com/office/drawing/2016/ink" xmlns:am3d="http://schemas.microsoft.com/office/drawing/2017/model3d" xmlns:o="urn:schemas-microsoft-com:office:office" xmlns:oel="http://schemas.microsoft.com/office/2019/extlst" xmlns:r="http://schemas.openxmlformats.org/officeDocument/2006/relationships" xmlns:m="http://schemas.openxmlformats.org/officeDocument/2006/math" xmlns:v="urn:schemas-microsoft-com:vml" xmlns:wp14="http://schemas.microsoft.com/office/word/2010/wordprocessingDrawing" xmlns:wp="http://schemas.openxmlformats.org/drawingml/2006/wordprocessingDrawing" xmlns:w10="urn:schemas-microsoft-com:office:word" xmlns:w="http://schemas.openxmlformats.org/wordprocessingml/2006/main" xmlns:w14="http://schemas.microsoft.com/office/word/2010/wordml" xmlns:w15="http://schemas.microsoft.com/office/word/2012/wordml" xmlns:w16cex="http://schemas.microsoft.com/office/word/2018/wordml/cex" xmlns:w16cid="http://schemas.microsoft.com/office/word/2016/wordml/cid" xmlns:w16="http://schemas.microsoft.com/office/word/2018/wordml" xmlns:w16du="http://schemas.microsoft.com/office/word/2023/wordml/word16du" xmlns:w16sdtdh="http://schemas.microsoft.com/office/word/2020/wordml/sdtdatahash" xmlns:w16sdtfl="http://schemas.microsoft.com/office/word/2024/wordml/sdtformatlock" xmlns:w16se="http://schemas.microsoft.com/office/word/2015/wordml/symex" xmlns:wpg="http://schemas.microsoft.com/office/word/2010/wordprocessingGroup" xmlns:wpi="http://schemas.microsoft.com/office/word/2010/wordprocessingInk" xmlns:wne="http://schemas.microsoft.com/office/word/2006/wordml" xmlns:wps="http://schemas.microsoft.com/office/word/2010/wordprocessingShape" mc:Ignorable="w14 w15 w16se w16cid w16 w16cex w16sdtdh w16sdtfl w16du wp14">
+  <w:endnote w:type="separator" w:id="-1">
+    <w:p>
+      <w:pPr>
+        <w:spacing w:after="0" w:line="240" w:lineRule="auto"/>
+      </w:pPr>
+      <w:r>
+        <w:separator/>
+      </w:r>
+    </w:p>
+  </w:endnote>
+  <w:endnote w:type="continuationSeparator" w:id="0">
+    <w:p>
+      <w:pPr>
+        <w:spacing w:after="0" w:line="240" w:lineRule="auto"/>
+      </w:pPr>
+      <w:r>
+        <w:continuationSeparator/>
+      </w:r>
+    </w:p>
+  </w:endnote>
+</w:endnotes>
+</file>
+
+<file path=word/footnotes.xml><?xml version="1.0" encoding="utf-8"?>
+<w:footnotes xmlns:wpc="http://schemas.microsoft.com/office/word/2010/wordprocessingCanvas" xmlns:cx="http://schemas.microsoft.com/office/drawing/2014/chartex" xmlns:cx1="http://schemas.microsoft.com/office/drawing/2015/9/8/chartex" xmlns:cx2="http://schemas.microsoft.com/office/drawing/2015/10/21/chartex" xmlns:cx3="http://schemas.microsoft.com/office/drawing/2016/5/9/chartex" xmlns:cx4="http://schemas.microsoft.com/office/drawing/2016/5/10/chartex" xmlns:cx5="http://schemas.microsoft.com/office/drawing/2016/5/11/chartex" xmlns:cx6="http://schemas.microsoft.com/office/drawing/2016/5/12/chartex" xmlns:cx7="http://schemas.microsoft.com/office/drawing/2016/5/13/chartex" xmlns:cx8="http://schemas.microsoft.com/office/drawing/2016/5/14/chartex" xmlns:mc="http://schemas.openxmlformats.org/markup-compatibility/2006" xmlns:aink="http://schemas.microsoft.com/office/drawing/2016/ink" xmlns:am3d="http://schemas.microsoft.com/office/drawing/2017/model3d" xmlns:o="urn:schemas-microsoft-com:office:office" xmlns:oel="http://schemas.microsoft.com/office/2019/extlst" xmlns:r="http://schemas.openxmlformats.org/officeDocument/2006/relationships" xmlns:m="http://schemas.openxmlformats.org/officeDocument/2006/math" xmlns:v="urn:schemas-microsoft-com:vml" xmlns:wp14="http://schemas.microsoft.com/office/word/2010/wordprocessingDrawing" xmlns:wp="http://schemas.openxmlformats.org/drawingml/2006/wordprocessingDrawing" xmlns:w10="urn:schemas-microsoft-com:office:word" xmlns:w="http://schemas.openxmlformats.org/wordprocessingml/2006/main" xmlns:w14="http://schemas.microsoft.com/office/word/2010/wordml" xmlns:w15="http://schemas.microsoft.com/office/word/2012/wordml" xmlns:w16cex="http://schemas.microsoft.com/office/word/2018/wordml/cex" xmlns:w16cid="http://schemas.microsoft.com/office/word/2016/wordml/cid" xmlns:w16="http://schemas.microsoft.com/office/word/2018/wordml" xmlns:w16du="http://schemas.microsoft.com/office/word/2023/wordml/word16du" xmlns:w16sdtdh="http://schemas.microsoft.com/office/word/2020/wordml/sdtdatahash" xmlns:w16sdtfl="http://schemas.microsoft.com/office/word/2024/wordml/sdtformatlock" xmlns:w16se="http://schemas.microsoft.com/office/word/2015/wordml/symex" xmlns:wpg="http://schemas.microsoft.com/office/word/2010/wordprocessingGroup" xmlns:wpi="http://schemas.microsoft.com/office/word/2010/wordprocessingInk" xmlns:wne="http://schemas.microsoft.com/office/word/2006/wordml" xmlns:wps="http://schemas.microsoft.com/office/word/2010/wordprocessingShape" mc:Ignorable="w14 w15 w16se w16cid w16 w16cex w16sdtdh w16sdtfl w16du wp14">
+  <w:footnote w:type="separator" w:id="-1">
+    <w:p>
+      <w:pPr>
+        <w:spacing w:after="0" w:line="240" w:lineRule="auto"/>
+      </w:pPr>
+      <w:r>
+        <w:separator/>
+      </w:r>
+    </w:p>
+  </w:footnote>
+  <w:footnote w:type="continuationSeparator" w:id="0">
+    <w:p>
+      <w:pPr>
+        <w:spacing w:after="0" w:line="240" w:lineRule="auto"/>
+      </w:pPr>
+      <w:r>
+        <w:continuationSeparator/>
+      </w:r>
+    </w:p>
+  </w:footnote>
+</w:footnotes>
 </file>
 
 <file path=word/numbering.xml><?xml version="1.0" encoding="utf-8"?>
@@ -9571,6 +8814,7 @@
   <w:style w:type="character" w:default="1" w:styleId="Fontepargpadro">
     <w:name w:val="Default Paragraph Font"/>
     <w:uiPriority w:val="1"/>
+    <w:semiHidden/>
     <w:unhideWhenUsed/>
   </w:style>
   <w:style w:type="table" w:default="1" w:styleId="Tabelanormal">
@@ -9757,6 +9001,50 @@
     <w:name w:val="apple-tab-span"/>
     <w:basedOn w:val="Fontepargpadro"/>
     <w:rsid w:val="00D53335"/>
+  </w:style>
+  <w:style w:type="paragraph" w:styleId="Cabealho">
+    <w:name w:val="header"/>
+    <w:basedOn w:val="Normal"/>
+    <w:link w:val="CabealhoChar"/>
+    <w:uiPriority w:val="99"/>
+    <w:unhideWhenUsed/>
+    <w:rsid w:val="00E72746"/>
+    <w:pPr>
+      <w:tabs>
+        <w:tab w:val="center" w:pos="4252"/>
+        <w:tab w:val="right" w:pos="8504"/>
+      </w:tabs>
+      <w:spacing w:after="0" w:line="240" w:lineRule="auto"/>
+    </w:pPr>
+  </w:style>
+  <w:style w:type="character" w:customStyle="1" w:styleId="CabealhoChar">
+    <w:name w:val="Cabeçalho Char"/>
+    <w:basedOn w:val="Fontepargpadro"/>
+    <w:link w:val="Cabealho"/>
+    <w:uiPriority w:val="99"/>
+    <w:rsid w:val="00E72746"/>
+  </w:style>
+  <w:style w:type="paragraph" w:styleId="Rodap">
+    <w:name w:val="footer"/>
+    <w:basedOn w:val="Normal"/>
+    <w:link w:val="RodapChar"/>
+    <w:uiPriority w:val="99"/>
+    <w:unhideWhenUsed/>
+    <w:rsid w:val="00E72746"/>
+    <w:pPr>
+      <w:tabs>
+        <w:tab w:val="center" w:pos="4252"/>
+        <w:tab w:val="right" w:pos="8504"/>
+      </w:tabs>
+      <w:spacing w:after="0" w:line="240" w:lineRule="auto"/>
+    </w:pPr>
+  </w:style>
+  <w:style w:type="character" w:customStyle="1" w:styleId="RodapChar">
+    <w:name w:val="Rodapé Char"/>
+    <w:basedOn w:val="Fontepargpadro"/>
+    <w:link w:val="Rodap"/>
+    <w:uiPriority w:val="99"/>
+    <w:rsid w:val="00E72746"/>
   </w:style>
 </w:styles>
 </file>

</xml_diff>

<commit_message>
Estudos e praticas do ALURA
Começando os cursos da alura
</commit_message>
<xml_diff>
--- a/Curso Python/Anotações sobre o Curso de Python.docx
+++ b/Curso Python/Anotações sobre o Curso de Python.docx
@@ -5495,9 +5495,8 @@
       <w:pPr>
         <w:spacing w:line="240" w:lineRule="auto"/>
         <w:rPr>
-          <w:rFonts w:ascii="Times New Roman" w:eastAsia="Times New Roman" w:hAnsi="Times New Roman" w:cs="Times New Roman"/>
-          <w:sz w:val="24"/>
-          <w:szCs w:val="24"/>
+          <w:rFonts w:ascii="Calibri" w:eastAsia="Times New Roman" w:hAnsi="Calibri" w:cs="Calibri"/>
+          <w:color w:val="000000"/>
           <w:lang w:eastAsia="pt-BR"/>
         </w:rPr>
       </w:pPr>
@@ -5779,9 +5778,8 @@
       <w:pPr>
         <w:spacing w:line="240" w:lineRule="auto"/>
         <w:rPr>
-          <w:rFonts w:ascii="Times New Roman" w:eastAsia="Times New Roman" w:hAnsi="Times New Roman" w:cs="Times New Roman"/>
-          <w:sz w:val="24"/>
-          <w:szCs w:val="24"/>
+          <w:rFonts w:ascii="Calibri" w:eastAsia="Times New Roman" w:hAnsi="Calibri" w:cs="Calibri"/>
+          <w:color w:val="000000"/>
           <w:lang w:eastAsia="pt-BR"/>
         </w:rPr>
       </w:pPr>
@@ -5828,6 +5826,72 @@
           <w:lang w:eastAsia="pt-BR"/>
         </w:rPr>
         <w:t xml:space="preserve"> do print</w:t>
+      </w:r>
+    </w:p>
+    <w:p>
+      <w:pPr>
+        <w:spacing w:line="240" w:lineRule="auto"/>
+        <w:rPr>
+          <w:rFonts w:ascii="Times New Roman" w:eastAsia="Times New Roman" w:hAnsi="Times New Roman" w:cs="Times New Roman"/>
+          <w:sz w:val="24"/>
+          <w:szCs w:val="24"/>
+          <w:lang w:eastAsia="pt-BR"/>
+        </w:rPr>
+      </w:pPr>
+      <w:r>
+        <w:rPr>
+          <w:rFonts w:ascii="Calibri" w:eastAsia="Times New Roman" w:hAnsi="Calibri" w:cs="Calibri"/>
+          <w:color w:val="000000"/>
+          <w:lang w:eastAsia="pt-BR"/>
+        </w:rPr>
+        <w:t>Saber mais de tuplas (</w:t>
+      </w:r>
+      <w:hyperlink r:id="rId8" w:history="1">
+        <w:r>
+          <w:rPr>
+            <w:rStyle w:val="Hyperlink"/>
+            <w:rFonts w:ascii="Calibri" w:eastAsia="Times New Roman" w:hAnsi="Calibri" w:cs="Calibri"/>
+            <w:lang w:eastAsia="pt-BR"/>
+          </w:rPr>
+          <w:t>https://docs.python.org/pt-br/3/tutorial/datastructures.html#tuples-and-sequences</w:t>
+        </w:r>
+      </w:hyperlink>
+      <w:r>
+        <w:rPr>
+          <w:rFonts w:ascii="Calibri" w:eastAsia="Times New Roman" w:hAnsi="Calibri" w:cs="Calibri"/>
+          <w:color w:val="000000"/>
+          <w:lang w:eastAsia="pt-BR"/>
+        </w:rPr>
+        <w:t xml:space="preserve">) </w:t>
+      </w:r>
+      <w:r>
+        <w:rPr>
+          <w:rFonts w:ascii="Calibri" w:eastAsia="Times New Roman" w:hAnsi="Calibri" w:cs="Calibri"/>
+          <w:color w:val="000000"/>
+          <w:lang w:eastAsia="pt-BR"/>
+        </w:rPr>
+        <w:br/>
+      </w:r>
+      <w:hyperlink r:id="rId9" w:history="1">
+        <w:r>
+          <w:rPr>
+            <w:rStyle w:val="Hyperlink"/>
+            <w:rFonts w:ascii="Times New Roman" w:eastAsia="Times New Roman" w:hAnsi="Times New Roman" w:cs="Times New Roman"/>
+            <w:sz w:val="24"/>
+            <w:szCs w:val="24"/>
+            <w:lang w:eastAsia="pt-BR"/>
+          </w:rPr>
+          <w:t>https://www.alura.com.br/artigos/conhecendo-as-tuplas-no-python</w:t>
+        </w:r>
+      </w:hyperlink>
+      <w:r>
+        <w:rPr>
+          <w:rFonts w:ascii="Times New Roman" w:eastAsia="Times New Roman" w:hAnsi="Times New Roman" w:cs="Times New Roman"/>
+          <w:sz w:val="24"/>
+          <w:szCs w:val="24"/>
+          <w:lang w:eastAsia="pt-BR"/>
+        </w:rPr>
+        <w:t xml:space="preserve"> </w:t>
       </w:r>
     </w:p>
     <w:p>
@@ -6239,6 +6303,7 @@
           <w:color w:val="000000"/>
           <w:lang w:eastAsia="pt-BR"/>
         </w:rPr>
+        <w:lastRenderedPageBreak/>
         <w:t>del</w:t>
       </w:r>
       <w:proofErr w:type="spellEnd"/>
@@ -6287,7 +6352,6 @@
           <w:color w:val="000000"/>
           <w:lang w:eastAsia="pt-BR"/>
         </w:rPr>
-        <w:lastRenderedPageBreak/>
         <w:t>lanche.pop</w:t>
       </w:r>
       <w:proofErr w:type="spellEnd"/>
@@ -7174,7 +7238,7 @@
                     <pic:cNvPicPr/>
                   </pic:nvPicPr>
                   <pic:blipFill>
-                    <a:blip r:embed="rId8"/>
+                    <a:blip r:embed="rId10"/>
                     <a:stretch>
                       <a:fillRect/>
                     </a:stretch>
@@ -7352,7 +7416,7 @@
                     <pic:cNvPicPr/>
                   </pic:nvPicPr>
                   <pic:blipFill>
-                    <a:blip r:embed="rId9"/>
+                    <a:blip r:embed="rId11"/>
                     <a:stretch>
                       <a:fillRect/>
                     </a:stretch>
@@ -7472,7 +7536,7 @@
                     <pic:cNvPicPr/>
                   </pic:nvPicPr>
                   <pic:blipFill>
-                    <a:blip r:embed="rId10"/>
+                    <a:blip r:embed="rId12"/>
                     <a:stretch>
                       <a:fillRect/>
                     </a:stretch>
@@ -7704,7 +7768,7 @@
                     <pic:cNvPicPr/>
                   </pic:nvPicPr>
                   <pic:blipFill>
-                    <a:blip r:embed="rId11"/>
+                    <a:blip r:embed="rId13"/>
                     <a:stretch>
                       <a:fillRect/>
                     </a:stretch>
@@ -7979,6 +8043,9 @@
     </w:p>
     <w:p>
       <w:r>
+        <w:rPr>
+          <w:noProof/>
+        </w:rPr>
         <w:drawing>
           <wp:inline distT="0" distB="0" distL="0" distR="0" wp14:anchorId="2A2B2A58" wp14:editId="598CFA4E">
             <wp:extent cx="5400040" cy="3982085"/>
@@ -7995,7 +8062,7 @@
                     <pic:cNvPicPr/>
                   </pic:nvPicPr>
                   <pic:blipFill>
-                    <a:blip r:embed="rId12"/>
+                    <a:blip r:embed="rId14"/>
                     <a:stretch>
                       <a:fillRect/>
                     </a:stretch>
@@ -8040,6 +8107,9 @@
     </w:p>
     <w:p>
       <w:r>
+        <w:rPr>
+          <w:noProof/>
+        </w:rPr>
         <w:lastRenderedPageBreak/>
         <w:drawing>
           <wp:inline distT="0" distB="0" distL="0" distR="0" wp14:anchorId="6811E1F9" wp14:editId="067790F9">
@@ -8057,7 +8127,7 @@
                     <pic:cNvPicPr/>
                   </pic:nvPicPr>
                   <pic:blipFill>
-                    <a:blip r:embed="rId13"/>
+                    <a:blip r:embed="rId15"/>
                     <a:stretch>
                       <a:fillRect/>
                     </a:stretch>
@@ -8115,6 +8185,9 @@
     </w:p>
     <w:p>
       <w:r>
+        <w:rPr>
+          <w:noProof/>
+        </w:rPr>
         <w:drawing>
           <wp:inline distT="0" distB="0" distL="0" distR="0" wp14:anchorId="0B9CD7CF" wp14:editId="12F76022">
             <wp:extent cx="5400040" cy="2498090"/>
@@ -8131,7 +8204,7 @@
                     <pic:cNvPicPr/>
                   </pic:nvPicPr>
                   <pic:blipFill>
-                    <a:blip r:embed="rId14"/>
+                    <a:blip r:embed="rId16"/>
                     <a:stretch>
                       <a:fillRect/>
                     </a:stretch>
@@ -8152,7 +8225,1464 @@
         </w:drawing>
       </w:r>
     </w:p>
+    <w:p/>
+    <w:p>
+      <w:pPr>
+        <w:rPr>
+          <w:sz w:val="52"/>
+          <w:szCs w:val="52"/>
+        </w:rPr>
+      </w:pPr>
+      <w:r>
+        <w:rPr>
+          <w:sz w:val="52"/>
+          <w:szCs w:val="52"/>
+        </w:rPr>
+        <w:lastRenderedPageBreak/>
+        <w:t xml:space="preserve">Curso </w:t>
+      </w:r>
+      <w:proofErr w:type="spellStart"/>
+      <w:r>
+        <w:rPr>
+          <w:sz w:val="52"/>
+          <w:szCs w:val="52"/>
+        </w:rPr>
+        <w:t>Alura</w:t>
+      </w:r>
+      <w:proofErr w:type="spellEnd"/>
+    </w:p>
+    <w:p>
+      <w:pPr>
+        <w:rPr>
+          <w:sz w:val="52"/>
+          <w:szCs w:val="52"/>
+        </w:rPr>
+      </w:pPr>
+    </w:p>
+    <w:p>
+      <w:r>
+        <w:t>Existe como ter uma quebra de linha dentro do Print</w:t>
+      </w:r>
+    </w:p>
+    <w:p>
+      <w:r>
+        <w:t xml:space="preserve">Basta utilizar 3 aspas duplas, então além de comentário, tem como quebrar linha EX: </w:t>
+      </w:r>
+    </w:p>
+    <w:p>
+      <w:r>
+        <w:t xml:space="preserve">Print(“”” </w:t>
+      </w:r>
+      <w:proofErr w:type="spellStart"/>
+      <w:r>
+        <w:t>Ola</w:t>
+      </w:r>
+      <w:proofErr w:type="spellEnd"/>
+      <w:r>
+        <w:t xml:space="preserve"> mundo </w:t>
+      </w:r>
+    </w:p>
+    <w:p/>
+    <w:p>
+      <w:r>
+        <w:t>“””)</w:t>
+      </w:r>
+    </w:p>
+    <w:p>
+      <w:r>
+        <w:t xml:space="preserve">Nesse caso ele vai mostrar o </w:t>
+      </w:r>
+      <w:proofErr w:type="spellStart"/>
+      <w:r>
+        <w:t>ola</w:t>
+      </w:r>
+      <w:proofErr w:type="spellEnd"/>
+      <w:r>
+        <w:t xml:space="preserve"> mundo e quebrar duas linhas pois foram 2 </w:t>
+      </w:r>
+      <w:proofErr w:type="spellStart"/>
+      <w:r>
+        <w:t>enters</w:t>
+      </w:r>
+      <w:proofErr w:type="spellEnd"/>
+      <w:r>
+        <w:t xml:space="preserve"> </w:t>
+      </w:r>
+    </w:p>
+    <w:p>
+      <w:r>
+        <w:t>Para imprimir a palavra ‘ALURA’ com cada letra em cada linha com a função print utilizando o parâmetro </w:t>
+      </w:r>
+      <w:proofErr w:type="spellStart"/>
+      <w:r>
+        <w:rPr>
+          <w:i/>
+          <w:iCs/>
+        </w:rPr>
+        <w:t>sep</w:t>
+      </w:r>
+      <w:proofErr w:type="spellEnd"/>
+      <w:r>
+        <w:t> para especificar o separador entre os argumentos da seguinte forma:</w:t>
+      </w:r>
+    </w:p>
+    <w:p>
+      <w:r>
+        <w:t>print('A','L','U','R','A',</w:t>
+      </w:r>
+      <w:proofErr w:type="spellStart"/>
+      <w:r>
+        <w:t>sep</w:t>
+      </w:r>
+      <w:proofErr w:type="spellEnd"/>
+      <w:r>
+        <w:t>='\n')</w:t>
+      </w:r>
+    </w:p>
+    <w:p>
+      <w:r>
+        <w:t xml:space="preserve">para arredondar podemos utilizar isso (para </w:t>
+      </w:r>
+      <w:proofErr w:type="spellStart"/>
+      <w:r>
+        <w:t>strings</w:t>
+      </w:r>
+      <w:proofErr w:type="spellEnd"/>
+      <w:r>
+        <w:t>)</w:t>
+      </w:r>
+    </w:p>
+    <w:p>
+      <w:r>
+        <w:t># Utilizando a função round()</w:t>
+      </w:r>
+    </w:p>
+    <w:p>
+      <w:r>
+        <w:t>print('O valor arredondado de pi é:', round(pi, 2))</w:t>
+      </w:r>
+    </w:p>
+    <w:p/>
+    <w:p/>
+    <w:p>
+      <w:r>
+        <w:t xml:space="preserve">Biblioteca OS </w:t>
+      </w:r>
+    </w:p>
+    <w:p>
+      <w:r>
+        <w:t xml:space="preserve">Ele serve para controlar o sistema do </w:t>
+      </w:r>
+      <w:proofErr w:type="spellStart"/>
+      <w:r>
+        <w:t>pc</w:t>
+      </w:r>
+      <w:proofErr w:type="spellEnd"/>
+      <w:r>
+        <w:t xml:space="preserve"> </w:t>
+      </w:r>
+    </w:p>
+    <w:p/>
+    <w:p>
+      <w:r>
+        <w:t>__</w:t>
+      </w:r>
+      <w:proofErr w:type="spellStart"/>
+      <w:r>
+        <w:t>name</w:t>
+      </w:r>
+      <w:proofErr w:type="spellEnd"/>
+      <w:r>
+        <w:t xml:space="preserve">__ </w:t>
+      </w:r>
+    </w:p>
+    <w:p>
+      <w:pPr>
+        <w:rPr>
+          <w:b/>
+          <w:bCs/>
+        </w:rPr>
+      </w:pPr>
+      <w:r>
+        <w:rPr>
+          <w:b/>
+          <w:bCs/>
+        </w:rPr>
+        <w:t>E</w:t>
+      </w:r>
+      <w:r>
+        <w:rPr>
+          <w:b/>
+          <w:bCs/>
+        </w:rPr>
+        <w:t xml:space="preserve">ntendendo o </w:t>
+      </w:r>
+      <w:proofErr w:type="spellStart"/>
+      <w:r>
+        <w:rPr>
+          <w:b/>
+          <w:bCs/>
+        </w:rPr>
+        <w:t>if</w:t>
+      </w:r>
+      <w:proofErr w:type="spellEnd"/>
+      <w:r>
+        <w:rPr>
+          <w:b/>
+          <w:bCs/>
+        </w:rPr>
+        <w:t xml:space="preserve"> __</w:t>
+      </w:r>
+      <w:proofErr w:type="spellStart"/>
+      <w:r>
+        <w:rPr>
+          <w:b/>
+          <w:bCs/>
+        </w:rPr>
+        <w:t>name</w:t>
+      </w:r>
+      <w:proofErr w:type="spellEnd"/>
+      <w:r>
+        <w:rPr>
+          <w:b/>
+          <w:bCs/>
+        </w:rPr>
+        <w:t>__ == '__</w:t>
+      </w:r>
+      <w:proofErr w:type="spellStart"/>
+      <w:r>
+        <w:rPr>
+          <w:b/>
+          <w:bCs/>
+        </w:rPr>
+        <w:t>main</w:t>
+      </w:r>
+      <w:proofErr w:type="spellEnd"/>
+      <w:r>
+        <w:rPr>
+          <w:b/>
+          <w:bCs/>
+        </w:rPr>
+        <w:t>__' em Python</w:t>
+      </w:r>
+    </w:p>
+    <w:p>
+      <w:pPr>
+        <w:rPr>
+          <w:b/>
+          <w:bCs/>
+        </w:rPr>
+      </w:pPr>
+      <w:r>
+        <w:rPr>
+          <w:b/>
+          <w:bCs/>
+        </w:rPr>
+        <w:t>O que é o __</w:t>
+      </w:r>
+      <w:proofErr w:type="spellStart"/>
+      <w:r>
+        <w:rPr>
+          <w:b/>
+          <w:bCs/>
+        </w:rPr>
+        <w:t>name</w:t>
+      </w:r>
+      <w:proofErr w:type="spellEnd"/>
+      <w:r>
+        <w:rPr>
+          <w:b/>
+          <w:bCs/>
+        </w:rPr>
+        <w:t>__?</w:t>
+      </w:r>
+    </w:p>
+    <w:p>
+      <w:pPr>
+        <w:numPr>
+          <w:ilvl w:val="0"/>
+          <w:numId w:val="2"/>
+        </w:numPr>
+      </w:pPr>
+      <w:r>
+        <w:t>Toda vez que um arquivo Python é executado, o interpretador cria algumas variáveis especiais automaticamente.</w:t>
+      </w:r>
+    </w:p>
+    <w:p>
+      <w:pPr>
+        <w:numPr>
+          <w:ilvl w:val="0"/>
+          <w:numId w:val="2"/>
+        </w:numPr>
+      </w:pPr>
+      <w:r>
+        <w:t>Uma dessas variáveis é __</w:t>
+      </w:r>
+      <w:proofErr w:type="spellStart"/>
+      <w:r>
+        <w:t>name</w:t>
+      </w:r>
+      <w:proofErr w:type="spellEnd"/>
+      <w:r>
+        <w:t>__.</w:t>
+      </w:r>
+    </w:p>
+    <w:p>
+      <w:pPr>
+        <w:numPr>
+          <w:ilvl w:val="0"/>
+          <w:numId w:val="2"/>
+        </w:numPr>
+      </w:pPr>
+      <w:r>
+        <w:t xml:space="preserve">O valor dela depende de </w:t>
+      </w:r>
+      <w:r>
+        <w:rPr>
+          <w:b/>
+          <w:bCs/>
+        </w:rPr>
+        <w:t>como o arquivo foi executado</w:t>
+      </w:r>
+      <w:r>
+        <w:t>:</w:t>
+      </w:r>
+    </w:p>
+    <w:p>
+      <w:pPr>
+        <w:numPr>
+          <w:ilvl w:val="1"/>
+          <w:numId w:val="2"/>
+        </w:numPr>
+      </w:pPr>
+      <w:r>
+        <w:t xml:space="preserve">Se o arquivo foi </w:t>
+      </w:r>
+      <w:r>
+        <w:rPr>
+          <w:b/>
+          <w:bCs/>
+        </w:rPr>
+        <w:t>executado diretamente</w:t>
+      </w:r>
+      <w:r>
+        <w:t xml:space="preserve"> (</w:t>
+      </w:r>
+      <w:proofErr w:type="spellStart"/>
+      <w:r>
+        <w:t>python</w:t>
+      </w:r>
+      <w:proofErr w:type="spellEnd"/>
+      <w:r>
+        <w:t xml:space="preserve"> meu_arquivo.py), o valor de __</w:t>
+      </w:r>
+      <w:proofErr w:type="spellStart"/>
+      <w:r>
+        <w:t>name</w:t>
+      </w:r>
+      <w:proofErr w:type="spellEnd"/>
+      <w:r>
+        <w:t>__ será '__</w:t>
+      </w:r>
+      <w:proofErr w:type="spellStart"/>
+      <w:r>
+        <w:t>main</w:t>
+      </w:r>
+      <w:proofErr w:type="spellEnd"/>
+      <w:r>
+        <w:t>__'.</w:t>
+      </w:r>
+    </w:p>
+    <w:p>
+      <w:pPr>
+        <w:numPr>
+          <w:ilvl w:val="1"/>
+          <w:numId w:val="2"/>
+        </w:numPr>
+      </w:pPr>
+      <w:r>
+        <w:t xml:space="preserve">Se o arquivo foi </w:t>
+      </w:r>
+      <w:r>
+        <w:rPr>
+          <w:b/>
+          <w:bCs/>
+        </w:rPr>
+        <w:t>importado como módulo</w:t>
+      </w:r>
+      <w:r>
+        <w:t xml:space="preserve"> em outro programa (</w:t>
+      </w:r>
+      <w:proofErr w:type="spellStart"/>
+      <w:r>
+        <w:t>import</w:t>
+      </w:r>
+      <w:proofErr w:type="spellEnd"/>
+      <w:r>
+        <w:t xml:space="preserve"> </w:t>
+      </w:r>
+      <w:proofErr w:type="spellStart"/>
+      <w:r>
+        <w:t>meu_arquivo</w:t>
+      </w:r>
+      <w:proofErr w:type="spellEnd"/>
+      <w:r>
+        <w:t>), o valor de __</w:t>
+      </w:r>
+      <w:proofErr w:type="spellStart"/>
+      <w:r>
+        <w:t>name</w:t>
+      </w:r>
+      <w:proofErr w:type="spellEnd"/>
+      <w:r>
+        <w:t xml:space="preserve">__ será o </w:t>
+      </w:r>
+      <w:r>
+        <w:rPr>
+          <w:b/>
+          <w:bCs/>
+        </w:rPr>
+        <w:t>nome do arquivo</w:t>
+      </w:r>
+      <w:r>
+        <w:t xml:space="preserve"> (sem a extensão .</w:t>
+      </w:r>
+      <w:proofErr w:type="spellStart"/>
+      <w:r>
+        <w:t>py</w:t>
+      </w:r>
+      <w:proofErr w:type="spellEnd"/>
+      <w:r>
+        <w:t>).</w:t>
+      </w:r>
+    </w:p>
+    <w:p>
+      <w:pPr>
+        <w:rPr>
+          <w:b/>
+          <w:bCs/>
+        </w:rPr>
+      </w:pPr>
+      <w:r>
+        <w:rPr>
+          <w:b/>
+          <w:bCs/>
+        </w:rPr>
+        <w:lastRenderedPageBreak/>
+        <w:t xml:space="preserve">Para que serve o </w:t>
+      </w:r>
+      <w:proofErr w:type="spellStart"/>
+      <w:r>
+        <w:rPr>
+          <w:b/>
+          <w:bCs/>
+        </w:rPr>
+        <w:t>if</w:t>
+      </w:r>
+      <w:proofErr w:type="spellEnd"/>
+      <w:r>
+        <w:rPr>
+          <w:b/>
+          <w:bCs/>
+        </w:rPr>
+        <w:t xml:space="preserve"> __</w:t>
+      </w:r>
+      <w:proofErr w:type="spellStart"/>
+      <w:r>
+        <w:rPr>
+          <w:b/>
+          <w:bCs/>
+        </w:rPr>
+        <w:t>name</w:t>
+      </w:r>
+      <w:proofErr w:type="spellEnd"/>
+      <w:r>
+        <w:rPr>
+          <w:b/>
+          <w:bCs/>
+        </w:rPr>
+        <w:t>__ == '__</w:t>
+      </w:r>
+      <w:proofErr w:type="spellStart"/>
+      <w:r>
+        <w:rPr>
+          <w:b/>
+          <w:bCs/>
+        </w:rPr>
+        <w:t>main</w:t>
+      </w:r>
+      <w:proofErr w:type="spellEnd"/>
+      <w:r>
+        <w:rPr>
+          <w:b/>
+          <w:bCs/>
+        </w:rPr>
+        <w:t>__': ?</w:t>
+      </w:r>
+    </w:p>
+    <w:p>
+      <w:r>
+        <w:t xml:space="preserve">Essa estrutura é usada para </w:t>
+      </w:r>
+      <w:r>
+        <w:rPr>
+          <w:b/>
+          <w:bCs/>
+        </w:rPr>
+        <w:t>diferenciar</w:t>
+      </w:r>
+      <w:r>
+        <w:t xml:space="preserve"> quando o arquivo está sendo:</w:t>
+      </w:r>
+    </w:p>
+    <w:p>
+      <w:pPr>
+        <w:numPr>
+          <w:ilvl w:val="0"/>
+          <w:numId w:val="3"/>
+        </w:numPr>
+      </w:pPr>
+      <w:r>
+        <w:t>Executado diretamente → roda o código dentro do bloco.</w:t>
+      </w:r>
+    </w:p>
+    <w:p>
+      <w:pPr>
+        <w:numPr>
+          <w:ilvl w:val="0"/>
+          <w:numId w:val="3"/>
+        </w:numPr>
+      </w:pPr>
+      <w:r>
+        <w:t>Importado em outro arquivo → ignora o bloco.</w:t>
+      </w:r>
+    </w:p>
+    <w:p>
+      <w:r>
+        <w:t xml:space="preserve">Ou seja, é uma </w:t>
+      </w:r>
+      <w:r>
+        <w:rPr>
+          <w:b/>
+          <w:bCs/>
+        </w:rPr>
+        <w:t>proteção</w:t>
+      </w:r>
+      <w:r>
+        <w:t xml:space="preserve"> que impede que certos trechos de código sejam executados de forma indesejada ao importar módulos.</w:t>
+      </w:r>
+    </w:p>
+    <w:p>
+      <w:pPr>
+        <w:rPr>
+          <w:b/>
+          <w:bCs/>
+        </w:rPr>
+      </w:pPr>
+      <w:r>
+        <w:rPr>
+          <w:b/>
+          <w:bCs/>
+        </w:rPr>
+        <w:t>Exemplo básico</w:t>
+      </w:r>
+    </w:p>
+    <w:p>
+      <w:r>
+        <w:t># arquivo: exemplo.py</w:t>
+      </w:r>
+    </w:p>
+    <w:p>
+      <w:proofErr w:type="spellStart"/>
+      <w:r>
+        <w:t>def</w:t>
+      </w:r>
+      <w:proofErr w:type="spellEnd"/>
+      <w:r>
+        <w:t xml:space="preserve"> </w:t>
+      </w:r>
+      <w:proofErr w:type="spellStart"/>
+      <w:r>
+        <w:t>saudacao</w:t>
+      </w:r>
+      <w:proofErr w:type="spellEnd"/>
+      <w:r>
+        <w:t>():</w:t>
+      </w:r>
+    </w:p>
+    <w:p>
+      <w:r>
+        <w:t xml:space="preserve">    print("Olá, seja bem-vindo!")</w:t>
+      </w:r>
+    </w:p>
+    <w:p>
+      <w:pPr>
+        <w:rPr>
+          <w:lang w:val="de-DE"/>
+        </w:rPr>
+      </w:pPr>
+      <w:r>
+        <w:rPr>
+          <w:lang w:val="de-DE"/>
+        </w:rPr>
+        <w:t>if __name__ == '__main__':</w:t>
+      </w:r>
+    </w:p>
+    <w:p>
+      <w:r>
+        <w:rPr>
+          <w:lang w:val="de-DE"/>
+        </w:rPr>
+        <w:t xml:space="preserve">    </w:t>
+      </w:r>
+      <w:r>
+        <w:t>print("Executando diretamente")</w:t>
+      </w:r>
+    </w:p>
+    <w:p>
+      <w:r>
+        <w:t xml:space="preserve">    </w:t>
+      </w:r>
+      <w:proofErr w:type="spellStart"/>
+      <w:r>
+        <w:t>saudacao</w:t>
+      </w:r>
+      <w:proofErr w:type="spellEnd"/>
+      <w:r>
+        <w:t>()</w:t>
+      </w:r>
+    </w:p>
+    <w:p>
+      <w:pPr>
+        <w:numPr>
+          <w:ilvl w:val="0"/>
+          <w:numId w:val="4"/>
+        </w:numPr>
+      </w:pPr>
+      <w:r>
+        <w:t xml:space="preserve">Se rodarmos </w:t>
+      </w:r>
+      <w:proofErr w:type="spellStart"/>
+      <w:r>
+        <w:t>python</w:t>
+      </w:r>
+      <w:proofErr w:type="spellEnd"/>
+      <w:r>
+        <w:t xml:space="preserve"> exemplo.py:</w:t>
+      </w:r>
+    </w:p>
+    <w:p>
+      <w:pPr>
+        <w:numPr>
+          <w:ilvl w:val="0"/>
+          <w:numId w:val="4"/>
+        </w:numPr>
+      </w:pPr>
+      <w:r>
+        <w:t>Executando diretamente</w:t>
+      </w:r>
+    </w:p>
+    <w:p>
+      <w:pPr>
+        <w:numPr>
+          <w:ilvl w:val="0"/>
+          <w:numId w:val="4"/>
+        </w:numPr>
+      </w:pPr>
+      <w:r>
+        <w:t>Olá, seja bem-vindo!</w:t>
+      </w:r>
+    </w:p>
+    <w:p>
+      <w:pPr>
+        <w:numPr>
+          <w:ilvl w:val="0"/>
+          <w:numId w:val="4"/>
+        </w:numPr>
+      </w:pPr>
+      <w:r>
+        <w:t>Se importarmos em outro arquivo:</w:t>
+      </w:r>
+    </w:p>
+    <w:p>
+      <w:pPr>
+        <w:numPr>
+          <w:ilvl w:val="0"/>
+          <w:numId w:val="4"/>
+        </w:numPr>
+      </w:pPr>
+      <w:proofErr w:type="spellStart"/>
+      <w:r>
+        <w:t>import</w:t>
+      </w:r>
+      <w:proofErr w:type="spellEnd"/>
+      <w:r>
+        <w:t xml:space="preserve"> exemplo</w:t>
+      </w:r>
+    </w:p>
+    <w:p>
+      <w:pPr>
+        <w:numPr>
+          <w:ilvl w:val="0"/>
+          <w:numId w:val="4"/>
+        </w:numPr>
+      </w:pPr>
+      <w:proofErr w:type="spellStart"/>
+      <w:r>
+        <w:t>exemplo.saudacao</w:t>
+      </w:r>
+      <w:proofErr w:type="spellEnd"/>
+      <w:r>
+        <w:t>()</w:t>
+      </w:r>
+    </w:p>
+    <w:p>
+      <w:r>
+        <w:t>Saída:</w:t>
+      </w:r>
+    </w:p>
+    <w:p>
+      <w:r>
+        <w:t>Olá, seja bem-vindo!</w:t>
+      </w:r>
+    </w:p>
+    <w:p>
+      <w:r>
+        <w:rPr>
+          <w:rFonts w:ascii="Segoe UI Symbol" w:hAnsi="Segoe UI Symbol" w:cs="Segoe UI Symbol"/>
+        </w:rPr>
+        <w:t>➝</w:t>
+      </w:r>
+      <w:r>
+        <w:t xml:space="preserve"> Note que a linha "Executando diretamente" </w:t>
+      </w:r>
+      <w:r>
+        <w:rPr>
+          <w:b/>
+          <w:bCs/>
+        </w:rPr>
+        <w:t>não aparece</w:t>
+      </w:r>
+      <w:r>
+        <w:t xml:space="preserve">, pois o bloco </w:t>
+      </w:r>
+      <w:proofErr w:type="spellStart"/>
+      <w:r>
+        <w:t>if</w:t>
+      </w:r>
+      <w:proofErr w:type="spellEnd"/>
+      <w:r>
+        <w:t xml:space="preserve"> __</w:t>
+      </w:r>
+      <w:proofErr w:type="spellStart"/>
+      <w:r>
+        <w:t>name</w:t>
+      </w:r>
+      <w:proofErr w:type="spellEnd"/>
+      <w:r>
+        <w:t>__ == '__</w:t>
+      </w:r>
+      <w:proofErr w:type="spellStart"/>
+      <w:r>
+        <w:t>main</w:t>
+      </w:r>
+      <w:proofErr w:type="spellEnd"/>
+      <w:r>
+        <w:t>__' não foi executado.</w:t>
+      </w:r>
+    </w:p>
+    <w:p>
+      <w:pPr>
+        <w:rPr>
+          <w:b/>
+          <w:bCs/>
+        </w:rPr>
+      </w:pPr>
+      <w:r>
+        <w:rPr>
+          <w:b/>
+          <w:bCs/>
+        </w:rPr>
+        <w:t>Vantagens de usar</w:t>
+      </w:r>
+    </w:p>
+    <w:p>
+      <w:pPr>
+        <w:numPr>
+          <w:ilvl w:val="0"/>
+          <w:numId w:val="5"/>
+        </w:numPr>
+      </w:pPr>
+      <w:r>
+        <w:rPr>
+          <w:b/>
+          <w:bCs/>
+        </w:rPr>
+        <w:t>Reutilização de código</w:t>
+      </w:r>
+      <w:r>
+        <w:t xml:space="preserve"> → você pode escrever funções e classes que são usadas tanto no próprio arquivo quanto em outros.</w:t>
+      </w:r>
+    </w:p>
+    <w:p>
+      <w:pPr>
+        <w:numPr>
+          <w:ilvl w:val="0"/>
+          <w:numId w:val="5"/>
+        </w:numPr>
+      </w:pPr>
+      <w:r>
+        <w:rPr>
+          <w:b/>
+          <w:bCs/>
+        </w:rPr>
+        <w:t>Organização</w:t>
+      </w:r>
+      <w:r>
+        <w:t xml:space="preserve"> → separa o “código principal” (que roda quando você executa o script) do “código reutilizável” (que pode ser importado).</w:t>
+      </w:r>
+    </w:p>
+    <w:p>
+      <w:pPr>
+        <w:numPr>
+          <w:ilvl w:val="0"/>
+          <w:numId w:val="5"/>
+        </w:numPr>
+      </w:pPr>
+      <w:r>
+        <w:rPr>
+          <w:b/>
+          <w:bCs/>
+        </w:rPr>
+        <w:t>Boas práticas</w:t>
+      </w:r>
+      <w:r>
+        <w:t xml:space="preserve"> → é um padrão recomendado em praticamente todo projeto Python.</w:t>
+      </w:r>
+    </w:p>
+    <w:p>
+      <w:r>
+        <w:pict w14:anchorId="2D0B8D83">
+          <v:rect id="_x0000_i1058" style="width:0;height:1.5pt" o:hralign="center" o:hrstd="t" o:hr="t" fillcolor="#a0a0a0" stroked="f"/>
+        </w:pict>
+      </w:r>
+    </w:p>
+    <w:p>
+      <w:pPr>
+        <w:rPr>
+          <w:b/>
+          <w:bCs/>
+        </w:rPr>
+      </w:pPr>
+      <w:r>
+        <w:rPr>
+          <w:b/>
+          <w:bCs/>
+        </w:rPr>
+        <w:t>Estrutura comum em projetos</w:t>
+      </w:r>
+    </w:p>
+    <w:p>
+      <w:r>
+        <w:t>É muito comum encontrar esse padrão em projetos Python:</w:t>
+      </w:r>
+    </w:p>
+    <w:p>
+      <w:proofErr w:type="spellStart"/>
+      <w:r>
+        <w:lastRenderedPageBreak/>
+        <w:t>def</w:t>
+      </w:r>
+      <w:proofErr w:type="spellEnd"/>
+      <w:r>
+        <w:t xml:space="preserve"> </w:t>
+      </w:r>
+      <w:proofErr w:type="spellStart"/>
+      <w:r>
+        <w:t>main</w:t>
+      </w:r>
+      <w:proofErr w:type="spellEnd"/>
+      <w:r>
+        <w:t>():</w:t>
+      </w:r>
+    </w:p>
+    <w:p>
+      <w:r>
+        <w:t xml:space="preserve">    # lógica principal do programa</w:t>
+      </w:r>
+    </w:p>
+    <w:p>
+      <w:r>
+        <w:t xml:space="preserve">    print("Rodando o programa principal...")</w:t>
+      </w:r>
+    </w:p>
+    <w:p>
+      <w:pPr>
+        <w:rPr>
+          <w:lang w:val="de-DE"/>
+        </w:rPr>
+      </w:pPr>
+      <w:r>
+        <w:rPr>
+          <w:lang w:val="de-DE"/>
+        </w:rPr>
+        <w:t>if __name__ == '__main__':</w:t>
+      </w:r>
+    </w:p>
+    <w:p>
+      <w:r>
+        <w:rPr>
+          <w:lang w:val="de-DE"/>
+        </w:rPr>
+        <w:t xml:space="preserve">    </w:t>
+      </w:r>
+      <w:proofErr w:type="spellStart"/>
+      <w:r>
+        <w:t>main</w:t>
+      </w:r>
+      <w:proofErr w:type="spellEnd"/>
+      <w:r>
+        <w:t>()</w:t>
+      </w:r>
+    </w:p>
+    <w:p>
+      <w:r>
+        <w:t>Assim, o arquivo pode ser:</w:t>
+      </w:r>
+    </w:p>
+    <w:p>
+      <w:pPr>
+        <w:numPr>
+          <w:ilvl w:val="0"/>
+          <w:numId w:val="6"/>
+        </w:numPr>
+      </w:pPr>
+      <w:r>
+        <w:t xml:space="preserve">Executado diretamente → roda a função </w:t>
+      </w:r>
+      <w:proofErr w:type="spellStart"/>
+      <w:r>
+        <w:t>main</w:t>
+      </w:r>
+      <w:proofErr w:type="spellEnd"/>
+      <w:r>
+        <w:t>().</w:t>
+      </w:r>
+    </w:p>
+    <w:p>
+      <w:pPr>
+        <w:numPr>
+          <w:ilvl w:val="0"/>
+          <w:numId w:val="6"/>
+        </w:numPr>
+      </w:pPr>
+      <w:r>
+        <w:t xml:space="preserve">Importado em outro módulo → permite chamar </w:t>
+      </w:r>
+      <w:proofErr w:type="spellStart"/>
+      <w:r>
+        <w:t>main</w:t>
+      </w:r>
+      <w:proofErr w:type="spellEnd"/>
+      <w:r>
+        <w:t>() manualmente sem executar automaticamente.</w:t>
+      </w:r>
+    </w:p>
+    <w:p>
+      <w:r>
+        <w:pict w14:anchorId="2F40AF8F">
+          <v:rect id="_x0000_i1059" style="width:0;height:1.5pt" o:hralign="center" o:hrstd="t" o:hr="t" fillcolor="#a0a0a0" stroked="f"/>
+        </w:pict>
+      </w:r>
+    </w:p>
+    <w:p>
+      <w:r>
+        <w:rPr>
+          <w:rFonts w:ascii="Segoe UI Emoji" w:hAnsi="Segoe UI Emoji" w:cs="Segoe UI Emoji"/>
+        </w:rPr>
+        <w:t>✅</w:t>
+      </w:r>
+      <w:r>
+        <w:t xml:space="preserve"> Em resumo:</w:t>
+      </w:r>
+    </w:p>
+    <w:p>
+      <w:pPr>
+        <w:numPr>
+          <w:ilvl w:val="0"/>
+          <w:numId w:val="7"/>
+        </w:numPr>
+      </w:pPr>
+      <w:r>
+        <w:t>__</w:t>
+      </w:r>
+      <w:proofErr w:type="spellStart"/>
+      <w:r>
+        <w:t>name</w:t>
+      </w:r>
+      <w:proofErr w:type="spellEnd"/>
+      <w:r>
+        <w:t xml:space="preserve">__ é uma variável especial que indica </w:t>
+      </w:r>
+      <w:r>
+        <w:rPr>
+          <w:b/>
+          <w:bCs/>
+        </w:rPr>
+        <w:t>como o arquivo foi carregado</w:t>
+      </w:r>
+      <w:r>
+        <w:t>.</w:t>
+      </w:r>
+    </w:p>
+    <w:p>
+      <w:pPr>
+        <w:numPr>
+          <w:ilvl w:val="0"/>
+          <w:numId w:val="7"/>
+        </w:numPr>
+      </w:pPr>
+      <w:r>
+        <w:t xml:space="preserve">O </w:t>
+      </w:r>
+      <w:proofErr w:type="spellStart"/>
+      <w:r>
+        <w:t>if</w:t>
+      </w:r>
+      <w:proofErr w:type="spellEnd"/>
+      <w:r>
+        <w:t xml:space="preserve"> __</w:t>
+      </w:r>
+      <w:proofErr w:type="spellStart"/>
+      <w:r>
+        <w:t>name</w:t>
+      </w:r>
+      <w:proofErr w:type="spellEnd"/>
+      <w:r>
+        <w:t>__ == '__</w:t>
+      </w:r>
+      <w:proofErr w:type="spellStart"/>
+      <w:r>
+        <w:t>main</w:t>
+      </w:r>
+      <w:proofErr w:type="spellEnd"/>
+      <w:r>
+        <w:t xml:space="preserve">__': garante que </w:t>
+      </w:r>
+      <w:r>
+        <w:rPr>
+          <w:b/>
+          <w:bCs/>
+        </w:rPr>
+        <w:t>código só rode quando o arquivo for executado diretamente</w:t>
+      </w:r>
+      <w:r>
+        <w:t>.</w:t>
+      </w:r>
+    </w:p>
+    <w:p>
+      <w:pPr>
+        <w:numPr>
+          <w:ilvl w:val="0"/>
+          <w:numId w:val="7"/>
+        </w:numPr>
+      </w:pPr>
+      <w:r>
+        <w:t xml:space="preserve">É uma forma de deixar seu código </w:t>
+      </w:r>
+      <w:r>
+        <w:rPr>
+          <w:b/>
+          <w:bCs/>
+        </w:rPr>
+        <w:t>modular, organizado e reutilizável</w:t>
+      </w:r>
+      <w:r>
+        <w:t>.</w:t>
+      </w:r>
+    </w:p>
+    <w:p>
+      <w:r>
+        <w:t>Instrução MATCH</w:t>
+      </w:r>
+    </w:p>
+    <w:p>
+      <w:pPr>
+        <w:sectPr>
+          <w:pgSz w:w="11906" w:h="16838"/>
+          <w:pgMar w:top="1417" w:right="1701" w:bottom="1417" w:left="1701" w:header="708" w:footer="708" w:gutter="0"/>
+          <w:cols w:space="708"/>
+          <w:docGrid w:linePitch="360"/>
+        </w:sectPr>
+      </w:pPr>
+      <w:r>
+        <w:t xml:space="preserve"> É uma instrução igual o switch case em outras linguagens pode ser abordado para simplificar as instruções de </w:t>
+      </w:r>
+      <w:proofErr w:type="spellStart"/>
+      <w:r>
+        <w:t>if</w:t>
+      </w:r>
+      <w:proofErr w:type="spellEnd"/>
+      <w:r>
+        <w:t xml:space="preserve"> e </w:t>
+      </w:r>
+      <w:proofErr w:type="spellStart"/>
+      <w:r>
+        <w:t>else</w:t>
+      </w:r>
+      <w:proofErr w:type="spellEnd"/>
+      <w:r>
+        <w:t xml:space="preserve"> caso precise, EXEMPLO:</w:t>
+      </w:r>
+      <w:r>
+        <w:br/>
+      </w:r>
+    </w:p>
+    <w:p>
+      <w:r>
+        <w:drawing>
+          <wp:inline distT="0" distB="0" distL="0" distR="0" wp14:anchorId="2DE0C955" wp14:editId="61243679">
+            <wp:extent cx="3757198" cy="2560320"/>
+            <wp:effectExtent l="0" t="0" r="0" b="0"/>
+            <wp:docPr id="2142410846" name="Imagem 1" descr="Texto&#10;&#10;O conteúdo gerado por IA pode estar incorreto."/>
+            <wp:cNvGraphicFramePr>
+              <a:graphicFrameLocks xmlns:a="http://schemas.openxmlformats.org/drawingml/2006/main" noChangeAspect="1"/>
+            </wp:cNvGraphicFramePr>
+            <a:graphic xmlns:a="http://schemas.openxmlformats.org/drawingml/2006/main">
+              <a:graphicData uri="http://schemas.openxmlformats.org/drawingml/2006/picture">
+                <pic:pic xmlns:pic="http://schemas.openxmlformats.org/drawingml/2006/picture">
+                  <pic:nvPicPr>
+                    <pic:cNvPr id="2142410846" name="Imagem 1" descr="Texto&#10;&#10;O conteúdo gerado por IA pode estar incorreto."/>
+                    <pic:cNvPicPr/>
+                  </pic:nvPicPr>
+                  <pic:blipFill>
+                    <a:blip r:embed="rId17"/>
+                    <a:stretch>
+                      <a:fillRect/>
+                    </a:stretch>
+                  </pic:blipFill>
+                  <pic:spPr>
+                    <a:xfrm>
+                      <a:off x="0" y="0"/>
+                      <a:ext cx="3795168" cy="2586195"/>
+                    </a:xfrm>
+                    <a:prstGeom prst="rect">
+                      <a:avLst/>
+                    </a:prstGeom>
+                  </pic:spPr>
+                </pic:pic>
+              </a:graphicData>
+            </a:graphic>
+          </wp:inline>
+        </w:drawing>
+      </w:r>
+    </w:p>
+    <w:p>
+      <w:pPr>
+        <w:sectPr>
+          <w:type w:val="continuous"/>
+          <w:pgSz w:w="11906" w:h="16838"/>
+          <w:pgMar w:top="1417" w:right="1701" w:bottom="1417" w:left="1701" w:header="708" w:footer="708" w:gutter="0"/>
+          <w:cols w:num="2" w:space="708"/>
+          <w:docGrid w:linePitch="360"/>
+        </w:sectPr>
+      </w:pPr>
+      <w:r>
+        <w:drawing>
+          <wp:inline distT="0" distB="0" distL="0" distR="0" wp14:anchorId="033F7151" wp14:editId="58045A8E">
+            <wp:extent cx="3434300" cy="2499360"/>
+            <wp:effectExtent l="0" t="0" r="0" b="0"/>
+            <wp:docPr id="29028656" name="Imagem 1" descr="Texto&#10;&#10;O conteúdo gerado por IA pode estar incorreto."/>
+            <wp:cNvGraphicFramePr>
+              <a:graphicFrameLocks xmlns:a="http://schemas.openxmlformats.org/drawingml/2006/main" noChangeAspect="1"/>
+            </wp:cNvGraphicFramePr>
+            <a:graphic xmlns:a="http://schemas.openxmlformats.org/drawingml/2006/main">
+              <a:graphicData uri="http://schemas.openxmlformats.org/drawingml/2006/picture">
+                <pic:pic xmlns:pic="http://schemas.openxmlformats.org/drawingml/2006/picture">
+                  <pic:nvPicPr>
+                    <pic:cNvPr id="29028656" name="Imagem 1" descr="Texto&#10;&#10;O conteúdo gerado por IA pode estar incorreto."/>
+                    <pic:cNvPicPr/>
+                  </pic:nvPicPr>
+                  <pic:blipFill>
+                    <a:blip r:embed="rId18"/>
+                    <a:stretch>
+                      <a:fillRect/>
+                    </a:stretch>
+                  </pic:blipFill>
+                  <pic:spPr>
+                    <a:xfrm>
+                      <a:off x="0" y="0"/>
+                      <a:ext cx="3447136" cy="2508701"/>
+                    </a:xfrm>
+                    <a:prstGeom prst="rect">
+                      <a:avLst/>
+                    </a:prstGeom>
+                  </pic:spPr>
+                </pic:pic>
+              </a:graphicData>
+            </a:graphic>
+          </wp:inline>
+        </w:drawing>
+      </w:r>
+    </w:p>
+    <w:tbl>
+      <w:tblPr>
+        <w:tblStyle w:val="Tabelacomgrade"/>
+        <w:tblW w:w="0" w:type="auto"/>
+        <w:tblInd w:w="38" w:type="dxa"/>
+        <w:tblLook w:val="04A0" w:firstRow="1" w:lastRow="0" w:firstColumn="1" w:lastColumn="0" w:noHBand="0" w:noVBand="1"/>
+      </w:tblPr>
+      <w:tblGrid>
+        <w:gridCol w:w="4322"/>
+        <w:gridCol w:w="4322"/>
+      </w:tblGrid>
+      <w:tr>
+        <w:tc>
+          <w:tcPr>
+            <w:tcW w:w="4322" w:type="dxa"/>
+            <w:vAlign w:val="center"/>
+          </w:tcPr>
+          <w:p>
+            <w:r>
+              <w:rPr>
+                <w:rStyle w:val="Forte"/>
+                <w:rFonts w:ascii="Source Serif Pro" w:hAnsi="Source Serif Pro"/>
+                <w:color w:val="222222"/>
+                <w:sz w:val="27"/>
+                <w:szCs w:val="27"/>
+              </w:rPr>
+              <w:t>Vantagens da Instrução </w:t>
+            </w:r>
+            <w:r>
+              <w:rPr>
+                <w:rStyle w:val="CdigoHTML"/>
+                <w:rFonts w:eastAsiaTheme="minorHAnsi"/>
+                <w:b/>
+                <w:bCs/>
+                <w:color w:val="FFFFFF"/>
+                <w:sz w:val="23"/>
+                <w:szCs w:val="23"/>
+                <w:shd w:val="clear" w:color="auto" w:fill="272822"/>
+              </w:rPr>
+              <w:t>match</w:t>
+            </w:r>
+          </w:p>
+        </w:tc>
+        <w:tc>
+          <w:tcPr>
+            <w:tcW w:w="4322" w:type="dxa"/>
+            <w:vAlign w:val="center"/>
+          </w:tcPr>
+          <w:p>
+            <w:r>
+              <w:rPr>
+                <w:rStyle w:val="Forte"/>
+                <w:rFonts w:ascii="Source Serif Pro" w:hAnsi="Source Serif Pro"/>
+                <w:color w:val="222222"/>
+                <w:sz w:val="27"/>
+                <w:szCs w:val="27"/>
+              </w:rPr>
+              <w:t>Vantagens da Estrutura </w:t>
+            </w:r>
+            <w:proofErr w:type="spellStart"/>
+            <w:r>
+              <w:rPr>
+                <w:rStyle w:val="CdigoHTML"/>
+                <w:rFonts w:eastAsiaTheme="minorHAnsi"/>
+                <w:b/>
+                <w:bCs/>
+                <w:color w:val="FFFFFF"/>
+                <w:sz w:val="23"/>
+                <w:szCs w:val="23"/>
+                <w:shd w:val="clear" w:color="auto" w:fill="272822"/>
+              </w:rPr>
+              <w:t>if</w:t>
+            </w:r>
+            <w:proofErr w:type="spellEnd"/>
+          </w:p>
+        </w:tc>
+      </w:tr>
+      <w:tr>
+        <w:tc>
+          <w:tcPr>
+            <w:tcW w:w="4322" w:type="dxa"/>
+            <w:vAlign w:val="center"/>
+          </w:tcPr>
+          <w:p>
+            <w:r>
+              <w:rPr>
+                <w:rFonts w:ascii="Source Serif Pro" w:hAnsi="Source Serif Pro"/>
+                <w:color w:val="222222"/>
+              </w:rPr>
+              <w:t>Lidar com condições complexas e múltiplos padrões de maneira mais intuitiva.</w:t>
+            </w:r>
+          </w:p>
+        </w:tc>
+        <w:tc>
+          <w:tcPr>
+            <w:tcW w:w="4322" w:type="dxa"/>
+            <w:vAlign w:val="center"/>
+          </w:tcPr>
+          <w:p>
+            <w:r>
+              <w:rPr>
+                <w:rFonts w:ascii="Source Serif Pro" w:hAnsi="Source Serif Pro"/>
+                <w:color w:val="222222"/>
+              </w:rPr>
+              <w:t>Implementação clássica e amplamente conhecida.</w:t>
+            </w:r>
+          </w:p>
+        </w:tc>
+      </w:tr>
+      <w:tr>
+        <w:tc>
+          <w:tcPr>
+            <w:tcW w:w="4322" w:type="dxa"/>
+            <w:vAlign w:val="center"/>
+          </w:tcPr>
+          <w:p>
+            <w:r>
+              <w:rPr>
+                <w:rFonts w:ascii="Source Serif Pro" w:hAnsi="Source Serif Pro"/>
+                <w:color w:val="222222"/>
+              </w:rPr>
+              <w:t>Sintaxe concisa melhora a legibilidade do código, especialmente em casos complexos.</w:t>
+            </w:r>
+          </w:p>
+        </w:tc>
+        <w:tc>
+          <w:tcPr>
+            <w:tcW w:w="4322" w:type="dxa"/>
+            <w:vAlign w:val="center"/>
+          </w:tcPr>
+          <w:p>
+            <w:r>
+              <w:rPr>
+                <w:rFonts w:ascii="Source Serif Pro" w:hAnsi="Source Serif Pro"/>
+                <w:color w:val="222222"/>
+              </w:rPr>
+              <w:t>Amplamente suportada em todas as versões do Python.</w:t>
+            </w:r>
+          </w:p>
+        </w:tc>
+      </w:tr>
+      <w:tr>
+        <w:tc>
+          <w:tcPr>
+            <w:tcW w:w="4322" w:type="dxa"/>
+            <w:vAlign w:val="center"/>
+          </w:tcPr>
+          <w:p>
+            <w:r>
+              <w:rPr>
+                <w:rFonts w:ascii="Source Serif Pro" w:hAnsi="Source Serif Pro"/>
+                <w:color w:val="222222"/>
+              </w:rPr>
+              <w:t xml:space="preserve">Permite desestruturação direta, evitando </w:t>
+            </w:r>
+            <w:r>
+              <w:rPr>
+                <w:rFonts w:ascii="Source Serif Pro" w:hAnsi="Source Serif Pro"/>
+                <w:color w:val="222222"/>
+              </w:rPr>
+              <w:lastRenderedPageBreak/>
+              <w:t>repetição excessiva de variáveis.</w:t>
+            </w:r>
+          </w:p>
+        </w:tc>
+        <w:tc>
+          <w:tcPr>
+            <w:tcW w:w="4322" w:type="dxa"/>
+            <w:vAlign w:val="center"/>
+          </w:tcPr>
+          <w:p>
+            <w:r>
+              <w:rPr>
+                <w:rFonts w:ascii="Source Serif Pro" w:hAnsi="Source Serif Pro"/>
+                <w:color w:val="222222"/>
+              </w:rPr>
+              <w:lastRenderedPageBreak/>
+              <w:t xml:space="preserve">Estrutura simples e direta para lógica </w:t>
+            </w:r>
+            <w:r>
+              <w:rPr>
+                <w:rFonts w:ascii="Source Serif Pro" w:hAnsi="Source Serif Pro"/>
+                <w:color w:val="222222"/>
+              </w:rPr>
+              <w:lastRenderedPageBreak/>
+              <w:t>condicional básica.</w:t>
+            </w:r>
+          </w:p>
+        </w:tc>
+      </w:tr>
+      <w:tr>
+        <w:tc>
+          <w:tcPr>
+            <w:tcW w:w="4322" w:type="dxa"/>
+            <w:vAlign w:val="center"/>
+          </w:tcPr>
+          <w:p>
+            <w:r>
+              <w:rPr>
+                <w:rFonts w:ascii="Source Serif Pro" w:hAnsi="Source Serif Pro"/>
+                <w:color w:val="222222"/>
+              </w:rPr>
+              <w:lastRenderedPageBreak/>
+              <w:t>Adiciona expressividade ao código, especialmente em situações de correspondência de padrões.</w:t>
+            </w:r>
+          </w:p>
+        </w:tc>
+        <w:tc>
+          <w:tcPr>
+            <w:tcW w:w="4322" w:type="dxa"/>
+            <w:vAlign w:val="center"/>
+          </w:tcPr>
+          <w:p>
+            <w:r>
+              <w:rPr>
+                <w:rFonts w:ascii="Source Serif Pro" w:hAnsi="Source Serif Pro"/>
+                <w:color w:val="222222"/>
+              </w:rPr>
+              <w:t xml:space="preserve">Pode ser mais intuitiva para </w:t>
+            </w:r>
+            <w:proofErr w:type="spellStart"/>
+            <w:r>
+              <w:rPr>
+                <w:rFonts w:ascii="Source Serif Pro" w:hAnsi="Source Serif Pro"/>
+                <w:color w:val="222222"/>
+              </w:rPr>
+              <w:t>devs</w:t>
+            </w:r>
+            <w:proofErr w:type="spellEnd"/>
+            <w:r>
+              <w:rPr>
+                <w:rFonts w:ascii="Source Serif Pro" w:hAnsi="Source Serif Pro"/>
+                <w:color w:val="222222"/>
+              </w:rPr>
+              <w:t xml:space="preserve"> familiarizados com estruturas de controle convencionais.</w:t>
+            </w:r>
+          </w:p>
+        </w:tc>
+      </w:tr>
+    </w:tbl>
+    <w:p>
+      <w:r>
+        <w:t xml:space="preserve"> Mais sobre match aqui { </w:t>
+      </w:r>
+      <w:hyperlink r:id="rId19" w:history="1">
+        <w:r>
+          <w:rPr>
+            <w:rStyle w:val="Hyperlink"/>
+          </w:rPr>
+          <w:t>https://docs.python.org/pt-br/3/tutorial/controlflow.html#match-statements</w:t>
+        </w:r>
+      </w:hyperlink>
+      <w:r>
+        <w:t xml:space="preserve"> }</w:t>
+      </w:r>
+    </w:p>
     <w:sectPr>
+      <w:type w:val="continuous"/>
       <w:pgSz w:w="11906" w:h="16838"/>
       <w:pgMar w:top="1417" w:right="1701" w:bottom="1417" w:left="1701" w:header="708" w:footer="708" w:gutter="0"/>
       <w:cols w:space="708"/>
@@ -8215,9 +9745,158 @@
 <file path=word/numbering.xml><?xml version="1.0" encoding="utf-8"?>
 <w:numbering xmlns:wpc="http://schemas.microsoft.com/office/word/2010/wordprocessingCanvas" xmlns:cx="http://schemas.microsoft.com/office/drawing/2014/chartex" xmlns:cx1="http://schemas.microsoft.com/office/drawing/2015/9/8/chartex" xmlns:cx2="http://schemas.microsoft.com/office/drawing/2015/10/21/chartex" xmlns:cx3="http://schemas.microsoft.com/office/drawing/2016/5/9/chartex" xmlns:cx4="http://schemas.microsoft.com/office/drawing/2016/5/10/chartex" xmlns:cx5="http://schemas.microsoft.com/office/drawing/2016/5/11/chartex" xmlns:cx6="http://schemas.microsoft.com/office/drawing/2016/5/12/chartex" xmlns:cx7="http://schemas.microsoft.com/office/drawing/2016/5/13/chartex" xmlns:cx8="http://schemas.microsoft.com/office/drawing/2016/5/14/chartex" xmlns:mc="http://schemas.openxmlformats.org/markup-compatibility/2006" xmlns:aink="http://schemas.microsoft.com/office/drawing/2016/ink" xmlns:am3d="http://schemas.microsoft.com/office/drawing/2017/model3d" xmlns:o="urn:schemas-microsoft-com:office:office" xmlns:oel="http://schemas.microsoft.com/office/2019/extlst" xmlns:r="http://schemas.openxmlformats.org/officeDocument/2006/relationships" xmlns:m="http://schemas.openxmlformats.org/officeDocument/2006/math" xmlns:v="urn:schemas-microsoft-com:vml" xmlns:wp14="http://schemas.microsoft.com/office/word/2010/wordprocessingDrawing" xmlns:wp="http://schemas.openxmlformats.org/drawingml/2006/wordprocessingDrawing" xmlns:w10="urn:schemas-microsoft-com:office:word" xmlns:w="http://schemas.openxmlformats.org/wordprocessingml/2006/main" xmlns:w14="http://schemas.microsoft.com/office/word/2010/wordml" xmlns:w15="http://schemas.microsoft.com/office/word/2012/wordml" xmlns:w16cex="http://schemas.microsoft.com/office/word/2018/wordml/cex" xmlns:w16cid="http://schemas.microsoft.com/office/word/2016/wordml/cid" xmlns:w16="http://schemas.microsoft.com/office/word/2018/wordml" xmlns:w16du="http://schemas.microsoft.com/office/word/2023/wordml/word16du" xmlns:w16sdtdh="http://schemas.microsoft.com/office/word/2020/wordml/sdtdatahash" xmlns:w16sdtfl="http://schemas.microsoft.com/office/word/2024/wordml/sdtformatlock" xmlns:w16se="http://schemas.microsoft.com/office/word/2015/wordml/symex" xmlns:wpg="http://schemas.microsoft.com/office/word/2010/wordprocessingGroup" xmlns:wpi="http://schemas.microsoft.com/office/word/2010/wordprocessingInk" xmlns:wne="http://schemas.microsoft.com/office/word/2006/wordml" xmlns:wps="http://schemas.microsoft.com/office/word/2010/wordprocessingShape" mc:Ignorable="w14 w15 w16se w16cid w16 w16cex w16sdtdh w16sdtfl w16du wp14">
   <w:abstractNum w:abstractNumId="0" w15:restartNumberingAfterBreak="0">
-    <w:nsid w:val="5EE77BF7"/>
+    <w:nsid w:val="022D21EF"/>
     <w:multiLevelType w:val="multilevel"/>
-    <w:tmpl w:val="148481A0"/>
+    <w:tmpl w:val="0F0CA9A6"/>
+    <w:lvl w:ilvl="0">
+      <w:start w:val="1"/>
+      <w:numFmt w:val="bullet"/>
+      <w:lvlText w:val=""/>
+      <w:lvlJc w:val="left"/>
+      <w:pPr>
+        <w:tabs>
+          <w:tab w:val="num" w:pos="720"/>
+        </w:tabs>
+        <w:ind w:left="720" w:hanging="360"/>
+      </w:pPr>
+      <w:rPr>
+        <w:rFonts w:ascii="Symbol" w:hAnsi="Symbol" w:hint="default"/>
+        <w:sz w:val="20"/>
+      </w:rPr>
+    </w:lvl>
+    <w:lvl w:ilvl="1">
+      <w:start w:val="1"/>
+      <w:numFmt w:val="bullet"/>
+      <w:lvlText w:val="o"/>
+      <w:lvlJc w:val="left"/>
+      <w:pPr>
+        <w:tabs>
+          <w:tab w:val="num" w:pos="1440"/>
+        </w:tabs>
+        <w:ind w:left="1440" w:hanging="360"/>
+      </w:pPr>
+      <w:rPr>
+        <w:rFonts w:ascii="Courier New" w:hAnsi="Courier New" w:hint="default"/>
+        <w:sz w:val="20"/>
+      </w:rPr>
+    </w:lvl>
+    <w:lvl w:ilvl="2" w:tentative="1">
+      <w:start w:val="1"/>
+      <w:numFmt w:val="bullet"/>
+      <w:lvlText w:val=""/>
+      <w:lvlJc w:val="left"/>
+      <w:pPr>
+        <w:tabs>
+          <w:tab w:val="num" w:pos="2160"/>
+        </w:tabs>
+        <w:ind w:left="2160" w:hanging="360"/>
+      </w:pPr>
+      <w:rPr>
+        <w:rFonts w:ascii="Wingdings" w:hAnsi="Wingdings" w:hint="default"/>
+        <w:sz w:val="20"/>
+      </w:rPr>
+    </w:lvl>
+    <w:lvl w:ilvl="3" w:tentative="1">
+      <w:start w:val="1"/>
+      <w:numFmt w:val="bullet"/>
+      <w:lvlText w:val=""/>
+      <w:lvlJc w:val="left"/>
+      <w:pPr>
+        <w:tabs>
+          <w:tab w:val="num" w:pos="2880"/>
+        </w:tabs>
+        <w:ind w:left="2880" w:hanging="360"/>
+      </w:pPr>
+      <w:rPr>
+        <w:rFonts w:ascii="Wingdings" w:hAnsi="Wingdings" w:hint="default"/>
+        <w:sz w:val="20"/>
+      </w:rPr>
+    </w:lvl>
+    <w:lvl w:ilvl="4" w:tentative="1">
+      <w:start w:val="1"/>
+      <w:numFmt w:val="bullet"/>
+      <w:lvlText w:val=""/>
+      <w:lvlJc w:val="left"/>
+      <w:pPr>
+        <w:tabs>
+          <w:tab w:val="num" w:pos="3600"/>
+        </w:tabs>
+        <w:ind w:left="3600" w:hanging="360"/>
+      </w:pPr>
+      <w:rPr>
+        <w:rFonts w:ascii="Wingdings" w:hAnsi="Wingdings" w:hint="default"/>
+        <w:sz w:val="20"/>
+      </w:rPr>
+    </w:lvl>
+    <w:lvl w:ilvl="5" w:tentative="1">
+      <w:start w:val="1"/>
+      <w:numFmt w:val="bullet"/>
+      <w:lvlText w:val=""/>
+      <w:lvlJc w:val="left"/>
+      <w:pPr>
+        <w:tabs>
+          <w:tab w:val="num" w:pos="4320"/>
+        </w:tabs>
+        <w:ind w:left="4320" w:hanging="360"/>
+      </w:pPr>
+      <w:rPr>
+        <w:rFonts w:ascii="Wingdings" w:hAnsi="Wingdings" w:hint="default"/>
+        <w:sz w:val="20"/>
+      </w:rPr>
+    </w:lvl>
+    <w:lvl w:ilvl="6" w:tentative="1">
+      <w:start w:val="1"/>
+      <w:numFmt w:val="bullet"/>
+      <w:lvlText w:val=""/>
+      <w:lvlJc w:val="left"/>
+      <w:pPr>
+        <w:tabs>
+          <w:tab w:val="num" w:pos="5040"/>
+        </w:tabs>
+        <w:ind w:left="5040" w:hanging="360"/>
+      </w:pPr>
+      <w:rPr>
+        <w:rFonts w:ascii="Wingdings" w:hAnsi="Wingdings" w:hint="default"/>
+        <w:sz w:val="20"/>
+      </w:rPr>
+    </w:lvl>
+    <w:lvl w:ilvl="7" w:tentative="1">
+      <w:start w:val="1"/>
+      <w:numFmt w:val="bullet"/>
+      <w:lvlText w:val=""/>
+      <w:lvlJc w:val="left"/>
+      <w:pPr>
+        <w:tabs>
+          <w:tab w:val="num" w:pos="5760"/>
+        </w:tabs>
+        <w:ind w:left="5760" w:hanging="360"/>
+      </w:pPr>
+      <w:rPr>
+        <w:rFonts w:ascii="Wingdings" w:hAnsi="Wingdings" w:hint="default"/>
+        <w:sz w:val="20"/>
+      </w:rPr>
+    </w:lvl>
+    <w:lvl w:ilvl="8" w:tentative="1">
+      <w:start w:val="1"/>
+      <w:numFmt w:val="bullet"/>
+      <w:lvlText w:val=""/>
+      <w:lvlJc w:val="left"/>
+      <w:pPr>
+        <w:tabs>
+          <w:tab w:val="num" w:pos="6480"/>
+        </w:tabs>
+        <w:ind w:left="6480" w:hanging="360"/>
+      </w:pPr>
+      <w:rPr>
+        <w:rFonts w:ascii="Wingdings" w:hAnsi="Wingdings" w:hint="default"/>
+        <w:sz w:val="20"/>
+      </w:rPr>
+    </w:lvl>
+  </w:abstractNum>
+  <w:abstractNum w:abstractNumId="1" w15:restartNumberingAfterBreak="0">
+    <w:nsid w:val="087F1094"/>
+    <w:multiLevelType w:val="multilevel"/>
+    <w:tmpl w:val="79286394"/>
     <w:lvl w:ilvl="0">
       <w:start w:val="1"/>
       <w:numFmt w:val="bullet"/>
@@ -8363,8 +10042,735 @@
       </w:rPr>
     </w:lvl>
   </w:abstractNum>
+  <w:abstractNum w:abstractNumId="2" w15:restartNumberingAfterBreak="0">
+    <w:nsid w:val="2BE82857"/>
+    <w:multiLevelType w:val="multilevel"/>
+    <w:tmpl w:val="B9F21F0C"/>
+    <w:lvl w:ilvl="0">
+      <w:start w:val="1"/>
+      <w:numFmt w:val="bullet"/>
+      <w:lvlText w:val=""/>
+      <w:lvlJc w:val="left"/>
+      <w:pPr>
+        <w:tabs>
+          <w:tab w:val="num" w:pos="720"/>
+        </w:tabs>
+        <w:ind w:left="720" w:hanging="360"/>
+      </w:pPr>
+      <w:rPr>
+        <w:rFonts w:ascii="Symbol" w:hAnsi="Symbol" w:hint="default"/>
+        <w:sz w:val="20"/>
+      </w:rPr>
+    </w:lvl>
+    <w:lvl w:ilvl="1" w:tentative="1">
+      <w:start w:val="1"/>
+      <w:numFmt w:val="bullet"/>
+      <w:lvlText w:val="o"/>
+      <w:lvlJc w:val="left"/>
+      <w:pPr>
+        <w:tabs>
+          <w:tab w:val="num" w:pos="1440"/>
+        </w:tabs>
+        <w:ind w:left="1440" w:hanging="360"/>
+      </w:pPr>
+      <w:rPr>
+        <w:rFonts w:ascii="Courier New" w:hAnsi="Courier New" w:hint="default"/>
+        <w:sz w:val="20"/>
+      </w:rPr>
+    </w:lvl>
+    <w:lvl w:ilvl="2" w:tentative="1">
+      <w:start w:val="1"/>
+      <w:numFmt w:val="bullet"/>
+      <w:lvlText w:val=""/>
+      <w:lvlJc w:val="left"/>
+      <w:pPr>
+        <w:tabs>
+          <w:tab w:val="num" w:pos="2160"/>
+        </w:tabs>
+        <w:ind w:left="2160" w:hanging="360"/>
+      </w:pPr>
+      <w:rPr>
+        <w:rFonts w:ascii="Wingdings" w:hAnsi="Wingdings" w:hint="default"/>
+        <w:sz w:val="20"/>
+      </w:rPr>
+    </w:lvl>
+    <w:lvl w:ilvl="3" w:tentative="1">
+      <w:start w:val="1"/>
+      <w:numFmt w:val="bullet"/>
+      <w:lvlText w:val=""/>
+      <w:lvlJc w:val="left"/>
+      <w:pPr>
+        <w:tabs>
+          <w:tab w:val="num" w:pos="2880"/>
+        </w:tabs>
+        <w:ind w:left="2880" w:hanging="360"/>
+      </w:pPr>
+      <w:rPr>
+        <w:rFonts w:ascii="Wingdings" w:hAnsi="Wingdings" w:hint="default"/>
+        <w:sz w:val="20"/>
+      </w:rPr>
+    </w:lvl>
+    <w:lvl w:ilvl="4" w:tentative="1">
+      <w:start w:val="1"/>
+      <w:numFmt w:val="bullet"/>
+      <w:lvlText w:val=""/>
+      <w:lvlJc w:val="left"/>
+      <w:pPr>
+        <w:tabs>
+          <w:tab w:val="num" w:pos="3600"/>
+        </w:tabs>
+        <w:ind w:left="3600" w:hanging="360"/>
+      </w:pPr>
+      <w:rPr>
+        <w:rFonts w:ascii="Wingdings" w:hAnsi="Wingdings" w:hint="default"/>
+        <w:sz w:val="20"/>
+      </w:rPr>
+    </w:lvl>
+    <w:lvl w:ilvl="5" w:tentative="1">
+      <w:start w:val="1"/>
+      <w:numFmt w:val="bullet"/>
+      <w:lvlText w:val=""/>
+      <w:lvlJc w:val="left"/>
+      <w:pPr>
+        <w:tabs>
+          <w:tab w:val="num" w:pos="4320"/>
+        </w:tabs>
+        <w:ind w:left="4320" w:hanging="360"/>
+      </w:pPr>
+      <w:rPr>
+        <w:rFonts w:ascii="Wingdings" w:hAnsi="Wingdings" w:hint="default"/>
+        <w:sz w:val="20"/>
+      </w:rPr>
+    </w:lvl>
+    <w:lvl w:ilvl="6" w:tentative="1">
+      <w:start w:val="1"/>
+      <w:numFmt w:val="bullet"/>
+      <w:lvlText w:val=""/>
+      <w:lvlJc w:val="left"/>
+      <w:pPr>
+        <w:tabs>
+          <w:tab w:val="num" w:pos="5040"/>
+        </w:tabs>
+        <w:ind w:left="5040" w:hanging="360"/>
+      </w:pPr>
+      <w:rPr>
+        <w:rFonts w:ascii="Wingdings" w:hAnsi="Wingdings" w:hint="default"/>
+        <w:sz w:val="20"/>
+      </w:rPr>
+    </w:lvl>
+    <w:lvl w:ilvl="7" w:tentative="1">
+      <w:start w:val="1"/>
+      <w:numFmt w:val="bullet"/>
+      <w:lvlText w:val=""/>
+      <w:lvlJc w:val="left"/>
+      <w:pPr>
+        <w:tabs>
+          <w:tab w:val="num" w:pos="5760"/>
+        </w:tabs>
+        <w:ind w:left="5760" w:hanging="360"/>
+      </w:pPr>
+      <w:rPr>
+        <w:rFonts w:ascii="Wingdings" w:hAnsi="Wingdings" w:hint="default"/>
+        <w:sz w:val="20"/>
+      </w:rPr>
+    </w:lvl>
+    <w:lvl w:ilvl="8" w:tentative="1">
+      <w:start w:val="1"/>
+      <w:numFmt w:val="bullet"/>
+      <w:lvlText w:val=""/>
+      <w:lvlJc w:val="left"/>
+      <w:pPr>
+        <w:tabs>
+          <w:tab w:val="num" w:pos="6480"/>
+        </w:tabs>
+        <w:ind w:left="6480" w:hanging="360"/>
+      </w:pPr>
+      <w:rPr>
+        <w:rFonts w:ascii="Wingdings" w:hAnsi="Wingdings" w:hint="default"/>
+        <w:sz w:val="20"/>
+      </w:rPr>
+    </w:lvl>
+  </w:abstractNum>
+  <w:abstractNum w:abstractNumId="3" w15:restartNumberingAfterBreak="0">
+    <w:nsid w:val="32B2016E"/>
+    <w:multiLevelType w:val="multilevel"/>
+    <w:tmpl w:val="1C44B038"/>
+    <w:lvl w:ilvl="0">
+      <w:start w:val="1"/>
+      <w:numFmt w:val="bullet"/>
+      <w:lvlText w:val=""/>
+      <w:lvlJc w:val="left"/>
+      <w:pPr>
+        <w:tabs>
+          <w:tab w:val="num" w:pos="720"/>
+        </w:tabs>
+        <w:ind w:left="720" w:hanging="360"/>
+      </w:pPr>
+      <w:rPr>
+        <w:rFonts w:ascii="Symbol" w:hAnsi="Symbol" w:hint="default"/>
+        <w:sz w:val="20"/>
+      </w:rPr>
+    </w:lvl>
+    <w:lvl w:ilvl="1" w:tentative="1">
+      <w:start w:val="1"/>
+      <w:numFmt w:val="bullet"/>
+      <w:lvlText w:val="o"/>
+      <w:lvlJc w:val="left"/>
+      <w:pPr>
+        <w:tabs>
+          <w:tab w:val="num" w:pos="1440"/>
+        </w:tabs>
+        <w:ind w:left="1440" w:hanging="360"/>
+      </w:pPr>
+      <w:rPr>
+        <w:rFonts w:ascii="Courier New" w:hAnsi="Courier New" w:hint="default"/>
+        <w:sz w:val="20"/>
+      </w:rPr>
+    </w:lvl>
+    <w:lvl w:ilvl="2" w:tentative="1">
+      <w:start w:val="1"/>
+      <w:numFmt w:val="bullet"/>
+      <w:lvlText w:val=""/>
+      <w:lvlJc w:val="left"/>
+      <w:pPr>
+        <w:tabs>
+          <w:tab w:val="num" w:pos="2160"/>
+        </w:tabs>
+        <w:ind w:left="2160" w:hanging="360"/>
+      </w:pPr>
+      <w:rPr>
+        <w:rFonts w:ascii="Wingdings" w:hAnsi="Wingdings" w:hint="default"/>
+        <w:sz w:val="20"/>
+      </w:rPr>
+    </w:lvl>
+    <w:lvl w:ilvl="3" w:tentative="1">
+      <w:start w:val="1"/>
+      <w:numFmt w:val="bullet"/>
+      <w:lvlText w:val=""/>
+      <w:lvlJc w:val="left"/>
+      <w:pPr>
+        <w:tabs>
+          <w:tab w:val="num" w:pos="2880"/>
+        </w:tabs>
+        <w:ind w:left="2880" w:hanging="360"/>
+      </w:pPr>
+      <w:rPr>
+        <w:rFonts w:ascii="Wingdings" w:hAnsi="Wingdings" w:hint="default"/>
+        <w:sz w:val="20"/>
+      </w:rPr>
+    </w:lvl>
+    <w:lvl w:ilvl="4" w:tentative="1">
+      <w:start w:val="1"/>
+      <w:numFmt w:val="bullet"/>
+      <w:lvlText w:val=""/>
+      <w:lvlJc w:val="left"/>
+      <w:pPr>
+        <w:tabs>
+          <w:tab w:val="num" w:pos="3600"/>
+        </w:tabs>
+        <w:ind w:left="3600" w:hanging="360"/>
+      </w:pPr>
+      <w:rPr>
+        <w:rFonts w:ascii="Wingdings" w:hAnsi="Wingdings" w:hint="default"/>
+        <w:sz w:val="20"/>
+      </w:rPr>
+    </w:lvl>
+    <w:lvl w:ilvl="5" w:tentative="1">
+      <w:start w:val="1"/>
+      <w:numFmt w:val="bullet"/>
+      <w:lvlText w:val=""/>
+      <w:lvlJc w:val="left"/>
+      <w:pPr>
+        <w:tabs>
+          <w:tab w:val="num" w:pos="4320"/>
+        </w:tabs>
+        <w:ind w:left="4320" w:hanging="360"/>
+      </w:pPr>
+      <w:rPr>
+        <w:rFonts w:ascii="Wingdings" w:hAnsi="Wingdings" w:hint="default"/>
+        <w:sz w:val="20"/>
+      </w:rPr>
+    </w:lvl>
+    <w:lvl w:ilvl="6" w:tentative="1">
+      <w:start w:val="1"/>
+      <w:numFmt w:val="bullet"/>
+      <w:lvlText w:val=""/>
+      <w:lvlJc w:val="left"/>
+      <w:pPr>
+        <w:tabs>
+          <w:tab w:val="num" w:pos="5040"/>
+        </w:tabs>
+        <w:ind w:left="5040" w:hanging="360"/>
+      </w:pPr>
+      <w:rPr>
+        <w:rFonts w:ascii="Wingdings" w:hAnsi="Wingdings" w:hint="default"/>
+        <w:sz w:val="20"/>
+      </w:rPr>
+    </w:lvl>
+    <w:lvl w:ilvl="7" w:tentative="1">
+      <w:start w:val="1"/>
+      <w:numFmt w:val="bullet"/>
+      <w:lvlText w:val=""/>
+      <w:lvlJc w:val="left"/>
+      <w:pPr>
+        <w:tabs>
+          <w:tab w:val="num" w:pos="5760"/>
+        </w:tabs>
+        <w:ind w:left="5760" w:hanging="360"/>
+      </w:pPr>
+      <w:rPr>
+        <w:rFonts w:ascii="Wingdings" w:hAnsi="Wingdings" w:hint="default"/>
+        <w:sz w:val="20"/>
+      </w:rPr>
+    </w:lvl>
+    <w:lvl w:ilvl="8" w:tentative="1">
+      <w:start w:val="1"/>
+      <w:numFmt w:val="bullet"/>
+      <w:lvlText w:val=""/>
+      <w:lvlJc w:val="left"/>
+      <w:pPr>
+        <w:tabs>
+          <w:tab w:val="num" w:pos="6480"/>
+        </w:tabs>
+        <w:ind w:left="6480" w:hanging="360"/>
+      </w:pPr>
+      <w:rPr>
+        <w:rFonts w:ascii="Wingdings" w:hAnsi="Wingdings" w:hint="default"/>
+        <w:sz w:val="20"/>
+      </w:rPr>
+    </w:lvl>
+  </w:abstractNum>
+  <w:abstractNum w:abstractNumId="4" w15:restartNumberingAfterBreak="0">
+    <w:nsid w:val="3ECF4AE2"/>
+    <w:multiLevelType w:val="multilevel"/>
+    <w:tmpl w:val="1B029BBA"/>
+    <w:lvl w:ilvl="0">
+      <w:start w:val="1"/>
+      <w:numFmt w:val="decimal"/>
+      <w:lvlText w:val="%1."/>
+      <w:lvlJc w:val="left"/>
+      <w:pPr>
+        <w:tabs>
+          <w:tab w:val="num" w:pos="720"/>
+        </w:tabs>
+        <w:ind w:left="720" w:hanging="360"/>
+      </w:pPr>
+    </w:lvl>
+    <w:lvl w:ilvl="1" w:tentative="1">
+      <w:start w:val="1"/>
+      <w:numFmt w:val="decimal"/>
+      <w:lvlText w:val="%2."/>
+      <w:lvlJc w:val="left"/>
+      <w:pPr>
+        <w:tabs>
+          <w:tab w:val="num" w:pos="1440"/>
+        </w:tabs>
+        <w:ind w:left="1440" w:hanging="360"/>
+      </w:pPr>
+    </w:lvl>
+    <w:lvl w:ilvl="2" w:tentative="1">
+      <w:start w:val="1"/>
+      <w:numFmt w:val="decimal"/>
+      <w:lvlText w:val="%3."/>
+      <w:lvlJc w:val="left"/>
+      <w:pPr>
+        <w:tabs>
+          <w:tab w:val="num" w:pos="2160"/>
+        </w:tabs>
+        <w:ind w:left="2160" w:hanging="360"/>
+      </w:pPr>
+    </w:lvl>
+    <w:lvl w:ilvl="3" w:tentative="1">
+      <w:start w:val="1"/>
+      <w:numFmt w:val="decimal"/>
+      <w:lvlText w:val="%4."/>
+      <w:lvlJc w:val="left"/>
+      <w:pPr>
+        <w:tabs>
+          <w:tab w:val="num" w:pos="2880"/>
+        </w:tabs>
+        <w:ind w:left="2880" w:hanging="360"/>
+      </w:pPr>
+    </w:lvl>
+    <w:lvl w:ilvl="4" w:tentative="1">
+      <w:start w:val="1"/>
+      <w:numFmt w:val="decimal"/>
+      <w:lvlText w:val="%5."/>
+      <w:lvlJc w:val="left"/>
+      <w:pPr>
+        <w:tabs>
+          <w:tab w:val="num" w:pos="3600"/>
+        </w:tabs>
+        <w:ind w:left="3600" w:hanging="360"/>
+      </w:pPr>
+    </w:lvl>
+    <w:lvl w:ilvl="5" w:tentative="1">
+      <w:start w:val="1"/>
+      <w:numFmt w:val="decimal"/>
+      <w:lvlText w:val="%6."/>
+      <w:lvlJc w:val="left"/>
+      <w:pPr>
+        <w:tabs>
+          <w:tab w:val="num" w:pos="4320"/>
+        </w:tabs>
+        <w:ind w:left="4320" w:hanging="360"/>
+      </w:pPr>
+    </w:lvl>
+    <w:lvl w:ilvl="6" w:tentative="1">
+      <w:start w:val="1"/>
+      <w:numFmt w:val="decimal"/>
+      <w:lvlText w:val="%7."/>
+      <w:lvlJc w:val="left"/>
+      <w:pPr>
+        <w:tabs>
+          <w:tab w:val="num" w:pos="5040"/>
+        </w:tabs>
+        <w:ind w:left="5040" w:hanging="360"/>
+      </w:pPr>
+    </w:lvl>
+    <w:lvl w:ilvl="7" w:tentative="1">
+      <w:start w:val="1"/>
+      <w:numFmt w:val="decimal"/>
+      <w:lvlText w:val="%8."/>
+      <w:lvlJc w:val="left"/>
+      <w:pPr>
+        <w:tabs>
+          <w:tab w:val="num" w:pos="5760"/>
+        </w:tabs>
+        <w:ind w:left="5760" w:hanging="360"/>
+      </w:pPr>
+    </w:lvl>
+    <w:lvl w:ilvl="8" w:tentative="1">
+      <w:start w:val="1"/>
+      <w:numFmt w:val="decimal"/>
+      <w:lvlText w:val="%9."/>
+      <w:lvlJc w:val="left"/>
+      <w:pPr>
+        <w:tabs>
+          <w:tab w:val="num" w:pos="6480"/>
+        </w:tabs>
+        <w:ind w:left="6480" w:hanging="360"/>
+      </w:pPr>
+    </w:lvl>
+  </w:abstractNum>
+  <w:abstractNum w:abstractNumId="5" w15:restartNumberingAfterBreak="0">
+    <w:nsid w:val="5EE77BF7"/>
+    <w:multiLevelType w:val="multilevel"/>
+    <w:tmpl w:val="148481A0"/>
+    <w:lvl w:ilvl="0">
+      <w:start w:val="1"/>
+      <w:numFmt w:val="bullet"/>
+      <w:lvlText w:val=""/>
+      <w:lvlJc w:val="left"/>
+      <w:pPr>
+        <w:tabs>
+          <w:tab w:val="num" w:pos="720"/>
+        </w:tabs>
+        <w:ind w:left="720" w:hanging="360"/>
+      </w:pPr>
+      <w:rPr>
+        <w:rFonts w:ascii="Symbol" w:hAnsi="Symbol" w:hint="default"/>
+        <w:sz w:val="20"/>
+      </w:rPr>
+    </w:lvl>
+    <w:lvl w:ilvl="1" w:tentative="1">
+      <w:start w:val="1"/>
+      <w:numFmt w:val="bullet"/>
+      <w:lvlText w:val="o"/>
+      <w:lvlJc w:val="left"/>
+      <w:pPr>
+        <w:tabs>
+          <w:tab w:val="num" w:pos="1440"/>
+        </w:tabs>
+        <w:ind w:left="1440" w:hanging="360"/>
+      </w:pPr>
+      <w:rPr>
+        <w:rFonts w:ascii="Courier New" w:hAnsi="Courier New" w:hint="default"/>
+        <w:sz w:val="20"/>
+      </w:rPr>
+    </w:lvl>
+    <w:lvl w:ilvl="2" w:tentative="1">
+      <w:start w:val="1"/>
+      <w:numFmt w:val="bullet"/>
+      <w:lvlText w:val=""/>
+      <w:lvlJc w:val="left"/>
+      <w:pPr>
+        <w:tabs>
+          <w:tab w:val="num" w:pos="2160"/>
+        </w:tabs>
+        <w:ind w:left="2160" w:hanging="360"/>
+      </w:pPr>
+      <w:rPr>
+        <w:rFonts w:ascii="Wingdings" w:hAnsi="Wingdings" w:hint="default"/>
+        <w:sz w:val="20"/>
+      </w:rPr>
+    </w:lvl>
+    <w:lvl w:ilvl="3" w:tentative="1">
+      <w:start w:val="1"/>
+      <w:numFmt w:val="bullet"/>
+      <w:lvlText w:val=""/>
+      <w:lvlJc w:val="left"/>
+      <w:pPr>
+        <w:tabs>
+          <w:tab w:val="num" w:pos="2880"/>
+        </w:tabs>
+        <w:ind w:left="2880" w:hanging="360"/>
+      </w:pPr>
+      <w:rPr>
+        <w:rFonts w:ascii="Wingdings" w:hAnsi="Wingdings" w:hint="default"/>
+        <w:sz w:val="20"/>
+      </w:rPr>
+    </w:lvl>
+    <w:lvl w:ilvl="4" w:tentative="1">
+      <w:start w:val="1"/>
+      <w:numFmt w:val="bullet"/>
+      <w:lvlText w:val=""/>
+      <w:lvlJc w:val="left"/>
+      <w:pPr>
+        <w:tabs>
+          <w:tab w:val="num" w:pos="3600"/>
+        </w:tabs>
+        <w:ind w:left="3600" w:hanging="360"/>
+      </w:pPr>
+      <w:rPr>
+        <w:rFonts w:ascii="Wingdings" w:hAnsi="Wingdings" w:hint="default"/>
+        <w:sz w:val="20"/>
+      </w:rPr>
+    </w:lvl>
+    <w:lvl w:ilvl="5" w:tentative="1">
+      <w:start w:val="1"/>
+      <w:numFmt w:val="bullet"/>
+      <w:lvlText w:val=""/>
+      <w:lvlJc w:val="left"/>
+      <w:pPr>
+        <w:tabs>
+          <w:tab w:val="num" w:pos="4320"/>
+        </w:tabs>
+        <w:ind w:left="4320" w:hanging="360"/>
+      </w:pPr>
+      <w:rPr>
+        <w:rFonts w:ascii="Wingdings" w:hAnsi="Wingdings" w:hint="default"/>
+        <w:sz w:val="20"/>
+      </w:rPr>
+    </w:lvl>
+    <w:lvl w:ilvl="6" w:tentative="1">
+      <w:start w:val="1"/>
+      <w:numFmt w:val="bullet"/>
+      <w:lvlText w:val=""/>
+      <w:lvlJc w:val="left"/>
+      <w:pPr>
+        <w:tabs>
+          <w:tab w:val="num" w:pos="5040"/>
+        </w:tabs>
+        <w:ind w:left="5040" w:hanging="360"/>
+      </w:pPr>
+      <w:rPr>
+        <w:rFonts w:ascii="Wingdings" w:hAnsi="Wingdings" w:hint="default"/>
+        <w:sz w:val="20"/>
+      </w:rPr>
+    </w:lvl>
+    <w:lvl w:ilvl="7" w:tentative="1">
+      <w:start w:val="1"/>
+      <w:numFmt w:val="bullet"/>
+      <w:lvlText w:val=""/>
+      <w:lvlJc w:val="left"/>
+      <w:pPr>
+        <w:tabs>
+          <w:tab w:val="num" w:pos="5760"/>
+        </w:tabs>
+        <w:ind w:left="5760" w:hanging="360"/>
+      </w:pPr>
+      <w:rPr>
+        <w:rFonts w:ascii="Wingdings" w:hAnsi="Wingdings" w:hint="default"/>
+        <w:sz w:val="20"/>
+      </w:rPr>
+    </w:lvl>
+    <w:lvl w:ilvl="8" w:tentative="1">
+      <w:start w:val="1"/>
+      <w:numFmt w:val="bullet"/>
+      <w:lvlText w:val=""/>
+      <w:lvlJc w:val="left"/>
+      <w:pPr>
+        <w:tabs>
+          <w:tab w:val="num" w:pos="6480"/>
+        </w:tabs>
+        <w:ind w:left="6480" w:hanging="360"/>
+      </w:pPr>
+      <w:rPr>
+        <w:rFonts w:ascii="Wingdings" w:hAnsi="Wingdings" w:hint="default"/>
+        <w:sz w:val="20"/>
+      </w:rPr>
+    </w:lvl>
+  </w:abstractNum>
+  <w:abstractNum w:abstractNumId="6" w15:restartNumberingAfterBreak="0">
+    <w:nsid w:val="716C7A33"/>
+    <w:multiLevelType w:val="multilevel"/>
+    <w:tmpl w:val="7F70923C"/>
+    <w:lvl w:ilvl="0">
+      <w:start w:val="1"/>
+      <w:numFmt w:val="bullet"/>
+      <w:lvlText w:val=""/>
+      <w:lvlJc w:val="left"/>
+      <w:pPr>
+        <w:tabs>
+          <w:tab w:val="num" w:pos="720"/>
+        </w:tabs>
+        <w:ind w:left="720" w:hanging="360"/>
+      </w:pPr>
+      <w:rPr>
+        <w:rFonts w:ascii="Symbol" w:hAnsi="Symbol" w:hint="default"/>
+        <w:sz w:val="20"/>
+      </w:rPr>
+    </w:lvl>
+    <w:lvl w:ilvl="1" w:tentative="1">
+      <w:start w:val="1"/>
+      <w:numFmt w:val="bullet"/>
+      <w:lvlText w:val="o"/>
+      <w:lvlJc w:val="left"/>
+      <w:pPr>
+        <w:tabs>
+          <w:tab w:val="num" w:pos="1440"/>
+        </w:tabs>
+        <w:ind w:left="1440" w:hanging="360"/>
+      </w:pPr>
+      <w:rPr>
+        <w:rFonts w:ascii="Courier New" w:hAnsi="Courier New" w:hint="default"/>
+        <w:sz w:val="20"/>
+      </w:rPr>
+    </w:lvl>
+    <w:lvl w:ilvl="2" w:tentative="1">
+      <w:start w:val="1"/>
+      <w:numFmt w:val="bullet"/>
+      <w:lvlText w:val=""/>
+      <w:lvlJc w:val="left"/>
+      <w:pPr>
+        <w:tabs>
+          <w:tab w:val="num" w:pos="2160"/>
+        </w:tabs>
+        <w:ind w:left="2160" w:hanging="360"/>
+      </w:pPr>
+      <w:rPr>
+        <w:rFonts w:ascii="Wingdings" w:hAnsi="Wingdings" w:hint="default"/>
+        <w:sz w:val="20"/>
+      </w:rPr>
+    </w:lvl>
+    <w:lvl w:ilvl="3" w:tentative="1">
+      <w:start w:val="1"/>
+      <w:numFmt w:val="bullet"/>
+      <w:lvlText w:val=""/>
+      <w:lvlJc w:val="left"/>
+      <w:pPr>
+        <w:tabs>
+          <w:tab w:val="num" w:pos="2880"/>
+        </w:tabs>
+        <w:ind w:left="2880" w:hanging="360"/>
+      </w:pPr>
+      <w:rPr>
+        <w:rFonts w:ascii="Wingdings" w:hAnsi="Wingdings" w:hint="default"/>
+        <w:sz w:val="20"/>
+      </w:rPr>
+    </w:lvl>
+    <w:lvl w:ilvl="4" w:tentative="1">
+      <w:start w:val="1"/>
+      <w:numFmt w:val="bullet"/>
+      <w:lvlText w:val=""/>
+      <w:lvlJc w:val="left"/>
+      <w:pPr>
+        <w:tabs>
+          <w:tab w:val="num" w:pos="3600"/>
+        </w:tabs>
+        <w:ind w:left="3600" w:hanging="360"/>
+      </w:pPr>
+      <w:rPr>
+        <w:rFonts w:ascii="Wingdings" w:hAnsi="Wingdings" w:hint="default"/>
+        <w:sz w:val="20"/>
+      </w:rPr>
+    </w:lvl>
+    <w:lvl w:ilvl="5" w:tentative="1">
+      <w:start w:val="1"/>
+      <w:numFmt w:val="bullet"/>
+      <w:lvlText w:val=""/>
+      <w:lvlJc w:val="left"/>
+      <w:pPr>
+        <w:tabs>
+          <w:tab w:val="num" w:pos="4320"/>
+        </w:tabs>
+        <w:ind w:left="4320" w:hanging="360"/>
+      </w:pPr>
+      <w:rPr>
+        <w:rFonts w:ascii="Wingdings" w:hAnsi="Wingdings" w:hint="default"/>
+        <w:sz w:val="20"/>
+      </w:rPr>
+    </w:lvl>
+    <w:lvl w:ilvl="6" w:tentative="1">
+      <w:start w:val="1"/>
+      <w:numFmt w:val="bullet"/>
+      <w:lvlText w:val=""/>
+      <w:lvlJc w:val="left"/>
+      <w:pPr>
+        <w:tabs>
+          <w:tab w:val="num" w:pos="5040"/>
+        </w:tabs>
+        <w:ind w:left="5040" w:hanging="360"/>
+      </w:pPr>
+      <w:rPr>
+        <w:rFonts w:ascii="Wingdings" w:hAnsi="Wingdings" w:hint="default"/>
+        <w:sz w:val="20"/>
+      </w:rPr>
+    </w:lvl>
+    <w:lvl w:ilvl="7" w:tentative="1">
+      <w:start w:val="1"/>
+      <w:numFmt w:val="bullet"/>
+      <w:lvlText w:val=""/>
+      <w:lvlJc w:val="left"/>
+      <w:pPr>
+        <w:tabs>
+          <w:tab w:val="num" w:pos="5760"/>
+        </w:tabs>
+        <w:ind w:left="5760" w:hanging="360"/>
+      </w:pPr>
+      <w:rPr>
+        <w:rFonts w:ascii="Wingdings" w:hAnsi="Wingdings" w:hint="default"/>
+        <w:sz w:val="20"/>
+      </w:rPr>
+    </w:lvl>
+    <w:lvl w:ilvl="8" w:tentative="1">
+      <w:start w:val="1"/>
+      <w:numFmt w:val="bullet"/>
+      <w:lvlText w:val=""/>
+      <w:lvlJc w:val="left"/>
+      <w:pPr>
+        <w:tabs>
+          <w:tab w:val="num" w:pos="6480"/>
+        </w:tabs>
+        <w:ind w:left="6480" w:hanging="360"/>
+      </w:pPr>
+      <w:rPr>
+        <w:rFonts w:ascii="Wingdings" w:hAnsi="Wingdings" w:hint="default"/>
+        <w:sz w:val="20"/>
+      </w:rPr>
+    </w:lvl>
+  </w:abstractNum>
   <w:num w:numId="1" w16cid:durableId="721563420">
+    <w:abstractNumId w:val="5"/>
+  </w:num>
+  <w:num w:numId="2" w16cid:durableId="1916435742">
     <w:abstractNumId w:val="0"/>
+  </w:num>
+  <w:num w:numId="3" w16cid:durableId="1807046365">
+    <w:abstractNumId w:val="4"/>
+  </w:num>
+  <w:num w:numId="4" w16cid:durableId="1785878598">
+    <w:abstractNumId w:val="3"/>
+  </w:num>
+  <w:num w:numId="5" w16cid:durableId="1069571351">
+    <w:abstractNumId w:val="2"/>
+  </w:num>
+  <w:num w:numId="6" w16cid:durableId="1130441956">
+    <w:abstractNumId w:val="1"/>
+  </w:num>
+  <w:num w:numId="7" w16cid:durableId="922684831">
+    <w:abstractNumId w:val="6"/>
   </w:num>
 </w:numbering>
 </file>
@@ -8814,7 +11220,6 @@
   <w:style w:type="character" w:default="1" w:styleId="Fontepargpadro">
     <w:name w:val="Default Paragraph Font"/>
     <w:uiPriority w:val="1"/>
-    <w:semiHidden/>
     <w:unhideWhenUsed/>
   </w:style>
   <w:style w:type="table" w:default="1" w:styleId="Tabelanormal">
@@ -9045,6 +11450,42 @@
     <w:link w:val="Rodap"/>
     <w:uiPriority w:val="99"/>
     <w:rsid w:val="00E72746"/>
+  </w:style>
+  <w:style w:type="character" w:styleId="CdigoHTML">
+    <w:name w:val="HTML Code"/>
+    <w:basedOn w:val="Fontepargpadro"/>
+    <w:uiPriority w:val="99"/>
+    <w:semiHidden/>
+    <w:unhideWhenUsed/>
+    <w:rsid w:val="007B1D7B"/>
+    <w:rPr>
+      <w:rFonts w:ascii="Courier New" w:eastAsia="Times New Roman" w:hAnsi="Courier New" w:cs="Courier New"/>
+      <w:sz w:val="20"/>
+      <w:szCs w:val="20"/>
+    </w:rPr>
+  </w:style>
+  <w:style w:type="character" w:styleId="Hyperlink">
+    <w:name w:val="Hyperlink"/>
+    <w:basedOn w:val="Fontepargpadro"/>
+    <w:uiPriority w:val="99"/>
+    <w:unhideWhenUsed/>
+    <w:rsid w:val="00B22FEF"/>
+    <w:rPr>
+      <w:color w:val="0563C1" w:themeColor="hyperlink"/>
+      <w:u w:val="single"/>
+    </w:rPr>
+  </w:style>
+  <w:style w:type="character" w:styleId="MenoPendente">
+    <w:name w:val="Unresolved Mention"/>
+    <w:basedOn w:val="Fontepargpadro"/>
+    <w:uiPriority w:val="99"/>
+    <w:semiHidden/>
+    <w:unhideWhenUsed/>
+    <w:rsid w:val="00B22FEF"/>
+    <w:rPr>
+      <w:color w:val="605E5C"/>
+      <w:shd w:val="clear" w:color="auto" w:fill="E1DFDD"/>
+    </w:rPr>
   </w:style>
 </w:styles>
 </file>

</xml_diff>

<commit_message>
Adicionando práticas do curso de python
</commit_message>
<xml_diff>
--- a/Curso Python/Anotações sobre o Curso de Python.docx
+++ b/Curso Python/Anotações sobre o Curso de Python.docx
@@ -100,7 +100,25 @@
           <w:color w:val="000000"/>
           <w:lang w:eastAsia="pt-BR"/>
         </w:rPr>
-        <w:t>: Print(‘</w:t>
+        <w:t xml:space="preserve">: </w:t>
+      </w:r>
+      <w:proofErr w:type="gramStart"/>
+      <w:r>
+        <w:rPr>
+          <w:rFonts w:ascii="Calibri" w:eastAsia="Times New Roman" w:hAnsi="Calibri" w:cs="Calibri"/>
+          <w:color w:val="000000"/>
+          <w:lang w:eastAsia="pt-BR"/>
+        </w:rPr>
+        <w:t>Print(</w:t>
+      </w:r>
+      <w:proofErr w:type="gramEnd"/>
+      <w:r>
+        <w:rPr>
+          <w:rFonts w:ascii="Calibri" w:eastAsia="Times New Roman" w:hAnsi="Calibri" w:cs="Calibri"/>
+          <w:color w:val="000000"/>
+          <w:lang w:eastAsia="pt-BR"/>
+        </w:rPr>
+        <w:t>‘</w:t>
       </w:r>
       <w:proofErr w:type="spellStart"/>
       <w:r>
@@ -206,6 +224,7 @@
         <w:t xml:space="preserve"> precisa colocar o tipo que </w:t>
       </w:r>
       <w:proofErr w:type="spellStart"/>
+      <w:proofErr w:type="gramStart"/>
       <w:r>
         <w:rPr>
           <w:rFonts w:ascii="Calibri" w:eastAsia="Times New Roman" w:hAnsi="Calibri" w:cs="Calibri"/>
@@ -215,6 +234,7 @@
         <w:t>ira</w:t>
       </w:r>
       <w:proofErr w:type="spellEnd"/>
+      <w:proofErr w:type="gramEnd"/>
       <w:r>
         <w:rPr>
           <w:rFonts w:ascii="Calibri" w:eastAsia="Times New Roman" w:hAnsi="Calibri" w:cs="Calibri"/>
@@ -253,6 +273,7 @@
         <w:t xml:space="preserve">: n1 = </w:t>
       </w:r>
       <w:proofErr w:type="spellStart"/>
+      <w:proofErr w:type="gramStart"/>
       <w:r>
         <w:rPr>
           <w:rFonts w:ascii="Calibri" w:eastAsia="Times New Roman" w:hAnsi="Calibri" w:cs="Calibri"/>
@@ -268,7 +289,16 @@
           <w:color w:val="000000"/>
           <w:lang w:eastAsia="pt-BR"/>
         </w:rPr>
-        <w:t>(input(‘Digite um número’) </w:t>
+        <w:t>(input(</w:t>
+      </w:r>
+      <w:proofErr w:type="gramEnd"/>
+      <w:r>
+        <w:rPr>
+          <w:rFonts w:ascii="Calibri" w:eastAsia="Times New Roman" w:hAnsi="Calibri" w:cs="Calibri"/>
+          <w:color w:val="000000"/>
+          <w:lang w:eastAsia="pt-BR"/>
+        </w:rPr>
+        <w:t>‘Digite um número’) </w:t>
       </w:r>
     </w:p>
     <w:p>
@@ -308,6 +338,7 @@
         <w:t xml:space="preserve"> para deixar uma programação </w:t>
       </w:r>
       <w:proofErr w:type="spellStart"/>
+      <w:proofErr w:type="gramStart"/>
       <w:r>
         <w:rPr>
           <w:rFonts w:ascii="Calibri" w:eastAsia="Times New Roman" w:hAnsi="Calibri" w:cs="Calibri"/>
@@ -325,6 +356,7 @@
         </w:rPr>
         <w:t xml:space="preserve"> definida</w:t>
       </w:r>
+      <w:proofErr w:type="gramEnd"/>
     </w:p>
     <w:p>
       <w:pPr>
@@ -402,6 +434,7 @@
         <w:t>(</w:t>
       </w:r>
       <w:proofErr w:type="spellStart"/>
+      <w:proofErr w:type="gramStart"/>
       <w:r>
         <w:rPr>
           <w:rFonts w:ascii="Calibri" w:eastAsia="Times New Roman" w:hAnsi="Calibri" w:cs="Calibri"/>
@@ -411,6 +444,7 @@
         <w:t>n.isalnum</w:t>
       </w:r>
       <w:proofErr w:type="spellEnd"/>
+      <w:proofErr w:type="gramEnd"/>
       <w:r>
         <w:rPr>
           <w:rFonts w:ascii="Calibri" w:eastAsia="Times New Roman" w:hAnsi="Calibri" w:cs="Calibri"/>
@@ -439,6 +473,7 @@
         <w:t xml:space="preserve">O </w:t>
       </w:r>
       <w:proofErr w:type="spellStart"/>
+      <w:proofErr w:type="gramStart"/>
       <w:r>
         <w:rPr>
           <w:rFonts w:ascii="Calibri" w:eastAsia="Times New Roman" w:hAnsi="Calibri" w:cs="Calibri"/>
@@ -454,7 +489,16 @@
           <w:color w:val="000000"/>
           <w:lang w:eastAsia="pt-BR"/>
         </w:rPr>
-        <w:t xml:space="preserve">()método retornará </w:t>
+        <w:t>(</w:t>
+      </w:r>
+      <w:proofErr w:type="gramEnd"/>
+      <w:r>
+        <w:rPr>
+          <w:rFonts w:ascii="Calibri" w:eastAsia="Times New Roman" w:hAnsi="Calibri" w:cs="Calibri"/>
+          <w:color w:val="000000"/>
+          <w:lang w:eastAsia="pt-BR"/>
+        </w:rPr>
+        <w:t xml:space="preserve">)método retornará </w:t>
       </w:r>
       <w:proofErr w:type="spellStart"/>
       <w:r>
@@ -491,7 +535,25 @@
           <w:color w:val="000000"/>
           <w:lang w:eastAsia="pt-BR"/>
         </w:rPr>
-        <w:t>Exemplo de caracteres que não são alfanuméricos: (espaço)!#%&amp;? etc.</w:t>
+        <w:t>Exemplo de caracteres que não são alfanuméricos: (espaço</w:t>
+      </w:r>
+      <w:proofErr w:type="gramStart"/>
+      <w:r>
+        <w:rPr>
+          <w:rFonts w:ascii="Calibri" w:eastAsia="Times New Roman" w:hAnsi="Calibri" w:cs="Calibri"/>
+          <w:color w:val="000000"/>
+          <w:lang w:eastAsia="pt-BR"/>
+        </w:rPr>
+        <w:t>)!#</w:t>
+      </w:r>
+      <w:proofErr w:type="gramEnd"/>
+      <w:r>
+        <w:rPr>
+          <w:rFonts w:ascii="Calibri" w:eastAsia="Times New Roman" w:hAnsi="Calibri" w:cs="Calibri"/>
+          <w:color w:val="000000"/>
+          <w:lang w:eastAsia="pt-BR"/>
+        </w:rPr>
+        <w:t>%&amp;? etc.</w:t>
       </w:r>
     </w:p>
     <w:p>
@@ -520,6 +582,7 @@
         <w:t xml:space="preserve">Print </w:t>
       </w:r>
       <w:proofErr w:type="spellStart"/>
+      <w:proofErr w:type="gramStart"/>
       <w:r>
         <w:rPr>
           <w:rFonts w:ascii="Calibri" w:eastAsia="Times New Roman" w:hAnsi="Calibri" w:cs="Calibri"/>
@@ -535,7 +598,34 @@
           <w:color w:val="000000"/>
           <w:lang w:eastAsia="pt-BR"/>
         </w:rPr>
-        <w:t xml:space="preserve">() é pra saber se é </w:t>
+        <w:t>(</w:t>
+      </w:r>
+      <w:proofErr w:type="gramEnd"/>
+      <w:r>
+        <w:rPr>
+          <w:rFonts w:ascii="Calibri" w:eastAsia="Times New Roman" w:hAnsi="Calibri" w:cs="Calibri"/>
+          <w:color w:val="000000"/>
+          <w:lang w:eastAsia="pt-BR"/>
+        </w:rPr>
+        <w:t xml:space="preserve">) é </w:t>
+      </w:r>
+      <w:proofErr w:type="gramStart"/>
+      <w:r>
+        <w:rPr>
+          <w:rFonts w:ascii="Calibri" w:eastAsia="Times New Roman" w:hAnsi="Calibri" w:cs="Calibri"/>
+          <w:color w:val="000000"/>
+          <w:lang w:eastAsia="pt-BR"/>
+        </w:rPr>
+        <w:t>pra</w:t>
+      </w:r>
+      <w:proofErr w:type="gramEnd"/>
+      <w:r>
+        <w:rPr>
+          <w:rFonts w:ascii="Calibri" w:eastAsia="Times New Roman" w:hAnsi="Calibri" w:cs="Calibri"/>
+          <w:color w:val="000000"/>
+          <w:lang w:eastAsia="pt-BR"/>
+        </w:rPr>
+        <w:t xml:space="preserve"> saber se é </w:t>
       </w:r>
       <w:proofErr w:type="spellStart"/>
       <w:r>
@@ -574,6 +664,7 @@
         <w:t>Print(</w:t>
       </w:r>
       <w:proofErr w:type="spellStart"/>
+      <w:proofErr w:type="gramStart"/>
       <w:r>
         <w:rPr>
           <w:rFonts w:ascii="Calibri" w:eastAsia="Times New Roman" w:hAnsi="Calibri" w:cs="Calibri"/>
@@ -583,13 +674,32 @@
         <w:t>n.isnumeric</w:t>
       </w:r>
       <w:proofErr w:type="spellEnd"/>
-      <w:r>
-        <w:rPr>
-          <w:rFonts w:ascii="Calibri" w:eastAsia="Times New Roman" w:hAnsi="Calibri" w:cs="Calibri"/>
-          <w:color w:val="000000"/>
-          <w:lang w:eastAsia="pt-BR"/>
-        </w:rPr>
-        <w:t>()) é pra saber se é número</w:t>
+      <w:proofErr w:type="gramEnd"/>
+      <w:r>
+        <w:rPr>
+          <w:rFonts w:ascii="Calibri" w:eastAsia="Times New Roman" w:hAnsi="Calibri" w:cs="Calibri"/>
+          <w:color w:val="000000"/>
+          <w:lang w:eastAsia="pt-BR"/>
+        </w:rPr>
+        <w:t xml:space="preserve">()) é </w:t>
+      </w:r>
+      <w:proofErr w:type="gramStart"/>
+      <w:r>
+        <w:rPr>
+          <w:rFonts w:ascii="Calibri" w:eastAsia="Times New Roman" w:hAnsi="Calibri" w:cs="Calibri"/>
+          <w:color w:val="000000"/>
+          <w:lang w:eastAsia="pt-BR"/>
+        </w:rPr>
+        <w:t>pra</w:t>
+      </w:r>
+      <w:proofErr w:type="gramEnd"/>
+      <w:r>
+        <w:rPr>
+          <w:rFonts w:ascii="Calibri" w:eastAsia="Times New Roman" w:hAnsi="Calibri" w:cs="Calibri"/>
+          <w:color w:val="000000"/>
+          <w:lang w:eastAsia="pt-BR"/>
+        </w:rPr>
+        <w:t xml:space="preserve"> saber se é número</w:t>
       </w:r>
     </w:p>
     <w:p>
@@ -712,9 +822,19 @@
           <w:color w:val="000000"/>
           <w:lang w:eastAsia="pt-BR"/>
         </w:rPr>
-        <w:t>Float:numero</w:t>
-      </w:r>
-      <w:proofErr w:type="spellEnd"/>
+        <w:t>Float:</w:t>
+      </w:r>
+      <w:proofErr w:type="gramStart"/>
+      <w:r>
+        <w:rPr>
+          <w:rFonts w:ascii="Calibri" w:eastAsia="Times New Roman" w:hAnsi="Calibri" w:cs="Calibri"/>
+          <w:color w:val="000000"/>
+          <w:lang w:eastAsia="pt-BR"/>
+        </w:rPr>
+        <w:t>numero</w:t>
+      </w:r>
+      <w:proofErr w:type="spellEnd"/>
+      <w:proofErr w:type="gramEnd"/>
       <w:r>
         <w:rPr>
           <w:rFonts w:ascii="Calibri" w:eastAsia="Times New Roman" w:hAnsi="Calibri" w:cs="Calibri"/>
@@ -792,6 +912,7 @@
           <w:lang w:eastAsia="pt-BR"/>
         </w:rPr>
       </w:pPr>
+      <w:proofErr w:type="gramStart"/>
       <w:r>
         <w:rPr>
           <w:rFonts w:ascii="Calibri" w:eastAsia="Times New Roman" w:hAnsi="Calibri" w:cs="Calibri"/>
@@ -810,6 +931,7 @@
         <w:t>format</w:t>
       </w:r>
       <w:proofErr w:type="spellEnd"/>
+      <w:proofErr w:type="gramEnd"/>
       <w:r>
         <w:rPr>
           <w:rFonts w:ascii="Calibri" w:eastAsia="Times New Roman" w:hAnsi="Calibri" w:cs="Calibri"/>
@@ -819,6 +941,7 @@
         <w:t xml:space="preserve"> para mostrar o que </w:t>
       </w:r>
       <w:proofErr w:type="spellStart"/>
+      <w:proofErr w:type="gramStart"/>
       <w:r>
         <w:rPr>
           <w:rFonts w:ascii="Calibri" w:eastAsia="Times New Roman" w:hAnsi="Calibri" w:cs="Calibri"/>
@@ -828,6 +951,7 @@
         <w:t>esta</w:t>
       </w:r>
       <w:proofErr w:type="spellEnd"/>
+      <w:proofErr w:type="gramEnd"/>
       <w:r>
         <w:rPr>
           <w:rFonts w:ascii="Calibri" w:eastAsia="Times New Roman" w:hAnsi="Calibri" w:cs="Calibri"/>
@@ -952,6 +1076,7 @@
         <w:t xml:space="preserve">**(potência, elevado ao </w:t>
       </w:r>
       <w:proofErr w:type="spellStart"/>
+      <w:proofErr w:type="gramStart"/>
       <w:r>
         <w:rPr>
           <w:rFonts w:ascii="Calibri" w:eastAsia="Times New Roman" w:hAnsi="Calibri" w:cs="Calibri"/>
@@ -961,6 +1086,7 @@
         <w:t>numero</w:t>
       </w:r>
       <w:proofErr w:type="spellEnd"/>
+      <w:proofErr w:type="gramEnd"/>
       <w:r>
         <w:rPr>
           <w:rFonts w:ascii="Calibri" w:eastAsia="Times New Roman" w:hAnsi="Calibri" w:cs="Calibri"/>
@@ -1062,8 +1188,18 @@
           <w:color w:val="000000"/>
           <w:lang w:eastAsia="pt-BR"/>
         </w:rPr>
-        <w:t>1° ( )</w:t>
-      </w:r>
+        <w:t xml:space="preserve">1° </w:t>
+      </w:r>
+      <w:proofErr w:type="gramStart"/>
+      <w:r>
+        <w:rPr>
+          <w:rFonts w:ascii="Calibri" w:eastAsia="Times New Roman" w:hAnsi="Calibri" w:cs="Calibri"/>
+          <w:color w:val="000000"/>
+          <w:lang w:eastAsia="pt-BR"/>
+        </w:rPr>
+        <w:t>( )</w:t>
+      </w:r>
+      <w:proofErr w:type="gramEnd"/>
     </w:p>
     <w:p>
       <w:pPr>
@@ -1233,8 +1369,18 @@
           <w:color w:val="000000"/>
           <w:lang w:eastAsia="pt-BR"/>
         </w:rPr>
-        <w:t>: e para escolher uma importação em especifico</w:t>
-      </w:r>
+        <w:t xml:space="preserve">: e para escolher uma importação em </w:t>
+      </w:r>
+      <w:proofErr w:type="gramStart"/>
+      <w:r>
+        <w:rPr>
+          <w:rFonts w:ascii="Calibri" w:eastAsia="Times New Roman" w:hAnsi="Calibri" w:cs="Calibri"/>
+          <w:color w:val="000000"/>
+          <w:lang w:eastAsia="pt-BR"/>
+        </w:rPr>
+        <w:t>especifico</w:t>
+      </w:r>
+      <w:proofErr w:type="gramEnd"/>
     </w:p>
     <w:p>
       <w:pPr>
@@ -1321,6 +1467,7 @@
         </w:rPr>
       </w:pPr>
       <w:proofErr w:type="spellStart"/>
+      <w:proofErr w:type="gramStart"/>
       <w:r>
         <w:rPr>
           <w:rFonts w:ascii="Calibri" w:eastAsia="Times New Roman" w:hAnsi="Calibri" w:cs="Calibri"/>
@@ -1336,7 +1483,16 @@
           <w:color w:val="000000"/>
           <w:lang w:eastAsia="pt-BR"/>
         </w:rPr>
-        <w:t xml:space="preserve"> : faz arredondamento para cima</w:t>
+        <w:t xml:space="preserve"> :</w:t>
+      </w:r>
+      <w:proofErr w:type="gramEnd"/>
+      <w:r>
+        <w:rPr>
+          <w:rFonts w:ascii="Calibri" w:eastAsia="Times New Roman" w:hAnsi="Calibri" w:cs="Calibri"/>
+          <w:color w:val="000000"/>
+          <w:lang w:eastAsia="pt-BR"/>
+        </w:rPr>
+        <w:t xml:space="preserve"> faz arredondamento para cima</w:t>
       </w:r>
     </w:p>
     <w:p>
@@ -1423,8 +1579,18 @@
           <w:color w:val="000000"/>
           <w:lang w:eastAsia="pt-BR"/>
         </w:rPr>
-        <w:t>: potencia</w:t>
-      </w:r>
+        <w:t xml:space="preserve">: </w:t>
+      </w:r>
+      <w:proofErr w:type="gramStart"/>
+      <w:r>
+        <w:rPr>
+          <w:rFonts w:ascii="Calibri" w:eastAsia="Times New Roman" w:hAnsi="Calibri" w:cs="Calibri"/>
+          <w:color w:val="000000"/>
+          <w:lang w:eastAsia="pt-BR"/>
+        </w:rPr>
+        <w:t>potencia</w:t>
+      </w:r>
+      <w:proofErr w:type="gramEnd"/>
     </w:p>
     <w:p>
       <w:pPr>
@@ -1524,13 +1690,23 @@
         </w:rPr>
       </w:pPr>
       <w:proofErr w:type="spellStart"/>
-      <w:r>
-        <w:rPr>
-          <w:rFonts w:ascii="Calibri" w:eastAsia="Times New Roman" w:hAnsi="Calibri" w:cs="Calibri"/>
-          <w:color w:val="000000"/>
-          <w:lang w:eastAsia="pt-BR"/>
-        </w:rPr>
-        <w:t>Cos,sin,tan</w:t>
+      <w:proofErr w:type="gramStart"/>
+      <w:r>
+        <w:rPr>
+          <w:rFonts w:ascii="Calibri" w:eastAsia="Times New Roman" w:hAnsi="Calibri" w:cs="Calibri"/>
+          <w:color w:val="000000"/>
+          <w:lang w:eastAsia="pt-BR"/>
+        </w:rPr>
+        <w:t>Cos,sin</w:t>
+      </w:r>
+      <w:proofErr w:type="gramEnd"/>
+      <w:r>
+        <w:rPr>
+          <w:rFonts w:ascii="Calibri" w:eastAsia="Times New Roman" w:hAnsi="Calibri" w:cs="Calibri"/>
+          <w:color w:val="000000"/>
+          <w:lang w:eastAsia="pt-BR"/>
+        </w:rPr>
+        <w:t>,tan</w:t>
       </w:r>
       <w:proofErr w:type="spellEnd"/>
       <w:r>
@@ -1542,6 +1718,7 @@
         <w:t xml:space="preserve">: para calcular o cosseno seno e tangente, e para calcular precisa colocar o </w:t>
       </w:r>
       <w:proofErr w:type="spellStart"/>
+      <w:proofErr w:type="gramStart"/>
       <w:r>
         <w:rPr>
           <w:rFonts w:ascii="Calibri" w:eastAsia="Times New Roman" w:hAnsi="Calibri" w:cs="Calibri"/>
@@ -1557,7 +1734,16 @@
           <w:color w:val="000000"/>
           <w:lang w:eastAsia="pt-BR"/>
         </w:rPr>
-        <w:t>( ) para calcular em radiano</w:t>
+        <w:t>( )</w:t>
+      </w:r>
+      <w:proofErr w:type="gramEnd"/>
+      <w:r>
+        <w:rPr>
+          <w:rFonts w:ascii="Calibri" w:eastAsia="Times New Roman" w:hAnsi="Calibri" w:cs="Calibri"/>
+          <w:color w:val="000000"/>
+          <w:lang w:eastAsia="pt-BR"/>
+        </w:rPr>
+        <w:t xml:space="preserve"> para calcular em radiano</w:t>
       </w:r>
     </w:p>
     <w:p>
@@ -1616,6 +1802,7 @@
         <w:t xml:space="preserve">; </w:t>
       </w:r>
       <w:proofErr w:type="spellStart"/>
+      <w:proofErr w:type="gramStart"/>
       <w:r>
         <w:rPr>
           <w:rFonts w:ascii="Calibri" w:eastAsia="Times New Roman" w:hAnsi="Calibri" w:cs="Calibri"/>
@@ -1625,13 +1812,32 @@
         <w:t>text;back</w:t>
       </w:r>
       <w:proofErr w:type="spellEnd"/>
-      <w:r>
-        <w:rPr>
-          <w:rFonts w:ascii="Calibri" w:eastAsia="Times New Roman" w:hAnsi="Calibri" w:cs="Calibri"/>
-          <w:color w:val="000000"/>
-          <w:lang w:eastAsia="pt-BR"/>
-        </w:rPr>
-        <w:t xml:space="preserve"> m , serve para colocar cores no </w:t>
+      <w:proofErr w:type="gramEnd"/>
+      <w:r>
+        <w:rPr>
+          <w:rFonts w:ascii="Calibri" w:eastAsia="Times New Roman" w:hAnsi="Calibri" w:cs="Calibri"/>
+          <w:color w:val="000000"/>
+          <w:lang w:eastAsia="pt-BR"/>
+        </w:rPr>
+        <w:t xml:space="preserve"> </w:t>
+      </w:r>
+      <w:proofErr w:type="gramStart"/>
+      <w:r>
+        <w:rPr>
+          <w:rFonts w:ascii="Calibri" w:eastAsia="Times New Roman" w:hAnsi="Calibri" w:cs="Calibri"/>
+          <w:color w:val="000000"/>
+          <w:lang w:eastAsia="pt-BR"/>
+        </w:rPr>
+        <w:t>m ,</w:t>
+      </w:r>
+      <w:proofErr w:type="gramEnd"/>
+      <w:r>
+        <w:rPr>
+          <w:rFonts w:ascii="Calibri" w:eastAsia="Times New Roman" w:hAnsi="Calibri" w:cs="Calibri"/>
+          <w:color w:val="000000"/>
+          <w:lang w:eastAsia="pt-BR"/>
+        </w:rPr>
+        <w:t xml:space="preserve"> serve para colocar cores no </w:t>
       </w:r>
       <w:proofErr w:type="spellStart"/>
       <w:r>
@@ -1728,6 +1934,7 @@
               </w:rPr>
             </w:pPr>
             <w:proofErr w:type="spellStart"/>
+            <w:proofErr w:type="gramStart"/>
             <w:r>
               <w:rPr>
                 <w:rFonts w:ascii="Calibri" w:eastAsia="Times New Roman" w:hAnsi="Calibri" w:cs="Calibri"/>
@@ -1743,7 +1950,16 @@
                 <w:color w:val="000000"/>
                 <w:lang w:eastAsia="pt-BR"/>
               </w:rPr>
-              <w:t>(cor da letra)</w:t>
+              <w:t>(</w:t>
+            </w:r>
+            <w:proofErr w:type="gramEnd"/>
+            <w:r>
+              <w:rPr>
+                <w:rFonts w:ascii="Calibri" w:eastAsia="Times New Roman" w:hAnsi="Calibri" w:cs="Calibri"/>
+                <w:color w:val="000000"/>
+                <w:lang w:eastAsia="pt-BR"/>
+              </w:rPr>
+              <w:t>cor da letra)</w:t>
             </w:r>
           </w:p>
         </w:tc>
@@ -1774,13 +1990,23 @@
                 <w:lang w:eastAsia="pt-BR"/>
               </w:rPr>
             </w:pPr>
+            <w:proofErr w:type="gramStart"/>
             <w:r>
               <w:rPr>
                 <w:rFonts w:ascii="Calibri" w:eastAsia="Times New Roman" w:hAnsi="Calibri" w:cs="Calibri"/>
                 <w:color w:val="000000"/>
                 <w:lang w:eastAsia="pt-BR"/>
               </w:rPr>
-              <w:t>Back(cor de fundo)</w:t>
+              <w:t>Back(</w:t>
+            </w:r>
+            <w:proofErr w:type="gramEnd"/>
+            <w:r>
+              <w:rPr>
+                <w:rFonts w:ascii="Calibri" w:eastAsia="Times New Roman" w:hAnsi="Calibri" w:cs="Calibri"/>
+                <w:color w:val="000000"/>
+                <w:lang w:eastAsia="pt-BR"/>
+              </w:rPr>
+              <w:t>cor de fundo)</w:t>
             </w:r>
           </w:p>
         </w:tc>
@@ -2782,6 +3008,7 @@
         <w:t>x</w:t>
       </w:r>
       <w:proofErr w:type="spellEnd"/>
+      <w:proofErr w:type="gramStart"/>
       <w:r>
         <w:rPr>
           <w:rFonts w:ascii="Calibri" w:eastAsia="Times New Roman" w:hAnsi="Calibri" w:cs="Calibri"/>
@@ -2798,7 +3025,16 @@
           <w:color w:val="000000"/>
           <w:lang w:eastAsia="pt-BR"/>
         </w:rPr>
-        <w:t xml:space="preserve">  fatiamento de </w:t>
+        <w:t>  fatiamento</w:t>
+      </w:r>
+      <w:proofErr w:type="gramEnd"/>
+      <w:r>
+        <w:rPr>
+          <w:rFonts w:ascii="Calibri" w:eastAsia="Times New Roman" w:hAnsi="Calibri" w:cs="Calibri"/>
+          <w:color w:val="000000"/>
+          <w:lang w:eastAsia="pt-BR"/>
+        </w:rPr>
+        <w:t xml:space="preserve"> de </w:t>
       </w:r>
       <w:proofErr w:type="spellStart"/>
       <w:r>
@@ -2816,7 +3052,43 @@
           <w:color w:val="000000"/>
           <w:lang w:eastAsia="pt-BR"/>
         </w:rPr>
-        <w:t xml:space="preserve"> usa para pegar uma lista e terminar uma antes dela, aonde começa e aonde termina um antes</w:t>
+        <w:t xml:space="preserve"> usa para pegar uma lista e terminar uma antes dela, </w:t>
+      </w:r>
+      <w:proofErr w:type="gramStart"/>
+      <w:r>
+        <w:rPr>
+          <w:rFonts w:ascii="Calibri" w:eastAsia="Times New Roman" w:hAnsi="Calibri" w:cs="Calibri"/>
+          <w:color w:val="000000"/>
+          <w:lang w:eastAsia="pt-BR"/>
+        </w:rPr>
+        <w:t>aonde</w:t>
+      </w:r>
+      <w:proofErr w:type="gramEnd"/>
+      <w:r>
+        <w:rPr>
+          <w:rFonts w:ascii="Calibri" w:eastAsia="Times New Roman" w:hAnsi="Calibri" w:cs="Calibri"/>
+          <w:color w:val="000000"/>
+          <w:lang w:eastAsia="pt-BR"/>
+        </w:rPr>
+        <w:t xml:space="preserve"> começa e </w:t>
+      </w:r>
+      <w:proofErr w:type="gramStart"/>
+      <w:r>
+        <w:rPr>
+          <w:rFonts w:ascii="Calibri" w:eastAsia="Times New Roman" w:hAnsi="Calibri" w:cs="Calibri"/>
+          <w:color w:val="000000"/>
+          <w:lang w:eastAsia="pt-BR"/>
+        </w:rPr>
+        <w:t>aonde</w:t>
+      </w:r>
+      <w:proofErr w:type="gramEnd"/>
+      <w:r>
+        <w:rPr>
+          <w:rFonts w:ascii="Calibri" w:eastAsia="Times New Roman" w:hAnsi="Calibri" w:cs="Calibri"/>
+          <w:color w:val="000000"/>
+          <w:lang w:eastAsia="pt-BR"/>
+        </w:rPr>
+        <w:t xml:space="preserve"> termina um antes</w:t>
       </w:r>
     </w:p>
     <w:p>
@@ -2866,6 +3138,7 @@
         <w:t xml:space="preserve"> ele pega ou do </w:t>
       </w:r>
       <w:proofErr w:type="spellStart"/>
+      <w:proofErr w:type="gramStart"/>
       <w:r>
         <w:rPr>
           <w:rFonts w:ascii="Calibri" w:eastAsia="Times New Roman" w:hAnsi="Calibri" w:cs="Calibri"/>
@@ -2875,15 +3148,71 @@
         <w:t>inicio</w:t>
       </w:r>
       <w:proofErr w:type="spellEnd"/>
-      <w:r>
-        <w:rPr>
-          <w:rFonts w:ascii="Calibri" w:eastAsia="Times New Roman" w:hAnsi="Calibri" w:cs="Calibri"/>
-          <w:color w:val="000000"/>
-          <w:lang w:eastAsia="pt-BR"/>
-        </w:rPr>
-        <w:t xml:space="preserve"> até o final (quando você coloca aonde ele vai terminar) ou ele coloca aonde você quer q ele pegue </w:t>
-      </w:r>
-      <w:proofErr w:type="spellStart"/>
+      <w:proofErr w:type="gramEnd"/>
+      <w:r>
+        <w:rPr>
+          <w:rFonts w:ascii="Calibri" w:eastAsia="Times New Roman" w:hAnsi="Calibri" w:cs="Calibri"/>
+          <w:color w:val="000000"/>
+          <w:lang w:eastAsia="pt-BR"/>
+        </w:rPr>
+        <w:t xml:space="preserve"> até o final (quando você coloca </w:t>
+      </w:r>
+      <w:proofErr w:type="gramStart"/>
+      <w:r>
+        <w:rPr>
+          <w:rFonts w:ascii="Calibri" w:eastAsia="Times New Roman" w:hAnsi="Calibri" w:cs="Calibri"/>
+          <w:color w:val="000000"/>
+          <w:lang w:eastAsia="pt-BR"/>
+        </w:rPr>
+        <w:t>aonde</w:t>
+      </w:r>
+      <w:proofErr w:type="gramEnd"/>
+      <w:r>
+        <w:rPr>
+          <w:rFonts w:ascii="Calibri" w:eastAsia="Times New Roman" w:hAnsi="Calibri" w:cs="Calibri"/>
+          <w:color w:val="000000"/>
+          <w:lang w:eastAsia="pt-BR"/>
+        </w:rPr>
+        <w:t xml:space="preserve"> ele vai terminar) ou ele coloca </w:t>
+      </w:r>
+      <w:proofErr w:type="gramStart"/>
+      <w:r>
+        <w:rPr>
+          <w:rFonts w:ascii="Calibri" w:eastAsia="Times New Roman" w:hAnsi="Calibri" w:cs="Calibri"/>
+          <w:color w:val="000000"/>
+          <w:lang w:eastAsia="pt-BR"/>
+        </w:rPr>
+        <w:t>aonde</w:t>
+      </w:r>
+      <w:proofErr w:type="gramEnd"/>
+      <w:r>
+        <w:rPr>
+          <w:rFonts w:ascii="Calibri" w:eastAsia="Times New Roman" w:hAnsi="Calibri" w:cs="Calibri"/>
+          <w:color w:val="000000"/>
+          <w:lang w:eastAsia="pt-BR"/>
+        </w:rPr>
+        <w:t xml:space="preserve"> você quer </w:t>
+      </w:r>
+      <w:proofErr w:type="gramStart"/>
+      <w:r>
+        <w:rPr>
+          <w:rFonts w:ascii="Calibri" w:eastAsia="Times New Roman" w:hAnsi="Calibri" w:cs="Calibri"/>
+          <w:color w:val="000000"/>
+          <w:lang w:eastAsia="pt-BR"/>
+        </w:rPr>
+        <w:t>q</w:t>
+      </w:r>
+      <w:proofErr w:type="gramEnd"/>
+      <w:r>
+        <w:rPr>
+          <w:rFonts w:ascii="Calibri" w:eastAsia="Times New Roman" w:hAnsi="Calibri" w:cs="Calibri"/>
+          <w:color w:val="000000"/>
+          <w:lang w:eastAsia="pt-BR"/>
+        </w:rPr>
+        <w:t xml:space="preserve"> ele pegue </w:t>
+      </w:r>
+      <w:proofErr w:type="spellStart"/>
+      <w:proofErr w:type="gramStart"/>
       <w:r>
         <w:rPr>
           <w:rFonts w:ascii="Calibri" w:eastAsia="Times New Roman" w:hAnsi="Calibri" w:cs="Calibri"/>
@@ -2893,6 +3222,7 @@
         <w:t>ate</w:t>
       </w:r>
       <w:proofErr w:type="spellEnd"/>
+      <w:proofErr w:type="gramEnd"/>
       <w:r>
         <w:rPr>
           <w:rFonts w:ascii="Calibri" w:eastAsia="Times New Roman" w:hAnsi="Calibri" w:cs="Calibri"/>
@@ -2925,20 +3255,34 @@
           <w:szCs w:val="32"/>
           <w:lang w:eastAsia="pt-BR"/>
         </w:rPr>
-        <w:t> Analise</w:t>
-      </w:r>
-    </w:p>
-    <w:p>
-      <w:pPr>
-        <w:spacing w:line="240" w:lineRule="auto"/>
-        <w:rPr>
-          <w:rFonts w:ascii="Times New Roman" w:eastAsia="Times New Roman" w:hAnsi="Times New Roman" w:cs="Times New Roman"/>
-          <w:sz w:val="24"/>
-          <w:szCs w:val="24"/>
-          <w:lang w:eastAsia="pt-BR"/>
-        </w:rPr>
-      </w:pPr>
-      <w:proofErr w:type="spellStart"/>
+        <w:t> </w:t>
+      </w:r>
+      <w:proofErr w:type="gramStart"/>
+      <w:r>
+        <w:rPr>
+          <w:rFonts w:ascii="Calibri" w:eastAsia="Times New Roman" w:hAnsi="Calibri" w:cs="Calibri"/>
+          <w:color w:val="2F5496"/>
+          <w:kern w:val="36"/>
+          <w:sz w:val="32"/>
+          <w:szCs w:val="32"/>
+          <w:lang w:eastAsia="pt-BR"/>
+        </w:rPr>
+        <w:t>Analise</w:t>
+      </w:r>
+      <w:proofErr w:type="gramEnd"/>
+    </w:p>
+    <w:p>
+      <w:pPr>
+        <w:spacing w:line="240" w:lineRule="auto"/>
+        <w:rPr>
+          <w:rFonts w:ascii="Times New Roman" w:eastAsia="Times New Roman" w:hAnsi="Times New Roman" w:cs="Times New Roman"/>
+          <w:sz w:val="24"/>
+          <w:szCs w:val="24"/>
+          <w:lang w:eastAsia="pt-BR"/>
+        </w:rPr>
+      </w:pPr>
+      <w:proofErr w:type="spellStart"/>
+      <w:proofErr w:type="gramStart"/>
       <w:r>
         <w:rPr>
           <w:rFonts w:ascii="Calibri" w:eastAsia="Times New Roman" w:hAnsi="Calibri" w:cs="Calibri"/>
@@ -2958,36 +3302,9 @@
           <w:color w:val="000000"/>
           <w:lang w:eastAsia="pt-BR"/>
         </w:rPr>
-        <w:t>( XXX ):</w:t>
-      </w:r>
-      <w:r>
-        <w:rPr>
-          <w:rFonts w:ascii="Calibri" w:eastAsia="Times New Roman" w:hAnsi="Calibri" w:cs="Calibri"/>
-          <w:color w:val="000000"/>
-          <w:lang w:eastAsia="pt-BR"/>
-        </w:rPr>
-        <w:t>é para saber o tanto de caracteres que existem.</w:t>
-      </w:r>
-    </w:p>
-    <w:p>
-      <w:pPr>
-        <w:spacing w:line="240" w:lineRule="auto"/>
-        <w:rPr>
-          <w:rFonts w:ascii="Times New Roman" w:eastAsia="Times New Roman" w:hAnsi="Times New Roman" w:cs="Times New Roman"/>
-          <w:sz w:val="24"/>
-          <w:szCs w:val="24"/>
-          <w:lang w:eastAsia="pt-BR"/>
-        </w:rPr>
-      </w:pPr>
-      <w:proofErr w:type="spellStart"/>
-      <w:r>
-        <w:rPr>
-          <w:rFonts w:ascii="Calibri" w:eastAsia="Times New Roman" w:hAnsi="Calibri" w:cs="Calibri"/>
-          <w:color w:val="000000"/>
-          <w:lang w:eastAsia="pt-BR"/>
-        </w:rPr>
-        <w:t>xx</w:t>
-      </w:r>
+        <w:t>( XXX</w:t>
+      </w:r>
+      <w:proofErr w:type="gramEnd"/>
       <w:r>
         <w:rPr>
           <w:rFonts w:ascii="Calibri" w:eastAsia="Times New Roman" w:hAnsi="Calibri" w:cs="Calibri"/>
@@ -2996,109 +3313,15 @@
           <w:color w:val="000000"/>
           <w:lang w:eastAsia="pt-BR"/>
         </w:rPr>
-        <w:t>.count</w:t>
-      </w:r>
-      <w:proofErr w:type="spellEnd"/>
-      <w:r>
-        <w:rPr>
-          <w:rFonts w:ascii="Calibri" w:eastAsia="Times New Roman" w:hAnsi="Calibri" w:cs="Calibri"/>
-          <w:color w:val="000000"/>
-          <w:lang w:eastAsia="pt-BR"/>
-        </w:rPr>
-        <w:t>(x): serve para contar o tanto de caracteres que existe na frase</w:t>
-      </w:r>
-    </w:p>
-    <w:p>
-      <w:pPr>
-        <w:spacing w:line="240" w:lineRule="auto"/>
-        <w:rPr>
-          <w:rFonts w:ascii="Times New Roman" w:eastAsia="Times New Roman" w:hAnsi="Times New Roman" w:cs="Times New Roman"/>
-          <w:sz w:val="24"/>
-          <w:szCs w:val="24"/>
-          <w:lang w:eastAsia="pt-BR"/>
-        </w:rPr>
-      </w:pPr>
-      <w:r>
-        <w:rPr>
-          <w:rFonts w:ascii="Calibri" w:eastAsia="Times New Roman" w:hAnsi="Calibri" w:cs="Calibri"/>
-          <w:color w:val="000000"/>
-          <w:lang w:eastAsia="pt-BR"/>
-        </w:rPr>
-        <w:t xml:space="preserve">frase = Curso em </w:t>
-      </w:r>
-      <w:proofErr w:type="spellStart"/>
-      <w:r>
-        <w:rPr>
-          <w:rFonts w:ascii="Calibri" w:eastAsia="Times New Roman" w:hAnsi="Calibri" w:cs="Calibri"/>
-          <w:color w:val="000000"/>
-          <w:lang w:eastAsia="pt-BR"/>
-        </w:rPr>
-        <w:t>Video</w:t>
-      </w:r>
-      <w:proofErr w:type="spellEnd"/>
-      <w:r>
-        <w:rPr>
-          <w:rFonts w:ascii="Calibri" w:eastAsia="Times New Roman" w:hAnsi="Calibri" w:cs="Calibri"/>
-          <w:color w:val="000000"/>
-          <w:lang w:eastAsia="pt-BR"/>
-        </w:rPr>
-        <w:t xml:space="preserve"> Python</w:t>
-      </w:r>
-    </w:p>
-    <w:p>
-      <w:pPr>
-        <w:spacing w:line="240" w:lineRule="auto"/>
-        <w:rPr>
-          <w:rFonts w:ascii="Times New Roman" w:eastAsia="Times New Roman" w:hAnsi="Times New Roman" w:cs="Times New Roman"/>
-          <w:sz w:val="24"/>
-          <w:szCs w:val="24"/>
-          <w:lang w:eastAsia="pt-BR"/>
-        </w:rPr>
-      </w:pPr>
-      <w:r>
-        <w:rPr>
-          <w:rFonts w:ascii="Calibri" w:eastAsia="Times New Roman" w:hAnsi="Calibri" w:cs="Calibri"/>
-          <w:color w:val="000000"/>
-          <w:lang w:eastAsia="pt-BR"/>
-        </w:rPr>
-        <w:t xml:space="preserve">ex. </w:t>
-      </w:r>
-      <w:proofErr w:type="spellStart"/>
-      <w:r>
-        <w:rPr>
-          <w:rFonts w:ascii="Calibri" w:eastAsia="Times New Roman" w:hAnsi="Calibri" w:cs="Calibri"/>
-          <w:color w:val="000000"/>
-          <w:lang w:eastAsia="pt-BR"/>
-        </w:rPr>
-        <w:t>frase.count</w:t>
-      </w:r>
-      <w:proofErr w:type="spellEnd"/>
-      <w:r>
-        <w:rPr>
-          <w:rFonts w:ascii="Calibri" w:eastAsia="Times New Roman" w:hAnsi="Calibri" w:cs="Calibri"/>
-          <w:color w:val="000000"/>
-          <w:lang w:eastAsia="pt-BR"/>
-        </w:rPr>
-        <w:t>(‘o’)</w:t>
-      </w:r>
-    </w:p>
-    <w:p>
-      <w:pPr>
-        <w:spacing w:line="240" w:lineRule="auto"/>
-        <w:rPr>
-          <w:rFonts w:ascii="Times New Roman" w:eastAsia="Times New Roman" w:hAnsi="Times New Roman" w:cs="Times New Roman"/>
-          <w:sz w:val="24"/>
-          <w:szCs w:val="24"/>
-          <w:lang w:eastAsia="pt-BR"/>
-        </w:rPr>
-      </w:pPr>
-      <w:r>
-        <w:rPr>
-          <w:rFonts w:ascii="Calibri" w:eastAsia="Times New Roman" w:hAnsi="Calibri" w:cs="Calibri"/>
-          <w:color w:val="000000"/>
-          <w:lang w:eastAsia="pt-BR"/>
-        </w:rPr>
-        <w:t>3</w:t>
+        <w:t xml:space="preserve"> ):</w:t>
+      </w:r>
+      <w:r>
+        <w:rPr>
+          <w:rFonts w:ascii="Calibri" w:eastAsia="Times New Roman" w:hAnsi="Calibri" w:cs="Calibri"/>
+          <w:color w:val="000000"/>
+          <w:lang w:eastAsia="pt-BR"/>
+        </w:rPr>
+        <w:t>é para saber o tanto de caracteres que existem.</w:t>
       </w:r>
     </w:p>
     <w:p>
@@ -3128,66 +3351,132 @@
           <w:color w:val="000000"/>
           <w:lang w:eastAsia="pt-BR"/>
         </w:rPr>
-        <w:t>.find</w:t>
-      </w:r>
-      <w:proofErr w:type="spellEnd"/>
-      <w:r>
-        <w:rPr>
-          <w:rFonts w:ascii="Calibri" w:eastAsia="Times New Roman" w:hAnsi="Calibri" w:cs="Calibri"/>
-          <w:color w:val="000000"/>
-          <w:lang w:eastAsia="pt-BR"/>
-        </w:rPr>
-        <w:t>(‘</w:t>
-      </w:r>
-      <w:proofErr w:type="spellStart"/>
-      <w:r>
-        <w:rPr>
-          <w:rFonts w:ascii="Calibri" w:eastAsia="Times New Roman" w:hAnsi="Calibri" w:cs="Calibri"/>
-          <w:color w:val="000000"/>
-          <w:lang w:eastAsia="pt-BR"/>
-        </w:rPr>
-        <w:t>xxx</w:t>
-      </w:r>
-      <w:proofErr w:type="spellEnd"/>
-      <w:r>
-        <w:rPr>
-          <w:rFonts w:ascii="Calibri" w:eastAsia="Times New Roman" w:hAnsi="Calibri" w:cs="Calibri"/>
-          <w:color w:val="000000"/>
-          <w:lang w:eastAsia="pt-BR"/>
-        </w:rPr>
-        <w:t>’)Serve para mostrar aonde encontrou o que ele pediu</w:t>
-      </w:r>
-    </w:p>
-    <w:p>
-      <w:pPr>
-        <w:spacing w:line="240" w:lineRule="auto"/>
-        <w:rPr>
-          <w:rFonts w:ascii="Times New Roman" w:eastAsia="Times New Roman" w:hAnsi="Times New Roman" w:cs="Times New Roman"/>
-          <w:sz w:val="24"/>
-          <w:szCs w:val="24"/>
-          <w:lang w:eastAsia="pt-BR"/>
-        </w:rPr>
-      </w:pPr>
-      <w:r>
-        <w:rPr>
-          <w:rFonts w:ascii="Calibri" w:eastAsia="Times New Roman" w:hAnsi="Calibri" w:cs="Calibri"/>
-          <w:color w:val="000000"/>
-          <w:lang w:eastAsia="pt-BR"/>
-        </w:rPr>
-        <w:t>aonde não existe ele vai te mostrar -1(significa que não tem)</w:t>
-      </w:r>
-    </w:p>
-    <w:p>
-      <w:pPr>
-        <w:spacing w:line="240" w:lineRule="auto"/>
-        <w:rPr>
-          <w:rFonts w:ascii="Times New Roman" w:eastAsia="Times New Roman" w:hAnsi="Times New Roman" w:cs="Times New Roman"/>
-          <w:sz w:val="24"/>
-          <w:szCs w:val="24"/>
-          <w:lang w:eastAsia="pt-BR"/>
-        </w:rPr>
-      </w:pPr>
-      <w:proofErr w:type="spellStart"/>
+        <w:t>.count</w:t>
+      </w:r>
+      <w:proofErr w:type="spellEnd"/>
+      <w:r>
+        <w:rPr>
+          <w:rFonts w:ascii="Calibri" w:eastAsia="Times New Roman" w:hAnsi="Calibri" w:cs="Calibri"/>
+          <w:color w:val="000000"/>
+          <w:lang w:eastAsia="pt-BR"/>
+        </w:rPr>
+        <w:t>(x): serve para contar o tanto de caracteres que existe na frase</w:t>
+      </w:r>
+    </w:p>
+    <w:p>
+      <w:pPr>
+        <w:spacing w:line="240" w:lineRule="auto"/>
+        <w:rPr>
+          <w:rFonts w:ascii="Times New Roman" w:eastAsia="Times New Roman" w:hAnsi="Times New Roman" w:cs="Times New Roman"/>
+          <w:sz w:val="24"/>
+          <w:szCs w:val="24"/>
+          <w:lang w:eastAsia="pt-BR"/>
+        </w:rPr>
+      </w:pPr>
+      <w:r>
+        <w:rPr>
+          <w:rFonts w:ascii="Calibri" w:eastAsia="Times New Roman" w:hAnsi="Calibri" w:cs="Calibri"/>
+          <w:color w:val="000000"/>
+          <w:lang w:eastAsia="pt-BR"/>
+        </w:rPr>
+        <w:t xml:space="preserve">frase = Curso em </w:t>
+      </w:r>
+      <w:proofErr w:type="spellStart"/>
+      <w:r>
+        <w:rPr>
+          <w:rFonts w:ascii="Calibri" w:eastAsia="Times New Roman" w:hAnsi="Calibri" w:cs="Calibri"/>
+          <w:color w:val="000000"/>
+          <w:lang w:eastAsia="pt-BR"/>
+        </w:rPr>
+        <w:t>Video</w:t>
+      </w:r>
+      <w:proofErr w:type="spellEnd"/>
+      <w:r>
+        <w:rPr>
+          <w:rFonts w:ascii="Calibri" w:eastAsia="Times New Roman" w:hAnsi="Calibri" w:cs="Calibri"/>
+          <w:color w:val="000000"/>
+          <w:lang w:eastAsia="pt-BR"/>
+        </w:rPr>
+        <w:t xml:space="preserve"> Python</w:t>
+      </w:r>
+    </w:p>
+    <w:p>
+      <w:pPr>
+        <w:spacing w:line="240" w:lineRule="auto"/>
+        <w:rPr>
+          <w:rFonts w:ascii="Times New Roman" w:eastAsia="Times New Roman" w:hAnsi="Times New Roman" w:cs="Times New Roman"/>
+          <w:sz w:val="24"/>
+          <w:szCs w:val="24"/>
+          <w:lang w:eastAsia="pt-BR"/>
+        </w:rPr>
+      </w:pPr>
+      <w:r>
+        <w:rPr>
+          <w:rFonts w:ascii="Calibri" w:eastAsia="Times New Roman" w:hAnsi="Calibri" w:cs="Calibri"/>
+          <w:color w:val="000000"/>
+          <w:lang w:eastAsia="pt-BR"/>
+        </w:rPr>
+        <w:t xml:space="preserve">ex. </w:t>
+      </w:r>
+      <w:proofErr w:type="spellStart"/>
+      <w:proofErr w:type="gramStart"/>
+      <w:r>
+        <w:rPr>
+          <w:rFonts w:ascii="Calibri" w:eastAsia="Times New Roman" w:hAnsi="Calibri" w:cs="Calibri"/>
+          <w:color w:val="000000"/>
+          <w:lang w:eastAsia="pt-BR"/>
+        </w:rPr>
+        <w:t>frase.count</w:t>
+      </w:r>
+      <w:proofErr w:type="spellEnd"/>
+      <w:proofErr w:type="gramEnd"/>
+      <w:r>
+        <w:rPr>
+          <w:rFonts w:ascii="Calibri" w:eastAsia="Times New Roman" w:hAnsi="Calibri" w:cs="Calibri"/>
+          <w:color w:val="000000"/>
+          <w:lang w:eastAsia="pt-BR"/>
+        </w:rPr>
+        <w:t>(‘o’)</w:t>
+      </w:r>
+    </w:p>
+    <w:p>
+      <w:pPr>
+        <w:spacing w:line="240" w:lineRule="auto"/>
+        <w:rPr>
+          <w:rFonts w:ascii="Times New Roman" w:eastAsia="Times New Roman" w:hAnsi="Times New Roman" w:cs="Times New Roman"/>
+          <w:sz w:val="24"/>
+          <w:szCs w:val="24"/>
+          <w:lang w:eastAsia="pt-BR"/>
+        </w:rPr>
+      </w:pPr>
+      <w:r>
+        <w:rPr>
+          <w:rFonts w:ascii="Calibri" w:eastAsia="Times New Roman" w:hAnsi="Calibri" w:cs="Calibri"/>
+          <w:color w:val="000000"/>
+          <w:lang w:eastAsia="pt-BR"/>
+        </w:rPr>
+        <w:t>3</w:t>
+      </w:r>
+    </w:p>
+    <w:p>
+      <w:pPr>
+        <w:spacing w:line="240" w:lineRule="auto"/>
+        <w:rPr>
+          <w:rFonts w:ascii="Times New Roman" w:eastAsia="Times New Roman" w:hAnsi="Times New Roman" w:cs="Times New Roman"/>
+          <w:sz w:val="24"/>
+          <w:szCs w:val="24"/>
+          <w:lang w:eastAsia="pt-BR"/>
+        </w:rPr>
+      </w:pPr>
+      <w:proofErr w:type="spellStart"/>
+      <w:r>
+        <w:rPr>
+          <w:rFonts w:ascii="Calibri" w:eastAsia="Times New Roman" w:hAnsi="Calibri" w:cs="Calibri"/>
+          <w:color w:val="000000"/>
+          <w:lang w:eastAsia="pt-BR"/>
+        </w:rPr>
+        <w:t>xx</w:t>
+      </w:r>
       <w:r>
         <w:rPr>
           <w:rFonts w:ascii="Calibri" w:eastAsia="Times New Roman" w:hAnsi="Calibri" w:cs="Calibri"/>
@@ -3196,6 +3485,112 @@
           <w:color w:val="000000"/>
           <w:lang w:eastAsia="pt-BR"/>
         </w:rPr>
+        <w:t>.find</w:t>
+      </w:r>
+      <w:proofErr w:type="spellEnd"/>
+      <w:r>
+        <w:rPr>
+          <w:rFonts w:ascii="Calibri" w:eastAsia="Times New Roman" w:hAnsi="Calibri" w:cs="Calibri"/>
+          <w:color w:val="000000"/>
+          <w:lang w:eastAsia="pt-BR"/>
+        </w:rPr>
+        <w:t>(‘</w:t>
+      </w:r>
+      <w:proofErr w:type="spellStart"/>
+      <w:r>
+        <w:rPr>
+          <w:rFonts w:ascii="Calibri" w:eastAsia="Times New Roman" w:hAnsi="Calibri" w:cs="Calibri"/>
+          <w:color w:val="000000"/>
+          <w:lang w:eastAsia="pt-BR"/>
+        </w:rPr>
+        <w:t>xxx</w:t>
+      </w:r>
+      <w:proofErr w:type="spellEnd"/>
+      <w:proofErr w:type="gramStart"/>
+      <w:r>
+        <w:rPr>
+          <w:rFonts w:ascii="Calibri" w:eastAsia="Times New Roman" w:hAnsi="Calibri" w:cs="Calibri"/>
+          <w:color w:val="000000"/>
+          <w:lang w:eastAsia="pt-BR"/>
+        </w:rPr>
+        <w:t>’)Serve</w:t>
+      </w:r>
+      <w:proofErr w:type="gramEnd"/>
+      <w:r>
+        <w:rPr>
+          <w:rFonts w:ascii="Calibri" w:eastAsia="Times New Roman" w:hAnsi="Calibri" w:cs="Calibri"/>
+          <w:color w:val="000000"/>
+          <w:lang w:eastAsia="pt-BR"/>
+        </w:rPr>
+        <w:t xml:space="preserve"> para mostrar </w:t>
+      </w:r>
+      <w:proofErr w:type="gramStart"/>
+      <w:r>
+        <w:rPr>
+          <w:rFonts w:ascii="Calibri" w:eastAsia="Times New Roman" w:hAnsi="Calibri" w:cs="Calibri"/>
+          <w:color w:val="000000"/>
+          <w:lang w:eastAsia="pt-BR"/>
+        </w:rPr>
+        <w:t>aonde</w:t>
+      </w:r>
+      <w:proofErr w:type="gramEnd"/>
+      <w:r>
+        <w:rPr>
+          <w:rFonts w:ascii="Calibri" w:eastAsia="Times New Roman" w:hAnsi="Calibri" w:cs="Calibri"/>
+          <w:color w:val="000000"/>
+          <w:lang w:eastAsia="pt-BR"/>
+        </w:rPr>
+        <w:t xml:space="preserve"> encontrou o que ele pediu</w:t>
+      </w:r>
+    </w:p>
+    <w:p>
+      <w:pPr>
+        <w:spacing w:line="240" w:lineRule="auto"/>
+        <w:rPr>
+          <w:rFonts w:ascii="Times New Roman" w:eastAsia="Times New Roman" w:hAnsi="Times New Roman" w:cs="Times New Roman"/>
+          <w:sz w:val="24"/>
+          <w:szCs w:val="24"/>
+          <w:lang w:eastAsia="pt-BR"/>
+        </w:rPr>
+      </w:pPr>
+      <w:proofErr w:type="gramStart"/>
+      <w:r>
+        <w:rPr>
+          <w:rFonts w:ascii="Calibri" w:eastAsia="Times New Roman" w:hAnsi="Calibri" w:cs="Calibri"/>
+          <w:color w:val="000000"/>
+          <w:lang w:eastAsia="pt-BR"/>
+        </w:rPr>
+        <w:t>aonde</w:t>
+      </w:r>
+      <w:proofErr w:type="gramEnd"/>
+      <w:r>
+        <w:rPr>
+          <w:rFonts w:ascii="Calibri" w:eastAsia="Times New Roman" w:hAnsi="Calibri" w:cs="Calibri"/>
+          <w:color w:val="000000"/>
+          <w:lang w:eastAsia="pt-BR"/>
+        </w:rPr>
+        <w:t xml:space="preserve"> não existe ele vai te mostrar -1(significa que não tem)</w:t>
+      </w:r>
+    </w:p>
+    <w:p>
+      <w:pPr>
+        <w:spacing w:line="240" w:lineRule="auto"/>
+        <w:rPr>
+          <w:rFonts w:ascii="Times New Roman" w:eastAsia="Times New Roman" w:hAnsi="Times New Roman" w:cs="Times New Roman"/>
+          <w:sz w:val="24"/>
+          <w:szCs w:val="24"/>
+          <w:lang w:eastAsia="pt-BR"/>
+        </w:rPr>
+      </w:pPr>
+      <w:proofErr w:type="spellStart"/>
+      <w:r>
+        <w:rPr>
+          <w:rFonts w:ascii="Calibri" w:eastAsia="Times New Roman" w:hAnsi="Calibri" w:cs="Calibri"/>
+          <w:b/>
+          <w:bCs/>
+          <w:color w:val="000000"/>
+          <w:lang w:eastAsia="pt-BR"/>
+        </w:rPr>
         <w:t>in</w:t>
       </w:r>
       <w:r>
@@ -3300,25 +3695,53 @@
           <w:color w:val="000000"/>
           <w:lang w:eastAsia="pt-BR"/>
         </w:rPr>
-        <w:t xml:space="preserve"> in e ao contrario</w:t>
-      </w:r>
-    </w:p>
-    <w:p>
-      <w:pPr>
-        <w:spacing w:line="240" w:lineRule="auto"/>
-        <w:rPr>
-          <w:rFonts w:ascii="Calibri" w:eastAsia="Times New Roman" w:hAnsi="Calibri" w:cs="Calibri"/>
-          <w:color w:val="000000"/>
-          <w:lang w:eastAsia="pt-BR"/>
-        </w:rPr>
-      </w:pPr>
-      <w:r>
-        <w:rPr>
-          <w:rFonts w:ascii="Calibri" w:eastAsia="Times New Roman" w:hAnsi="Calibri" w:cs="Calibri"/>
-          <w:color w:val="000000"/>
-          <w:lang w:eastAsia="pt-BR"/>
-        </w:rPr>
-        <w:t>Para printar as aspas “” basta usar o \” que no print ira aparecer as aspas.</w:t>
+        <w:t xml:space="preserve"> in e ao </w:t>
+      </w:r>
+      <w:proofErr w:type="gramStart"/>
+      <w:r>
+        <w:rPr>
+          <w:rFonts w:ascii="Calibri" w:eastAsia="Times New Roman" w:hAnsi="Calibri" w:cs="Calibri"/>
+          <w:color w:val="000000"/>
+          <w:lang w:eastAsia="pt-BR"/>
+        </w:rPr>
+        <w:t>contrario</w:t>
+      </w:r>
+      <w:proofErr w:type="gramEnd"/>
+    </w:p>
+    <w:p>
+      <w:pPr>
+        <w:spacing w:line="240" w:lineRule="auto"/>
+        <w:rPr>
+          <w:rFonts w:ascii="Calibri" w:eastAsia="Times New Roman" w:hAnsi="Calibri" w:cs="Calibri"/>
+          <w:color w:val="000000"/>
+          <w:lang w:eastAsia="pt-BR"/>
+        </w:rPr>
+      </w:pPr>
+      <w:r>
+        <w:rPr>
+          <w:rFonts w:ascii="Calibri" w:eastAsia="Times New Roman" w:hAnsi="Calibri" w:cs="Calibri"/>
+          <w:color w:val="000000"/>
+          <w:lang w:eastAsia="pt-BR"/>
+        </w:rPr>
+        <w:t xml:space="preserve">Para printar as aspas “” basta usar o \” que no print </w:t>
+      </w:r>
+      <w:proofErr w:type="gramStart"/>
+      <w:r>
+        <w:rPr>
+          <w:rFonts w:ascii="Calibri" w:eastAsia="Times New Roman" w:hAnsi="Calibri" w:cs="Calibri"/>
+          <w:color w:val="000000"/>
+          <w:lang w:eastAsia="pt-BR"/>
+        </w:rPr>
+        <w:t>ira</w:t>
+      </w:r>
+      <w:proofErr w:type="gramEnd"/>
+      <w:r>
+        <w:rPr>
+          <w:rFonts w:ascii="Calibri" w:eastAsia="Times New Roman" w:hAnsi="Calibri" w:cs="Calibri"/>
+          <w:color w:val="000000"/>
+          <w:lang w:eastAsia="pt-BR"/>
+        </w:rPr>
+        <w:t xml:space="preserve"> aparecer as aspas.</w:t>
       </w:r>
     </w:p>
     <w:p>
@@ -3385,6 +3808,7 @@
         </w:rPr>
         <w:t>xxx.</w:t>
       </w:r>
+      <w:proofErr w:type="gramStart"/>
       <w:r>
         <w:rPr>
           <w:rFonts w:ascii="Calibri" w:eastAsia="Times New Roman" w:hAnsi="Calibri" w:cs="Calibri"/>
@@ -3405,6 +3829,7 @@
         <w:t>(</w:t>
       </w:r>
       <w:proofErr w:type="spellStart"/>
+      <w:proofErr w:type="gramEnd"/>
       <w:r>
         <w:rPr>
           <w:rFonts w:ascii="Calibri" w:eastAsia="Times New Roman" w:hAnsi="Calibri" w:cs="Calibri"/>
@@ -3420,7 +3845,25 @@
           <w:color w:val="000000"/>
           <w:lang w:eastAsia="pt-BR"/>
         </w:rPr>
-        <w:t xml:space="preserve"> que você quer)-: serve para substituir a palavra que você quer pela palavra que você quer.</w:t>
+        <w:t xml:space="preserve"> que você </w:t>
+      </w:r>
+      <w:proofErr w:type="gramStart"/>
+      <w:r>
+        <w:rPr>
+          <w:rFonts w:ascii="Calibri" w:eastAsia="Times New Roman" w:hAnsi="Calibri" w:cs="Calibri"/>
+          <w:color w:val="000000"/>
+          <w:lang w:eastAsia="pt-BR"/>
+        </w:rPr>
+        <w:t>quer)-</w:t>
+      </w:r>
+      <w:proofErr w:type="gramEnd"/>
+      <w:r>
+        <w:rPr>
+          <w:rFonts w:ascii="Calibri" w:eastAsia="Times New Roman" w:hAnsi="Calibri" w:cs="Calibri"/>
+          <w:color w:val="000000"/>
+          <w:lang w:eastAsia="pt-BR"/>
+        </w:rPr>
+        <w:t>: serve para substituir a palavra que você quer pela palavra que você quer.</w:t>
       </w:r>
     </w:p>
     <w:p>
@@ -3450,9 +3893,9 @@
           <w:color w:val="000000"/>
           <w:lang w:eastAsia="pt-BR"/>
         </w:rPr>
-        <w:t>.upper</w:t>
-      </w:r>
-      <w:proofErr w:type="spellEnd"/>
+        <w:t>.</w:t>
+      </w:r>
+      <w:proofErr w:type="gramStart"/>
       <w:r>
         <w:rPr>
           <w:rFonts w:ascii="Calibri" w:eastAsia="Times New Roman" w:hAnsi="Calibri" w:cs="Calibri"/>
@@ -3461,36 +3904,9 @@
           <w:color w:val="000000"/>
           <w:lang w:eastAsia="pt-BR"/>
         </w:rPr>
-        <w:t>()</w:t>
-      </w:r>
-      <w:r>
-        <w:rPr>
-          <w:rFonts w:ascii="Calibri" w:eastAsia="Times New Roman" w:hAnsi="Calibri" w:cs="Calibri"/>
-          <w:color w:val="000000"/>
-          <w:lang w:eastAsia="pt-BR"/>
-        </w:rPr>
-        <w:t>: ele vai transformar o que você quer em letras maiúsculas</w:t>
-      </w:r>
-    </w:p>
-    <w:p>
-      <w:pPr>
-        <w:spacing w:line="240" w:lineRule="auto"/>
-        <w:rPr>
-          <w:rFonts w:ascii="Times New Roman" w:eastAsia="Times New Roman" w:hAnsi="Times New Roman" w:cs="Times New Roman"/>
-          <w:sz w:val="24"/>
-          <w:szCs w:val="24"/>
-          <w:lang w:eastAsia="pt-BR"/>
-        </w:rPr>
-      </w:pPr>
-      <w:proofErr w:type="spellStart"/>
-      <w:r>
-        <w:rPr>
-          <w:rFonts w:ascii="Calibri" w:eastAsia="Times New Roman" w:hAnsi="Calibri" w:cs="Calibri"/>
-          <w:color w:val="000000"/>
-          <w:lang w:eastAsia="pt-BR"/>
-        </w:rPr>
-        <w:t>xxx</w:t>
-      </w:r>
+        <w:t>upper</w:t>
+      </w:r>
+      <w:proofErr w:type="spellEnd"/>
       <w:r>
         <w:rPr>
           <w:rFonts w:ascii="Calibri" w:eastAsia="Times New Roman" w:hAnsi="Calibri" w:cs="Calibri"/>
@@ -3499,9 +3915,9 @@
           <w:color w:val="000000"/>
           <w:lang w:eastAsia="pt-BR"/>
         </w:rPr>
-        <w:t>.lower</w:t>
-      </w:r>
-      <w:proofErr w:type="spellEnd"/>
+        <w:t>(</w:t>
+      </w:r>
+      <w:proofErr w:type="gramEnd"/>
       <w:r>
         <w:rPr>
           <w:rFonts w:ascii="Calibri" w:eastAsia="Times New Roman" w:hAnsi="Calibri" w:cs="Calibri"/>
@@ -3510,15 +3926,15 @@
           <w:color w:val="000000"/>
           <w:lang w:eastAsia="pt-BR"/>
         </w:rPr>
-        <w:t>()</w:t>
-      </w:r>
-      <w:r>
-        <w:rPr>
-          <w:rFonts w:ascii="Calibri" w:eastAsia="Times New Roman" w:hAnsi="Calibri" w:cs="Calibri"/>
-          <w:color w:val="000000"/>
-          <w:lang w:eastAsia="pt-BR"/>
-        </w:rPr>
-        <w:t>: ele vai transformar o que você quer em letras minúsculas</w:t>
+        <w:t>)</w:t>
+      </w:r>
+      <w:r>
+        <w:rPr>
+          <w:rFonts w:ascii="Calibri" w:eastAsia="Times New Roman" w:hAnsi="Calibri" w:cs="Calibri"/>
+          <w:color w:val="000000"/>
+          <w:lang w:eastAsia="pt-BR"/>
+        </w:rPr>
+        <w:t>: ele vai transformar o que você quer em letras maiúsculas</w:t>
       </w:r>
     </w:p>
     <w:p>
@@ -3548,9 +3964,9 @@
           <w:color w:val="000000"/>
           <w:lang w:eastAsia="pt-BR"/>
         </w:rPr>
-        <w:t>.capitalize</w:t>
-      </w:r>
-      <w:proofErr w:type="spellEnd"/>
+        <w:t>.</w:t>
+      </w:r>
+      <w:proofErr w:type="gramStart"/>
       <w:r>
         <w:rPr>
           <w:rFonts w:ascii="Calibri" w:eastAsia="Times New Roman" w:hAnsi="Calibri" w:cs="Calibri"/>
@@ -3559,16 +3975,9 @@
           <w:color w:val="000000"/>
           <w:lang w:eastAsia="pt-BR"/>
         </w:rPr>
-        <w:t xml:space="preserve">(): </w:t>
-      </w:r>
-      <w:r>
-        <w:rPr>
-          <w:rFonts w:ascii="Calibri" w:eastAsia="Times New Roman" w:hAnsi="Calibri" w:cs="Calibri"/>
-          <w:color w:val="000000"/>
-          <w:lang w:eastAsia="pt-BR"/>
-        </w:rPr>
-        <w:t xml:space="preserve">ele vai pegar toda a sua frase e transformar para minúscula , </w:t>
-      </w:r>
+        <w:t>lower</w:t>
+      </w:r>
+      <w:proofErr w:type="spellEnd"/>
       <w:r>
         <w:rPr>
           <w:rFonts w:ascii="Calibri" w:eastAsia="Times New Roman" w:hAnsi="Calibri" w:cs="Calibri"/>
@@ -3577,28 +3986,9 @@
           <w:color w:val="000000"/>
           <w:lang w:eastAsia="pt-BR"/>
         </w:rPr>
-        <w:t>menos a primeira letra</w:t>
-      </w:r>
-    </w:p>
-    <w:p>
-      <w:pPr>
-        <w:spacing w:line="240" w:lineRule="auto"/>
-        <w:rPr>
-          <w:rFonts w:ascii="Times New Roman" w:eastAsia="Times New Roman" w:hAnsi="Times New Roman" w:cs="Times New Roman"/>
-          <w:sz w:val="24"/>
-          <w:szCs w:val="24"/>
-          <w:lang w:eastAsia="pt-BR"/>
-        </w:rPr>
-      </w:pPr>
-      <w:proofErr w:type="spellStart"/>
-      <w:r>
-        <w:rPr>
-          <w:rFonts w:ascii="Calibri" w:eastAsia="Times New Roman" w:hAnsi="Calibri" w:cs="Calibri"/>
-          <w:color w:val="000000"/>
-          <w:lang w:eastAsia="pt-BR"/>
-        </w:rPr>
-        <w:t>xxx</w:t>
-      </w:r>
+        <w:t>(</w:t>
+      </w:r>
+      <w:proofErr w:type="gramEnd"/>
       <w:r>
         <w:rPr>
           <w:rFonts w:ascii="Calibri" w:eastAsia="Times New Roman" w:hAnsi="Calibri" w:cs="Calibri"/>
@@ -3607,9 +3997,36 @@
           <w:color w:val="000000"/>
           <w:lang w:eastAsia="pt-BR"/>
         </w:rPr>
-        <w:t>.title</w:t>
-      </w:r>
-      <w:proofErr w:type="spellEnd"/>
+        <w:t>)</w:t>
+      </w:r>
+      <w:r>
+        <w:rPr>
+          <w:rFonts w:ascii="Calibri" w:eastAsia="Times New Roman" w:hAnsi="Calibri" w:cs="Calibri"/>
+          <w:color w:val="000000"/>
+          <w:lang w:eastAsia="pt-BR"/>
+        </w:rPr>
+        <w:t>: ele vai transformar o que você quer em letras minúsculas</w:t>
+      </w:r>
+    </w:p>
+    <w:p>
+      <w:pPr>
+        <w:spacing w:line="240" w:lineRule="auto"/>
+        <w:rPr>
+          <w:rFonts w:ascii="Times New Roman" w:eastAsia="Times New Roman" w:hAnsi="Times New Roman" w:cs="Times New Roman"/>
+          <w:sz w:val="24"/>
+          <w:szCs w:val="24"/>
+          <w:lang w:eastAsia="pt-BR"/>
+        </w:rPr>
+      </w:pPr>
+      <w:proofErr w:type="spellStart"/>
+      <w:r>
+        <w:rPr>
+          <w:rFonts w:ascii="Calibri" w:eastAsia="Times New Roman" w:hAnsi="Calibri" w:cs="Calibri"/>
+          <w:color w:val="000000"/>
+          <w:lang w:eastAsia="pt-BR"/>
+        </w:rPr>
+        <w:t>xxx</w:t>
+      </w:r>
       <w:r>
         <w:rPr>
           <w:rFonts w:ascii="Calibri" w:eastAsia="Times New Roman" w:hAnsi="Calibri" w:cs="Calibri"/>
@@ -3618,36 +4035,9 @@
           <w:color w:val="000000"/>
           <w:lang w:eastAsia="pt-BR"/>
         </w:rPr>
-        <w:t xml:space="preserve">() </w:t>
-      </w:r>
-      <w:r>
-        <w:rPr>
-          <w:rFonts w:ascii="Calibri" w:eastAsia="Times New Roman" w:hAnsi="Calibri" w:cs="Calibri"/>
-          <w:color w:val="000000"/>
-          <w:lang w:eastAsia="pt-BR"/>
-        </w:rPr>
-        <w:t>: ele pega palavra por palavra e coloca com a primeira letra maiúscula.</w:t>
-      </w:r>
-    </w:p>
-    <w:p>
-      <w:pPr>
-        <w:spacing w:line="240" w:lineRule="auto"/>
-        <w:rPr>
-          <w:rFonts w:ascii="Times New Roman" w:eastAsia="Times New Roman" w:hAnsi="Times New Roman" w:cs="Times New Roman"/>
-          <w:sz w:val="24"/>
-          <w:szCs w:val="24"/>
-          <w:lang w:eastAsia="pt-BR"/>
-        </w:rPr>
-      </w:pPr>
-      <w:proofErr w:type="spellStart"/>
-      <w:r>
-        <w:rPr>
-          <w:rFonts w:ascii="Calibri" w:eastAsia="Times New Roman" w:hAnsi="Calibri" w:cs="Calibri"/>
-          <w:color w:val="000000"/>
-          <w:lang w:eastAsia="pt-BR"/>
-        </w:rPr>
-        <w:t>xxx</w:t>
-      </w:r>
+        <w:t>.</w:t>
+      </w:r>
+      <w:proofErr w:type="gramStart"/>
       <w:r>
         <w:rPr>
           <w:rFonts w:ascii="Calibri" w:eastAsia="Times New Roman" w:hAnsi="Calibri" w:cs="Calibri"/>
@@ -3656,7 +4046,7 @@
           <w:color w:val="000000"/>
           <w:lang w:eastAsia="pt-BR"/>
         </w:rPr>
-        <w:t>.strip</w:t>
+        <w:t>capitalize</w:t>
       </w:r>
       <w:proofErr w:type="spellEnd"/>
       <w:r>
@@ -3667,36 +4057,9 @@
           <w:color w:val="000000"/>
           <w:lang w:eastAsia="pt-BR"/>
         </w:rPr>
-        <w:t>()</w:t>
-      </w:r>
-      <w:r>
-        <w:rPr>
-          <w:rFonts w:ascii="Calibri" w:eastAsia="Times New Roman" w:hAnsi="Calibri" w:cs="Calibri"/>
-          <w:color w:val="000000"/>
-          <w:lang w:eastAsia="pt-BR"/>
-        </w:rPr>
-        <w:t>: serve para remover os espaços antes e depois da sua frase</w:t>
-      </w:r>
-    </w:p>
-    <w:p>
-      <w:pPr>
-        <w:spacing w:line="240" w:lineRule="auto"/>
-        <w:rPr>
-          <w:rFonts w:ascii="Times New Roman" w:eastAsia="Times New Roman" w:hAnsi="Times New Roman" w:cs="Times New Roman"/>
-          <w:sz w:val="24"/>
-          <w:szCs w:val="24"/>
-          <w:lang w:eastAsia="pt-BR"/>
-        </w:rPr>
-      </w:pPr>
-      <w:proofErr w:type="spellStart"/>
-      <w:r>
-        <w:rPr>
-          <w:rFonts w:ascii="Calibri" w:eastAsia="Times New Roman" w:hAnsi="Calibri" w:cs="Calibri"/>
-          <w:color w:val="000000"/>
-          <w:lang w:eastAsia="pt-BR"/>
-        </w:rPr>
-        <w:t>xxx</w:t>
-      </w:r>
+        <w:t>(</w:t>
+      </w:r>
+      <w:proofErr w:type="gramEnd"/>
       <w:r>
         <w:rPr>
           <w:rFonts w:ascii="Calibri" w:eastAsia="Times New Roman" w:hAnsi="Calibri" w:cs="Calibri"/>
@@ -3705,9 +4068,34 @@
           <w:color w:val="000000"/>
           <w:lang w:eastAsia="pt-BR"/>
         </w:rPr>
-        <w:t>.rstrip</w:t>
-      </w:r>
-      <w:proofErr w:type="spellEnd"/>
+        <w:t xml:space="preserve">): </w:t>
+      </w:r>
+      <w:r>
+        <w:rPr>
+          <w:rFonts w:ascii="Calibri" w:eastAsia="Times New Roman" w:hAnsi="Calibri" w:cs="Calibri"/>
+          <w:color w:val="000000"/>
+          <w:lang w:eastAsia="pt-BR"/>
+        </w:rPr>
+        <w:t xml:space="preserve">ele vai pegar toda a sua frase e transformar para </w:t>
+      </w:r>
+      <w:proofErr w:type="gramStart"/>
+      <w:r>
+        <w:rPr>
+          <w:rFonts w:ascii="Calibri" w:eastAsia="Times New Roman" w:hAnsi="Calibri" w:cs="Calibri"/>
+          <w:color w:val="000000"/>
+          <w:lang w:eastAsia="pt-BR"/>
+        </w:rPr>
+        <w:t>minúscula ,</w:t>
+      </w:r>
+      <w:proofErr w:type="gramEnd"/>
+      <w:r>
+        <w:rPr>
+          <w:rFonts w:ascii="Calibri" w:eastAsia="Times New Roman" w:hAnsi="Calibri" w:cs="Calibri"/>
+          <w:color w:val="000000"/>
+          <w:lang w:eastAsia="pt-BR"/>
+        </w:rPr>
+        <w:t xml:space="preserve"> </w:t>
+      </w:r>
       <w:r>
         <w:rPr>
           <w:rFonts w:ascii="Calibri" w:eastAsia="Times New Roman" w:hAnsi="Calibri" w:cs="Calibri"/>
@@ -3716,33 +4104,7 @@
           <w:color w:val="000000"/>
           <w:lang w:eastAsia="pt-BR"/>
         </w:rPr>
-        <w:t>()</w:t>
-      </w:r>
-      <w:r>
-        <w:rPr>
-          <w:rFonts w:ascii="Calibri" w:eastAsia="Times New Roman" w:hAnsi="Calibri" w:cs="Calibri"/>
-          <w:color w:val="000000"/>
-          <w:lang w:eastAsia="pt-BR"/>
-        </w:rPr>
-        <w:t>: remove todos os espaços em brancos da direita(</w:t>
-      </w:r>
-      <w:proofErr w:type="spellStart"/>
-      <w:r>
-        <w:rPr>
-          <w:rFonts w:ascii="Calibri" w:eastAsia="Times New Roman" w:hAnsi="Calibri" w:cs="Calibri"/>
-          <w:color w:val="000000"/>
-          <w:lang w:eastAsia="pt-BR"/>
-        </w:rPr>
-        <w:t>right</w:t>
-      </w:r>
-      <w:proofErr w:type="spellEnd"/>
-      <w:r>
-        <w:rPr>
-          <w:rFonts w:ascii="Calibri" w:eastAsia="Times New Roman" w:hAnsi="Calibri" w:cs="Calibri"/>
-          <w:color w:val="000000"/>
-          <w:lang w:eastAsia="pt-BR"/>
-        </w:rPr>
-        <w:t>)</w:t>
+        <w:t>menos a primeira letra</w:t>
       </w:r>
     </w:p>
     <w:p>
@@ -3772,9 +4134,9 @@
           <w:color w:val="000000"/>
           <w:lang w:eastAsia="pt-BR"/>
         </w:rPr>
-        <w:t>.lstrip</w:t>
-      </w:r>
-      <w:proofErr w:type="spellEnd"/>
+        <w:t>.</w:t>
+      </w:r>
+      <w:proofErr w:type="gramStart"/>
       <w:r>
         <w:rPr>
           <w:rFonts w:ascii="Calibri" w:eastAsia="Times New Roman" w:hAnsi="Calibri" w:cs="Calibri"/>
@@ -3783,54 +4145,9 @@
           <w:color w:val="000000"/>
           <w:lang w:eastAsia="pt-BR"/>
         </w:rPr>
-        <w:t>()</w:t>
-      </w:r>
-      <w:r>
-        <w:rPr>
-          <w:rFonts w:ascii="Calibri" w:eastAsia="Times New Roman" w:hAnsi="Calibri" w:cs="Calibri"/>
-          <w:color w:val="000000"/>
-          <w:lang w:eastAsia="pt-BR"/>
-        </w:rPr>
-        <w:t>: remove todos os espaços em branco da esquerda(</w:t>
-      </w:r>
-      <w:proofErr w:type="spellStart"/>
-      <w:r>
-        <w:rPr>
-          <w:rFonts w:ascii="Calibri" w:eastAsia="Times New Roman" w:hAnsi="Calibri" w:cs="Calibri"/>
-          <w:color w:val="000000"/>
-          <w:lang w:eastAsia="pt-BR"/>
-        </w:rPr>
-        <w:t>left</w:t>
-      </w:r>
-      <w:proofErr w:type="spellEnd"/>
-      <w:r>
-        <w:rPr>
-          <w:rFonts w:ascii="Calibri" w:eastAsia="Times New Roman" w:hAnsi="Calibri" w:cs="Calibri"/>
-          <w:color w:val="000000"/>
-          <w:lang w:eastAsia="pt-BR"/>
-        </w:rPr>
-        <w:t>)</w:t>
-      </w:r>
-    </w:p>
-    <w:p>
-      <w:pPr>
-        <w:spacing w:line="240" w:lineRule="auto"/>
-        <w:rPr>
-          <w:rFonts w:ascii="Times New Roman" w:eastAsia="Times New Roman" w:hAnsi="Times New Roman" w:cs="Times New Roman"/>
-          <w:sz w:val="24"/>
-          <w:szCs w:val="24"/>
-          <w:lang w:eastAsia="pt-BR"/>
-        </w:rPr>
-      </w:pPr>
-      <w:proofErr w:type="spellStart"/>
-      <w:r>
-        <w:rPr>
-          <w:rFonts w:ascii="Calibri" w:eastAsia="Times New Roman" w:hAnsi="Calibri" w:cs="Calibri"/>
-          <w:color w:val="000000"/>
-          <w:lang w:eastAsia="pt-BR"/>
-        </w:rPr>
-        <w:t>xxx</w:t>
-      </w:r>
+        <w:t>title</w:t>
+      </w:r>
+      <w:proofErr w:type="spellEnd"/>
       <w:r>
         <w:rPr>
           <w:rFonts w:ascii="Calibri" w:eastAsia="Times New Roman" w:hAnsi="Calibri" w:cs="Calibri"/>
@@ -3839,9 +4156,45 @@
           <w:color w:val="000000"/>
           <w:lang w:eastAsia="pt-BR"/>
         </w:rPr>
-        <w:t>.split</w:t>
-      </w:r>
-      <w:proofErr w:type="spellEnd"/>
+        <w:t xml:space="preserve">() </w:t>
+      </w:r>
+      <w:r>
+        <w:rPr>
+          <w:rFonts w:ascii="Calibri" w:eastAsia="Times New Roman" w:hAnsi="Calibri" w:cs="Calibri"/>
+          <w:color w:val="000000"/>
+          <w:lang w:eastAsia="pt-BR"/>
+        </w:rPr>
+        <w:t>:</w:t>
+      </w:r>
+      <w:proofErr w:type="gramEnd"/>
+      <w:r>
+        <w:rPr>
+          <w:rFonts w:ascii="Calibri" w:eastAsia="Times New Roman" w:hAnsi="Calibri" w:cs="Calibri"/>
+          <w:color w:val="000000"/>
+          <w:lang w:eastAsia="pt-BR"/>
+        </w:rPr>
+        <w:t xml:space="preserve"> ele pega palavra por palavra e coloca com a primeira letra maiúscula.</w:t>
+      </w:r>
+    </w:p>
+    <w:p>
+      <w:pPr>
+        <w:spacing w:line="240" w:lineRule="auto"/>
+        <w:rPr>
+          <w:rFonts w:ascii="Times New Roman" w:eastAsia="Times New Roman" w:hAnsi="Times New Roman" w:cs="Times New Roman"/>
+          <w:sz w:val="24"/>
+          <w:szCs w:val="24"/>
+          <w:lang w:eastAsia="pt-BR"/>
+        </w:rPr>
+      </w:pPr>
+      <w:proofErr w:type="spellStart"/>
+      <w:r>
+        <w:rPr>
+          <w:rFonts w:ascii="Calibri" w:eastAsia="Times New Roman" w:hAnsi="Calibri" w:cs="Calibri"/>
+          <w:color w:val="000000"/>
+          <w:lang w:eastAsia="pt-BR"/>
+        </w:rPr>
+        <w:t>xxx</w:t>
+      </w:r>
       <w:r>
         <w:rPr>
           <w:rFonts w:ascii="Calibri" w:eastAsia="Times New Roman" w:hAnsi="Calibri" w:cs="Calibri"/>
@@ -3850,34 +4203,9 @@
           <w:color w:val="000000"/>
           <w:lang w:eastAsia="pt-BR"/>
         </w:rPr>
-        <w:t>()</w:t>
-      </w:r>
-      <w:r>
-        <w:rPr>
-          <w:rFonts w:ascii="Calibri" w:eastAsia="Times New Roman" w:hAnsi="Calibri" w:cs="Calibri"/>
-          <w:color w:val="000000"/>
-          <w:lang w:eastAsia="pt-BR"/>
-        </w:rPr>
-        <w:t>: serve para dividir onde existem os espaços em branco.</w:t>
-      </w:r>
-    </w:p>
-    <w:p>
-      <w:pPr>
-        <w:spacing w:line="240" w:lineRule="auto"/>
-        <w:rPr>
-          <w:rFonts w:ascii="Calibri" w:eastAsia="Times New Roman" w:hAnsi="Calibri" w:cs="Calibri"/>
-          <w:color w:val="000000"/>
-          <w:lang w:eastAsia="pt-BR"/>
-        </w:rPr>
-      </w:pPr>
-      <w:r>
-        <w:rPr>
-          <w:rFonts w:ascii="Calibri" w:eastAsia="Times New Roman" w:hAnsi="Calibri" w:cs="Calibri"/>
-          <w:color w:val="000000"/>
-          <w:lang w:eastAsia="pt-BR"/>
-        </w:rPr>
-        <w:t>‘X’</w:t>
-      </w:r>
+        <w:t>.</w:t>
+      </w:r>
+      <w:proofErr w:type="gramStart"/>
       <w:r>
         <w:rPr>
           <w:rFonts w:ascii="Calibri" w:eastAsia="Times New Roman" w:hAnsi="Calibri" w:cs="Calibri"/>
@@ -3886,9 +4214,9 @@
           <w:color w:val="000000"/>
           <w:lang w:eastAsia="pt-BR"/>
         </w:rPr>
-        <w:t>.</w:t>
-      </w:r>
-      <w:proofErr w:type="spellStart"/>
+        <w:t>strip</w:t>
+      </w:r>
+      <w:proofErr w:type="spellEnd"/>
       <w:r>
         <w:rPr>
           <w:rFonts w:ascii="Calibri" w:eastAsia="Times New Roman" w:hAnsi="Calibri" w:cs="Calibri"/>
@@ -3897,9 +4225,9 @@
           <w:color w:val="000000"/>
           <w:lang w:eastAsia="pt-BR"/>
         </w:rPr>
-        <w:t>join</w:t>
-      </w:r>
-      <w:proofErr w:type="spellEnd"/>
+        <w:t>(</w:t>
+      </w:r>
+      <w:proofErr w:type="gramEnd"/>
       <w:r>
         <w:rPr>
           <w:rFonts w:ascii="Calibri" w:eastAsia="Times New Roman" w:hAnsi="Calibri" w:cs="Calibri"/>
@@ -3908,8 +4236,27 @@
           <w:color w:val="000000"/>
           <w:lang w:eastAsia="pt-BR"/>
         </w:rPr>
-        <w:t>(</w:t>
-      </w:r>
+        <w:t>)</w:t>
+      </w:r>
+      <w:r>
+        <w:rPr>
+          <w:rFonts w:ascii="Calibri" w:eastAsia="Times New Roman" w:hAnsi="Calibri" w:cs="Calibri"/>
+          <w:color w:val="000000"/>
+          <w:lang w:eastAsia="pt-BR"/>
+        </w:rPr>
+        <w:t>: serve para remover os espaços antes e depois da sua frase</w:t>
+      </w:r>
+    </w:p>
+    <w:p>
+      <w:pPr>
+        <w:spacing w:line="240" w:lineRule="auto"/>
+        <w:rPr>
+          <w:rFonts w:ascii="Times New Roman" w:eastAsia="Times New Roman" w:hAnsi="Times New Roman" w:cs="Times New Roman"/>
+          <w:sz w:val="24"/>
+          <w:szCs w:val="24"/>
+          <w:lang w:eastAsia="pt-BR"/>
+        </w:rPr>
+      </w:pPr>
       <w:proofErr w:type="spellStart"/>
       <w:r>
         <w:rPr>
@@ -3919,7 +4266,6 @@
         </w:rPr>
         <w:t>xxx</w:t>
       </w:r>
-      <w:proofErr w:type="spellEnd"/>
       <w:r>
         <w:rPr>
           <w:rFonts w:ascii="Calibri" w:eastAsia="Times New Roman" w:hAnsi="Calibri" w:cs="Calibri"/>
@@ -3928,6 +4274,305 @@
           <w:color w:val="000000"/>
           <w:lang w:eastAsia="pt-BR"/>
         </w:rPr>
+        <w:t>.</w:t>
+      </w:r>
+      <w:proofErr w:type="gramStart"/>
+      <w:r>
+        <w:rPr>
+          <w:rFonts w:ascii="Calibri" w:eastAsia="Times New Roman" w:hAnsi="Calibri" w:cs="Calibri"/>
+          <w:b/>
+          <w:bCs/>
+          <w:color w:val="000000"/>
+          <w:lang w:eastAsia="pt-BR"/>
+        </w:rPr>
+        <w:t>rstrip</w:t>
+      </w:r>
+      <w:proofErr w:type="spellEnd"/>
+      <w:r>
+        <w:rPr>
+          <w:rFonts w:ascii="Calibri" w:eastAsia="Times New Roman" w:hAnsi="Calibri" w:cs="Calibri"/>
+          <w:b/>
+          <w:bCs/>
+          <w:color w:val="000000"/>
+          <w:lang w:eastAsia="pt-BR"/>
+        </w:rPr>
+        <w:t>(</w:t>
+      </w:r>
+      <w:proofErr w:type="gramEnd"/>
+      <w:r>
+        <w:rPr>
+          <w:rFonts w:ascii="Calibri" w:eastAsia="Times New Roman" w:hAnsi="Calibri" w:cs="Calibri"/>
+          <w:b/>
+          <w:bCs/>
+          <w:color w:val="000000"/>
+          <w:lang w:eastAsia="pt-BR"/>
+        </w:rPr>
+        <w:t>)</w:t>
+      </w:r>
+      <w:r>
+        <w:rPr>
+          <w:rFonts w:ascii="Calibri" w:eastAsia="Times New Roman" w:hAnsi="Calibri" w:cs="Calibri"/>
+          <w:color w:val="000000"/>
+          <w:lang w:eastAsia="pt-BR"/>
+        </w:rPr>
+        <w:t>: remove todos os espaços em brancos da direita(</w:t>
+      </w:r>
+      <w:proofErr w:type="spellStart"/>
+      <w:r>
+        <w:rPr>
+          <w:rFonts w:ascii="Calibri" w:eastAsia="Times New Roman" w:hAnsi="Calibri" w:cs="Calibri"/>
+          <w:color w:val="000000"/>
+          <w:lang w:eastAsia="pt-BR"/>
+        </w:rPr>
+        <w:t>right</w:t>
+      </w:r>
+      <w:proofErr w:type="spellEnd"/>
+      <w:r>
+        <w:rPr>
+          <w:rFonts w:ascii="Calibri" w:eastAsia="Times New Roman" w:hAnsi="Calibri" w:cs="Calibri"/>
+          <w:color w:val="000000"/>
+          <w:lang w:eastAsia="pt-BR"/>
+        </w:rPr>
+        <w:t>)</w:t>
+      </w:r>
+    </w:p>
+    <w:p>
+      <w:pPr>
+        <w:spacing w:line="240" w:lineRule="auto"/>
+        <w:rPr>
+          <w:rFonts w:ascii="Times New Roman" w:eastAsia="Times New Roman" w:hAnsi="Times New Roman" w:cs="Times New Roman"/>
+          <w:sz w:val="24"/>
+          <w:szCs w:val="24"/>
+          <w:lang w:eastAsia="pt-BR"/>
+        </w:rPr>
+      </w:pPr>
+      <w:proofErr w:type="spellStart"/>
+      <w:r>
+        <w:rPr>
+          <w:rFonts w:ascii="Calibri" w:eastAsia="Times New Roman" w:hAnsi="Calibri" w:cs="Calibri"/>
+          <w:color w:val="000000"/>
+          <w:lang w:eastAsia="pt-BR"/>
+        </w:rPr>
+        <w:t>xxx</w:t>
+      </w:r>
+      <w:r>
+        <w:rPr>
+          <w:rFonts w:ascii="Calibri" w:eastAsia="Times New Roman" w:hAnsi="Calibri" w:cs="Calibri"/>
+          <w:b/>
+          <w:bCs/>
+          <w:color w:val="000000"/>
+          <w:lang w:eastAsia="pt-BR"/>
+        </w:rPr>
+        <w:t>.</w:t>
+      </w:r>
+      <w:proofErr w:type="gramStart"/>
+      <w:r>
+        <w:rPr>
+          <w:rFonts w:ascii="Calibri" w:eastAsia="Times New Roman" w:hAnsi="Calibri" w:cs="Calibri"/>
+          <w:b/>
+          <w:bCs/>
+          <w:color w:val="000000"/>
+          <w:lang w:eastAsia="pt-BR"/>
+        </w:rPr>
+        <w:t>lstrip</w:t>
+      </w:r>
+      <w:proofErr w:type="spellEnd"/>
+      <w:r>
+        <w:rPr>
+          <w:rFonts w:ascii="Calibri" w:eastAsia="Times New Roman" w:hAnsi="Calibri" w:cs="Calibri"/>
+          <w:b/>
+          <w:bCs/>
+          <w:color w:val="000000"/>
+          <w:lang w:eastAsia="pt-BR"/>
+        </w:rPr>
+        <w:t>(</w:t>
+      </w:r>
+      <w:proofErr w:type="gramEnd"/>
+      <w:r>
+        <w:rPr>
+          <w:rFonts w:ascii="Calibri" w:eastAsia="Times New Roman" w:hAnsi="Calibri" w:cs="Calibri"/>
+          <w:b/>
+          <w:bCs/>
+          <w:color w:val="000000"/>
+          <w:lang w:eastAsia="pt-BR"/>
+        </w:rPr>
+        <w:t>)</w:t>
+      </w:r>
+      <w:r>
+        <w:rPr>
+          <w:rFonts w:ascii="Calibri" w:eastAsia="Times New Roman" w:hAnsi="Calibri" w:cs="Calibri"/>
+          <w:color w:val="000000"/>
+          <w:lang w:eastAsia="pt-BR"/>
+        </w:rPr>
+        <w:t>: remove todos os espaços em branco da esquerda(</w:t>
+      </w:r>
+      <w:proofErr w:type="spellStart"/>
+      <w:r>
+        <w:rPr>
+          <w:rFonts w:ascii="Calibri" w:eastAsia="Times New Roman" w:hAnsi="Calibri" w:cs="Calibri"/>
+          <w:color w:val="000000"/>
+          <w:lang w:eastAsia="pt-BR"/>
+        </w:rPr>
+        <w:t>left</w:t>
+      </w:r>
+      <w:proofErr w:type="spellEnd"/>
+      <w:r>
+        <w:rPr>
+          <w:rFonts w:ascii="Calibri" w:eastAsia="Times New Roman" w:hAnsi="Calibri" w:cs="Calibri"/>
+          <w:color w:val="000000"/>
+          <w:lang w:eastAsia="pt-BR"/>
+        </w:rPr>
+        <w:t>)</w:t>
+      </w:r>
+    </w:p>
+    <w:p>
+      <w:pPr>
+        <w:spacing w:line="240" w:lineRule="auto"/>
+        <w:rPr>
+          <w:rFonts w:ascii="Times New Roman" w:eastAsia="Times New Roman" w:hAnsi="Times New Roman" w:cs="Times New Roman"/>
+          <w:sz w:val="24"/>
+          <w:szCs w:val="24"/>
+          <w:lang w:eastAsia="pt-BR"/>
+        </w:rPr>
+      </w:pPr>
+      <w:proofErr w:type="spellStart"/>
+      <w:r>
+        <w:rPr>
+          <w:rFonts w:ascii="Calibri" w:eastAsia="Times New Roman" w:hAnsi="Calibri" w:cs="Calibri"/>
+          <w:color w:val="000000"/>
+          <w:lang w:eastAsia="pt-BR"/>
+        </w:rPr>
+        <w:t>xxx</w:t>
+      </w:r>
+      <w:r>
+        <w:rPr>
+          <w:rFonts w:ascii="Calibri" w:eastAsia="Times New Roman" w:hAnsi="Calibri" w:cs="Calibri"/>
+          <w:b/>
+          <w:bCs/>
+          <w:color w:val="000000"/>
+          <w:lang w:eastAsia="pt-BR"/>
+        </w:rPr>
+        <w:t>.</w:t>
+      </w:r>
+      <w:proofErr w:type="gramStart"/>
+      <w:r>
+        <w:rPr>
+          <w:rFonts w:ascii="Calibri" w:eastAsia="Times New Roman" w:hAnsi="Calibri" w:cs="Calibri"/>
+          <w:b/>
+          <w:bCs/>
+          <w:color w:val="000000"/>
+          <w:lang w:eastAsia="pt-BR"/>
+        </w:rPr>
+        <w:t>split</w:t>
+      </w:r>
+      <w:proofErr w:type="spellEnd"/>
+      <w:r>
+        <w:rPr>
+          <w:rFonts w:ascii="Calibri" w:eastAsia="Times New Roman" w:hAnsi="Calibri" w:cs="Calibri"/>
+          <w:b/>
+          <w:bCs/>
+          <w:color w:val="000000"/>
+          <w:lang w:eastAsia="pt-BR"/>
+        </w:rPr>
+        <w:t>(</w:t>
+      </w:r>
+      <w:proofErr w:type="gramEnd"/>
+      <w:r>
+        <w:rPr>
+          <w:rFonts w:ascii="Calibri" w:eastAsia="Times New Roman" w:hAnsi="Calibri" w:cs="Calibri"/>
+          <w:b/>
+          <w:bCs/>
+          <w:color w:val="000000"/>
+          <w:lang w:eastAsia="pt-BR"/>
+        </w:rPr>
+        <w:t>)</w:t>
+      </w:r>
+      <w:r>
+        <w:rPr>
+          <w:rFonts w:ascii="Calibri" w:eastAsia="Times New Roman" w:hAnsi="Calibri" w:cs="Calibri"/>
+          <w:color w:val="000000"/>
+          <w:lang w:eastAsia="pt-BR"/>
+        </w:rPr>
+        <w:t>: serve para dividir onde existem os espaços em branco.</w:t>
+      </w:r>
+    </w:p>
+    <w:p>
+      <w:pPr>
+        <w:spacing w:line="240" w:lineRule="auto"/>
+        <w:rPr>
+          <w:rFonts w:ascii="Calibri" w:eastAsia="Times New Roman" w:hAnsi="Calibri" w:cs="Calibri"/>
+          <w:color w:val="000000"/>
+          <w:lang w:eastAsia="pt-BR"/>
+        </w:rPr>
+      </w:pPr>
+      <w:r>
+        <w:rPr>
+          <w:rFonts w:ascii="Calibri" w:eastAsia="Times New Roman" w:hAnsi="Calibri" w:cs="Calibri"/>
+          <w:color w:val="000000"/>
+          <w:lang w:eastAsia="pt-BR"/>
+        </w:rPr>
+        <w:t>‘X</w:t>
+      </w:r>
+      <w:proofErr w:type="gramStart"/>
+      <w:r>
+        <w:rPr>
+          <w:rFonts w:ascii="Calibri" w:eastAsia="Times New Roman" w:hAnsi="Calibri" w:cs="Calibri"/>
+          <w:color w:val="000000"/>
+          <w:lang w:eastAsia="pt-BR"/>
+        </w:rPr>
+        <w:t>’</w:t>
+      </w:r>
+      <w:r>
+        <w:rPr>
+          <w:rFonts w:ascii="Calibri" w:eastAsia="Times New Roman" w:hAnsi="Calibri" w:cs="Calibri"/>
+          <w:b/>
+          <w:bCs/>
+          <w:color w:val="000000"/>
+          <w:lang w:eastAsia="pt-BR"/>
+        </w:rPr>
+        <w:t>.</w:t>
+      </w:r>
+      <w:proofErr w:type="spellStart"/>
+      <w:r>
+        <w:rPr>
+          <w:rFonts w:ascii="Calibri" w:eastAsia="Times New Roman" w:hAnsi="Calibri" w:cs="Calibri"/>
+          <w:b/>
+          <w:bCs/>
+          <w:color w:val="000000"/>
+          <w:lang w:eastAsia="pt-BR"/>
+        </w:rPr>
+        <w:t>join</w:t>
+      </w:r>
+      <w:proofErr w:type="spellEnd"/>
+      <w:proofErr w:type="gramEnd"/>
+      <w:r>
+        <w:rPr>
+          <w:rFonts w:ascii="Calibri" w:eastAsia="Times New Roman" w:hAnsi="Calibri" w:cs="Calibri"/>
+          <w:b/>
+          <w:bCs/>
+          <w:color w:val="000000"/>
+          <w:lang w:eastAsia="pt-BR"/>
+        </w:rPr>
+        <w:t>(</w:t>
+      </w:r>
+      <w:proofErr w:type="spellStart"/>
+      <w:r>
+        <w:rPr>
+          <w:rFonts w:ascii="Calibri" w:eastAsia="Times New Roman" w:hAnsi="Calibri" w:cs="Calibri"/>
+          <w:color w:val="000000"/>
+          <w:lang w:eastAsia="pt-BR"/>
+        </w:rPr>
+        <w:t>xxx</w:t>
+      </w:r>
+      <w:proofErr w:type="spellEnd"/>
+      <w:r>
+        <w:rPr>
+          <w:rFonts w:ascii="Calibri" w:eastAsia="Times New Roman" w:hAnsi="Calibri" w:cs="Calibri"/>
+          <w:b/>
+          <w:bCs/>
+          <w:color w:val="000000"/>
+          <w:lang w:eastAsia="pt-BR"/>
+        </w:rPr>
         <w:t xml:space="preserve">): </w:t>
       </w:r>
       <w:r>
@@ -3979,14 +4624,31 @@
           <w:color w:val="000000"/>
           <w:lang w:eastAsia="pt-BR"/>
         </w:rPr>
-        <w:t xml:space="preserve">e ^5 quer dizer para </w:t>
+        <w:t xml:space="preserve">e ^5 quer dizer </w:t>
+      </w:r>
+      <w:proofErr w:type="gramStart"/>
+      <w:r>
+        <w:rPr>
+          <w:rFonts w:ascii="Calibri" w:eastAsia="Times New Roman" w:hAnsi="Calibri" w:cs="Calibri"/>
+          <w:color w:val="000000"/>
+          <w:lang w:eastAsia="pt-BR"/>
+        </w:rPr>
+        <w:t xml:space="preserve">para </w:t>
       </w:r>
       <w:r>
         <w:rPr>
           <w:rFonts w:ascii="Calibri" w:hAnsi="Calibri" w:cs="Calibri"/>
           <w:color w:val="000000"/>
         </w:rPr>
-        <w:t>: ^5 → instrução de formatação:</w:t>
+        <w:t>:</w:t>
+      </w:r>
+      <w:proofErr w:type="gramEnd"/>
+      <w:r>
+        <w:rPr>
+          <w:rFonts w:ascii="Calibri" w:hAnsi="Calibri" w:cs="Calibri"/>
+          <w:color w:val="000000"/>
+        </w:rPr>
+        <w:t xml:space="preserve"> ^5 → instrução de formatação:</w:t>
       </w:r>
     </w:p>
     <w:p>
@@ -4042,6 +4704,7 @@
           <w:lang w:eastAsia="pt-BR"/>
         </w:rPr>
       </w:pPr>
+      <w:proofErr w:type="gramStart"/>
       <w:r>
         <w:rPr>
           <w:rFonts w:ascii="Calibri" w:eastAsia="Times New Roman" w:hAnsi="Calibri" w:cs="Calibri"/>
@@ -4050,16 +4713,18 @@
         </w:rPr>
         <w:t>[  1  ]</w:t>
       </w:r>
-    </w:p>
-    <w:p>
-      <w:pPr>
-        <w:spacing w:line="240" w:lineRule="auto"/>
-        <w:rPr>
-          <w:rFonts w:ascii="Calibri" w:eastAsia="Times New Roman" w:hAnsi="Calibri" w:cs="Calibri"/>
-          <w:color w:val="000000"/>
-          <w:lang w:eastAsia="pt-BR"/>
-        </w:rPr>
-      </w:pPr>
+      <w:proofErr w:type="gramEnd"/>
+    </w:p>
+    <w:p>
+      <w:pPr>
+        <w:spacing w:line="240" w:lineRule="auto"/>
+        <w:rPr>
+          <w:rFonts w:ascii="Calibri" w:eastAsia="Times New Roman" w:hAnsi="Calibri" w:cs="Calibri"/>
+          <w:color w:val="000000"/>
+          <w:lang w:eastAsia="pt-BR"/>
+        </w:rPr>
+      </w:pPr>
+      <w:proofErr w:type="gramStart"/>
       <w:r>
         <w:rPr>
           <w:rFonts w:ascii="Calibri" w:eastAsia="Times New Roman" w:hAnsi="Calibri" w:cs="Calibri"/>
@@ -4068,23 +4733,34 @@
         </w:rPr>
         <w:t>[ 22  ]</w:t>
       </w:r>
-    </w:p>
-    <w:p>
-      <w:pPr>
-        <w:spacing w:line="240" w:lineRule="auto"/>
-        <w:rPr>
-          <w:rFonts w:ascii="Calibri" w:eastAsia="Times New Roman" w:hAnsi="Calibri" w:cs="Calibri"/>
-          <w:color w:val="000000"/>
-          <w:lang w:eastAsia="pt-BR"/>
-        </w:rPr>
-      </w:pPr>
-      <w:r>
-        <w:rPr>
-          <w:rFonts w:ascii="Calibri" w:eastAsia="Times New Roman" w:hAnsi="Calibri" w:cs="Calibri"/>
-          <w:color w:val="000000"/>
-          <w:lang w:eastAsia="pt-BR"/>
-        </w:rPr>
-        <w:t>[ 333 ]</w:t>
+      <w:proofErr w:type="gramEnd"/>
+    </w:p>
+    <w:p>
+      <w:pPr>
+        <w:spacing w:line="240" w:lineRule="auto"/>
+        <w:rPr>
+          <w:rFonts w:ascii="Calibri" w:eastAsia="Times New Roman" w:hAnsi="Calibri" w:cs="Calibri"/>
+          <w:color w:val="000000"/>
+          <w:lang w:eastAsia="pt-BR"/>
+        </w:rPr>
+      </w:pPr>
+      <w:proofErr w:type="gramStart"/>
+      <w:r>
+        <w:rPr>
+          <w:rFonts w:ascii="Calibri" w:eastAsia="Times New Roman" w:hAnsi="Calibri" w:cs="Calibri"/>
+          <w:color w:val="000000"/>
+          <w:lang w:eastAsia="pt-BR"/>
+        </w:rPr>
+        <w:t>[ 333</w:t>
+      </w:r>
+      <w:proofErr w:type="gramEnd"/>
+      <w:r>
+        <w:rPr>
+          <w:rFonts w:ascii="Calibri" w:eastAsia="Times New Roman" w:hAnsi="Calibri" w:cs="Calibri"/>
+          <w:color w:val="000000"/>
+          <w:lang w:eastAsia="pt-BR"/>
+        </w:rPr>
+        <w:t xml:space="preserve"> ]</w:t>
       </w:r>
     </w:p>
     <w:p>
@@ -4166,6 +4842,7 @@
         </w:rPr>
       </w:pPr>
       <w:proofErr w:type="spellStart"/>
+      <w:proofErr w:type="gramStart"/>
       <w:r>
         <w:rPr>
           <w:rFonts w:ascii="Calibri" w:eastAsia="Times New Roman" w:hAnsi="Calibri" w:cs="Calibri"/>
@@ -4193,7 +4870,18 @@
           <w:color w:val="000000"/>
           <w:lang w:eastAsia="pt-BR"/>
         </w:rPr>
-        <w:t>():</w:t>
+        <w:t>(</w:t>
+      </w:r>
+      <w:proofErr w:type="gramEnd"/>
+      <w:r>
+        <w:rPr>
+          <w:rFonts w:ascii="Calibri" w:eastAsia="Times New Roman" w:hAnsi="Calibri" w:cs="Calibri"/>
+          <w:b/>
+          <w:bCs/>
+          <w:color w:val="000000"/>
+          <w:lang w:eastAsia="pt-BR"/>
+        </w:rPr>
+        <w:t>):</w:t>
       </w:r>
     </w:p>
     <w:p>
@@ -4601,7 +5289,25 @@
           <w:color w:val="000000"/>
           <w:lang w:eastAsia="pt-BR"/>
         </w:rPr>
-        <w:t xml:space="preserve">para fazer um laço com for precisa de uma estrutura para “parar” o programa </w:t>
+        <w:t xml:space="preserve">para fazer um laço com for </w:t>
+      </w:r>
+      <w:proofErr w:type="gramStart"/>
+      <w:r>
+        <w:rPr>
+          <w:rFonts w:ascii="Calibri" w:eastAsia="Times New Roman" w:hAnsi="Calibri" w:cs="Calibri"/>
+          <w:color w:val="000000"/>
+          <w:lang w:eastAsia="pt-BR"/>
+        </w:rPr>
+        <w:t>precisa</w:t>
+      </w:r>
+      <w:proofErr w:type="gramEnd"/>
+      <w:r>
+        <w:rPr>
+          <w:rFonts w:ascii="Calibri" w:eastAsia="Times New Roman" w:hAnsi="Calibri" w:cs="Calibri"/>
+          <w:color w:val="000000"/>
+          <w:lang w:eastAsia="pt-BR"/>
+        </w:rPr>
+        <w:t xml:space="preserve"> de uma estrutura para “parar” o programa </w:t>
       </w:r>
       <w:proofErr w:type="spellStart"/>
       <w:r>
@@ -4630,7 +5336,25 @@
           <w:color w:val="000000"/>
           <w:lang w:eastAsia="pt-BR"/>
         </w:rPr>
-        <w:t>for c in range(0,3): </w:t>
+        <w:t xml:space="preserve">for c in </w:t>
+      </w:r>
+      <w:proofErr w:type="gramStart"/>
+      <w:r>
+        <w:rPr>
+          <w:rFonts w:ascii="Calibri" w:eastAsia="Times New Roman" w:hAnsi="Calibri" w:cs="Calibri"/>
+          <w:color w:val="000000"/>
+          <w:lang w:eastAsia="pt-BR"/>
+        </w:rPr>
+        <w:t>range(</w:t>
+      </w:r>
+      <w:proofErr w:type="gramEnd"/>
+      <w:r>
+        <w:rPr>
+          <w:rFonts w:ascii="Calibri" w:eastAsia="Times New Roman" w:hAnsi="Calibri" w:cs="Calibri"/>
+          <w:color w:val="000000"/>
+          <w:lang w:eastAsia="pt-BR"/>
+        </w:rPr>
+        <w:t>0,3): </w:t>
       </w:r>
     </w:p>
     <w:p>
@@ -4673,6 +5397,7 @@
         <w:t xml:space="preserve">ele vai fazer isso de 0 </w:t>
       </w:r>
       <w:proofErr w:type="spellStart"/>
+      <w:proofErr w:type="gramStart"/>
       <w:r>
         <w:rPr>
           <w:rFonts w:ascii="Calibri" w:eastAsia="Times New Roman" w:hAnsi="Calibri" w:cs="Calibri"/>
@@ -4682,6 +5407,7 @@
         <w:t>ate</w:t>
       </w:r>
       <w:proofErr w:type="spellEnd"/>
+      <w:proofErr w:type="gramEnd"/>
       <w:r>
         <w:rPr>
           <w:rFonts w:ascii="Calibri" w:eastAsia="Times New Roman" w:hAnsi="Calibri" w:cs="Calibri"/>
@@ -4707,7 +5433,25 @@
           <w:color w:val="000000"/>
           <w:lang w:eastAsia="pt-BR"/>
         </w:rPr>
-        <w:t>Na contagem regressiva você coloca -1  no final</w:t>
+        <w:t>Na contagem regressiva você coloca -</w:t>
+      </w:r>
+      <w:proofErr w:type="gramStart"/>
+      <w:r>
+        <w:rPr>
+          <w:rFonts w:ascii="Calibri" w:eastAsia="Times New Roman" w:hAnsi="Calibri" w:cs="Calibri"/>
+          <w:color w:val="000000"/>
+          <w:lang w:eastAsia="pt-BR"/>
+        </w:rPr>
+        <w:t>1  no</w:t>
+      </w:r>
+      <w:proofErr w:type="gramEnd"/>
+      <w:r>
+        <w:rPr>
+          <w:rFonts w:ascii="Calibri" w:eastAsia="Times New Roman" w:hAnsi="Calibri" w:cs="Calibri"/>
+          <w:color w:val="000000"/>
+          <w:lang w:eastAsia="pt-BR"/>
+        </w:rPr>
+        <w:t xml:space="preserve"> final</w:t>
       </w:r>
     </w:p>
     <w:p>
@@ -4755,7 +5499,25 @@
           <w:color w:val="000000"/>
           <w:lang w:eastAsia="pt-BR"/>
         </w:rPr>
-        <w:t>for c in range(0, 10, -1)</w:t>
+        <w:t xml:space="preserve">for c in </w:t>
+      </w:r>
+      <w:proofErr w:type="gramStart"/>
+      <w:r>
+        <w:rPr>
+          <w:rFonts w:ascii="Calibri" w:eastAsia="Times New Roman" w:hAnsi="Calibri" w:cs="Calibri"/>
+          <w:color w:val="000000"/>
+          <w:lang w:eastAsia="pt-BR"/>
+        </w:rPr>
+        <w:t>range(</w:t>
+      </w:r>
+      <w:proofErr w:type="gramEnd"/>
+      <w:r>
+        <w:rPr>
+          <w:rFonts w:ascii="Calibri" w:eastAsia="Times New Roman" w:hAnsi="Calibri" w:cs="Calibri"/>
+          <w:color w:val="000000"/>
+          <w:lang w:eastAsia="pt-BR"/>
+        </w:rPr>
+        <w:t>0, 10, -1)</w:t>
       </w:r>
     </w:p>
     <w:p>
@@ -4777,6 +5539,7 @@
         <w:t xml:space="preserve">ele não considera o </w:t>
       </w:r>
       <w:proofErr w:type="spellStart"/>
+      <w:proofErr w:type="gramStart"/>
       <w:r>
         <w:rPr>
           <w:rFonts w:ascii="Calibri" w:eastAsia="Times New Roman" w:hAnsi="Calibri" w:cs="Calibri"/>
@@ -4786,6 +5549,7 @@
         <w:t>ultimo</w:t>
       </w:r>
       <w:proofErr w:type="spellEnd"/>
+      <w:proofErr w:type="gramEnd"/>
       <w:r>
         <w:rPr>
           <w:rFonts w:ascii="Calibri" w:eastAsia="Times New Roman" w:hAnsi="Calibri" w:cs="Calibri"/>
@@ -4872,6 +5636,7 @@
         <w:t xml:space="preserve">for c in </w:t>
       </w:r>
       <w:proofErr w:type="spellStart"/>
+      <w:proofErr w:type="gramStart"/>
       <w:r>
         <w:rPr>
           <w:rFonts w:ascii="Calibri" w:eastAsia="Times New Roman" w:hAnsi="Calibri" w:cs="Calibri"/>
@@ -4887,7 +5652,16 @@
           <w:color w:val="000000"/>
           <w:lang w:eastAsia="pt-BR"/>
         </w:rPr>
-        <w:t>(1, 10, 2)</w:t>
+        <w:t>(</w:t>
+      </w:r>
+      <w:proofErr w:type="gramEnd"/>
+      <w:r>
+        <w:rPr>
+          <w:rFonts w:ascii="Calibri" w:eastAsia="Times New Roman" w:hAnsi="Calibri" w:cs="Calibri"/>
+          <w:color w:val="000000"/>
+          <w:lang w:eastAsia="pt-BR"/>
+        </w:rPr>
+        <w:t>1, 10, 2)</w:t>
       </w:r>
     </w:p>
     <w:p>
@@ -4954,7 +5728,25 @@
           <w:color w:val="000000"/>
           <w:lang w:eastAsia="pt-BR"/>
         </w:rPr>
-        <w:t>Se usa quando não se sabe o limite q vai ser usado, então deve ter uma condição.</w:t>
+        <w:t xml:space="preserve">Se usa quando não se sabe o limite </w:t>
+      </w:r>
+      <w:proofErr w:type="gramStart"/>
+      <w:r>
+        <w:rPr>
+          <w:rFonts w:ascii="Calibri" w:eastAsia="Times New Roman" w:hAnsi="Calibri" w:cs="Calibri"/>
+          <w:color w:val="000000"/>
+          <w:lang w:eastAsia="pt-BR"/>
+        </w:rPr>
+        <w:t>q</w:t>
+      </w:r>
+      <w:proofErr w:type="gramEnd"/>
+      <w:r>
+        <w:rPr>
+          <w:rFonts w:ascii="Calibri" w:eastAsia="Times New Roman" w:hAnsi="Calibri" w:cs="Calibri"/>
+          <w:color w:val="000000"/>
+          <w:lang w:eastAsia="pt-BR"/>
+        </w:rPr>
+        <w:t xml:space="preserve"> vai ser usado, então deve ter uma condição.</w:t>
       </w:r>
     </w:p>
     <w:p>
@@ -5023,13 +5815,23 @@
           <w:lang w:eastAsia="pt-BR"/>
         </w:rPr>
       </w:pPr>
-      <w:r>
-        <w:rPr>
-          <w:rFonts w:ascii="Calibri" w:eastAsia="Times New Roman" w:hAnsi="Calibri" w:cs="Calibri"/>
-          <w:color w:val="000000"/>
-          <w:lang w:eastAsia="pt-BR"/>
-        </w:rPr>
-        <w:t>condição( teste logico)</w:t>
+      <w:proofErr w:type="gramStart"/>
+      <w:r>
+        <w:rPr>
+          <w:rFonts w:ascii="Calibri" w:eastAsia="Times New Roman" w:hAnsi="Calibri" w:cs="Calibri"/>
+          <w:color w:val="000000"/>
+          <w:lang w:eastAsia="pt-BR"/>
+        </w:rPr>
+        <w:t>condição( teste</w:t>
+      </w:r>
+      <w:proofErr w:type="gramEnd"/>
+      <w:r>
+        <w:rPr>
+          <w:rFonts w:ascii="Calibri" w:eastAsia="Times New Roman" w:hAnsi="Calibri" w:cs="Calibri"/>
+          <w:color w:val="000000"/>
+          <w:lang w:eastAsia="pt-BR"/>
+        </w:rPr>
+        <w:t xml:space="preserve"> logico)</w:t>
       </w:r>
     </w:p>
     <w:p>
@@ -5197,13 +5999,23 @@
           <w:lang w:eastAsia="pt-BR"/>
         </w:rPr>
       </w:pPr>
-      <w:r>
-        <w:rPr>
-          <w:rFonts w:ascii="Calibri" w:eastAsia="Times New Roman" w:hAnsi="Calibri" w:cs="Calibri"/>
-          <w:color w:val="000000"/>
-          <w:lang w:eastAsia="pt-BR"/>
-        </w:rPr>
-        <w:t>print("Fim do Loop")</w:t>
+      <w:proofErr w:type="gramStart"/>
+      <w:r>
+        <w:rPr>
+          <w:rFonts w:ascii="Calibri" w:eastAsia="Times New Roman" w:hAnsi="Calibri" w:cs="Calibri"/>
+          <w:color w:val="000000"/>
+          <w:lang w:eastAsia="pt-BR"/>
+        </w:rPr>
+        <w:t>print(</w:t>
+      </w:r>
+      <w:proofErr w:type="gramEnd"/>
+      <w:r>
+        <w:rPr>
+          <w:rFonts w:ascii="Calibri" w:eastAsia="Times New Roman" w:hAnsi="Calibri" w:cs="Calibri"/>
+          <w:color w:val="000000"/>
+          <w:lang w:eastAsia="pt-BR"/>
+        </w:rPr>
+        <w:t>"Fim do Loop")</w:t>
       </w:r>
     </w:p>
     <w:p>
@@ -5406,13 +6218,23 @@
           <w:lang w:eastAsia="pt-BR"/>
         </w:rPr>
       </w:pPr>
-      <w:r>
-        <w:rPr>
-          <w:rFonts w:ascii="Calibri" w:eastAsia="Times New Roman" w:hAnsi="Calibri" w:cs="Calibri"/>
-          <w:color w:val="000000"/>
-          <w:lang w:eastAsia="pt-BR"/>
-        </w:rPr>
-        <w:t>print("Fim do Loop")</w:t>
+      <w:proofErr w:type="gramStart"/>
+      <w:r>
+        <w:rPr>
+          <w:rFonts w:ascii="Calibri" w:eastAsia="Times New Roman" w:hAnsi="Calibri" w:cs="Calibri"/>
+          <w:color w:val="000000"/>
+          <w:lang w:eastAsia="pt-BR"/>
+        </w:rPr>
+        <w:t>print(</w:t>
+      </w:r>
+      <w:proofErr w:type="gramEnd"/>
+      <w:r>
+        <w:rPr>
+          <w:rFonts w:ascii="Calibri" w:eastAsia="Times New Roman" w:hAnsi="Calibri" w:cs="Calibri"/>
+          <w:color w:val="000000"/>
+          <w:lang w:eastAsia="pt-BR"/>
+        </w:rPr>
+        <w:t>"Fim do Loop")</w:t>
       </w:r>
     </w:p>
     <w:p>
@@ -5450,7 +6272,43 @@
           <w:color w:val="000000"/>
           <w:lang w:eastAsia="pt-BR"/>
         </w:rPr>
-        <w:t>Tuplas: as tuplas são imutáveis  ou seja, não pode ser mudada de jeito nenhum se é declarada ela fica armazenada pra sempre </w:t>
+        <w:t xml:space="preserve">Tuplas: as tuplas são </w:t>
+      </w:r>
+      <w:proofErr w:type="gramStart"/>
+      <w:r>
+        <w:rPr>
+          <w:rFonts w:ascii="Calibri" w:eastAsia="Times New Roman" w:hAnsi="Calibri" w:cs="Calibri"/>
+          <w:color w:val="000000"/>
+          <w:lang w:eastAsia="pt-BR"/>
+        </w:rPr>
+        <w:t>imutáveis  ou</w:t>
+      </w:r>
+      <w:proofErr w:type="gramEnd"/>
+      <w:r>
+        <w:rPr>
+          <w:rFonts w:ascii="Calibri" w:eastAsia="Times New Roman" w:hAnsi="Calibri" w:cs="Calibri"/>
+          <w:color w:val="000000"/>
+          <w:lang w:eastAsia="pt-BR"/>
+        </w:rPr>
+        <w:t xml:space="preserve"> seja, não pode ser mudada de jeito nenhum se é declarada ela fica armazenada </w:t>
+      </w:r>
+      <w:proofErr w:type="gramStart"/>
+      <w:r>
+        <w:rPr>
+          <w:rFonts w:ascii="Calibri" w:eastAsia="Times New Roman" w:hAnsi="Calibri" w:cs="Calibri"/>
+          <w:color w:val="000000"/>
+          <w:lang w:eastAsia="pt-BR"/>
+        </w:rPr>
+        <w:t>pra</w:t>
+      </w:r>
+      <w:proofErr w:type="gramEnd"/>
+      <w:r>
+        <w:rPr>
+          <w:rFonts w:ascii="Calibri" w:eastAsia="Times New Roman" w:hAnsi="Calibri" w:cs="Calibri"/>
+          <w:color w:val="000000"/>
+          <w:lang w:eastAsia="pt-BR"/>
+        </w:rPr>
+        <w:t xml:space="preserve"> sempre </w:t>
       </w:r>
     </w:p>
     <w:p>
@@ -5488,25 +6346,52 @@
           <w:color w:val="000000"/>
           <w:lang w:eastAsia="pt-BR"/>
         </w:rPr>
-        <w:t>A tupla pode ser apagada mas não mudada</w:t>
-      </w:r>
-    </w:p>
-    <w:p>
-      <w:pPr>
-        <w:spacing w:line="240" w:lineRule="auto"/>
-        <w:rPr>
-          <w:rFonts w:ascii="Calibri" w:eastAsia="Times New Roman" w:hAnsi="Calibri" w:cs="Calibri"/>
-          <w:color w:val="000000"/>
-          <w:lang w:eastAsia="pt-BR"/>
-        </w:rPr>
-      </w:pPr>
-      <w:r>
-        <w:rPr>
-          <w:rFonts w:ascii="Calibri" w:eastAsia="Times New Roman" w:hAnsi="Calibri" w:cs="Calibri"/>
-          <w:color w:val="000000"/>
-          <w:lang w:eastAsia="pt-BR"/>
-        </w:rPr>
-        <w:t xml:space="preserve">Para apagar algo basta colocar  </w:t>
+        <w:t xml:space="preserve">A tupla pode ser </w:t>
+      </w:r>
+      <w:proofErr w:type="gramStart"/>
+      <w:r>
+        <w:rPr>
+          <w:rFonts w:ascii="Calibri" w:eastAsia="Times New Roman" w:hAnsi="Calibri" w:cs="Calibri"/>
+          <w:color w:val="000000"/>
+          <w:lang w:eastAsia="pt-BR"/>
+        </w:rPr>
+        <w:t>apagada</w:t>
+      </w:r>
+      <w:proofErr w:type="gramEnd"/>
+      <w:r>
+        <w:rPr>
+          <w:rFonts w:ascii="Calibri" w:eastAsia="Times New Roman" w:hAnsi="Calibri" w:cs="Calibri"/>
+          <w:color w:val="000000"/>
+          <w:lang w:eastAsia="pt-BR"/>
+        </w:rPr>
+        <w:t xml:space="preserve"> mas não mudada</w:t>
+      </w:r>
+    </w:p>
+    <w:p>
+      <w:pPr>
+        <w:spacing w:line="240" w:lineRule="auto"/>
+        <w:rPr>
+          <w:rFonts w:ascii="Calibri" w:eastAsia="Times New Roman" w:hAnsi="Calibri" w:cs="Calibri"/>
+          <w:color w:val="000000"/>
+          <w:lang w:eastAsia="pt-BR"/>
+        </w:rPr>
+      </w:pPr>
+      <w:r>
+        <w:rPr>
+          <w:rFonts w:ascii="Calibri" w:eastAsia="Times New Roman" w:hAnsi="Calibri" w:cs="Calibri"/>
+          <w:color w:val="000000"/>
+          <w:lang w:eastAsia="pt-BR"/>
+        </w:rPr>
+        <w:t xml:space="preserve">Para apagar algo basta </w:t>
+      </w:r>
+      <w:proofErr w:type="gramStart"/>
+      <w:r>
+        <w:rPr>
+          <w:rFonts w:ascii="Calibri" w:eastAsia="Times New Roman" w:hAnsi="Calibri" w:cs="Calibri"/>
+          <w:color w:val="000000"/>
+          <w:lang w:eastAsia="pt-BR"/>
+        </w:rPr>
+        <w:t xml:space="preserve">colocar  </w:t>
       </w:r>
       <w:proofErr w:type="spellStart"/>
       <w:r>
@@ -5518,6 +6403,7 @@
         <w:t>del</w:t>
       </w:r>
       <w:proofErr w:type="spellEnd"/>
+      <w:proofErr w:type="gramEnd"/>
       <w:r>
         <w:rPr>
           <w:rFonts w:ascii="Calibri" w:eastAsia="Times New Roman" w:hAnsi="Calibri" w:cs="Calibri"/>
@@ -5587,8 +6473,20 @@
           <w:lang w:eastAsia="pt-BR"/>
         </w:rPr>
         <w:lastRenderedPageBreak/>
-        <w:t>Variáveis compostas podem armazenar varias</w:t>
-      </w:r>
+        <w:t xml:space="preserve">Variáveis compostas podem armazenar </w:t>
+      </w:r>
+      <w:proofErr w:type="gramStart"/>
+      <w:r>
+        <w:rPr>
+          <w:rFonts w:ascii="Calibri" w:eastAsia="Times New Roman" w:hAnsi="Calibri" w:cs="Calibri"/>
+          <w:color w:val="000000"/>
+          <w:sz w:val="28"/>
+          <w:szCs w:val="28"/>
+          <w:lang w:eastAsia="pt-BR"/>
+        </w:rPr>
+        <w:t>varias</w:t>
+      </w:r>
+      <w:proofErr w:type="gramEnd"/>
     </w:p>
     <w:p>
       <w:pPr>
@@ -5707,7 +6605,29 @@
           <w:szCs w:val="24"/>
           <w:lang w:eastAsia="pt-BR"/>
         </w:rPr>
-        <w:t>Pode mandar printar algo em especifico em uma tupla, utilizando comandos de texto</w:t>
+        <w:t xml:space="preserve">Pode mandar printar algo em </w:t>
+      </w:r>
+      <w:proofErr w:type="gramStart"/>
+      <w:r>
+        <w:rPr>
+          <w:rFonts w:ascii="Calibri" w:eastAsia="Times New Roman" w:hAnsi="Calibri" w:cs="Calibri"/>
+          <w:color w:val="000000"/>
+          <w:sz w:val="24"/>
+          <w:szCs w:val="24"/>
+          <w:lang w:eastAsia="pt-BR"/>
+        </w:rPr>
+        <w:t>especifico</w:t>
+      </w:r>
+      <w:proofErr w:type="gramEnd"/>
+      <w:r>
+        <w:rPr>
+          <w:rFonts w:ascii="Calibri" w:eastAsia="Times New Roman" w:hAnsi="Calibri" w:cs="Calibri"/>
+          <w:color w:val="000000"/>
+          <w:sz w:val="24"/>
+          <w:szCs w:val="24"/>
+          <w:lang w:eastAsia="pt-BR"/>
+        </w:rPr>
+        <w:t xml:space="preserve"> em uma tupla, utilizando comandos de texto</w:t>
       </w:r>
     </w:p>
     <w:p>
@@ -5846,7 +6766,7 @@
         </w:rPr>
         <w:t>Saber mais de tuplas (</w:t>
       </w:r>
-      <w:hyperlink r:id="rId8" w:history="1">
+      <w:hyperlink r:id="rId8" w:anchor="tuples-and-sequences" w:history="1">
         <w:r>
           <w:rPr>
             <w:rStyle w:val="Hyperlink"/>
@@ -5950,7 +6870,25 @@
           <w:color w:val="000000"/>
           <w:lang w:eastAsia="pt-BR"/>
         </w:rPr>
-        <w:t>Para fazer listas basta colocar eles entre colchetes [ ].elas podem ser modificadas.</w:t>
+        <w:t xml:space="preserve">Para fazer listas basta colocar eles entre colchetes </w:t>
+      </w:r>
+      <w:proofErr w:type="gramStart"/>
+      <w:r>
+        <w:rPr>
+          <w:rFonts w:ascii="Calibri" w:eastAsia="Times New Roman" w:hAnsi="Calibri" w:cs="Calibri"/>
+          <w:color w:val="000000"/>
+          <w:lang w:eastAsia="pt-BR"/>
+        </w:rPr>
+        <w:t>[ ].elas</w:t>
+      </w:r>
+      <w:proofErr w:type="gramEnd"/>
+      <w:r>
+        <w:rPr>
+          <w:rFonts w:ascii="Calibri" w:eastAsia="Times New Roman" w:hAnsi="Calibri" w:cs="Calibri"/>
+          <w:color w:val="000000"/>
+          <w:lang w:eastAsia="pt-BR"/>
+        </w:rPr>
+        <w:t xml:space="preserve"> podem ser modificadas.</w:t>
       </w:r>
     </w:p>
     <w:p>
@@ -6085,6 +7023,7 @@
         </w:rPr>
       </w:pPr>
       <w:proofErr w:type="spellStart"/>
+      <w:proofErr w:type="gramStart"/>
       <w:r>
         <w:rPr>
           <w:rFonts w:ascii="Calibri" w:eastAsia="Times New Roman" w:hAnsi="Calibri" w:cs="Calibri"/>
@@ -6094,6 +7033,7 @@
         <w:t>lanche.append</w:t>
       </w:r>
       <w:proofErr w:type="spellEnd"/>
+      <w:proofErr w:type="gramEnd"/>
       <w:r>
         <w:rPr>
           <w:rFonts w:ascii="Calibri" w:eastAsia="Times New Roman" w:hAnsi="Calibri" w:cs="Calibri"/>
@@ -6183,6 +7123,7 @@
         </w:rPr>
       </w:pPr>
       <w:proofErr w:type="spellStart"/>
+      <w:proofErr w:type="gramStart"/>
       <w:r>
         <w:rPr>
           <w:rFonts w:ascii="Calibri" w:eastAsia="Times New Roman" w:hAnsi="Calibri" w:cs="Calibri"/>
@@ -6192,32 +7133,69 @@
         <w:t>lanche.insert</w:t>
       </w:r>
       <w:proofErr w:type="spellEnd"/>
-      <w:r>
-        <w:rPr>
-          <w:rFonts w:ascii="Calibri" w:eastAsia="Times New Roman" w:hAnsi="Calibri" w:cs="Calibri"/>
-          <w:color w:val="000000"/>
-          <w:lang w:eastAsia="pt-BR"/>
-        </w:rPr>
-        <w:t>(0,cachorro quente)</w:t>
-      </w:r>
-    </w:p>
-    <w:p>
-      <w:pPr>
-        <w:spacing w:line="240" w:lineRule="auto"/>
-        <w:rPr>
-          <w:rFonts w:ascii="Times New Roman" w:eastAsia="Times New Roman" w:hAnsi="Times New Roman" w:cs="Times New Roman"/>
-          <w:sz w:val="24"/>
-          <w:szCs w:val="24"/>
-          <w:lang w:eastAsia="pt-BR"/>
-        </w:rPr>
-      </w:pPr>
-      <w:r>
-        <w:rPr>
-          <w:rFonts w:ascii="Calibri" w:eastAsia="Times New Roman" w:hAnsi="Calibri" w:cs="Calibri"/>
-          <w:color w:val="000000"/>
-          <w:lang w:eastAsia="pt-BR"/>
-        </w:rPr>
-        <w:t>ele vai adicionar o cachorro quente na posição 0 e vai “empurrar” o restante da lista</w:t>
+      <w:proofErr w:type="gramEnd"/>
+      <w:r>
+        <w:rPr>
+          <w:rFonts w:ascii="Calibri" w:eastAsia="Times New Roman" w:hAnsi="Calibri" w:cs="Calibri"/>
+          <w:color w:val="000000"/>
+          <w:lang w:eastAsia="pt-BR"/>
+        </w:rPr>
+        <w:t>(</w:t>
+      </w:r>
+      <w:proofErr w:type="gramStart"/>
+      <w:r>
+        <w:rPr>
+          <w:rFonts w:ascii="Calibri" w:eastAsia="Times New Roman" w:hAnsi="Calibri" w:cs="Calibri"/>
+          <w:color w:val="000000"/>
+          <w:lang w:eastAsia="pt-BR"/>
+        </w:rPr>
+        <w:t>0,cachorro</w:t>
+      </w:r>
+      <w:proofErr w:type="gramEnd"/>
+      <w:r>
+        <w:rPr>
+          <w:rFonts w:ascii="Calibri" w:eastAsia="Times New Roman" w:hAnsi="Calibri" w:cs="Calibri"/>
+          <w:color w:val="000000"/>
+          <w:lang w:eastAsia="pt-BR"/>
+        </w:rPr>
+        <w:t xml:space="preserve"> quente)</w:t>
+      </w:r>
+    </w:p>
+    <w:p>
+      <w:pPr>
+        <w:spacing w:line="240" w:lineRule="auto"/>
+        <w:rPr>
+          <w:rFonts w:ascii="Times New Roman" w:eastAsia="Times New Roman" w:hAnsi="Times New Roman" w:cs="Times New Roman"/>
+          <w:sz w:val="24"/>
+          <w:szCs w:val="24"/>
+          <w:lang w:eastAsia="pt-BR"/>
+        </w:rPr>
+      </w:pPr>
+      <w:r>
+        <w:rPr>
+          <w:rFonts w:ascii="Calibri" w:eastAsia="Times New Roman" w:hAnsi="Calibri" w:cs="Calibri"/>
+          <w:color w:val="000000"/>
+          <w:lang w:eastAsia="pt-BR"/>
+        </w:rPr>
+        <w:t xml:space="preserve">ele vai adicionar o </w:t>
+      </w:r>
+      <w:proofErr w:type="gramStart"/>
+      <w:r>
+        <w:rPr>
+          <w:rFonts w:ascii="Calibri" w:eastAsia="Times New Roman" w:hAnsi="Calibri" w:cs="Calibri"/>
+          <w:color w:val="000000"/>
+          <w:lang w:eastAsia="pt-BR"/>
+        </w:rPr>
+        <w:t>cachorro quente</w:t>
+      </w:r>
+      <w:proofErr w:type="gramEnd"/>
+      <w:r>
+        <w:rPr>
+          <w:rFonts w:ascii="Calibri" w:eastAsia="Times New Roman" w:hAnsi="Calibri" w:cs="Calibri"/>
+          <w:color w:val="000000"/>
+          <w:lang w:eastAsia="pt-BR"/>
+        </w:rPr>
+        <w:t xml:space="preserve"> na posição 0 e vai “empurrar” o restante da lista</w:t>
       </w:r>
     </w:p>
     <w:p>
@@ -6254,7 +7232,79 @@
           <w:color w:val="000000"/>
           <w:lang w:eastAsia="pt-BR"/>
         </w:rPr>
-        <w:t xml:space="preserve"> ou pop(normalmente ele é utilizado para eliminar o último elemento mas você pode especificar utilizando o número da posição entre parênteses () ), ou .remove( você pode especificar algo que você vai remover da lista)</w:t>
+        <w:t xml:space="preserve"> ou </w:t>
+      </w:r>
+      <w:proofErr w:type="gramStart"/>
+      <w:r>
+        <w:rPr>
+          <w:rFonts w:ascii="Calibri" w:eastAsia="Times New Roman" w:hAnsi="Calibri" w:cs="Calibri"/>
+          <w:color w:val="000000"/>
+          <w:lang w:eastAsia="pt-BR"/>
+        </w:rPr>
+        <w:t>pop(</w:t>
+      </w:r>
+      <w:proofErr w:type="gramEnd"/>
+      <w:r>
+        <w:rPr>
+          <w:rFonts w:ascii="Calibri" w:eastAsia="Times New Roman" w:hAnsi="Calibri" w:cs="Calibri"/>
+          <w:color w:val="000000"/>
+          <w:lang w:eastAsia="pt-BR"/>
+        </w:rPr>
+        <w:t xml:space="preserve">normalmente ele é utilizado para eliminar o último </w:t>
+      </w:r>
+      <w:proofErr w:type="gramStart"/>
+      <w:r>
+        <w:rPr>
+          <w:rFonts w:ascii="Calibri" w:eastAsia="Times New Roman" w:hAnsi="Calibri" w:cs="Calibri"/>
+          <w:color w:val="000000"/>
+          <w:lang w:eastAsia="pt-BR"/>
+        </w:rPr>
+        <w:t>elemento</w:t>
+      </w:r>
+      <w:proofErr w:type="gramEnd"/>
+      <w:r>
+        <w:rPr>
+          <w:rFonts w:ascii="Calibri" w:eastAsia="Times New Roman" w:hAnsi="Calibri" w:cs="Calibri"/>
+          <w:color w:val="000000"/>
+          <w:lang w:eastAsia="pt-BR"/>
+        </w:rPr>
+        <w:t xml:space="preserve"> mas você pode especificar utilizando o número da posição entre parênteses (</w:t>
+      </w:r>
+      <w:proofErr w:type="gramStart"/>
+      <w:r>
+        <w:rPr>
+          <w:rFonts w:ascii="Calibri" w:eastAsia="Times New Roman" w:hAnsi="Calibri" w:cs="Calibri"/>
+          <w:color w:val="000000"/>
+          <w:lang w:eastAsia="pt-BR"/>
+        </w:rPr>
+        <w:t>) )</w:t>
+      </w:r>
+      <w:proofErr w:type="gramEnd"/>
+      <w:r>
+        <w:rPr>
+          <w:rFonts w:ascii="Calibri" w:eastAsia="Times New Roman" w:hAnsi="Calibri" w:cs="Calibri"/>
+          <w:color w:val="000000"/>
+          <w:lang w:eastAsia="pt-BR"/>
+        </w:rPr>
+        <w:t xml:space="preserve">, </w:t>
+      </w:r>
+      <w:proofErr w:type="gramStart"/>
+      <w:r>
+        <w:rPr>
+          <w:rFonts w:ascii="Calibri" w:eastAsia="Times New Roman" w:hAnsi="Calibri" w:cs="Calibri"/>
+          <w:color w:val="000000"/>
+          <w:lang w:eastAsia="pt-BR"/>
+        </w:rPr>
+        <w:t>ou .remove( você</w:t>
+      </w:r>
+      <w:proofErr w:type="gramEnd"/>
+      <w:r>
+        <w:rPr>
+          <w:rFonts w:ascii="Calibri" w:eastAsia="Times New Roman" w:hAnsi="Calibri" w:cs="Calibri"/>
+          <w:color w:val="000000"/>
+          <w:lang w:eastAsia="pt-BR"/>
+        </w:rPr>
+        <w:t xml:space="preserve"> pode especificar algo que você vai remover da lista)</w:t>
       </w:r>
     </w:p>
     <w:p>
@@ -6313,7 +7363,25 @@
           <w:color w:val="000000"/>
           <w:lang w:eastAsia="pt-BR"/>
         </w:rPr>
-        <w:t xml:space="preserve"> lanche[3]</w:t>
+        <w:t xml:space="preserve"> </w:t>
+      </w:r>
+      <w:proofErr w:type="gramStart"/>
+      <w:r>
+        <w:rPr>
+          <w:rFonts w:ascii="Calibri" w:eastAsia="Times New Roman" w:hAnsi="Calibri" w:cs="Calibri"/>
+          <w:color w:val="000000"/>
+          <w:lang w:eastAsia="pt-BR"/>
+        </w:rPr>
+        <w:t>lanche[</w:t>
+      </w:r>
+      <w:proofErr w:type="gramEnd"/>
+      <w:r>
+        <w:rPr>
+          <w:rFonts w:ascii="Calibri" w:eastAsia="Times New Roman" w:hAnsi="Calibri" w:cs="Calibri"/>
+          <w:color w:val="000000"/>
+          <w:lang w:eastAsia="pt-BR"/>
+        </w:rPr>
+        <w:t>3]</w:t>
       </w:r>
     </w:p>
     <w:p>
@@ -6346,6 +7414,7 @@
         </w:rPr>
       </w:pPr>
       <w:proofErr w:type="spellStart"/>
+      <w:proofErr w:type="gramStart"/>
       <w:r>
         <w:rPr>
           <w:rFonts w:ascii="Calibri" w:eastAsia="Times New Roman" w:hAnsi="Calibri" w:cs="Calibri"/>
@@ -6361,7 +7430,16 @@
           <w:color w:val="000000"/>
           <w:lang w:eastAsia="pt-BR"/>
         </w:rPr>
-        <w:t xml:space="preserve">(3) neste caso se </w:t>
+        <w:t>(</w:t>
+      </w:r>
+      <w:proofErr w:type="gramEnd"/>
+      <w:r>
+        <w:rPr>
+          <w:rFonts w:ascii="Calibri" w:eastAsia="Times New Roman" w:hAnsi="Calibri" w:cs="Calibri"/>
+          <w:color w:val="000000"/>
+          <w:lang w:eastAsia="pt-BR"/>
+        </w:rPr>
+        <w:t xml:space="preserve">3) neste caso se </w:t>
       </w:r>
       <w:proofErr w:type="spellStart"/>
       <w:r>
@@ -6400,6 +7478,7 @@
         <w:t xml:space="preserve"> ele vai remover o </w:t>
       </w:r>
       <w:proofErr w:type="spellStart"/>
+      <w:proofErr w:type="gramStart"/>
       <w:r>
         <w:rPr>
           <w:rFonts w:ascii="Calibri" w:eastAsia="Times New Roman" w:hAnsi="Calibri" w:cs="Calibri"/>
@@ -6409,6 +7488,7 @@
         <w:t>ultimo</w:t>
       </w:r>
       <w:proofErr w:type="spellEnd"/>
+      <w:proofErr w:type="gramEnd"/>
       <w:r>
         <w:rPr>
           <w:rFonts w:ascii="Calibri" w:eastAsia="Times New Roman" w:hAnsi="Calibri" w:cs="Calibri"/>
@@ -6448,6 +7528,7 @@
         </w:rPr>
       </w:pPr>
       <w:proofErr w:type="spellStart"/>
+      <w:proofErr w:type="gramStart"/>
       <w:r>
         <w:rPr>
           <w:rFonts w:ascii="Calibri" w:eastAsia="Times New Roman" w:hAnsi="Calibri" w:cs="Calibri"/>
@@ -6457,6 +7538,7 @@
         <w:t>lanche.remove</w:t>
       </w:r>
       <w:proofErr w:type="spellEnd"/>
+      <w:proofErr w:type="gramEnd"/>
       <w:r>
         <w:rPr>
           <w:rFonts w:ascii="Calibri" w:eastAsia="Times New Roman" w:hAnsi="Calibri" w:cs="Calibri"/>
@@ -6688,9 +7770,28 @@
           <w:color w:val="000000"/>
           <w:lang w:eastAsia="pt-BR"/>
         </w:rPr>
-        <w:t xml:space="preserve">(range(4,11)) ele vai criar uma lista do 4 até o 10 lembrando q o </w:t>
-      </w:r>
-      <w:proofErr w:type="spellStart"/>
+        <w:t>(</w:t>
+      </w:r>
+      <w:proofErr w:type="gramStart"/>
+      <w:r>
+        <w:rPr>
+          <w:rFonts w:ascii="Calibri" w:eastAsia="Times New Roman" w:hAnsi="Calibri" w:cs="Calibri"/>
+          <w:color w:val="000000"/>
+          <w:lang w:eastAsia="pt-BR"/>
+        </w:rPr>
+        <w:t>range(</w:t>
+      </w:r>
+      <w:proofErr w:type="gramEnd"/>
+      <w:r>
+        <w:rPr>
+          <w:rFonts w:ascii="Calibri" w:eastAsia="Times New Roman" w:hAnsi="Calibri" w:cs="Calibri"/>
+          <w:color w:val="000000"/>
+          <w:lang w:eastAsia="pt-BR"/>
+        </w:rPr>
+        <w:t xml:space="preserve">4,11)) ele vai criar uma lista do 4 até o 10 lembrando q o </w:t>
+      </w:r>
+      <w:proofErr w:type="spellStart"/>
+      <w:proofErr w:type="gramStart"/>
       <w:r>
         <w:rPr>
           <w:rFonts w:ascii="Calibri" w:eastAsia="Times New Roman" w:hAnsi="Calibri" w:cs="Calibri"/>
@@ -6700,6 +7801,7 @@
         <w:t>ultimo</w:t>
       </w:r>
       <w:proofErr w:type="spellEnd"/>
+      <w:proofErr w:type="gramEnd"/>
       <w:r>
         <w:rPr>
           <w:rFonts w:ascii="Calibri" w:eastAsia="Times New Roman" w:hAnsi="Calibri" w:cs="Calibri"/>
@@ -6728,6 +7830,7 @@
         <w:t>se quiser colocar os elementos em ordem basta usar o nome_da_</w:t>
       </w:r>
       <w:proofErr w:type="spellStart"/>
+      <w:proofErr w:type="gramStart"/>
       <w:r>
         <w:rPr>
           <w:rFonts w:ascii="Calibri" w:eastAsia="Times New Roman" w:hAnsi="Calibri" w:cs="Calibri"/>
@@ -6761,7 +7864,16 @@
           <w:color w:val="000000"/>
           <w:lang w:eastAsia="pt-BR"/>
         </w:rPr>
-        <w:t>()</w:t>
+        <w:t>(</w:t>
+      </w:r>
+      <w:proofErr w:type="gramEnd"/>
+      <w:r>
+        <w:rPr>
+          <w:rFonts w:ascii="Calibri" w:eastAsia="Times New Roman" w:hAnsi="Calibri" w:cs="Calibri"/>
+          <w:color w:val="000000"/>
+          <w:lang w:eastAsia="pt-BR"/>
+        </w:rPr>
+        <w:t>)</w:t>
       </w:r>
     </w:p>
     <w:p>
@@ -6783,6 +7895,7 @@
         <w:t xml:space="preserve">se quiser em ordem ao </w:t>
       </w:r>
       <w:proofErr w:type="spellStart"/>
+      <w:proofErr w:type="gramStart"/>
       <w:r>
         <w:rPr>
           <w:rFonts w:ascii="Calibri" w:eastAsia="Times New Roman" w:hAnsi="Calibri" w:cs="Calibri"/>
@@ -6792,6 +7905,7 @@
         <w:t>contrario</w:t>
       </w:r>
       <w:proofErr w:type="spellEnd"/>
+      <w:proofErr w:type="gramEnd"/>
       <w:r>
         <w:rPr>
           <w:rFonts w:ascii="Calibri" w:eastAsia="Times New Roman" w:hAnsi="Calibri" w:cs="Calibri"/>
@@ -6828,9 +7942,19 @@
           <w:color w:val="000000"/>
           <w:lang w:eastAsia="pt-BR"/>
         </w:rPr>
-        <w:t>nome_da_variavel.sort</w:t>
-      </w:r>
-      <w:proofErr w:type="spellEnd"/>
+        <w:t>nome_da_</w:t>
+      </w:r>
+      <w:proofErr w:type="gramStart"/>
+      <w:r>
+        <w:rPr>
+          <w:rFonts w:ascii="Calibri" w:eastAsia="Times New Roman" w:hAnsi="Calibri" w:cs="Calibri"/>
+          <w:color w:val="000000"/>
+          <w:lang w:eastAsia="pt-BR"/>
+        </w:rPr>
+        <w:t>variavel.sort</w:t>
+      </w:r>
+      <w:proofErr w:type="spellEnd"/>
+      <w:proofErr w:type="gramEnd"/>
       <w:r>
         <w:rPr>
           <w:rFonts w:ascii="Calibri" w:eastAsia="Times New Roman" w:hAnsi="Calibri" w:cs="Calibri"/>
@@ -6877,6 +8001,7 @@
         <w:t xml:space="preserve">para saber o tamanho de uma lista basta usar o </w:t>
       </w:r>
       <w:proofErr w:type="spellStart"/>
+      <w:proofErr w:type="gramStart"/>
       <w:r>
         <w:rPr>
           <w:rFonts w:ascii="Calibri" w:eastAsia="Times New Roman" w:hAnsi="Calibri" w:cs="Calibri"/>
@@ -6892,7 +8017,16 @@
           <w:color w:val="000000"/>
           <w:lang w:eastAsia="pt-BR"/>
         </w:rPr>
-        <w:t>(nome da lista)</w:t>
+        <w:t>(</w:t>
+      </w:r>
+      <w:proofErr w:type="gramEnd"/>
+      <w:r>
+        <w:rPr>
+          <w:rFonts w:ascii="Calibri" w:eastAsia="Times New Roman" w:hAnsi="Calibri" w:cs="Calibri"/>
+          <w:color w:val="000000"/>
+          <w:lang w:eastAsia="pt-BR"/>
+        </w:rPr>
+        <w:t>nome da lista)</w:t>
       </w:r>
     </w:p>
     <w:p>
@@ -6933,6 +8067,7 @@
         <w:t xml:space="preserve">nome da variável = </w:t>
       </w:r>
       <w:proofErr w:type="spellStart"/>
+      <w:proofErr w:type="gramStart"/>
       <w:r>
         <w:rPr>
           <w:rFonts w:ascii="Calibri" w:eastAsia="Times New Roman" w:hAnsi="Calibri" w:cs="Calibri"/>
@@ -6948,7 +8083,16 @@
           <w:color w:val="000000"/>
           <w:lang w:eastAsia="pt-BR"/>
         </w:rPr>
-        <w:t>(nome da lista que vai ser copiada)</w:t>
+        <w:t>(</w:t>
+      </w:r>
+      <w:proofErr w:type="gramEnd"/>
+      <w:r>
+        <w:rPr>
+          <w:rFonts w:ascii="Calibri" w:eastAsia="Times New Roman" w:hAnsi="Calibri" w:cs="Calibri"/>
+          <w:color w:val="000000"/>
+          <w:lang w:eastAsia="pt-BR"/>
+        </w:rPr>
+        <w:t>nome da lista que vai ser copiada)</w:t>
       </w:r>
     </w:p>
     <w:p>
@@ -7014,7 +8158,25 @@
           <w:color w:val="000000"/>
           <w:lang w:eastAsia="pt-BR"/>
         </w:rPr>
-        <w:t>nome da variável = lista um  + lista 2</w:t>
+        <w:t xml:space="preserve">nome da variável = lista </w:t>
+      </w:r>
+      <w:proofErr w:type="gramStart"/>
+      <w:r>
+        <w:rPr>
+          <w:rFonts w:ascii="Calibri" w:eastAsia="Times New Roman" w:hAnsi="Calibri" w:cs="Calibri"/>
+          <w:color w:val="000000"/>
+          <w:lang w:eastAsia="pt-BR"/>
+        </w:rPr>
+        <w:t>um  +</w:t>
+      </w:r>
+      <w:proofErr w:type="gramEnd"/>
+      <w:r>
+        <w:rPr>
+          <w:rFonts w:ascii="Calibri" w:eastAsia="Times New Roman" w:hAnsi="Calibri" w:cs="Calibri"/>
+          <w:color w:val="000000"/>
+          <w:lang w:eastAsia="pt-BR"/>
+        </w:rPr>
+        <w:t xml:space="preserve"> lista 2</w:t>
       </w:r>
     </w:p>
     <w:p>
@@ -7051,7 +8213,43 @@
           <w:color w:val="000000"/>
           <w:lang w:eastAsia="pt-BR"/>
         </w:rPr>
-        <w:t xml:space="preserve"> faz uma ligação  entre listas então se for mudar algo em uma lista ela automaticamente vai ser mudada na outra, para resolver isso basta fazer uma cópia usando o : fatiamento </w:t>
+        <w:t xml:space="preserve"> faz uma </w:t>
+      </w:r>
+      <w:proofErr w:type="gramStart"/>
+      <w:r>
+        <w:rPr>
+          <w:rFonts w:ascii="Calibri" w:eastAsia="Times New Roman" w:hAnsi="Calibri" w:cs="Calibri"/>
+          <w:color w:val="000000"/>
+          <w:lang w:eastAsia="pt-BR"/>
+        </w:rPr>
+        <w:t>ligação  entre</w:t>
+      </w:r>
+      <w:proofErr w:type="gramEnd"/>
+      <w:r>
+        <w:rPr>
+          <w:rFonts w:ascii="Calibri" w:eastAsia="Times New Roman" w:hAnsi="Calibri" w:cs="Calibri"/>
+          <w:color w:val="000000"/>
+          <w:lang w:eastAsia="pt-BR"/>
+        </w:rPr>
+        <w:t xml:space="preserve"> listas então se for mudar algo em uma lista ela automaticamente vai ser mudada na outra, para resolver isso basta fazer uma cópia usando </w:t>
+      </w:r>
+      <w:proofErr w:type="gramStart"/>
+      <w:r>
+        <w:rPr>
+          <w:rFonts w:ascii="Calibri" w:eastAsia="Times New Roman" w:hAnsi="Calibri" w:cs="Calibri"/>
+          <w:color w:val="000000"/>
+          <w:lang w:eastAsia="pt-BR"/>
+        </w:rPr>
+        <w:t>o :</w:t>
+      </w:r>
+      <w:proofErr w:type="gramEnd"/>
+      <w:r>
+        <w:rPr>
+          <w:rFonts w:ascii="Calibri" w:eastAsia="Times New Roman" w:hAnsi="Calibri" w:cs="Calibri"/>
+          <w:color w:val="000000"/>
+          <w:lang w:eastAsia="pt-BR"/>
+        </w:rPr>
+        <w:t xml:space="preserve"> fatiamento </w:t>
       </w:r>
       <w:proofErr w:type="spellStart"/>
       <w:r>
@@ -7099,26 +8297,54 @@
           <w:color w:val="000000"/>
           <w:lang w:eastAsia="pt-BR"/>
         </w:rPr>
-        <w:t>b = a[ : ]</w:t>
-      </w:r>
-    </w:p>
-    <w:p>
-      <w:pPr>
-        <w:spacing w:line="240" w:lineRule="auto"/>
-        <w:rPr>
-          <w:rFonts w:ascii="Times New Roman" w:eastAsia="Times New Roman" w:hAnsi="Times New Roman" w:cs="Times New Roman"/>
-          <w:sz w:val="24"/>
-          <w:szCs w:val="24"/>
-          <w:lang w:eastAsia="pt-BR"/>
-        </w:rPr>
-      </w:pPr>
-      <w:r>
-        <w:rPr>
-          <w:rFonts w:ascii="Calibri" w:eastAsia="Times New Roman" w:hAnsi="Calibri" w:cs="Calibri"/>
-          <w:color w:val="000000"/>
-          <w:lang w:eastAsia="pt-BR"/>
-        </w:rPr>
-        <w:t>b[2] = 8</w:t>
+        <w:t xml:space="preserve">b = </w:t>
+      </w:r>
+      <w:proofErr w:type="gramStart"/>
+      <w:r>
+        <w:rPr>
+          <w:rFonts w:ascii="Calibri" w:eastAsia="Times New Roman" w:hAnsi="Calibri" w:cs="Calibri"/>
+          <w:color w:val="000000"/>
+          <w:lang w:eastAsia="pt-BR"/>
+        </w:rPr>
+        <w:t>a[ :</w:t>
+      </w:r>
+      <w:proofErr w:type="gramEnd"/>
+      <w:r>
+        <w:rPr>
+          <w:rFonts w:ascii="Calibri" w:eastAsia="Times New Roman" w:hAnsi="Calibri" w:cs="Calibri"/>
+          <w:color w:val="000000"/>
+          <w:lang w:eastAsia="pt-BR"/>
+        </w:rPr>
+        <w:t xml:space="preserve"> ]</w:t>
+      </w:r>
+    </w:p>
+    <w:p>
+      <w:pPr>
+        <w:spacing w:line="240" w:lineRule="auto"/>
+        <w:rPr>
+          <w:rFonts w:ascii="Times New Roman" w:eastAsia="Times New Roman" w:hAnsi="Times New Roman" w:cs="Times New Roman"/>
+          <w:sz w:val="24"/>
+          <w:szCs w:val="24"/>
+          <w:lang w:eastAsia="pt-BR"/>
+        </w:rPr>
+      </w:pPr>
+      <w:proofErr w:type="gramStart"/>
+      <w:r>
+        <w:rPr>
+          <w:rFonts w:ascii="Calibri" w:eastAsia="Times New Roman" w:hAnsi="Calibri" w:cs="Calibri"/>
+          <w:color w:val="000000"/>
+          <w:lang w:eastAsia="pt-BR"/>
+        </w:rPr>
+        <w:t>b[</w:t>
+      </w:r>
+      <w:proofErr w:type="gramEnd"/>
+      <w:r>
+        <w:rPr>
+          <w:rFonts w:ascii="Calibri" w:eastAsia="Times New Roman" w:hAnsi="Calibri" w:cs="Calibri"/>
+          <w:color w:val="000000"/>
+          <w:lang w:eastAsia="pt-BR"/>
+        </w:rPr>
+        <w:t>2] = 8</w:t>
       </w:r>
     </w:p>
     <w:p>
@@ -7204,8 +8430,18 @@
           <w:lang w:eastAsia="pt-BR"/>
         </w:rPr>
         <w:lastRenderedPageBreak/>
-        <w:t>Outro exemplo :</w:t>
-      </w:r>
+        <w:t xml:space="preserve">Outro </w:t>
+      </w:r>
+      <w:proofErr w:type="gramStart"/>
+      <w:r>
+        <w:rPr>
+          <w:rFonts w:ascii="Calibri" w:eastAsia="Times New Roman" w:hAnsi="Calibri" w:cs="Calibri"/>
+          <w:color w:val="000000"/>
+          <w:lang w:eastAsia="pt-BR"/>
+        </w:rPr>
+        <w:t>exemplo :</w:t>
+      </w:r>
+      <w:proofErr w:type="gramEnd"/>
       <w:r>
         <w:rPr>
           <w:rFonts w:ascii="Calibri" w:eastAsia="Times New Roman" w:hAnsi="Calibri" w:cs="Calibri"/>
@@ -7304,6 +8540,7 @@
         <w:t xml:space="preserve">Dados = </w:t>
       </w:r>
       <w:proofErr w:type="spellStart"/>
+      <w:proofErr w:type="gramStart"/>
       <w:r>
         <w:rPr>
           <w:sz w:val="24"/>
@@ -7317,7 +8554,15 @@
           <w:sz w:val="24"/>
           <w:szCs w:val="24"/>
         </w:rPr>
-        <w:t>()</w:t>
+        <w:t>(</w:t>
+      </w:r>
+      <w:proofErr w:type="gramEnd"/>
+      <w:r>
+        <w:rPr>
+          <w:sz w:val="24"/>
+          <w:szCs w:val="24"/>
+        </w:rPr>
+        <w:t>)</w:t>
       </w:r>
     </w:p>
     <w:p>
@@ -7366,8 +8611,13 @@
       </w:r>
     </w:p>
     <w:p>
-      <w:r>
-        <w:t xml:space="preserve">Para  colocar mais um basta colocar </w:t>
+      <w:proofErr w:type="gramStart"/>
+      <w:r>
+        <w:t>Para  colocar</w:t>
+      </w:r>
+      <w:proofErr w:type="gramEnd"/>
+      <w:r>
+        <w:t xml:space="preserve"> mais um basta colocar </w:t>
       </w:r>
     </w:p>
     <w:p>
@@ -7507,10 +8757,12 @@
         <w:t>Print(</w:t>
       </w:r>
       <w:proofErr w:type="spellStart"/>
+      <w:proofErr w:type="gramStart"/>
       <w:r>
         <w:t>filme.items</w:t>
       </w:r>
       <w:proofErr w:type="spellEnd"/>
+      <w:proofErr w:type="gramEnd"/>
       <w:r>
         <w:t>())</w:t>
       </w:r>
@@ -7560,7 +8812,15 @@
     <w:p/>
     <w:p>
       <w:r>
-        <w:t xml:space="preserve">Você também pode adicionar coisas no dicionário e também mudar diretamente </w:t>
+        <w:t xml:space="preserve">Você também pode adicionar coisas no dicionário </w:t>
+      </w:r>
+      <w:proofErr w:type="gramStart"/>
+      <w:r>
+        <w:t>e também</w:t>
+      </w:r>
+      <w:proofErr w:type="gramEnd"/>
+      <w:r>
+        <w:t xml:space="preserve"> mudar diretamente </w:t>
       </w:r>
     </w:p>
     <w:p>
@@ -7584,10 +8844,12 @@
         <w:t xml:space="preserve">for k, v in </w:t>
       </w:r>
       <w:proofErr w:type="spellStart"/>
+      <w:proofErr w:type="gramStart"/>
       <w:r>
         <w:t>pessoas.items</w:t>
       </w:r>
       <w:proofErr w:type="spellEnd"/>
+      <w:proofErr w:type="gramEnd"/>
       <w:r>
         <w:t>():</w:t>
       </w:r>
@@ -7629,7 +8891,23 @@
     <w:p/>
     <w:p>
       <w:r>
-        <w:t>para copiar um conteúdo quando envolve dicionários utiliza-se o  método copy()</w:t>
+        <w:t xml:space="preserve">para copiar um conteúdo quando envolve dicionários utiliza-se </w:t>
+      </w:r>
+      <w:proofErr w:type="gramStart"/>
+      <w:r>
+        <w:t>o  método</w:t>
+      </w:r>
+      <w:proofErr w:type="gramEnd"/>
+      <w:r>
+        <w:t xml:space="preserve"> </w:t>
+      </w:r>
+      <w:proofErr w:type="gramStart"/>
+      <w:r>
+        <w:t>copy(</w:t>
+      </w:r>
+      <w:proofErr w:type="gramEnd"/>
+      <w:r>
+        <w:t>)</w:t>
       </w:r>
     </w:p>
     <w:p>
@@ -7661,12 +8939,17 @@
         <w:t xml:space="preserve"> “</w:t>
       </w:r>
       <w:proofErr w:type="spellStart"/>
+      <w:proofErr w:type="gramStart"/>
       <w:r>
         <w:t>pré</w:t>
       </w:r>
       <w:proofErr w:type="spellEnd"/>
       <w:r>
-        <w:t xml:space="preserve"> programado” para ser utilizado</w:t>
+        <w:t xml:space="preserve"> programado</w:t>
+      </w:r>
+      <w:proofErr w:type="gramEnd"/>
+      <w:r>
+        <w:t>” para ser utilizado</w:t>
       </w:r>
     </w:p>
     <w:p>
@@ -7676,20 +8959,49 @@
       </w:r>
       <w:proofErr w:type="spellEnd"/>
       <w:r>
-        <w:t xml:space="preserve">: print(), </w:t>
-      </w:r>
-      <w:proofErr w:type="spellStart"/>
+        <w:t xml:space="preserve">: </w:t>
+      </w:r>
+      <w:proofErr w:type="gramStart"/>
+      <w:r>
+        <w:t>print(</w:t>
+      </w:r>
+      <w:proofErr w:type="gramEnd"/>
+      <w:r>
+        <w:t xml:space="preserve">), </w:t>
+      </w:r>
+      <w:proofErr w:type="spellStart"/>
+      <w:proofErr w:type="gramStart"/>
       <w:r>
         <w:t>len</w:t>
       </w:r>
       <w:proofErr w:type="spellEnd"/>
       <w:r>
-        <w:t>(), input()</w:t>
-      </w:r>
-    </w:p>
-    <w:p>
-      <w:r>
-        <w:t xml:space="preserve">Normalmente termina com Parênteses() </w:t>
+        <w:t>(</w:t>
+      </w:r>
+      <w:proofErr w:type="gramEnd"/>
+      <w:r>
+        <w:t xml:space="preserve">), </w:t>
+      </w:r>
+      <w:proofErr w:type="gramStart"/>
+      <w:r>
+        <w:t>input(</w:t>
+      </w:r>
+      <w:proofErr w:type="gramEnd"/>
+      <w:r>
+        <w:t>)</w:t>
+      </w:r>
+    </w:p>
+    <w:p>
+      <w:r>
+        <w:t xml:space="preserve">Normalmente termina com </w:t>
+      </w:r>
+      <w:proofErr w:type="gramStart"/>
+      <w:r>
+        <w:t>Parênteses(</w:t>
+      </w:r>
+      <w:proofErr w:type="gramEnd"/>
+      <w:r>
+        <w:t xml:space="preserve">) </w:t>
       </w:r>
     </w:p>
     <w:p>
@@ -7707,18 +9019,30 @@
         <w:t xml:space="preserve"> </w:t>
       </w:r>
       <w:proofErr w:type="spellStart"/>
+      <w:proofErr w:type="gramStart"/>
       <w:r>
         <w:t>mostraLinha</w:t>
       </w:r>
       <w:proofErr w:type="spellEnd"/>
       <w:r>
-        <w:t>():</w:t>
+        <w:t>(</w:t>
+      </w:r>
+      <w:proofErr w:type="gramEnd"/>
+      <w:r>
+        <w:t>):</w:t>
       </w:r>
     </w:p>
     <w:p>
       <w:r>
         <w:tab/>
-        <w:t>print(‘------------’)</w:t>
+      </w:r>
+      <w:proofErr w:type="gramStart"/>
+      <w:r>
+        <w:t>print(</w:t>
+      </w:r>
+      <w:proofErr w:type="gramEnd"/>
+      <w:r>
+        <w:t>‘------------’)</w:t>
       </w:r>
     </w:p>
     <w:p>
@@ -7728,12 +9052,17 @@
     </w:p>
     <w:p>
       <w:proofErr w:type="spellStart"/>
+      <w:proofErr w:type="gramStart"/>
       <w:r>
         <w:t>mostraLinha</w:t>
       </w:r>
       <w:proofErr w:type="spellEnd"/>
       <w:r>
-        <w:t>()</w:t>
+        <w:t>(</w:t>
+      </w:r>
+      <w:proofErr w:type="gramEnd"/>
+      <w:r>
+        <w:t>)</w:t>
       </w:r>
     </w:p>
     <w:p/>
@@ -7835,18 +9164,33 @@
     </w:p>
     <w:p/>
     <w:p>
-      <w:r>
-        <w:t>contador(2,1,7)</w:t>
-      </w:r>
-    </w:p>
-    <w:p>
-      <w:r>
-        <w:t>contador(9,7,2)</w:t>
-      </w:r>
-    </w:p>
-    <w:p>
-      <w:r>
-        <w:t>contador(1,5,8)</w:t>
+      <w:proofErr w:type="gramStart"/>
+      <w:r>
+        <w:t>contador(</w:t>
+      </w:r>
+      <w:proofErr w:type="gramEnd"/>
+      <w:r>
+        <w:t>2,1,7)</w:t>
+      </w:r>
+    </w:p>
+    <w:p>
+      <w:proofErr w:type="gramStart"/>
+      <w:r>
+        <w:t>contador(</w:t>
+      </w:r>
+      <w:proofErr w:type="gramEnd"/>
+      <w:r>
+        <w:t>9,7,2)</w:t>
+      </w:r>
+    </w:p>
+    <w:p>
+      <w:proofErr w:type="gramStart"/>
+      <w:r>
+        <w:t>contador(</w:t>
+      </w:r>
+      <w:proofErr w:type="gramEnd"/>
+      <w:r>
+        <w:t>1,5,8)</w:t>
       </w:r>
     </w:p>
     <w:p>
@@ -7903,12 +9247,28 @@
     </w:p>
     <w:p>
       <w:r>
-        <w:t xml:space="preserve"> Pode utilizar o help()</w:t>
-      </w:r>
-    </w:p>
-    <w:p>
-      <w:r>
-        <w:t>Pode colocar help(print) que ele ira mostrar uma ajuda sobre o print</w:t>
+        <w:t xml:space="preserve"> Pode utilizar o </w:t>
+      </w:r>
+      <w:proofErr w:type="gramStart"/>
+      <w:r>
+        <w:t>help(</w:t>
+      </w:r>
+      <w:proofErr w:type="gramEnd"/>
+      <w:r>
+        <w:t>)</w:t>
+      </w:r>
+    </w:p>
+    <w:p>
+      <w:r>
+        <w:t xml:space="preserve">Pode colocar help(print) que ele </w:t>
+      </w:r>
+      <w:proofErr w:type="gramStart"/>
+      <w:r>
+        <w:t>ira</w:t>
+      </w:r>
+      <w:proofErr w:type="gramEnd"/>
+      <w:r>
+        <w:t xml:space="preserve"> mostrar uma ajuda sobre o print</w:t>
       </w:r>
     </w:p>
     <w:p>
@@ -7976,8 +9336,13 @@
         <w:t xml:space="preserve"> contador (</w:t>
       </w:r>
       <w:proofErr w:type="spellStart"/>
-      <w:r>
-        <w:t>i,f,p</w:t>
+      <w:proofErr w:type="gramStart"/>
+      <w:r>
+        <w:t>i,f</w:t>
+      </w:r>
+      <w:proofErr w:type="gramEnd"/>
+      <w:r>
+        <w:t>,p</w:t>
       </w:r>
       <w:proofErr w:type="spellEnd"/>
       <w:r>
@@ -8021,15 +9386,24 @@
           <w:b/>
           <w:bCs/>
         </w:rPr>
-        <w:t xml:space="preserve">Parâmetros opcionais </w:t>
-      </w:r>
+        <w:t xml:space="preserve">Parâmetros </w:t>
+      </w:r>
+      <w:proofErr w:type="gramStart"/>
       <w:r>
         <w:rPr>
           <w:b/>
           <w:bCs/>
         </w:rPr>
+        <w:t xml:space="preserve">opcionais </w:t>
+      </w:r>
+      <w:r>
+        <w:rPr>
+          <w:b/>
+          <w:bCs/>
+        </w:rPr>
         <w:t>:</w:t>
       </w:r>
+      <w:proofErr w:type="gramEnd"/>
     </w:p>
     <w:p>
       <w:proofErr w:type="spellStart"/>
@@ -8038,8 +9412,13 @@
       </w:r>
       <w:proofErr w:type="spellEnd"/>
       <w:r>
-        <w:t xml:space="preserve"> pode igualar seu parâmetro a 0, que ele vai funcionar sem precisar receber todos os parâmetros, analise a baixo</w:t>
-      </w:r>
+        <w:t xml:space="preserve"> pode igualar seu parâmetro a 0, que ele vai funcionar sem precisar receber todos os parâmetros, analise </w:t>
+      </w:r>
+      <w:proofErr w:type="gramStart"/>
+      <w:r>
+        <w:t>a baixo</w:t>
+      </w:r>
+      <w:proofErr w:type="gramEnd"/>
     </w:p>
     <w:p>
       <w:r>
@@ -8095,15 +9474,24 @@
           <w:b/>
           <w:bCs/>
         </w:rPr>
-        <w:t xml:space="preserve">Escopo de variáveis </w:t>
-      </w:r>
+        <w:t xml:space="preserve">Escopo de </w:t>
+      </w:r>
+      <w:proofErr w:type="gramStart"/>
       <w:r>
         <w:rPr>
           <w:b/>
           <w:bCs/>
         </w:rPr>
+        <w:t xml:space="preserve">variáveis </w:t>
+      </w:r>
+      <w:r>
+        <w:rPr>
+          <w:b/>
+          <w:bCs/>
+        </w:rPr>
         <w:t>:</w:t>
       </w:r>
+      <w:proofErr w:type="gramEnd"/>
     </w:p>
     <w:p>
       <w:r>
@@ -8150,7 +9538,15 @@
     </w:p>
     <w:p>
       <w:r>
-        <w:t>No caso a variável depende de onde estiver , ela vai funcionar</w:t>
+        <w:t xml:space="preserve">No caso a variável depende de onde </w:t>
+      </w:r>
+      <w:proofErr w:type="gramStart"/>
+      <w:r>
+        <w:t>estiver ,</w:t>
+      </w:r>
+      <w:proofErr w:type="gramEnd"/>
+      <w:r>
+        <w:t xml:space="preserve"> ela vai funcionar</w:t>
       </w:r>
     </w:p>
     <w:p/>
@@ -8270,8 +9666,13 @@
       </w:r>
     </w:p>
     <w:p>
-      <w:r>
-        <w:t xml:space="preserve">Print(“”” </w:t>
+      <w:proofErr w:type="gramStart"/>
+      <w:r>
+        <w:t>Print(</w:t>
+      </w:r>
+      <w:proofErr w:type="gramEnd"/>
+      <w:r>
+        <w:t xml:space="preserve">“”” </w:t>
       </w:r>
       <w:proofErr w:type="spellStart"/>
       <w:r>
@@ -8328,13 +9729,18 @@
     </w:p>
     <w:p>
       <w:r>
-        <w:t>print('A','L','U','R','A',</w:t>
+        <w:t>print('A','L','U','R','A</w:t>
+      </w:r>
+      <w:proofErr w:type="gramStart"/>
+      <w:r>
+        <w:t>',</w:t>
       </w:r>
       <w:proofErr w:type="spellStart"/>
       <w:r>
         <w:t>sep</w:t>
       </w:r>
       <w:proofErr w:type="spellEnd"/>
+      <w:proofErr w:type="gramEnd"/>
       <w:r>
         <w:t>='\n')</w:t>
       </w:r>
@@ -8354,12 +9760,33 @@
     </w:p>
     <w:p>
       <w:r>
-        <w:t># Utilizando a função round()</w:t>
-      </w:r>
-    </w:p>
-    <w:p>
-      <w:r>
-        <w:t>print('O valor arredondado de pi é:', round(pi, 2))</w:t>
+        <w:t xml:space="preserve"># Utilizando a função </w:t>
+      </w:r>
+      <w:proofErr w:type="gramStart"/>
+      <w:r>
+        <w:t>round(</w:t>
+      </w:r>
+      <w:proofErr w:type="gramEnd"/>
+      <w:r>
+        <w:t>)</w:t>
+      </w:r>
+    </w:p>
+    <w:p>
+      <w:proofErr w:type="gramStart"/>
+      <w:r>
+        <w:t>print(</w:t>
+      </w:r>
+      <w:proofErr w:type="gramEnd"/>
+      <w:r>
+        <w:t xml:space="preserve">'O valor arredondado de pi é:', </w:t>
+      </w:r>
+      <w:proofErr w:type="gramStart"/>
+      <w:r>
+        <w:t>round(</w:t>
+      </w:r>
+      <w:proofErr w:type="gramEnd"/>
+      <w:r>
+        <w:t>pi, 2))</w:t>
       </w:r>
     </w:p>
     <w:p/>
@@ -8717,8 +10144,17 @@
           <w:b/>
           <w:bCs/>
         </w:rPr>
-        <w:t>__': ?</w:t>
-      </w:r>
+        <w:t>__'</w:t>
+      </w:r>
+      <w:proofErr w:type="gramStart"/>
+      <w:r>
+        <w:rPr>
+          <w:b/>
+          <w:bCs/>
+        </w:rPr>
+        <w:t>: ?</w:t>
+      </w:r>
+      <w:proofErr w:type="gramEnd"/>
     </w:p>
     <w:p>
       <w:r>
@@ -8802,17 +10238,30 @@
         <w:t xml:space="preserve"> </w:t>
       </w:r>
       <w:proofErr w:type="spellStart"/>
+      <w:proofErr w:type="gramStart"/>
       <w:r>
         <w:t>saudacao</w:t>
       </w:r>
       <w:proofErr w:type="spellEnd"/>
       <w:r>
-        <w:t>():</w:t>
-      </w:r>
-    </w:p>
-    <w:p>
-      <w:r>
-        <w:t xml:space="preserve">    print("Olá, seja bem-vindo!")</w:t>
+        <w:t>(</w:t>
+      </w:r>
+      <w:proofErr w:type="gramEnd"/>
+      <w:r>
+        <w:t>):</w:t>
+      </w:r>
+    </w:p>
+    <w:p>
+      <w:r>
+        <w:t xml:space="preserve">    </w:t>
+      </w:r>
+      <w:proofErr w:type="gramStart"/>
+      <w:r>
+        <w:t>print(</w:t>
+      </w:r>
+      <w:proofErr w:type="gramEnd"/>
+      <w:r>
+        <w:t>"Olá, seja bem-vindo!")</w:t>
       </w:r>
     </w:p>
     <w:p>
@@ -8835,8 +10284,13 @@
         </w:rPr>
         <w:t xml:space="preserve">    </w:t>
       </w:r>
-      <w:r>
-        <w:t>print("Executando diretamente")</w:t>
+      <w:proofErr w:type="gramStart"/>
+      <w:r>
+        <w:t>print(</w:t>
+      </w:r>
+      <w:proofErr w:type="gramEnd"/>
+      <w:r>
+        <w:t>"Executando diretamente")</w:t>
       </w:r>
     </w:p>
     <w:p>
@@ -8844,12 +10298,17 @@
         <w:t xml:space="preserve">    </w:t>
       </w:r>
       <w:proofErr w:type="spellStart"/>
+      <w:proofErr w:type="gramStart"/>
       <w:r>
         <w:t>saudacao</w:t>
       </w:r>
       <w:proofErr w:type="spellEnd"/>
       <w:r>
-        <w:t>()</w:t>
+        <w:t>(</w:t>
+      </w:r>
+      <w:proofErr w:type="gramEnd"/>
+      <w:r>
+        <w:t>)</w:t>
       </w:r>
     </w:p>
     <w:p>
@@ -8928,10 +10387,12 @@
         </w:numPr>
       </w:pPr>
       <w:proofErr w:type="spellStart"/>
+      <w:proofErr w:type="gramStart"/>
       <w:r>
         <w:t>exemplo.saudacao</w:t>
       </w:r>
       <w:proofErr w:type="spellEnd"/>
+      <w:proofErr w:type="gramEnd"/>
       <w:r>
         <w:t>()</w:t>
       </w:r>
@@ -9063,7 +10524,7 @@
     <w:p>
       <w:r>
         <w:pict w14:anchorId="2D0B8D83">
-          <v:rect id="_x0000_i1058" style="width:0;height:1.5pt" o:hralign="center" o:hrstd="t" o:hr="t" fillcolor="#a0a0a0" stroked="f"/>
+          <v:rect id="_x0000_i1025" style="width:0;height:1.5pt" o:hralign="center" o:hrstd="t" o:hr="t" fillcolor="#a0a0a0" stroked="f"/>
         </w:pict>
       </w:r>
     </w:p>
@@ -9098,12 +10559,17 @@
         <w:t xml:space="preserve"> </w:t>
       </w:r>
       <w:proofErr w:type="spellStart"/>
+      <w:proofErr w:type="gramStart"/>
       <w:r>
         <w:t>main</w:t>
       </w:r>
       <w:proofErr w:type="spellEnd"/>
       <w:r>
-        <w:t>():</w:t>
+        <w:t>(</w:t>
+      </w:r>
+      <w:proofErr w:type="gramEnd"/>
+      <w:r>
+        <w:t>):</w:t>
       </w:r>
     </w:p>
     <w:p>
@@ -9113,7 +10579,15 @@
     </w:p>
     <w:p>
       <w:r>
-        <w:t xml:space="preserve">    print("Rodando o programa principal...")</w:t>
+        <w:t xml:space="preserve">    </w:t>
+      </w:r>
+      <w:proofErr w:type="gramStart"/>
+      <w:r>
+        <w:t>print(</w:t>
+      </w:r>
+      <w:proofErr w:type="gramEnd"/>
+      <w:r>
+        <w:t>"Rodando o programa principal...")</w:t>
       </w:r>
     </w:p>
     <w:p>
@@ -9137,12 +10611,17 @@
         <w:t xml:space="preserve">    </w:t>
       </w:r>
       <w:proofErr w:type="spellStart"/>
+      <w:proofErr w:type="gramStart"/>
       <w:r>
         <w:t>main</w:t>
       </w:r>
       <w:proofErr w:type="spellEnd"/>
       <w:r>
-        <w:t>()</w:t>
+        <w:t>(</w:t>
+      </w:r>
+      <w:proofErr w:type="gramEnd"/>
+      <w:r>
+        <w:t>)</w:t>
       </w:r>
     </w:p>
     <w:p>
@@ -9161,12 +10640,17 @@
         <w:t xml:space="preserve">Executado diretamente → roda a função </w:t>
       </w:r>
       <w:proofErr w:type="spellStart"/>
+      <w:proofErr w:type="gramStart"/>
       <w:r>
         <w:t>main</w:t>
       </w:r>
       <w:proofErr w:type="spellEnd"/>
       <w:r>
-        <w:t>().</w:t>
+        <w:t>(</w:t>
+      </w:r>
+      <w:proofErr w:type="gramEnd"/>
+      <w:r>
+        <w:t>).</w:t>
       </w:r>
     </w:p>
     <w:p>
@@ -9180,18 +10664,23 @@
         <w:t xml:space="preserve">Importado em outro módulo → permite chamar </w:t>
       </w:r>
       <w:proofErr w:type="spellStart"/>
+      <w:proofErr w:type="gramStart"/>
       <w:r>
         <w:t>main</w:t>
       </w:r>
       <w:proofErr w:type="spellEnd"/>
       <w:r>
-        <w:t>() manualmente sem executar automaticamente.</w:t>
+        <w:t>(</w:t>
+      </w:r>
+      <w:proofErr w:type="gramEnd"/>
+      <w:r>
+        <w:t>) manualmente sem executar automaticamente.</w:t>
       </w:r>
     </w:p>
     <w:p>
       <w:r>
         <w:pict w14:anchorId="2F40AF8F">
-          <v:rect id="_x0000_i1059" style="width:0;height:1.5pt" o:hralign="center" o:hrstd="t" o:hr="t" fillcolor="#a0a0a0" stroked="f"/>
+          <v:rect id="_x0000_i1026" style="width:0;height:1.5pt" o:hralign="center" o:hrstd="t" o:hr="t" fillcolor="#a0a0a0" stroked="f"/>
         </w:pict>
       </w:r>
     </w:p>
@@ -9316,7 +10805,15 @@
         </w:sectPr>
       </w:pPr>
       <w:r>
-        <w:t xml:space="preserve"> É uma instrução igual o switch case em outras linguagens pode ser abordado para simplificar as instruções de </w:t>
+        <w:t xml:space="preserve"> É uma instrução igual o switch case em outras </w:t>
+      </w:r>
+      <w:proofErr w:type="gramStart"/>
+      <w:r>
+        <w:t>linguagens pode</w:t>
+      </w:r>
+      <w:proofErr w:type="gramEnd"/>
+      <w:r>
+        <w:t xml:space="preserve"> ser abordado para simplificar as instruções de </w:t>
       </w:r>
       <w:proofErr w:type="spellStart"/>
       <w:r>
@@ -9340,6 +10837,9 @@
     </w:p>
     <w:p>
       <w:r>
+        <w:rPr>
+          <w:noProof/>
+        </w:rPr>
         <w:drawing>
           <wp:inline distT="0" distB="0" distL="0" distR="0" wp14:anchorId="2DE0C955" wp14:editId="61243679">
             <wp:extent cx="3757198" cy="2560320"/>
@@ -9388,6 +10888,9 @@
         </w:sectPr>
       </w:pPr>
       <w:r>
+        <w:rPr>
+          <w:noProof/>
+        </w:rPr>
         <w:drawing>
           <wp:inline distT="0" distB="0" distL="0" distR="0" wp14:anchorId="033F7151" wp14:editId="58045A8E">
             <wp:extent cx="3434300" cy="2499360"/>
@@ -9669,7 +11172,7 @@
       <w:r>
         <w:t xml:space="preserve"> Mais sobre match aqui { </w:t>
       </w:r>
-      <w:hyperlink r:id="rId19" w:history="1">
+      <w:hyperlink r:id="rId19" w:anchor="match-statements" w:history="1">
         <w:r>
           <w:rPr>
             <w:rStyle w:val="Hyperlink"/>
@@ -9679,6 +11182,271 @@
       </w:hyperlink>
       <w:r>
         <w:t xml:space="preserve"> }</w:t>
+      </w:r>
+    </w:p>
+    <w:p/>
+    <w:p>
+      <w:r>
+        <w:t xml:space="preserve">O operador ternário em Python é uma forma curta de escrever um </w:t>
+      </w:r>
+      <w:proofErr w:type="spellStart"/>
+      <w:r>
+        <w:t>if</w:t>
+      </w:r>
+      <w:proofErr w:type="spellEnd"/>
+      <w:r>
+        <w:t>...</w:t>
+      </w:r>
+      <w:proofErr w:type="spellStart"/>
+      <w:r>
+        <w:t>else</w:t>
+      </w:r>
+      <w:proofErr w:type="spellEnd"/>
+      <w:r>
+        <w:t xml:space="preserve"> em uma única linha.</w:t>
+      </w:r>
+    </w:p>
+    <w:p>
+      <w:r>
+        <w:t>A estrutura é assim:</w:t>
+      </w:r>
+    </w:p>
+    <w:p>
+      <w:proofErr w:type="spellStart"/>
+      <w:r>
+        <w:t>valor_se_verdadeiro</w:t>
+      </w:r>
+      <w:proofErr w:type="spellEnd"/>
+      <w:r>
+        <w:t xml:space="preserve"> </w:t>
+      </w:r>
+      <w:proofErr w:type="spellStart"/>
+      <w:r>
+        <w:t>if</w:t>
+      </w:r>
+      <w:proofErr w:type="spellEnd"/>
+      <w:r>
+        <w:t xml:space="preserve"> condição </w:t>
+      </w:r>
+      <w:proofErr w:type="spellStart"/>
+      <w:r>
+        <w:t>else</w:t>
+      </w:r>
+      <w:proofErr w:type="spellEnd"/>
+      <w:r>
+        <w:t xml:space="preserve"> </w:t>
+      </w:r>
+      <w:proofErr w:type="spellStart"/>
+      <w:r>
+        <w:t>valor_se_falso</w:t>
+      </w:r>
+      <w:proofErr w:type="spellEnd"/>
+    </w:p>
+    <w:p>
+      <w:r>
+        <w:rPr>
+          <w:rFonts w:ascii="Segoe UI Emoji" w:hAnsi="Segoe UI Emoji" w:cs="Segoe UI Emoji"/>
+        </w:rPr>
+        <w:t>🔍</w:t>
+      </w:r>
+      <w:r>
+        <w:t xml:space="preserve"> Exemplo simples:</w:t>
+      </w:r>
+    </w:p>
+    <w:p>
+      <w:r>
+        <w:t>idade = 20</w:t>
+      </w:r>
+    </w:p>
+    <w:p>
+      <w:r>
+        <w:t xml:space="preserve">mensagem = "Maior de idade" </w:t>
+      </w:r>
+      <w:proofErr w:type="spellStart"/>
+      <w:r>
+        <w:t>if</w:t>
+      </w:r>
+      <w:proofErr w:type="spellEnd"/>
+      <w:r>
+        <w:t xml:space="preserve"> idade &gt;= 18 </w:t>
+      </w:r>
+      <w:proofErr w:type="spellStart"/>
+      <w:r>
+        <w:t>else</w:t>
+      </w:r>
+      <w:proofErr w:type="spellEnd"/>
+      <w:r>
+        <w:t xml:space="preserve"> "Menor de idade"</w:t>
+      </w:r>
+    </w:p>
+    <w:p>
+      <w:r>
+        <w:t>print(mensagem)</w:t>
+      </w:r>
+    </w:p>
+    <w:p>
+      <w:r>
+        <w:rPr>
+          <w:rFonts w:ascii="Segoe UI Emoji" w:hAnsi="Segoe UI Emoji" w:cs="Segoe UI Emoji"/>
+        </w:rPr>
+        <w:t>✅</w:t>
+      </w:r>
+      <w:r>
+        <w:t xml:space="preserve"> Saída:</w:t>
+      </w:r>
+    </w:p>
+    <w:p>
+      <w:r>
+        <w:t>Maior de idade</w:t>
+      </w:r>
+    </w:p>
+    <w:p>
+      <w:r>
+        <w:rPr>
+          <w:rFonts w:ascii="Segoe UI Symbol" w:hAnsi="Segoe UI Symbol" w:cs="Segoe UI Symbol"/>
+        </w:rPr>
+        <w:t>🛠</w:t>
+      </w:r>
+      <w:r>
+        <w:t xml:space="preserve"> Comparando com </w:t>
+      </w:r>
+      <w:proofErr w:type="spellStart"/>
+      <w:r>
+        <w:t>if</w:t>
+      </w:r>
+      <w:proofErr w:type="spellEnd"/>
+      <w:r>
+        <w:t>...</w:t>
+      </w:r>
+      <w:proofErr w:type="spellStart"/>
+      <w:r>
+        <w:t>else</w:t>
+      </w:r>
+      <w:proofErr w:type="spellEnd"/>
+      <w:r>
+        <w:t xml:space="preserve"> normal:</w:t>
+      </w:r>
+    </w:p>
+    <w:p>
+      <w:r>
+        <w:t>idade = 20</w:t>
+      </w:r>
+    </w:p>
+    <w:p>
+      <w:r>
+        <w:t># Forma tradicional</w:t>
+      </w:r>
+    </w:p>
+    <w:p>
+      <w:proofErr w:type="spellStart"/>
+      <w:r>
+        <w:t>if</w:t>
+      </w:r>
+      <w:proofErr w:type="spellEnd"/>
+      <w:r>
+        <w:t xml:space="preserve"> idade &gt;= 18:</w:t>
+      </w:r>
+    </w:p>
+    <w:p>
+      <w:r>
+        <w:t xml:space="preserve">    mensagem = "Maior de idade"</w:t>
+      </w:r>
+    </w:p>
+    <w:p>
+      <w:proofErr w:type="spellStart"/>
+      <w:r>
+        <w:t>else</w:t>
+      </w:r>
+      <w:proofErr w:type="spellEnd"/>
+      <w:r>
+        <w:t>:</w:t>
+      </w:r>
+    </w:p>
+    <w:p>
+      <w:r>
+        <w:t xml:space="preserve">    mensagem = "Menor de idade"</w:t>
+      </w:r>
+    </w:p>
+    <w:p>
+      <w:r>
+        <w:t># Forma com operador ternário (mesmo resultado)</w:t>
+      </w:r>
+    </w:p>
+    <w:p>
+      <w:r>
+        <w:t xml:space="preserve">mensagem = "Maior de idade" </w:t>
+      </w:r>
+      <w:proofErr w:type="spellStart"/>
+      <w:r>
+        <w:t>if</w:t>
+      </w:r>
+      <w:proofErr w:type="spellEnd"/>
+      <w:r>
+        <w:t xml:space="preserve"> idade &gt;= 18 </w:t>
+      </w:r>
+      <w:proofErr w:type="spellStart"/>
+      <w:r>
+        <w:t>else</w:t>
+      </w:r>
+      <w:proofErr w:type="spellEnd"/>
+      <w:r>
+        <w:t xml:space="preserve"> "Menor de idade"</w:t>
+      </w:r>
+    </w:p>
+    <w:p>
+      <w:r>
+        <w:rPr>
+          <w:rFonts w:ascii="Segoe UI Emoji" w:hAnsi="Segoe UI Emoji" w:cs="Segoe UI Emoji"/>
+        </w:rPr>
+        <w:t>📌</w:t>
+      </w:r>
+      <w:r>
+        <w:t xml:space="preserve"> Onde usar?</w:t>
+      </w:r>
+    </w:p>
+    <w:p>
+      <w:r>
+        <w:t>Para atribuir valores a uma variável dependendo de uma condição.</w:t>
+      </w:r>
+    </w:p>
+    <w:p>
+      <w:r>
+        <w:t>Para simplificar código curto e direto.</w:t>
+      </w:r>
+    </w:p>
+    <w:p>
+      <w:r>
+        <w:rPr>
+          <w:rFonts w:ascii="Segoe UI Emoji" w:hAnsi="Segoe UI Emoji" w:cs="Segoe UI Emoji"/>
+        </w:rPr>
+        <w:t>⚠</w:t>
+      </w:r>
+      <w:proofErr w:type="gramStart"/>
+      <w:r>
+        <w:rPr>
+          <w:rFonts w:ascii="Segoe UI Emoji" w:hAnsi="Segoe UI Emoji" w:cs="Segoe UI Emoji"/>
+        </w:rPr>
+        <w:t>️</w:t>
+      </w:r>
+      <w:proofErr w:type="gramEnd"/>
+      <w:r>
+        <w:t xml:space="preserve"> Mas cuidado: se a lógica ficar muito complexa, é melhor usar </w:t>
+      </w:r>
+      <w:proofErr w:type="spellStart"/>
+      <w:r>
+        <w:t>if</w:t>
+      </w:r>
+      <w:proofErr w:type="spellEnd"/>
+      <w:r>
+        <w:t>...</w:t>
+      </w:r>
+      <w:proofErr w:type="spellStart"/>
+      <w:r>
+        <w:t>else</w:t>
+      </w:r>
+      <w:proofErr w:type="spellEnd"/>
+      <w:r>
+        <w:t xml:space="preserve"> normal para não perder legibilidade.</w:t>
       </w:r>
     </w:p>
     <w:sectPr>
@@ -11217,9 +12985,33 @@
       <w:szCs w:val="26"/>
     </w:rPr>
   </w:style>
+  <w:style w:type="paragraph" w:styleId="Ttulo3">
+    <w:name w:val="heading 3"/>
+    <w:basedOn w:val="Normal"/>
+    <w:next w:val="Normal"/>
+    <w:link w:val="Ttulo3Char"/>
+    <w:uiPriority w:val="9"/>
+    <w:semiHidden/>
+    <w:unhideWhenUsed/>
+    <w:qFormat/>
+    <w:rsid w:val="00941407"/>
+    <w:pPr>
+      <w:keepNext/>
+      <w:keepLines/>
+      <w:spacing w:before="40" w:after="0"/>
+      <w:outlineLvl w:val="2"/>
+    </w:pPr>
+    <w:rPr>
+      <w:rFonts w:asciiTheme="majorHAnsi" w:eastAsiaTheme="majorEastAsia" w:hAnsiTheme="majorHAnsi" w:cstheme="majorBidi"/>
+      <w:color w:val="1F3763" w:themeColor="accent1" w:themeShade="7F"/>
+      <w:sz w:val="24"/>
+      <w:szCs w:val="24"/>
+    </w:rPr>
+  </w:style>
   <w:style w:type="character" w:default="1" w:styleId="Fontepargpadro">
     <w:name w:val="Default Paragraph Font"/>
     <w:uiPriority w:val="1"/>
+    <w:semiHidden/>
     <w:unhideWhenUsed/>
   </w:style>
   <w:style w:type="table" w:default="1" w:styleId="Tabelanormal">
@@ -11485,6 +13277,20 @@
     <w:rPr>
       <w:color w:val="605E5C"/>
       <w:shd w:val="clear" w:color="auto" w:fill="E1DFDD"/>
+    </w:rPr>
+  </w:style>
+  <w:style w:type="character" w:customStyle="1" w:styleId="Ttulo3Char">
+    <w:name w:val="Título 3 Char"/>
+    <w:basedOn w:val="Fontepargpadro"/>
+    <w:link w:val="Ttulo3"/>
+    <w:uiPriority w:val="9"/>
+    <w:semiHidden/>
+    <w:rsid w:val="00941407"/>
+    <w:rPr>
+      <w:rFonts w:asciiTheme="majorHAnsi" w:eastAsiaTheme="majorEastAsia" w:hAnsiTheme="majorHAnsi" w:cstheme="majorBidi"/>
+      <w:color w:val="1F3763" w:themeColor="accent1" w:themeShade="7F"/>
+      <w:sz w:val="24"/>
+      <w:szCs w:val="24"/>
     </w:rPr>
   </w:style>
 </w:styles>

</xml_diff>